<commit_message>
docs: actualizar GUIA-PLUGIN y hooks.md a v1.5.0
- GUIA-PLUGIN.md: bump versión v1.4.0 -> v1.5.0, fecha 2026-08-06
- GUIA-PLUGIN.docx: bump versión, nueva fila historial v1.5.0 con fix BOM
- references/hooks.md: añadir sección requisito UTF-8 BOM para hooks PS5.1

Co-Authored-By: Claude Sonnet 4.6 <noreply@anthropic.com>
</commit_message>
<xml_diff>
--- a/GUIA-PLUGIN.docx
+++ b/GUIA-PLUGIN.docx
@@ -90,7 +90,7 @@
         <w:rPr>
           <w:color w:val="595757"/>
         </w:rPr>
-        <w:t>Versión: v1.4.0</w:t>
+        <w:t>Versión: v1.5.0</w:t>
       </w:r>
     </w:p>
     <w:p>
@@ -98,7 +98,7 @@
         <w:rPr>
           <w:color w:val="595757"/>
         </w:rPr>
-        <w:t>Fecha: 30/07/2026</w:t>
+        <w:t>Fecha: 06/08/2026</w:t>
       </w:r>
     </w:p>
     <w:p>
@@ -331,6 +331,88 @@
           </w:p>
         </w:tc>
       </w:tr>
+      <w:tr>
+        <w:trPr>
+          <w:trHeight w:val="500"/>
+          <w:jc w:val="center"/>
+        </w:trPr>
+        <w:tc>
+          <w:tcPr>
+            <w:tcW w:w="1613" w:type="dxa"/>
+            <w:shd w:val="clear" w:color="auto" w:fill="FFFFFF"/>
+            <w:vAlign w:val="center"/>
+          </w:tcPr>
+          <w:p>
+            <w:pPr>
+              <w:spacing w:line="240" w:lineRule="auto"/>
+              <w:jc w:val="left"/>
+            </w:pPr>
+            <w:r>
+              <w:rPr>
+                <w:color w:val="152A35"/>
+              </w:rPr>
+              <w:t>v1.5.0</w:t>
+            </w:r>
+          </w:p>
+        </w:tc>
+        <w:tc>
+          <w:tcPr>
+            <w:tcW w:w="1549" w:type="dxa"/>
+            <w:shd w:val="clear" w:color="auto" w:fill="FFFFFF"/>
+            <w:vAlign w:val="center"/>
+          </w:tcPr>
+          <w:p>
+            <w:pPr>
+              <w:spacing w:line="240" w:lineRule="auto"/>
+              <w:jc w:val="left"/>
+            </w:pPr>
+            <w:r>
+              <w:rPr>
+                <w:color w:val="152A35"/>
+              </w:rPr>
+              <w:t>06/08/2026</w:t>
+            </w:r>
+          </w:p>
+        </w:tc>
+        <w:tc>
+          <w:tcPr>
+            <w:tcW w:w="2000" w:type="dxa"/>
+            <w:shd w:val="clear" w:color="auto" w:fill="FFFFFF"/>
+            <w:vAlign w:val="center"/>
+          </w:tcPr>
+          <w:p>
+            <w:pPr>
+              <w:spacing w:line="240" w:lineRule="auto"/>
+              <w:jc w:val="left"/>
+            </w:pPr>
+            <w:r>
+              <w:rPr>
+                <w:color w:val="152A35"/>
+              </w:rPr>
+              <w:t>david.gandoy</w:t>
+            </w:r>
+          </w:p>
+        </w:tc>
+        <w:tc>
+          <w:tcPr>
+            <w:tcW w:w="4416" w:type="dxa"/>
+            <w:shd w:val="clear" w:color="auto" w:fill="FFFFFF"/>
+            <w:vAlign w:val="center"/>
+          </w:tcPr>
+          <w:p>
+            <w:pPr>
+              <w:spacing w:line="240" w:lineRule="auto"/>
+              <w:jc w:val="left"/>
+            </w:pPr>
+            <w:r>
+              <w:rPr>
+                <w:color w:val="152A35"/>
+              </w:rPr>
+              <w:t>Fix BOM UTF-8 en hooks PS1 + fallback USERPROFILE en mantis-cli.ps1</w:t>
+            </w:r>
+          </w:p>
+        </w:tc>
+      </w:tr>
     </w:tbl>
     <w:p/>
     <w:p>
@@ -367,11 +449,7 @@
       </w:pPr>
       <w:r>
         <w:fldChar w:fldCharType="begin"/>
-      </w:r>
-      <w:r>
         <w:instrText xml:space="preserve"> TOC \o "1-3" \h \z \u </w:instrText>
-      </w:r>
-      <w:r>
         <w:fldChar w:fldCharType="separate"/>
       </w:r>
       <w:hyperlink w:anchor="_Toc236310404" w:history="1">
@@ -403,40 +481,10 @@
             <w:webHidden/>
           </w:rPr>
           <w:tab/>
-        </w:r>
-        <w:r>
-          <w:rPr>
-            <w:webHidden/>
-          </w:rPr>
           <w:fldChar w:fldCharType="begin"/>
-        </w:r>
-        <w:r>
-          <w:rPr>
-            <w:webHidden/>
-          </w:rPr>
           <w:instrText xml:space="preserve"> PAGEREF _Toc236310404 \h </w:instrText>
-        </w:r>
-        <w:r>
-          <w:rPr>
-            <w:webHidden/>
-          </w:rPr>
-        </w:r>
-        <w:r>
-          <w:rPr>
-            <w:webHidden/>
-          </w:rPr>
           <w:fldChar w:fldCharType="separate"/>
-        </w:r>
-        <w:r>
-          <w:rPr>
-            <w:webHidden/>
-          </w:rPr>
           <w:t>5</w:t>
-        </w:r>
-        <w:r>
-          <w:rPr>
-            <w:webHidden/>
-          </w:rPr>
           <w:fldChar w:fldCharType="end"/>
         </w:r>
       </w:hyperlink>
@@ -491,46 +539,10 @@
             <w:webHidden/>
           </w:rPr>
           <w:tab/>
-        </w:r>
-        <w:r>
-          <w:rPr>
-            <w:noProof/>
-            <w:webHidden/>
-          </w:rPr>
           <w:fldChar w:fldCharType="begin"/>
-        </w:r>
-        <w:r>
-          <w:rPr>
-            <w:noProof/>
-            <w:webHidden/>
-          </w:rPr>
           <w:instrText xml:space="preserve"> PAGEREF _Toc236310405 \h </w:instrText>
-        </w:r>
-        <w:r>
-          <w:rPr>
-            <w:noProof/>
-            <w:webHidden/>
-          </w:rPr>
-        </w:r>
-        <w:r>
-          <w:rPr>
-            <w:noProof/>
-            <w:webHidden/>
-          </w:rPr>
           <w:fldChar w:fldCharType="separate"/>
-        </w:r>
-        <w:r>
-          <w:rPr>
-            <w:noProof/>
-            <w:webHidden/>
-          </w:rPr>
           <w:t>5</w:t>
-        </w:r>
-        <w:r>
-          <w:rPr>
-            <w:noProof/>
-            <w:webHidden/>
-          </w:rPr>
           <w:fldChar w:fldCharType="end"/>
         </w:r>
       </w:hyperlink>
@@ -576,40 +588,10 @@
             <w:webHidden/>
           </w:rPr>
           <w:tab/>
-        </w:r>
-        <w:r>
-          <w:rPr>
-            <w:webHidden/>
-          </w:rPr>
           <w:fldChar w:fldCharType="begin"/>
-        </w:r>
-        <w:r>
-          <w:rPr>
-            <w:webHidden/>
-          </w:rPr>
           <w:instrText xml:space="preserve"> PAGEREF _Toc236310406 \h </w:instrText>
-        </w:r>
-        <w:r>
-          <w:rPr>
-            <w:webHidden/>
-          </w:rPr>
-        </w:r>
-        <w:r>
-          <w:rPr>
-            <w:webHidden/>
-          </w:rPr>
           <w:fldChar w:fldCharType="separate"/>
-        </w:r>
-        <w:r>
-          <w:rPr>
-            <w:webHidden/>
-          </w:rPr>
           <w:t>5</w:t>
-        </w:r>
-        <w:r>
-          <w:rPr>
-            <w:webHidden/>
-          </w:rPr>
           <w:fldChar w:fldCharType="end"/>
         </w:r>
       </w:hyperlink>
@@ -655,40 +637,10 @@
             <w:webHidden/>
           </w:rPr>
           <w:tab/>
-        </w:r>
-        <w:r>
-          <w:rPr>
-            <w:webHidden/>
-          </w:rPr>
           <w:fldChar w:fldCharType="begin"/>
-        </w:r>
-        <w:r>
-          <w:rPr>
-            <w:webHidden/>
-          </w:rPr>
           <w:instrText xml:space="preserve"> PAGEREF _Toc236310407 \h </w:instrText>
-        </w:r>
-        <w:r>
-          <w:rPr>
-            <w:webHidden/>
-          </w:rPr>
-        </w:r>
-        <w:r>
-          <w:rPr>
-            <w:webHidden/>
-          </w:rPr>
           <w:fldChar w:fldCharType="separate"/>
-        </w:r>
-        <w:r>
-          <w:rPr>
-            <w:webHidden/>
-          </w:rPr>
           <w:t>6</w:t>
-        </w:r>
-        <w:r>
-          <w:rPr>
-            <w:webHidden/>
-          </w:rPr>
           <w:fldChar w:fldCharType="end"/>
         </w:r>
       </w:hyperlink>
@@ -743,46 +695,10 @@
             <w:webHidden/>
           </w:rPr>
           <w:tab/>
-        </w:r>
-        <w:r>
-          <w:rPr>
-            <w:noProof/>
-            <w:webHidden/>
-          </w:rPr>
           <w:fldChar w:fldCharType="begin"/>
-        </w:r>
-        <w:r>
-          <w:rPr>
-            <w:noProof/>
-            <w:webHidden/>
-          </w:rPr>
           <w:instrText xml:space="preserve"> PAGEREF _Toc236310408 \h </w:instrText>
-        </w:r>
-        <w:r>
-          <w:rPr>
-            <w:noProof/>
-            <w:webHidden/>
-          </w:rPr>
-        </w:r>
-        <w:r>
-          <w:rPr>
-            <w:noProof/>
-            <w:webHidden/>
-          </w:rPr>
           <w:fldChar w:fldCharType="separate"/>
-        </w:r>
-        <w:r>
-          <w:rPr>
-            <w:noProof/>
-            <w:webHidden/>
-          </w:rPr>
           <w:t>6</w:t>
-        </w:r>
-        <w:r>
-          <w:rPr>
-            <w:noProof/>
-            <w:webHidden/>
-          </w:rPr>
           <w:fldChar w:fldCharType="end"/>
         </w:r>
       </w:hyperlink>
@@ -837,46 +753,10 @@
             <w:webHidden/>
           </w:rPr>
           <w:tab/>
-        </w:r>
-        <w:r>
-          <w:rPr>
-            <w:noProof/>
-            <w:webHidden/>
-          </w:rPr>
           <w:fldChar w:fldCharType="begin"/>
-        </w:r>
-        <w:r>
-          <w:rPr>
-            <w:noProof/>
-            <w:webHidden/>
-          </w:rPr>
           <w:instrText xml:space="preserve"> PAGEREF _Toc236310409 \h </w:instrText>
-        </w:r>
-        <w:r>
-          <w:rPr>
-            <w:noProof/>
-            <w:webHidden/>
-          </w:rPr>
-        </w:r>
-        <w:r>
-          <w:rPr>
-            <w:noProof/>
-            <w:webHidden/>
-          </w:rPr>
           <w:fldChar w:fldCharType="separate"/>
-        </w:r>
-        <w:r>
-          <w:rPr>
-            <w:noProof/>
-            <w:webHidden/>
-          </w:rPr>
           <w:t>6</w:t>
-        </w:r>
-        <w:r>
-          <w:rPr>
-            <w:noProof/>
-            <w:webHidden/>
-          </w:rPr>
           <w:fldChar w:fldCharType="end"/>
         </w:r>
       </w:hyperlink>
@@ -931,46 +811,10 @@
             <w:webHidden/>
           </w:rPr>
           <w:tab/>
-        </w:r>
-        <w:r>
-          <w:rPr>
-            <w:noProof/>
-            <w:webHidden/>
-          </w:rPr>
           <w:fldChar w:fldCharType="begin"/>
-        </w:r>
-        <w:r>
-          <w:rPr>
-            <w:noProof/>
-            <w:webHidden/>
-          </w:rPr>
           <w:instrText xml:space="preserve"> PAGEREF _Toc236310410 \h </w:instrText>
-        </w:r>
-        <w:r>
-          <w:rPr>
-            <w:noProof/>
-            <w:webHidden/>
-          </w:rPr>
-        </w:r>
-        <w:r>
-          <w:rPr>
-            <w:noProof/>
-            <w:webHidden/>
-          </w:rPr>
           <w:fldChar w:fldCharType="separate"/>
-        </w:r>
-        <w:r>
-          <w:rPr>
-            <w:noProof/>
-            <w:webHidden/>
-          </w:rPr>
           <w:t>7</w:t>
-        </w:r>
-        <w:r>
-          <w:rPr>
-            <w:noProof/>
-            <w:webHidden/>
-          </w:rPr>
           <w:fldChar w:fldCharType="end"/>
         </w:r>
       </w:hyperlink>
@@ -1025,46 +869,10 @@
             <w:webHidden/>
           </w:rPr>
           <w:tab/>
-        </w:r>
-        <w:r>
-          <w:rPr>
-            <w:noProof/>
-            <w:webHidden/>
-          </w:rPr>
           <w:fldChar w:fldCharType="begin"/>
-        </w:r>
-        <w:r>
-          <w:rPr>
-            <w:noProof/>
-            <w:webHidden/>
-          </w:rPr>
           <w:instrText xml:space="preserve"> PAGEREF _Toc236310411 \h </w:instrText>
-        </w:r>
-        <w:r>
-          <w:rPr>
-            <w:noProof/>
-            <w:webHidden/>
-          </w:rPr>
-        </w:r>
-        <w:r>
-          <w:rPr>
-            <w:noProof/>
-            <w:webHidden/>
-          </w:rPr>
           <w:fldChar w:fldCharType="separate"/>
-        </w:r>
-        <w:r>
-          <w:rPr>
-            <w:noProof/>
-            <w:webHidden/>
-          </w:rPr>
           <w:t>7</w:t>
-        </w:r>
-        <w:r>
-          <w:rPr>
-            <w:noProof/>
-            <w:webHidden/>
-          </w:rPr>
           <w:fldChar w:fldCharType="end"/>
         </w:r>
       </w:hyperlink>
@@ -1110,40 +918,10 @@
             <w:webHidden/>
           </w:rPr>
           <w:tab/>
-        </w:r>
-        <w:r>
-          <w:rPr>
-            <w:webHidden/>
-          </w:rPr>
           <w:fldChar w:fldCharType="begin"/>
-        </w:r>
-        <w:r>
-          <w:rPr>
-            <w:webHidden/>
-          </w:rPr>
           <w:instrText xml:space="preserve"> PAGEREF _Toc236310412 \h </w:instrText>
-        </w:r>
-        <w:r>
-          <w:rPr>
-            <w:webHidden/>
-          </w:rPr>
-        </w:r>
-        <w:r>
-          <w:rPr>
-            <w:webHidden/>
-          </w:rPr>
           <w:fldChar w:fldCharType="separate"/>
-        </w:r>
-        <w:r>
-          <w:rPr>
-            <w:webHidden/>
-          </w:rPr>
           <w:t>7</w:t>
-        </w:r>
-        <w:r>
-          <w:rPr>
-            <w:webHidden/>
-          </w:rPr>
           <w:fldChar w:fldCharType="end"/>
         </w:r>
       </w:hyperlink>
@@ -1198,46 +976,10 @@
             <w:webHidden/>
           </w:rPr>
           <w:tab/>
-        </w:r>
-        <w:r>
-          <w:rPr>
-            <w:noProof/>
-            <w:webHidden/>
-          </w:rPr>
           <w:fldChar w:fldCharType="begin"/>
-        </w:r>
-        <w:r>
-          <w:rPr>
-            <w:noProof/>
-            <w:webHidden/>
-          </w:rPr>
           <w:instrText xml:space="preserve"> PAGEREF _Toc236310413 \h </w:instrText>
-        </w:r>
-        <w:r>
-          <w:rPr>
-            <w:noProof/>
-            <w:webHidden/>
-          </w:rPr>
-        </w:r>
-        <w:r>
-          <w:rPr>
-            <w:noProof/>
-            <w:webHidden/>
-          </w:rPr>
           <w:fldChar w:fldCharType="separate"/>
-        </w:r>
-        <w:r>
-          <w:rPr>
-            <w:noProof/>
-            <w:webHidden/>
-          </w:rPr>
           <w:t>7</w:t>
-        </w:r>
-        <w:r>
-          <w:rPr>
-            <w:noProof/>
-            <w:webHidden/>
-          </w:rPr>
           <w:fldChar w:fldCharType="end"/>
         </w:r>
       </w:hyperlink>
@@ -1292,46 +1034,10 @@
             <w:webHidden/>
           </w:rPr>
           <w:tab/>
-        </w:r>
-        <w:r>
-          <w:rPr>
-            <w:noProof/>
-            <w:webHidden/>
-          </w:rPr>
           <w:fldChar w:fldCharType="begin"/>
-        </w:r>
-        <w:r>
-          <w:rPr>
-            <w:noProof/>
-            <w:webHidden/>
-          </w:rPr>
           <w:instrText xml:space="preserve"> PAGEREF _Toc236310414 \h </w:instrText>
-        </w:r>
-        <w:r>
-          <w:rPr>
-            <w:noProof/>
-            <w:webHidden/>
-          </w:rPr>
-        </w:r>
-        <w:r>
-          <w:rPr>
-            <w:noProof/>
-            <w:webHidden/>
-          </w:rPr>
           <w:fldChar w:fldCharType="separate"/>
-        </w:r>
-        <w:r>
-          <w:rPr>
-            <w:noProof/>
-            <w:webHidden/>
-          </w:rPr>
           <w:t>8</w:t>
-        </w:r>
-        <w:r>
-          <w:rPr>
-            <w:noProof/>
-            <w:webHidden/>
-          </w:rPr>
           <w:fldChar w:fldCharType="end"/>
         </w:r>
       </w:hyperlink>
@@ -1386,46 +1092,10 @@
             <w:webHidden/>
           </w:rPr>
           <w:tab/>
-        </w:r>
-        <w:r>
-          <w:rPr>
-            <w:noProof/>
-            <w:webHidden/>
-          </w:rPr>
           <w:fldChar w:fldCharType="begin"/>
-        </w:r>
-        <w:r>
-          <w:rPr>
-            <w:noProof/>
-            <w:webHidden/>
-          </w:rPr>
           <w:instrText xml:space="preserve"> PAGEREF _Toc236310415 \h </w:instrText>
-        </w:r>
-        <w:r>
-          <w:rPr>
-            <w:noProof/>
-            <w:webHidden/>
-          </w:rPr>
-        </w:r>
-        <w:r>
-          <w:rPr>
-            <w:noProof/>
-            <w:webHidden/>
-          </w:rPr>
           <w:fldChar w:fldCharType="separate"/>
-        </w:r>
-        <w:r>
-          <w:rPr>
-            <w:noProof/>
-            <w:webHidden/>
-          </w:rPr>
           <w:t>8</w:t>
-        </w:r>
-        <w:r>
-          <w:rPr>
-            <w:noProof/>
-            <w:webHidden/>
-          </w:rPr>
           <w:fldChar w:fldCharType="end"/>
         </w:r>
       </w:hyperlink>
@@ -1480,46 +1150,10 @@
             <w:webHidden/>
           </w:rPr>
           <w:tab/>
-        </w:r>
-        <w:r>
-          <w:rPr>
-            <w:noProof/>
-            <w:webHidden/>
-          </w:rPr>
           <w:fldChar w:fldCharType="begin"/>
-        </w:r>
-        <w:r>
-          <w:rPr>
-            <w:noProof/>
-            <w:webHidden/>
-          </w:rPr>
           <w:instrText xml:space="preserve"> PAGEREF _Toc236310416 \h </w:instrText>
-        </w:r>
-        <w:r>
-          <w:rPr>
-            <w:noProof/>
-            <w:webHidden/>
-          </w:rPr>
-        </w:r>
-        <w:r>
-          <w:rPr>
-            <w:noProof/>
-            <w:webHidden/>
-          </w:rPr>
           <w:fldChar w:fldCharType="separate"/>
-        </w:r>
-        <w:r>
-          <w:rPr>
-            <w:noProof/>
-            <w:webHidden/>
-          </w:rPr>
           <w:t>9</w:t>
-        </w:r>
-        <w:r>
-          <w:rPr>
-            <w:noProof/>
-            <w:webHidden/>
-          </w:rPr>
           <w:fldChar w:fldCharType="end"/>
         </w:r>
       </w:hyperlink>
@@ -1574,46 +1208,10 @@
             <w:webHidden/>
           </w:rPr>
           <w:tab/>
-        </w:r>
-        <w:r>
-          <w:rPr>
-            <w:noProof/>
-            <w:webHidden/>
-          </w:rPr>
           <w:fldChar w:fldCharType="begin"/>
-        </w:r>
-        <w:r>
-          <w:rPr>
-            <w:noProof/>
-            <w:webHidden/>
-          </w:rPr>
           <w:instrText xml:space="preserve"> PAGEREF _Toc236310417 \h </w:instrText>
-        </w:r>
-        <w:r>
-          <w:rPr>
-            <w:noProof/>
-            <w:webHidden/>
-          </w:rPr>
-        </w:r>
-        <w:r>
-          <w:rPr>
-            <w:noProof/>
-            <w:webHidden/>
-          </w:rPr>
           <w:fldChar w:fldCharType="separate"/>
-        </w:r>
-        <w:r>
-          <w:rPr>
-            <w:noProof/>
-            <w:webHidden/>
-          </w:rPr>
           <w:t>9</w:t>
-        </w:r>
-        <w:r>
-          <w:rPr>
-            <w:noProof/>
-            <w:webHidden/>
-          </w:rPr>
           <w:fldChar w:fldCharType="end"/>
         </w:r>
       </w:hyperlink>
@@ -1668,46 +1266,10 @@
             <w:webHidden/>
           </w:rPr>
           <w:tab/>
-        </w:r>
-        <w:r>
-          <w:rPr>
-            <w:noProof/>
-            <w:webHidden/>
-          </w:rPr>
           <w:fldChar w:fldCharType="begin"/>
-        </w:r>
-        <w:r>
-          <w:rPr>
-            <w:noProof/>
-            <w:webHidden/>
-          </w:rPr>
           <w:instrText xml:space="preserve"> PAGEREF _Toc236310418 \h </w:instrText>
-        </w:r>
-        <w:r>
-          <w:rPr>
-            <w:noProof/>
-            <w:webHidden/>
-          </w:rPr>
-        </w:r>
-        <w:r>
-          <w:rPr>
-            <w:noProof/>
-            <w:webHidden/>
-          </w:rPr>
           <w:fldChar w:fldCharType="separate"/>
-        </w:r>
-        <w:r>
-          <w:rPr>
-            <w:noProof/>
-            <w:webHidden/>
-          </w:rPr>
           <w:t>10</w:t>
-        </w:r>
-        <w:r>
-          <w:rPr>
-            <w:noProof/>
-            <w:webHidden/>
-          </w:rPr>
           <w:fldChar w:fldCharType="end"/>
         </w:r>
       </w:hyperlink>
@@ -1762,46 +1324,10 @@
             <w:webHidden/>
           </w:rPr>
           <w:tab/>
-        </w:r>
-        <w:r>
-          <w:rPr>
-            <w:noProof/>
-            <w:webHidden/>
-          </w:rPr>
           <w:fldChar w:fldCharType="begin"/>
-        </w:r>
-        <w:r>
-          <w:rPr>
-            <w:noProof/>
-            <w:webHidden/>
-          </w:rPr>
           <w:instrText xml:space="preserve"> PAGEREF _Toc236310419 \h </w:instrText>
-        </w:r>
-        <w:r>
-          <w:rPr>
-            <w:noProof/>
-            <w:webHidden/>
-          </w:rPr>
-        </w:r>
-        <w:r>
-          <w:rPr>
-            <w:noProof/>
-            <w:webHidden/>
-          </w:rPr>
           <w:fldChar w:fldCharType="separate"/>
-        </w:r>
-        <w:r>
-          <w:rPr>
-            <w:noProof/>
-            <w:webHidden/>
-          </w:rPr>
           <w:t>10</w:t>
-        </w:r>
-        <w:r>
-          <w:rPr>
-            <w:noProof/>
-            <w:webHidden/>
-          </w:rPr>
           <w:fldChar w:fldCharType="end"/>
         </w:r>
       </w:hyperlink>
@@ -1856,46 +1382,10 @@
             <w:webHidden/>
           </w:rPr>
           <w:tab/>
-        </w:r>
-        <w:r>
-          <w:rPr>
-            <w:noProof/>
-            <w:webHidden/>
-          </w:rPr>
           <w:fldChar w:fldCharType="begin"/>
-        </w:r>
-        <w:r>
-          <w:rPr>
-            <w:noProof/>
-            <w:webHidden/>
-          </w:rPr>
           <w:instrText xml:space="preserve"> PAGEREF _Toc236310420 \h </w:instrText>
-        </w:r>
-        <w:r>
-          <w:rPr>
-            <w:noProof/>
-            <w:webHidden/>
-          </w:rPr>
-        </w:r>
-        <w:r>
-          <w:rPr>
-            <w:noProof/>
-            <w:webHidden/>
-          </w:rPr>
           <w:fldChar w:fldCharType="separate"/>
-        </w:r>
-        <w:r>
-          <w:rPr>
-            <w:noProof/>
-            <w:webHidden/>
-          </w:rPr>
           <w:t>10</w:t>
-        </w:r>
-        <w:r>
-          <w:rPr>
-            <w:noProof/>
-            <w:webHidden/>
-          </w:rPr>
           <w:fldChar w:fldCharType="end"/>
         </w:r>
       </w:hyperlink>
@@ -1950,46 +1440,10 @@
             <w:webHidden/>
           </w:rPr>
           <w:tab/>
-        </w:r>
-        <w:r>
-          <w:rPr>
-            <w:noProof/>
-            <w:webHidden/>
-          </w:rPr>
           <w:fldChar w:fldCharType="begin"/>
-        </w:r>
-        <w:r>
-          <w:rPr>
-            <w:noProof/>
-            <w:webHidden/>
-          </w:rPr>
           <w:instrText xml:space="preserve"> PAGEREF _Toc236310421 \h </w:instrText>
-        </w:r>
-        <w:r>
-          <w:rPr>
-            <w:noProof/>
-            <w:webHidden/>
-          </w:rPr>
-        </w:r>
-        <w:r>
-          <w:rPr>
-            <w:noProof/>
-            <w:webHidden/>
-          </w:rPr>
           <w:fldChar w:fldCharType="separate"/>
-        </w:r>
-        <w:r>
-          <w:rPr>
-            <w:noProof/>
-            <w:webHidden/>
-          </w:rPr>
           <w:t>11</w:t>
-        </w:r>
-        <w:r>
-          <w:rPr>
-            <w:noProof/>
-            <w:webHidden/>
-          </w:rPr>
           <w:fldChar w:fldCharType="end"/>
         </w:r>
       </w:hyperlink>
@@ -2035,40 +1489,10 @@
             <w:webHidden/>
           </w:rPr>
           <w:tab/>
-        </w:r>
-        <w:r>
-          <w:rPr>
-            <w:webHidden/>
-          </w:rPr>
           <w:fldChar w:fldCharType="begin"/>
-        </w:r>
-        <w:r>
-          <w:rPr>
-            <w:webHidden/>
-          </w:rPr>
           <w:instrText xml:space="preserve"> PAGEREF _Toc236310422 \h </w:instrText>
-        </w:r>
-        <w:r>
-          <w:rPr>
-            <w:webHidden/>
-          </w:rPr>
-        </w:r>
-        <w:r>
-          <w:rPr>
-            <w:webHidden/>
-          </w:rPr>
           <w:fldChar w:fldCharType="separate"/>
-        </w:r>
-        <w:r>
-          <w:rPr>
-            <w:webHidden/>
-          </w:rPr>
           <w:t>11</w:t>
-        </w:r>
-        <w:r>
-          <w:rPr>
-            <w:webHidden/>
-          </w:rPr>
           <w:fldChar w:fldCharType="end"/>
         </w:r>
       </w:hyperlink>
@@ -2123,46 +1547,10 @@
             <w:webHidden/>
           </w:rPr>
           <w:tab/>
-        </w:r>
-        <w:r>
-          <w:rPr>
-            <w:noProof/>
-            <w:webHidden/>
-          </w:rPr>
           <w:fldChar w:fldCharType="begin"/>
-        </w:r>
-        <w:r>
-          <w:rPr>
-            <w:noProof/>
-            <w:webHidden/>
-          </w:rPr>
           <w:instrText xml:space="preserve"> PAGEREF _Toc236310423 \h </w:instrText>
-        </w:r>
-        <w:r>
-          <w:rPr>
-            <w:noProof/>
-            <w:webHidden/>
-          </w:rPr>
-        </w:r>
-        <w:r>
-          <w:rPr>
-            <w:noProof/>
-            <w:webHidden/>
-          </w:rPr>
           <w:fldChar w:fldCharType="separate"/>
-        </w:r>
-        <w:r>
-          <w:rPr>
-            <w:noProof/>
-            <w:webHidden/>
-          </w:rPr>
           <w:t>11</w:t>
-        </w:r>
-        <w:r>
-          <w:rPr>
-            <w:noProof/>
-            <w:webHidden/>
-          </w:rPr>
           <w:fldChar w:fldCharType="end"/>
         </w:r>
       </w:hyperlink>
@@ -2208,40 +1596,10 @@
             <w:webHidden/>
           </w:rPr>
           <w:tab/>
-        </w:r>
-        <w:r>
-          <w:rPr>
-            <w:webHidden/>
-          </w:rPr>
           <w:fldChar w:fldCharType="begin"/>
-        </w:r>
-        <w:r>
-          <w:rPr>
-            <w:webHidden/>
-          </w:rPr>
           <w:instrText xml:space="preserve"> PAGEREF _Toc236310424 \h </w:instrText>
-        </w:r>
-        <w:r>
-          <w:rPr>
-            <w:webHidden/>
-          </w:rPr>
-        </w:r>
-        <w:r>
-          <w:rPr>
-            <w:webHidden/>
-          </w:rPr>
           <w:fldChar w:fldCharType="separate"/>
-        </w:r>
-        <w:r>
-          <w:rPr>
-            <w:webHidden/>
-          </w:rPr>
           <w:t>13</w:t>
-        </w:r>
-        <w:r>
-          <w:rPr>
-            <w:webHidden/>
-          </w:rPr>
           <w:fldChar w:fldCharType="end"/>
         </w:r>
       </w:hyperlink>
@@ -2296,46 +1654,10 @@
             <w:webHidden/>
           </w:rPr>
           <w:tab/>
-        </w:r>
-        <w:r>
-          <w:rPr>
-            <w:noProof/>
-            <w:webHidden/>
-          </w:rPr>
           <w:fldChar w:fldCharType="begin"/>
-        </w:r>
-        <w:r>
-          <w:rPr>
-            <w:noProof/>
-            <w:webHidden/>
-          </w:rPr>
           <w:instrText xml:space="preserve"> PAGEREF _Toc236310425 \h </w:instrText>
-        </w:r>
-        <w:r>
-          <w:rPr>
-            <w:noProof/>
-            <w:webHidden/>
-          </w:rPr>
-        </w:r>
-        <w:r>
-          <w:rPr>
-            <w:noProof/>
-            <w:webHidden/>
-          </w:rPr>
           <w:fldChar w:fldCharType="separate"/>
-        </w:r>
-        <w:r>
-          <w:rPr>
-            <w:noProof/>
-            <w:webHidden/>
-          </w:rPr>
           <w:t>13</w:t>
-        </w:r>
-        <w:r>
-          <w:rPr>
-            <w:noProof/>
-            <w:webHidden/>
-          </w:rPr>
           <w:fldChar w:fldCharType="end"/>
         </w:r>
       </w:hyperlink>
@@ -2390,46 +1712,10 @@
             <w:webHidden/>
           </w:rPr>
           <w:tab/>
-        </w:r>
-        <w:r>
-          <w:rPr>
-            <w:noProof/>
-            <w:webHidden/>
-          </w:rPr>
           <w:fldChar w:fldCharType="begin"/>
-        </w:r>
-        <w:r>
-          <w:rPr>
-            <w:noProof/>
-            <w:webHidden/>
-          </w:rPr>
           <w:instrText xml:space="preserve"> PAGEREF _Toc236310426 \h </w:instrText>
-        </w:r>
-        <w:r>
-          <w:rPr>
-            <w:noProof/>
-            <w:webHidden/>
-          </w:rPr>
-        </w:r>
-        <w:r>
-          <w:rPr>
-            <w:noProof/>
-            <w:webHidden/>
-          </w:rPr>
           <w:fldChar w:fldCharType="separate"/>
-        </w:r>
-        <w:r>
-          <w:rPr>
-            <w:noProof/>
-            <w:webHidden/>
-          </w:rPr>
           <w:t>13</w:t>
-        </w:r>
-        <w:r>
-          <w:rPr>
-            <w:noProof/>
-            <w:webHidden/>
-          </w:rPr>
           <w:fldChar w:fldCharType="end"/>
         </w:r>
       </w:hyperlink>
@@ -2475,40 +1761,10 @@
             <w:webHidden/>
           </w:rPr>
           <w:tab/>
-        </w:r>
-        <w:r>
-          <w:rPr>
-            <w:webHidden/>
-          </w:rPr>
           <w:fldChar w:fldCharType="begin"/>
-        </w:r>
-        <w:r>
-          <w:rPr>
-            <w:webHidden/>
-          </w:rPr>
           <w:instrText xml:space="preserve"> PAGEREF _Toc236310427 \h </w:instrText>
-        </w:r>
-        <w:r>
-          <w:rPr>
-            <w:webHidden/>
-          </w:rPr>
-        </w:r>
-        <w:r>
-          <w:rPr>
-            <w:webHidden/>
-          </w:rPr>
           <w:fldChar w:fldCharType="separate"/>
-        </w:r>
-        <w:r>
-          <w:rPr>
-            <w:webHidden/>
-          </w:rPr>
           <w:t>13</w:t>
-        </w:r>
-        <w:r>
-          <w:rPr>
-            <w:webHidden/>
-          </w:rPr>
           <w:fldChar w:fldCharType="end"/>
         </w:r>
       </w:hyperlink>
@@ -2554,40 +1810,10 @@
             <w:webHidden/>
           </w:rPr>
           <w:tab/>
-        </w:r>
-        <w:r>
-          <w:rPr>
-            <w:webHidden/>
-          </w:rPr>
           <w:fldChar w:fldCharType="begin"/>
-        </w:r>
-        <w:r>
-          <w:rPr>
-            <w:webHidden/>
-          </w:rPr>
           <w:instrText xml:space="preserve"> PAGEREF _Toc236310428 \h </w:instrText>
-        </w:r>
-        <w:r>
-          <w:rPr>
-            <w:webHidden/>
-          </w:rPr>
-        </w:r>
-        <w:r>
-          <w:rPr>
-            <w:webHidden/>
-          </w:rPr>
           <w:fldChar w:fldCharType="separate"/>
-        </w:r>
-        <w:r>
-          <w:rPr>
-            <w:webHidden/>
-          </w:rPr>
           <w:t>14</w:t>
-        </w:r>
-        <w:r>
-          <w:rPr>
-            <w:webHidden/>
-          </w:rPr>
           <w:fldChar w:fldCharType="end"/>
         </w:r>
       </w:hyperlink>
@@ -2642,46 +1868,10 @@
             <w:webHidden/>
           </w:rPr>
           <w:tab/>
-        </w:r>
-        <w:r>
-          <w:rPr>
-            <w:noProof/>
-            <w:webHidden/>
-          </w:rPr>
           <w:fldChar w:fldCharType="begin"/>
-        </w:r>
-        <w:r>
-          <w:rPr>
-            <w:noProof/>
-            <w:webHidden/>
-          </w:rPr>
           <w:instrText xml:space="preserve"> PAGEREF _Toc236310429 \h </w:instrText>
-        </w:r>
-        <w:r>
-          <w:rPr>
-            <w:noProof/>
-            <w:webHidden/>
-          </w:rPr>
-        </w:r>
-        <w:r>
-          <w:rPr>
-            <w:noProof/>
-            <w:webHidden/>
-          </w:rPr>
           <w:fldChar w:fldCharType="separate"/>
-        </w:r>
-        <w:r>
-          <w:rPr>
-            <w:noProof/>
-            <w:webHidden/>
-          </w:rPr>
           <w:t>14</w:t>
-        </w:r>
-        <w:r>
-          <w:rPr>
-            <w:noProof/>
-            <w:webHidden/>
-          </w:rPr>
           <w:fldChar w:fldCharType="end"/>
         </w:r>
       </w:hyperlink>
@@ -2736,46 +1926,10 @@
             <w:webHidden/>
           </w:rPr>
           <w:tab/>
-        </w:r>
-        <w:r>
-          <w:rPr>
-            <w:noProof/>
-            <w:webHidden/>
-          </w:rPr>
           <w:fldChar w:fldCharType="begin"/>
-        </w:r>
-        <w:r>
-          <w:rPr>
-            <w:noProof/>
-            <w:webHidden/>
-          </w:rPr>
           <w:instrText xml:space="preserve"> PAGEREF _Toc236310430 \h </w:instrText>
-        </w:r>
-        <w:r>
-          <w:rPr>
-            <w:noProof/>
-            <w:webHidden/>
-          </w:rPr>
-        </w:r>
-        <w:r>
-          <w:rPr>
-            <w:noProof/>
-            <w:webHidden/>
-          </w:rPr>
           <w:fldChar w:fldCharType="separate"/>
-        </w:r>
-        <w:r>
-          <w:rPr>
-            <w:noProof/>
-            <w:webHidden/>
-          </w:rPr>
           <w:t>14</w:t>
-        </w:r>
-        <w:r>
-          <w:rPr>
-            <w:noProof/>
-            <w:webHidden/>
-          </w:rPr>
           <w:fldChar w:fldCharType="end"/>
         </w:r>
       </w:hyperlink>
@@ -2830,46 +1984,10 @@
             <w:webHidden/>
           </w:rPr>
           <w:tab/>
-        </w:r>
-        <w:r>
-          <w:rPr>
-            <w:noProof/>
-            <w:webHidden/>
-          </w:rPr>
           <w:fldChar w:fldCharType="begin"/>
-        </w:r>
-        <w:r>
-          <w:rPr>
-            <w:noProof/>
-            <w:webHidden/>
-          </w:rPr>
           <w:instrText xml:space="preserve"> PAGEREF _Toc236310431 \h </w:instrText>
-        </w:r>
-        <w:r>
-          <w:rPr>
-            <w:noProof/>
-            <w:webHidden/>
-          </w:rPr>
-        </w:r>
-        <w:r>
-          <w:rPr>
-            <w:noProof/>
-            <w:webHidden/>
-          </w:rPr>
           <w:fldChar w:fldCharType="separate"/>
-        </w:r>
-        <w:r>
-          <w:rPr>
-            <w:noProof/>
-            <w:webHidden/>
-          </w:rPr>
           <w:t>14</w:t>
-        </w:r>
-        <w:r>
-          <w:rPr>
-            <w:noProof/>
-            <w:webHidden/>
-          </w:rPr>
           <w:fldChar w:fldCharType="end"/>
         </w:r>
       </w:hyperlink>
@@ -2915,40 +2033,10 @@
             <w:webHidden/>
           </w:rPr>
           <w:tab/>
-        </w:r>
-        <w:r>
-          <w:rPr>
-            <w:webHidden/>
-          </w:rPr>
           <w:fldChar w:fldCharType="begin"/>
-        </w:r>
-        <w:r>
-          <w:rPr>
-            <w:webHidden/>
-          </w:rPr>
           <w:instrText xml:space="preserve"> PAGEREF _Toc236310432 \h </w:instrText>
-        </w:r>
-        <w:r>
-          <w:rPr>
-            <w:webHidden/>
-          </w:rPr>
-        </w:r>
-        <w:r>
-          <w:rPr>
-            <w:webHidden/>
-          </w:rPr>
           <w:fldChar w:fldCharType="separate"/>
-        </w:r>
-        <w:r>
-          <w:rPr>
-            <w:webHidden/>
-          </w:rPr>
           <w:t>14</w:t>
-        </w:r>
-        <w:r>
-          <w:rPr>
-            <w:webHidden/>
-          </w:rPr>
           <w:fldChar w:fldCharType="end"/>
         </w:r>
       </w:hyperlink>
@@ -3989,15 +3077,7 @@
     </w:p>
     <w:p>
       <w:r>
-        <w:t>El plugin expone 41 comandos de barra agrupados por categoría. Todos siguen el patrón /</w:t>
-      </w:r>
-      <w:proofErr w:type="spellStart"/>
-      <w:r>
-        <w:t>orchestrator</w:t>
-      </w:r>
-      <w:proofErr w:type="spellEnd"/>
-      <w:r>
-        <w:t>-&lt;nombre&gt;.</w:t>
+        <w:t>El plugin expone 41 comandos de barra agrupados por categoría. Todos siguen el patrón /orchestrator-&lt;nombre&gt;.</w:t>
       </w:r>
     </w:p>
     <w:p/>
@@ -8988,15 +8068,7 @@
     </w:p>
     <w:p>
       <w:r>
-        <w:t>No. Todo corre en local. El único acceso de red es a la BD del proyecto (si está en un servidor) y a MantisBT (si se usan los comandos /</w:t>
-      </w:r>
-      <w:proofErr w:type="spellStart"/>
-      <w:r>
-        <w:t>orchestrator</w:t>
-      </w:r>
-      <w:proofErr w:type="spellEnd"/>
-      <w:r>
-        <w:t>-mantis).</w:t>
+        <w:t>No. Todo corre en local. El único acceso de red es a la BD del proyecto (si está en un servidor) y a MantisBT (si se usan los comandos /orchestrator-mantis).</w:t>
       </w:r>
     </w:p>
     <w:p>
@@ -9160,7 +8232,7 @@
               <w:rPr>
                 <w:color w:val="152A35"/>
               </w:rPr>
-              <w:t>v1.4.0 (2026-07-30)</w:t>
+              <w:t>v1.5.0 (2026-08-06)</w:t>
             </w:r>
           </w:p>
         </w:tc>

</xml_diff>

<commit_message>
Update GUIA-PLUGIN to v1.6.0: integrate project-db-env into plugin
- New Paso 3: configure env.json from template
- Rename old Paso 3 -> Paso 4
- New section: Configuracion de entorno (env.json)
- New table row: Contexto BBDD integrado en el plugin
- New FAQ entries about env.json and project-db-env skill
- Version bump v1.5.0 -> v1.6.0, date 2026-08-07

Co-Authored-By: Claude Sonnet 4.6 <noreply@anthropic.com>
</commit_message>
<xml_diff>
--- a/GUIA-PLUGIN.docx
+++ b/GUIA-PLUGIN.docx
@@ -90,7 +90,7 @@
         <w:rPr>
           <w:color w:val="595757"/>
         </w:rPr>
-        <w:t>Versión: v1.5.0</w:t>
+        <w:t>Versión: v1.6.0</w:t>
       </w:r>
     </w:p>
     <w:p>
@@ -351,7 +351,7 @@
               <w:rPr>
                 <w:color w:val="152A35"/>
               </w:rPr>
-              <w:t>v1.5.0</w:t>
+              <w:t>v1.6.0</w:t>
             </w:r>
           </w:p>
         </w:tc>
@@ -474,7 +474,7 @@
           <w:rPr>
             <w:rStyle w:val="Hipervnculo"/>
           </w:rPr>
-          <w:t>¿Qué es este plugin?</w:t>
+          <w:t>¿Qué hace este plugin?</w:t>
         </w:r>
         <w:r>
           <w:rPr>
@@ -803,7 +803,7 @@
             <w:rStyle w:val="Hipervnculo"/>
             <w:noProof/>
           </w:rPr>
-          <w:t>Paso 3 — Verificar la instalación</w:t>
+          <w:t>Paso 4 — Verificar la instalación</w:t>
         </w:r>
         <w:r>
           <w:rPr>
@@ -2067,7 +2067,7 @@
       <w:bookmarkStart w:id="1" w:name="_Toc236310404"/>
       <w:r>
         <w:lastRenderedPageBreak/>
-        <w:t>¿Qué es este plugin?</w:t>
+        <w:t>¿Qué hace este plugin?</w:t>
       </w:r>
       <w:bookmarkEnd w:id="1"/>
     </w:p>
@@ -2377,6 +2377,50 @@
                 <w:color w:val="152A35"/>
               </w:rPr>
               <w:t>Compara modelo JSON local vs esquema real</w:t>
+            </w:r>
+          </w:p>
+        </w:tc>
+      </w:tr>
+      <w:tr w14:paraId="BB0004010">
+        <w:trPr>
+          <w:trHeight w:val="500"/>
+          <w:jc w:val="center"/>
+        </w:trPr>
+        <w:tc>
+          <w:tcPr>
+            <w:tcW w:w="4789" w:type="dxa"/>
+            <w:shd w:val="clear" w:color="auto" w:fill="F0F0F0"/>
+            <w:vAlign w:val="center"/>
+          </w:tcPr>
+          <w:p>
+            <w:pPr>
+              <w:spacing w:line="240" w:lineRule="auto"/>
+              <w:jc w:val="left"/>
+            </w:pPr>
+            <w:r>
+              <w:rPr>
+                <w:color w:val="152A35"/>
+              </w:rPr>
+              <w:t xml:space="preserve">Contexto BBDD en skill externo</w:t>
+            </w:r>
+          </w:p>
+        </w:tc>
+        <w:tc>
+          <w:tcPr>
+            <w:tcW w:w="4789" w:type="dxa"/>
+            <w:shd w:val="clear" w:color="auto" w:fill="F0F0F0"/>
+            <w:vAlign w:val="center"/>
+          </w:tcPr>
+          <w:p>
+            <w:pPr>
+              <w:spacing w:line="240" w:lineRule="auto"/>
+              <w:jc w:val="left"/>
+            </w:pPr>
+            <w:r>
+              <w:rPr>
+                <w:color w:val="152A35"/>
+              </w:rPr>
+              <w:t xml:space="preserve">Contexto BBDD integrado en el plugin (env.json)</w:t>
             </w:r>
           </w:p>
         </w:tc>
@@ -3007,9 +3051,107 @@
       <w:pPr>
         <w:pStyle w:val="Ttulo2"/>
       </w:pPr>
+      <w:r>
+        <w:t>Paso 3 — Configurar credenciales (env.json)</w:t>
+      </w:r>
+    </w:p>
+    <w:p>
+      <w:r>
+        <w:t xml:space="preserve">El plugin incluye un archivo env.template.json con la estructura de configuración de entorno. Debes crear tu propio env.json (ignorado por Git, nunca se sube) con tus credenciales reales:</w:t>
+      </w:r>
+    </w:p>
+    <w:p>
+      <w:pPr>
+        <w:shd w:val="clear" w:color="auto" w:fill="F5F5F5"/>
+        <w:spacing w:after="0" w:line="240" w:lineRule="auto"/>
+      </w:pPr>
+      <w:r>
+        <w:rPr>
+          <w:rFonts w:ascii="Courier New" w:hAnsi="Courier New" w:cs="Courier New"/>
+          <w:color w:val="152A35"/>
+          <w:sz w:val="18"/>
+          <w:szCs w:val="18"/>
+        </w:rPr>
+        <w:t xml:space="preserve">Copy-Item env.template.json env.json</w:t>
+      </w:r>
+    </w:p>
+    <w:p>
+      <w:r>
+        <w:t xml:space="preserve">Abre env.json y rellena los valores marcados con &lt;COMPLETAR&gt;:</w:t>
+      </w:r>
+    </w:p>
+    <w:p>
+      <w:pPr>
+        <w:numPr>
+          <w:ilvl w:val="0"/>
+          <w:numId w:val="1"/>
+        </w:numPr>
+        <w:spacing w:after="60"/>
+      </w:pPr>
+      <w:r>
+        <w:t xml:space="preserve">herramientas.mantis — URL y API key de MantisBT corporativo</w:t>
+      </w:r>
+    </w:p>
+    <w:p>
+      <w:pPr>
+        <w:numPr>
+          <w:ilvl w:val="0"/>
+          <w:numId w:val="1"/>
+        </w:numPr>
+        <w:spacing w:after="60"/>
+      </w:pPr>
+      <w:r>
+        <w:t xml:space="preserve">herramientas.svn — URL y credenciales del repositorio SVN</w:t>
+      </w:r>
+    </w:p>
+    <w:p>
+      <w:pPr>
+        <w:numPr>
+          <w:ilvl w:val="0"/>
+          <w:numId w:val="1"/>
+        </w:numPr>
+        <w:spacing w:after="60"/>
+      </w:pPr>
+      <w:r>
+        <w:t xml:space="preserve">credenciales_bbdd — usuarios y passwords por proyecto (Ingenieros, bancamarch...)</w:t>
+      </w:r>
+    </w:p>
+    <w:p>
+      <w:pPr>
+        <w:numPr>
+          <w:ilvl w:val="0"/>
+          <w:numId w:val="1"/>
+        </w:numPr>
+        <w:spacing w:after="60"/>
+      </w:pPr>
+      <w:r>
+        <w:t xml:space="preserve">entornos — connection strings completas por proyecto y entorno (DEV/PRE/PRO)</w:t>
+      </w:r>
+    </w:p>
+    <w:p>
+      <w:pPr>
+        <w:numPr>
+          <w:ilvl w:val="0"/>
+          <w:numId w:val="1"/>
+        </w:numPr>
+        <w:spacing w:after="60"/>
+      </w:pPr>
+      <w:r>
+        <w:t xml:space="preserve">contexto_personal — tu nombre, rol y equipo</w:t>
+      </w:r>
+    </w:p>
+    <w:p>
+      <w:r>
+        <w:t xml:space="preserve">Nota: Si no tienes env.json, el agente lo creará automáticamente desde la plantilla la primera vez que uses un comando de base de datos, y te pedirá que lo rellenes antes de continuar.</w:t>
+      </w:r>
+    </w:p>
+    <w:p>
+      <w:pPr>
+        <w:pStyle w:val="Ttulo2"/>
+      </w:pPr>
       <w:bookmarkStart w:id="7" w:name="_Toc236310410"/>
       <w:r>
-        <w:t>Paso 3 — Verificar la instalación</w:t>
+        <w:t>Paso 4 — Verificar la instalación</w:t>
       </w:r>
       <w:bookmarkEnd w:id="7"/>
     </w:p>
@@ -5741,6 +5883,562 @@
       </w:tr>
     </w:tbl>
     <w:p/>
+    <w:p>
+      <w:pPr>
+        <w:pStyle w:val="Ttulo1"/>
+      </w:pPr>
+      <w:bookmarkStart w:id="40" w:name="_TocEnvJson"/>
+      <w:r>
+        <w:t>Configuración de entorno (env.json)</w:t>
+      </w:r>
+      <w:bookmarkEnd w:id="40"/>
+    </w:p>
+    <w:p>
+      <w:r>
+        <w:t xml:space="preserve">El plugin gestiona el contexto de base de datos y herramientas de forma autónoma, sin depender de skills externos.</w:t>
+      </w:r>
+    </w:p>
+    <w:p>
+      <w:pPr>
+        <w:pStyle w:val="Ttulo2"/>
+      </w:pPr>
+      <w:r>
+        <w:t>Estructura de archivos</w:t>
+      </w:r>
+    </w:p>
+    <w:p>
+      <w:pPr>
+        <w:shd w:val="clear" w:color="auto" w:fill="F5F5F5"/>
+        <w:spacing w:after="0" w:line="240" w:lineRule="auto"/>
+      </w:pPr>
+      <w:r>
+        <w:rPr>
+          <w:rFonts w:ascii="Courier New" w:hAnsi="Courier New" w:cs="Courier New"/>
+          <w:color w:val="152A35"/>
+          <w:sz w:val="18"/>
+          <w:szCs w:val="18"/>
+        </w:rPr>
+        <w:t xml:space="preserve">&lt;directorio-del-plugin&gt;/</w:t>
+      </w:r>
+    </w:p>
+    <w:p>
+      <w:pPr>
+        <w:shd w:val="clear" w:color="auto" w:fill="F5F5F5"/>
+        <w:spacing w:after="0" w:line="240" w:lineRule="auto"/>
+      </w:pPr>
+      <w:r>
+        <w:rPr>
+          <w:rFonts w:ascii="Courier New" w:hAnsi="Courier New" w:cs="Courier New"/>
+          <w:color w:val="152A35"/>
+          <w:sz w:val="18"/>
+          <w:szCs w:val="18"/>
+        </w:rPr>
+        <w:t xml:space="preserve">├── env.json              &lt;-- TU configuración local (gitignored)</w:t>
+      </w:r>
+    </w:p>
+    <w:p>
+      <w:pPr>
+        <w:shd w:val="clear" w:color="auto" w:fill="F5F5F5"/>
+        <w:spacing w:after="0" w:line="240" w:lineRule="auto"/>
+      </w:pPr>
+      <w:r>
+        <w:rPr>
+          <w:rFonts w:ascii="Courier New" w:hAnsi="Courier New" w:cs="Courier New"/>
+          <w:color w:val="152A35"/>
+          <w:sz w:val="18"/>
+          <w:szCs w:val="18"/>
+        </w:rPr>
+        <w:t xml:space="preserve">├── env.template.json     &lt;-- Plantilla vacía (incluida en el repositorio)</w:t>
+      </w:r>
+    </w:p>
+    <w:p>
+      <w:pPr>
+        <w:shd w:val="clear" w:color="auto" w:fill="F5F5F5"/>
+        <w:spacing w:after="0" w:line="240" w:lineRule="auto"/>
+      </w:pPr>
+      <w:r>
+        <w:rPr>
+          <w:rFonts w:ascii="Courier New" w:hAnsi="Courier New" w:cs="Courier New"/>
+          <w:color w:val="152A35"/>
+          <w:sz w:val="18"/>
+          <w:szCs w:val="18"/>
+        </w:rPr>
+        <w:t xml:space="preserve">└── projects/</w:t>
+      </w:r>
+    </w:p>
+    <w:p>
+      <w:pPr>
+        <w:shd w:val="clear" w:color="auto" w:fill="F5F5F5"/>
+        <w:spacing w:after="0" w:line="240" w:lineRule="auto"/>
+      </w:pPr>
+      <w:r>
+        <w:rPr>
+          <w:rFonts w:ascii="Courier New" w:hAnsi="Courier New" w:cs="Courier New"/>
+          <w:color w:val="152A35"/>
+          <w:sz w:val="18"/>
+          <w:szCs w:val="18"/>
+        </w:rPr>
+        <w:t xml:space="preserve">    ├── Ingenieros/</w:t>
+      </w:r>
+    </w:p>
+    <w:p>
+      <w:pPr>
+        <w:shd w:val="clear" w:color="auto" w:fill="F5F5F5"/>
+        <w:spacing w:after="0" w:line="240" w:lineRule="auto"/>
+      </w:pPr>
+      <w:r>
+        <w:rPr>
+          <w:rFonts w:ascii="Courier New" w:hAnsi="Courier New" w:cs="Courier New"/>
+          <w:color w:val="152A35"/>
+          <w:sz w:val="18"/>
+          <w:szCs w:val="18"/>
+        </w:rPr>
+        <w:t xml:space="preserve">    │   ├── config.json   &lt;-- Metadatos del proyecto (motor, host, TNS alias...)</w:t>
+      </w:r>
+    </w:p>
+    <w:p>
+      <w:pPr>
+        <w:shd w:val="clear" w:color="auto" w:fill="F5F5F5"/>
+        <w:spacing w:after="0" w:line="240" w:lineRule="auto"/>
+      </w:pPr>
+      <w:r>
+        <w:rPr>
+          <w:rFonts w:ascii="Courier New" w:hAnsi="Courier New" w:cs="Courier New"/>
+          <w:color w:val="152A35"/>
+          <w:sz w:val="18"/>
+          <w:szCs w:val="18"/>
+        </w:rPr>
+        <w:t xml:space="preserve">    │   └── schema.md     &lt;-- Esquema completo BD (gitignored por tamaño)</w:t>
+      </w:r>
+    </w:p>
+    <w:p>
+      <w:pPr>
+        <w:shd w:val="clear" w:color="auto" w:fill="F5F5F5"/>
+        <w:spacing w:after="0" w:line="240" w:lineRule="auto"/>
+      </w:pPr>
+      <w:r>
+        <w:rPr>
+          <w:rFonts w:ascii="Courier New" w:hAnsi="Courier New" w:cs="Courier New"/>
+          <w:color w:val="152A35"/>
+          <w:sz w:val="18"/>
+          <w:szCs w:val="18"/>
+        </w:rPr>
+        <w:t xml:space="preserve">    └── bancamarch/</w:t>
+      </w:r>
+    </w:p>
+    <w:p>
+      <w:pPr>
+        <w:shd w:val="clear" w:color="auto" w:fill="F5F5F5"/>
+        <w:spacing w:after="0" w:line="240" w:lineRule="auto"/>
+      </w:pPr>
+      <w:r>
+        <w:rPr>
+          <w:rFonts w:ascii="Courier New" w:hAnsi="Courier New" w:cs="Courier New"/>
+          <w:color w:val="152A35"/>
+          <w:sz w:val="18"/>
+          <w:szCs w:val="18"/>
+        </w:rPr>
+        <w:t xml:space="preserve">        ├── config.json</w:t>
+      </w:r>
+    </w:p>
+    <w:p>
+      <w:pPr>
+        <w:shd w:val="clear" w:color="auto" w:fill="F5F5F5"/>
+        <w:spacing w:after="0" w:line="240" w:lineRule="auto"/>
+      </w:pPr>
+      <w:r>
+        <w:rPr>
+          <w:rFonts w:ascii="Courier New" w:hAnsi="Courier New" w:cs="Courier New"/>
+          <w:color w:val="152A35"/>
+          <w:sz w:val="18"/>
+          <w:szCs w:val="18"/>
+        </w:rPr>
+        <w:t xml:space="preserve">        └── schema.md</w:t>
+      </w:r>
+    </w:p>
+    <w:p>
+      <w:pPr>
+        <w:pStyle w:val="Ttulo2"/>
+      </w:pPr>
+      <w:r>
+        <w:t>Secciones principales de env.json</w:t>
+      </w:r>
+    </w:p>
+    <w:tbl>
+      <w:tblPr>
+        <w:tblStyle w:val="Tablaconestilo1"/>
+        <w:tblW w:w="9578" w:type="dxa"/>
+        <w:tblLook w:val="04A0" w:firstRow="1" w:lastRow="0" w:firstColumn="1" w:lastColumn="0" w:noHBand="0" w:noVBand="1"/>
+      </w:tblPr>
+      <w:tblGrid>
+        <w:gridCol w:w="4789"/>
+        <w:gridCol w:w="4789"/>
+      </w:tblGrid>
+      <w:tr w14:paraId="BB0002H0">
+        <w:trPr>
+          <w:trHeight w:val="500"/>
+          <w:jc w:val="center"/>
+        </w:trPr>
+        <w:tc>
+          <w:tcPr>
+            <w:tcW w:w="4789" w:type="dxa"/>
+            <w:shd w:val="clear" w:color="auto" w:fill="152A35"/>
+            <w:vAlign w:val="center"/>
+          </w:tcPr>
+          <w:p w14:paraId="BB0002H1">
+            <w:pPr>
+              <w:spacing w:line="240" w:lineRule="auto"/>
+              <w:jc w:val="left"/>
+            </w:pPr>
+            <w:r>
+              <w:rPr>
+                <w:b/>
+                <w:color w:val="FFFFFF"/>
+              </w:rPr>
+              <w:t>Sección</w:t>
+            </w:r>
+          </w:p>
+        </w:tc>
+        <w:tc>
+          <w:tcPr>
+            <w:tcW w:w="4789" w:type="dxa"/>
+            <w:shd w:val="clear" w:color="auto" w:fill="152A35"/>
+            <w:vAlign w:val="center"/>
+          </w:tcPr>
+          <w:p w14:paraId="BB0002H2">
+            <w:pPr>
+              <w:spacing w:line="240" w:lineRule="auto"/>
+              <w:jc w:val="left"/>
+            </w:pPr>
+            <w:r>
+              <w:rPr>
+                <w:b/>
+                <w:color w:val="FFFFFF"/>
+              </w:rPr>
+              <w:t>Contenido</w:t>
+            </w:r>
+          </w:p>
+        </w:tc>
+      </w:tr>
+      <w:tr w14:paraId="BB0002R0A0">
+        <w:trPr>
+          <w:trHeight w:val="500"/>
+          <w:jc w:val="center"/>
+        </w:trPr>
+        <w:tc>
+          <w:tcPr>
+            <w:tcW w:w="4789" w:type="dxa"/>
+            <w:shd w:val="clear" w:color="auto" w:fill="F0F0F0"/>
+            <w:vAlign w:val="center"/>
+          </w:tcPr>
+          <w:p w14:paraId="BB0002R0A">
+            <w:pPr>
+              <w:spacing w:line="240" w:lineRule="auto"/>
+              <w:jc w:val="left"/>
+            </w:pPr>
+            <w:r>
+              <w:rPr>
+                <w:color w:val="152A35"/>
+              </w:rPr>
+              <w:t xml:space="preserve">herramientas.mantis</w:t>
+            </w:r>
+          </w:p>
+        </w:tc>
+        <w:tc>
+          <w:tcPr>
+            <w:tcW w:w="4789" w:type="dxa"/>
+            <w:shd w:val="clear" w:color="auto" w:fill="F0F0F0"/>
+            <w:vAlign w:val="center"/>
+          </w:tcPr>
+          <w:p w14:paraId="BB0002R0B">
+            <w:pPr>
+              <w:spacing w:line="240" w:lineRule="auto"/>
+              <w:jc w:val="left"/>
+            </w:pPr>
+            <w:r>
+              <w:rPr>
+                <w:color w:val="152A35"/>
+              </w:rPr>
+              <w:t xml:space="preserve">URL, usuario y API key de MantisBT</w:t>
+            </w:r>
+          </w:p>
+        </w:tc>
+      </w:tr>
+      <w:tr w14:paraId="BB0002R1A0">
+        <w:trPr>
+          <w:trHeight w:val="500"/>
+          <w:jc w:val="center"/>
+        </w:trPr>
+        <w:tc>
+          <w:tcPr>
+            <w:tcW w:w="4789" w:type="dxa"/>
+            <w:shd w:val="clear" w:color="auto" w:fill="FFFFFF"/>
+            <w:vAlign w:val="center"/>
+          </w:tcPr>
+          <w:p w14:paraId="BB0002R1A">
+            <w:pPr>
+              <w:spacing w:line="240" w:lineRule="auto"/>
+              <w:jc w:val="left"/>
+            </w:pPr>
+            <w:r>
+              <w:rPr>
+                <w:color w:val="152A35"/>
+              </w:rPr>
+              <w:t xml:space="preserve">herramientas.svn</w:t>
+            </w:r>
+          </w:p>
+        </w:tc>
+        <w:tc>
+          <w:tcPr>
+            <w:tcW w:w="4789" w:type="dxa"/>
+            <w:shd w:val="clear" w:color="auto" w:fill="FFFFFF"/>
+            <w:vAlign w:val="center"/>
+          </w:tcPr>
+          <w:p w14:paraId="BB0002R1B">
+            <w:pPr>
+              <w:spacing w:line="240" w:lineRule="auto"/>
+              <w:jc w:val="left"/>
+            </w:pPr>
+            <w:r>
+              <w:rPr>
+                <w:color w:val="152A35"/>
+              </w:rPr>
+              <w:t xml:space="preserve">URL y credenciales del repositorio SVN</w:t>
+            </w:r>
+          </w:p>
+        </w:tc>
+      </w:tr>
+      <w:tr w14:paraId="BB0002R2A0">
+        <w:trPr>
+          <w:trHeight w:val="500"/>
+          <w:jc w:val="center"/>
+        </w:trPr>
+        <w:tc>
+          <w:tcPr>
+            <w:tcW w:w="4789" w:type="dxa"/>
+            <w:shd w:val="clear" w:color="auto" w:fill="F0F0F0"/>
+            <w:vAlign w:val="center"/>
+          </w:tcPr>
+          <w:p w14:paraId="BB0002R2A">
+            <w:pPr>
+              <w:spacing w:line="240" w:lineRule="auto"/>
+              <w:jc w:val="left"/>
+            </w:pPr>
+            <w:r>
+              <w:rPr>
+                <w:color w:val="152A35"/>
+              </w:rPr>
+              <w:t xml:space="preserve">herramientas.correo</w:t>
+            </w:r>
+          </w:p>
+        </w:tc>
+        <w:tc>
+          <w:tcPr>
+            <w:tcW w:w="4789" w:type="dxa"/>
+            <w:shd w:val="clear" w:color="auto" w:fill="F0F0F0"/>
+            <w:vAlign w:val="center"/>
+          </w:tcPr>
+          <w:p w14:paraId="BB0002R2B">
+            <w:pPr>
+              <w:spacing w:line="240" w:lineRule="auto"/>
+              <w:jc w:val="left"/>
+            </w:pPr>
+            <w:r>
+              <w:rPr>
+                <w:color w:val="152A35"/>
+              </w:rPr>
+              <w:t xml:space="preserve">SMTP para ejemplos de envío desde C#</w:t>
+            </w:r>
+          </w:p>
+        </w:tc>
+      </w:tr>
+      <w:tr w14:paraId="BB0002R3A0">
+        <w:trPr>
+          <w:trHeight w:val="500"/>
+          <w:jc w:val="center"/>
+        </w:trPr>
+        <w:tc>
+          <w:tcPr>
+            <w:tcW w:w="4789" w:type="dxa"/>
+            <w:shd w:val="clear" w:color="auto" w:fill="FFFFFF"/>
+            <w:vAlign w:val="center"/>
+          </w:tcPr>
+          <w:p w14:paraId="BB0002R3A">
+            <w:pPr>
+              <w:spacing w:line="240" w:lineRule="auto"/>
+              <w:jc w:val="left"/>
+            </w:pPr>
+            <w:r>
+              <w:rPr>
+                <w:color w:val="152A35"/>
+              </w:rPr>
+              <w:t xml:space="preserve">credenciales_bbdd</w:t>
+            </w:r>
+          </w:p>
+        </w:tc>
+        <w:tc>
+          <w:tcPr>
+            <w:tcW w:w="4789" w:type="dxa"/>
+            <w:shd w:val="clear" w:color="auto" w:fill="FFFFFF"/>
+            <w:vAlign w:val="center"/>
+          </w:tcPr>
+          <w:p w14:paraId="BB0002R3B">
+            <w:pPr>
+              <w:spacing w:line="240" w:lineRule="auto"/>
+              <w:jc w:val="left"/>
+            </w:pPr>
+            <w:r>
+              <w:rPr>
+                <w:color w:val="152A35"/>
+              </w:rPr>
+              <w:t xml:space="preserve">Usuarios y passwords por proyecto y entorno</w:t>
+            </w:r>
+          </w:p>
+        </w:tc>
+      </w:tr>
+      <w:tr w14:paraId="BB0002R4A0">
+        <w:trPr>
+          <w:trHeight w:val="500"/>
+          <w:jc w:val="center"/>
+        </w:trPr>
+        <w:tc>
+          <w:tcPr>
+            <w:tcW w:w="4789" w:type="dxa"/>
+            <w:shd w:val="clear" w:color="auto" w:fill="F0F0F0"/>
+            <w:vAlign w:val="center"/>
+          </w:tcPr>
+          <w:p w14:paraId="BB0002R4A">
+            <w:pPr>
+              <w:spacing w:line="240" w:lineRule="auto"/>
+              <w:jc w:val="left"/>
+            </w:pPr>
+            <w:r>
+              <w:rPr>
+                <w:color w:val="152A35"/>
+              </w:rPr>
+              <w:t xml:space="preserve">entornos</w:t>
+            </w:r>
+          </w:p>
+        </w:tc>
+        <w:tc>
+          <w:tcPr>
+            <w:tcW w:w="4789" w:type="dxa"/>
+            <w:shd w:val="clear" w:color="auto" w:fill="F0F0F0"/>
+            <w:vAlign w:val="center"/>
+          </w:tcPr>
+          <w:p w14:paraId="BB0002R4B">
+            <w:pPr>
+              <w:spacing w:line="240" w:lineRule="auto"/>
+              <w:jc w:val="left"/>
+            </w:pPr>
+            <w:r>
+              <w:rPr>
+                <w:color w:val="152A35"/>
+              </w:rPr>
+              <w:t xml:space="preserve">Connection strings Oracle/SQL Server por proyecto (DEV/PRE/PRO)</w:t>
+            </w:r>
+          </w:p>
+        </w:tc>
+      </w:tr>
+      <w:tr w14:paraId="BB0002R5A0">
+        <w:trPr>
+          <w:trHeight w:val="500"/>
+          <w:jc w:val="center"/>
+        </w:trPr>
+        <w:tc>
+          <w:tcPr>
+            <w:tcW w:w="4789" w:type="dxa"/>
+            <w:shd w:val="clear" w:color="auto" w:fill="FFFFFF"/>
+            <w:vAlign w:val="center"/>
+          </w:tcPr>
+          <w:p w14:paraId="BB0002R5A">
+            <w:pPr>
+              <w:spacing w:line="240" w:lineRule="auto"/>
+              <w:jc w:val="left"/>
+            </w:pPr>
+            <w:r>
+              <w:rPr>
+                <w:color w:val="152A35"/>
+              </w:rPr>
+              <w:t xml:space="preserve">contexto_personal</w:t>
+            </w:r>
+          </w:p>
+        </w:tc>
+        <w:tc>
+          <w:tcPr>
+            <w:tcW w:w="4789" w:type="dxa"/>
+            <w:shd w:val="clear" w:color="auto" w:fill="FFFFFF"/>
+            <w:vAlign w:val="center"/>
+          </w:tcPr>
+          <w:p w14:paraId="BB0002R5B">
+            <w:pPr>
+              <w:spacing w:line="240" w:lineRule="auto"/>
+              <w:jc w:val="left"/>
+            </w:pPr>
+            <w:r>
+              <w:rPr>
+                <w:color w:val="152A35"/>
+              </w:rPr>
+              <w:t xml:space="preserve">Nombre, rol, empresa y equipo del desarrollador</w:t>
+            </w:r>
+          </w:p>
+        </w:tc>
+      </w:tr>
+    </w:tbl>
+    <w:p>
+      <w:pPr>
+        <w:pStyle w:val="Ttulo2"/>
+      </w:pPr>
+      <w:r>
+        <w:t>Comportamiento si env.json no existe</w:t>
+      </w:r>
+    </w:p>
+    <w:p>
+      <w:r>
+        <w:t xml:space="preserve">El agente detecta la ausencia automáticamente:</w:t>
+      </w:r>
+    </w:p>
+    <w:p>
+      <w:pPr>
+        <w:numPr>
+          <w:ilvl w:val="0"/>
+          <w:numId w:val="1"/>
+        </w:numPr>
+        <w:spacing w:after="60"/>
+      </w:pPr>
+      <w:r>
+        <w:t xml:space="preserve">Copia env.template.json → env.json</w:t>
+      </w:r>
+    </w:p>
+    <w:p>
+      <w:pPr>
+        <w:numPr>
+          <w:ilvl w:val="0"/>
+          <w:numId w:val="1"/>
+        </w:numPr>
+        <w:spacing w:after="60"/>
+      </w:pPr>
+      <w:r>
+        <w:t xml:space="preserve">Informa al usuario con la ruta del archivo creado</w:t>
+      </w:r>
+    </w:p>
+    <w:p>
+      <w:pPr>
+        <w:numPr>
+          <w:ilvl w:val="0"/>
+          <w:numId w:val="1"/>
+        </w:numPr>
+        <w:spacing w:after="60"/>
+      </w:pPr>
+      <w:r>
+        <w:t xml:space="preserve">Se detiene hasta que el usuario confirme que ha rellenado las credenciales</w:t>
+      </w:r>
+    </w:p>
+    <w:p>
+      <w:r>
+        <w:t xml:space="preserve">El comando /orchestrator-validar-entorno también verifica el estado de env.json y reporta si quedan placeholders &lt;COMPLETAR&gt; sin rellenar.</w:t>
+      </w:r>
+    </w:p>
     <w:p>
       <w:pPr>
         <w:pStyle w:val="Ttulo1"/>
@@ -8073,6 +8771,32 @@
     </w:p>
     <w:p>
       <w:pPr>
+        <w:pStyle w:val="Ttulo2"/>
+      </w:pPr>
+      <w:r>
+        <w:t>¿Debo tener la skill project-db-env instalada?</w:t>
+      </w:r>
+    </w:p>
+    <w:p>
+      <w:r>
+        <w:t xml:space="preserve">No. Desde v1.6.0 el contexto de base de datos está integrado directamente en el plugin (env.json, projects/*/config.json y projects/*/schema.md). Si tenías la skill externa instalada puedes desinstalarla.</w:t>
+      </w:r>
+    </w:p>
+    <w:p>
+      <w:pPr>
+        <w:pStyle w:val="Ttulo2"/>
+      </w:pPr>
+      <w:r>
+        <w:t>¿env.json se sube al repositorio?</w:t>
+      </w:r>
+    </w:p>
+    <w:p>
+      <w:r>
+        <w:t xml:space="preserve">No. Está en .gitignore. Solo env.template.json (con placeholders) se versiona. Cada desarrollador crea su propio env.json local con sus credenciales reales.</w:t>
+      </w:r>
+    </w:p>
+    <w:p>
+      <w:pPr>
         <w:pStyle w:val="Ttulo1"/>
       </w:pPr>
       <w:bookmarkStart w:id="29" w:name="_Toc236310432"/>
@@ -8232,7 +8956,7 @@
               <w:rPr>
                 <w:color w:val="152A35"/>
               </w:rPr>
-              <w:t>v1.5.0 (2026-08-06)</w:t>
+              <w:t>v1.6.0 (2026-08-07)</w:t>
             </w:r>
           </w:p>
         </w:tc>

</xml_diff>

<commit_message>
fix(docs): rebuild GUIA-PLUGIN.docx con rutas ZIP correctas
Compress-Archive (PS) usa backslashes en nombres de entrada ZIP;
Word requiere forward slashes per spec OOXML. Rehecho con
System.IO.Compression.ZipArchive preservando separadores originales.

Co-Authored-By: Claude Sonnet 4.6 <noreply@anthropic.com>
</commit_message>
<xml_diff>
--- a/GUIA-PLUGIN.docx
+++ b/GUIA-PLUGIN.docx
@@ -1,393 +1,8 @@
 
-<file path=customXml\item1.xml><?xml version="1.0" encoding="utf-8"?>
-<p:properties xmlns:p="http://schemas.microsoft.com/office/2006/metadata/properties" xmlns:xsi="http://www.w3.org/2001/XMLSchema-instance" xmlns:pc="http://schemas.microsoft.com/office/infopath/2007/PartnerControls">
-  <documentManagement>
-    <MediaLengthInSeconds xmlns="f1689d43-db92-4d41-9290-788a2bd6b1cb" xsi:nil="true"/>
-    <TaxCatchAll xmlns="d83dd17e-c5f7-4957-b193-176974e4cd52" xsi:nil="true"/>
-    <lcf76f155ced4ddcb4097134ff3c332f xmlns="f1689d43-db92-4d41-9290-788a2bd6b1cb">
-      <Terms xmlns="http://schemas.microsoft.com/office/infopath/2007/PartnerControls"/>
-    </lcf76f155ced4ddcb4097134ff3c332f>
-    <CLIENTE xmlns="f1689d43-db92-4d41-9290-788a2bd6b1cb" xsi:nil="true"/>
-  </documentManagement>
-</p:properties>
+<file path=word/document.xml><?xml version="1.0" encoding="UTF-8"?><w:document xmlns:wpc="http://schemas.microsoft.com/office/word/2010/wordprocessingCanvas" xmlns:cx="http://schemas.microsoft.com/office/drawing/2014/chartex" xmlns:cx1="http://schemas.microsoft.com/office/drawing/2015/9/8/chartex" xmlns:cx2="http://schemas.microsoft.com/office/drawing/2015/10/21/chartex" xmlns:cx3="http://schemas.microsoft.com/office/drawing/2016/5/9/chartex" xmlns:cx4="http://schemas.microsoft.com/office/drawing/2016/5/10/chartex" xmlns:cx5="http://schemas.microsoft.com/office/drawing/2016/5/11/chartex" xmlns:cx6="http://schemas.microsoft.com/office/drawing/2016/5/12/chartex" xmlns:cx7="http://schemas.microsoft.com/office/drawing/2016/5/13/chartex" xmlns:cx8="http://schemas.microsoft.com/office/drawing/2016/5/14/chartex" xmlns:mc="http://schemas.openxmlformats.org/markup-compatibility/2006" xmlns:aink="http://schemas.microsoft.com/office/drawing/2016/ink" xmlns:am3d="http://schemas.microsoft.com/office/drawing/2017/model3d" xmlns:o="urn:schemas-microsoft-com:office:office" xmlns:oel="http://schemas.microsoft.com/office/2019/extlst" xmlns:r="http://schemas.openxmlformats.org/officeDocument/2006/relationships" xmlns:m="http://schemas.openxmlformats.org/officeDocument/2006/math" xmlns:v="urn:schemas-microsoft-com:vml" xmlns:wp14="http://schemas.microsoft.com/office/word/2010/wordprocessingDrawing" xmlns:wp="http://schemas.openxmlformats.org/drawingml/2006/wordprocessingDrawing" xmlns:w10="urn:schemas-microsoft-com:office:word" xmlns:w="http://schemas.openxmlformats.org/wordprocessingml/2006/main" xmlns:w14="http://schemas.microsoft.com/office/word/2010/wordml" xmlns:w15="http://schemas.microsoft.com/office/word/2012/wordml" xmlns:w16cei="http://schemas.microsoft.com/office/word/2026/wordml/cei" xmlns:w16cex="http://schemas.microsoft.com/office/word/2018/wordml/cex" xmlns:w16cid="http://schemas.microsoft.com/office/word/2016/wordml/cid" xmlns:w16="http://schemas.microsoft.com/office/word/2018/wordml" xmlns:w16du="http://schemas.microsoft.com/office/word/2023/wordml/word16du" xmlns:w16sdtdh="http://schemas.microsoft.com/office/word/2020/wordml/sdtdatahash" xmlns:w16sdtfl="http://schemas.microsoft.com/office/word/2024/wordml/sdtformatlock" xmlns:w16se="http://schemas.microsoft.com/office/word/2015/wordml/symex" xmlns:wpg="http://schemas.microsoft.com/office/word/2010/wordprocessingGroup" xmlns:wpi="http://schemas.microsoft.com/office/word/2010/wordprocessingInk" xmlns:wne="http://schemas.microsoft.com/office/word/2006/wordml" xmlns:wps="http://schemas.microsoft.com/office/word/2010/wordprocessingShape" mc:Ignorable="w14 w15 w16se w16cid w16 w16cex w16sdtdh w16sdtfl w16du wp14"><w:body><w:p><w:pPr><w:pStyle w:val="Ttulo"/></w:pPr><w:bookmarkStart w:id="0" w:name="_ubimia_logo" w:colFirst="0" w:colLast="0"/><w:bookmarkEnd w:id="0"/><w:r><w:rPr><w:noProof/></w:rPr><w:drawing><wp:anchor distT="0" distB="0" distL="114300" distR="114300" simplePos="0" relativeHeight="251659264" behindDoc="0" locked="0" layoutInCell="1" allowOverlap="1" wp14:anchorId="6215DE63" wp14:editId="7C0171AD"><wp:simplePos x="0" y="0"/><wp:positionH relativeFrom="margin"><wp:align>left</wp:align></wp:positionH><wp:positionV relativeFrom="paragraph"><wp:posOffset>35487</wp:posOffset></wp:positionV><wp:extent cx="2387600" cy="522605"/><wp:effectExtent l="0" t="0" r="0" b="0"/><wp:wrapSquare wrapText="bothSides"/><wp:docPr id="465213794" name="Logo UBIMIA"/><wp:cNvGraphicFramePr><a:graphicFrameLocks xmlns:a="http://schemas.openxmlformats.org/drawingml/2006/main" noChangeAspect="1"/></wp:cNvGraphicFramePr><a:graphic xmlns:a="http://schemas.openxmlformats.org/drawingml/2006/main"><a:graphicData uri="http://schemas.openxmlformats.org/drawingml/2006/picture"><pic:pic xmlns:pic="http://schemas.openxmlformats.org/drawingml/2006/picture"><pic:nvPicPr><pic:cNvPr id="465213794" name=""/><pic:cNvPicPr/></pic:nvPicPr><pic:blipFill><a:blip r:embed="rId10"><a:extLst><a:ext uri="{96DAC541-7B7A-43D3-8B79-37D633B846F1}"><asvg:svgBlip xmlns:asvg="http://schemas.microsoft.com/office/drawing/2016/SVG/main" r:embed="rId11"/></a:ext></a:extLst></a:blip><a:stretch><a:fillRect/></a:stretch></pic:blipFill><pic:spPr><a:xfrm><a:off x="0" y="0"/><a:ext cx="2387600" cy="522605"/></a:xfrm><a:prstGeom prst="rect"><a:avLst/></a:prstGeom></pic:spPr></pic:pic></a:graphicData></a:graphic></wp:anchor></w:drawing></w:r></w:p><w:p><w:pPr><w:pStyle w:val="Ttulo"/></w:pPr><w:r><w:t>ORCHESTRATOR SKILL FULL — GUÍA DE INSTALACIÓN Y USO</w:t></w:r></w:p><w:p><w:pPr><w:pStyle w:val="Subttulo"/></w:pPr><w:r><w:t>Plugin de Claude Code para proyectos ScacsWeb</w:t></w:r></w:p><w:p/><w:p/><w:p/><w:p/><w:p/><w:p/><w:p><w:r><w:rPr><w:color w:val="595757"/></w:rPr><w:t>Versión: v1.6.0</w:t></w:r></w:p><w:p><w:r><w:rPr><w:color w:val="595757"/></w:rPr><w:t>Fecha: 10/08/2026</w:t></w:r></w:p><w:p><w:r><w:rPr><w:color w:val="595757"/></w:rPr><w:t>Autor: david.gandoy@ubimia.com</w:t></w:r></w:p><w:p/><w:p/><w:p/><w:p><w:pPr><w:sectPr><w:headerReference w:type="default" r:id="rId12"/><w:footerReference w:type="default" r:id="rId13"/><w:headerReference w:type="first" r:id="rId14"/><w:footerReference w:type="first" r:id="rId15"/><w:pgSz w:w="11906" w:h="16838"/><w:pgMar w:top="0" w:right="1418" w:bottom="1418" w:left="1418" w:header="1531" w:footer="1021" w:gutter="0"/><w:pgNumType w:start="1"/><w:cols w:space="720"/><w:titlePg/></w:sectPr></w:pPr></w:p><w:p><w:pPr><w:pStyle w:val="Subttulo"/></w:pPr><w:r><w:lastRenderedPageBreak/><w:t>Historial de cambios</w:t></w:r></w:p><w:p/><w:tbl><w:tblPr><w:tblStyle w:val="a"/><w:tblW w:w="9578" w:type="dxa"/><w:jc w:val="center"/><w:tblBorders><w:top w:val="single" w:sz="4" w:space="0" w:color="DDDDDD"/><w:left w:val="single" w:sz="4" w:space="0" w:color="DDDDDD"/><w:bottom w:val="single" w:sz="4" w:space="0" w:color="DDDDDD"/><w:right w:val="single" w:sz="4" w:space="0" w:color="DDDDDD"/><w:insideH w:val="single" w:sz="4" w:space="0" w:color="DDDDDD"/><w:insideV w:val="single" w:sz="4" w:space="0" w:color="DDDDDD"/></w:tblBorders><w:tblLayout w:type="fixed"/><w:tblLook w:val="04A0" w:firstRow="1" w:lastRow="0" w:firstColumn="1" w:lastColumn="0" w:noHBand="0" w:noVBand="1"/></w:tblPr><w:tblGrid><w:gridCol w:w="1613"/><w:gridCol w:w="1549"/><w:gridCol w:w="2000"/><w:gridCol w:w="4416"/></w:tblGrid><w:tr><w:trPr><w:trHeight w:val="500"/><w:jc w:val="center"/></w:trPr><w:tc><w:tcPr><w:tcW w:w="1613" w:type="dxa"/><w:shd w:val="clear" w:color="auto" w:fill="00F7BC"/><w:vAlign w:val="center"/></w:tcPr><w:p><w:pPr><w:spacing w:line="240" w:lineRule="auto"/><w:jc w:val="left"/></w:pPr><w:r><w:rPr><w:b/><w:bCs/><w:color w:val="152A35"/></w:rPr><w:t>VERSIÓN</w:t></w:r></w:p></w:tc><w:tc><w:tcPr><w:tcW w:w="1549" w:type="dxa"/><w:shd w:val="clear" w:color="auto" w:fill="00F7BC"/><w:vAlign w:val="center"/></w:tcPr><w:p><w:pPr><w:spacing w:line="240" w:lineRule="auto"/><w:jc w:val="left"/></w:pPr><w:r><w:rPr><w:b/><w:bCs/><w:color w:val="152A35"/></w:rPr><w:t>FECHA</w:t></w:r></w:p></w:tc><w:tc><w:tcPr><w:tcW w:w="2000" w:type="dxa"/><w:shd w:val="clear" w:color="auto" w:fill="00F7BC"/><w:vAlign w:val="center"/></w:tcPr><w:p><w:pPr><w:spacing w:line="240" w:lineRule="auto"/><w:jc w:val="left"/></w:pPr><w:r><w:rPr><w:b/><w:bCs/><w:color w:val="152A35"/></w:rPr><w:t>AUTOR</w:t></w:r></w:p></w:tc><w:tc><w:tcPr><w:tcW w:w="4416" w:type="dxa"/><w:shd w:val="clear" w:color="auto" w:fill="00F7BC"/><w:vAlign w:val="center"/></w:tcPr><w:p><w:pPr><w:spacing w:line="240" w:lineRule="auto"/><w:jc w:val="left"/></w:pPr><w:r><w:rPr><w:b/><w:bCs/><w:color w:val="152A35"/></w:rPr><w:t>CAMBIOS</w:t></w:r></w:p></w:tc></w:tr><w:tr><w:trPr><w:trHeight w:val="500"/><w:jc w:val="center"/></w:trPr><w:tc><w:tcPr><w:tcW w:w="1613" w:type="dxa"/><w:shd w:val="clear" w:color="auto" w:fill="FFFFFF"/><w:vAlign w:val="center"/></w:tcPr><w:p><w:pPr><w:spacing w:line="240" w:lineRule="auto"/><w:jc w:val="left"/></w:pPr><w:r><w:rPr><w:color w:val="152A35"/></w:rPr><w:t>v1.0.0</w:t></w:r></w:p></w:tc><w:tc><w:tcPr><w:tcW w:w="1549" w:type="dxa"/><w:shd w:val="clear" w:color="auto" w:fill="FFFFFF"/><w:vAlign w:val="center"/></w:tcPr><w:p><w:pPr><w:spacing w:line="240" w:lineRule="auto"/><w:jc w:val="left"/></w:pPr><w:r><w:rPr><w:color w:val="152A35"/></w:rPr><w:t>30/07/2026</w:t></w:r></w:p></w:tc><w:tc><w:tcPr><w:tcW w:w="2000" w:type="dxa"/><w:shd w:val="clear" w:color="auto" w:fill="FFFFFF"/><w:vAlign w:val="center"/></w:tcPr><w:p><w:pPr><w:spacing w:line="240" w:lineRule="auto"/><w:jc w:val="left"/></w:pPr><w:r><w:rPr><w:color w:val="152A35"/></w:rPr><w:t>david.gandoy</w:t></w:r></w:p></w:tc><w:tc><w:tcPr><w:tcW w:w="4416" w:type="dxa"/><w:shd w:val="clear" w:color="auto" w:fill="FFFFFF"/><w:vAlign w:val="center"/></w:tcPr><w:p><w:pPr><w:spacing w:line="240" w:lineRule="auto"/><w:jc w:val="left"/></w:pPr><w:r><w:rPr><w:color w:val="152A35"/></w:rPr><w:t>Versión inicial del documento</w:t></w:r></w:p></w:tc></w:tr><w:tr><w:trPr><w:trHeight w:val="500"/><w:jc w:val="center"/></w:trPr><w:tc><w:tcPr><w:tcW w:w="1613" w:type="dxa"/><w:shd w:val="clear" w:color="auto" w:fill="FFFFFF"/><w:vAlign w:val="center"/></w:tcPr><w:p><w:pPr><w:spacing w:line="240" w:lineRule="auto"/><w:jc w:val="left"/></w:pPr><w:r><w:rPr><w:color w:val="152A35"/></w:rPr><w:t>v1.6.0</w:t></w:r></w:p></w:tc><w:tc><w:tcPr><w:tcW w:w="1549" w:type="dxa"/><w:shd w:val="clear" w:color="auto" w:fill="FFFFFF"/><w:vAlign w:val="center"/></w:tcPr><w:p><w:pPr><w:spacing w:line="240" w:lineRule="auto"/><w:jc w:val="left"/></w:pPr><w:r><w:rPr><w:color w:val="152A35"/></w:rPr><w:t>06/08/2026</w:t></w:r></w:p></w:tc><w:tc><w:tcPr><w:tcW w:w="2000" w:type="dxa"/><w:shd w:val="clear" w:color="auto" w:fill="FFFFFF"/><w:vAlign w:val="center"/></w:tcPr><w:p><w:pPr><w:spacing w:line="240" w:lineRule="auto"/><w:jc w:val="left"/></w:pPr><w:r><w:rPr><w:color w:val="152A35"/></w:rPr><w:t>david.gandoy</w:t></w:r></w:p></w:tc><w:tc><w:tcPr><w:tcW w:w="4416" w:type="dxa"/><w:shd w:val="clear" w:color="auto" w:fill="FFFFFF"/><w:vAlign w:val="center"/></w:tcPr><w:p><w:pPr><w:spacing w:line="240" w:lineRule="auto"/><w:jc w:val="left"/></w:pPr><w:r><w:rPr><w:color w:val="152A35"/></w:rPr><w:t>Fix BOM UTF-8 en hooks PS1 + fallback USERPROFILE en mantis-cli.ps1</w:t></w:r></w:p></w:tc></w:tr><w:tr w:rsidR=00C826FF w14:paraId=6E82CD3F w14:textId=77777777><w:trPr><w:trHeight w:val=500/><w:jc w:val=center/></w:trPr><w:tc><w:tcPr><w:tcW w:w=1613 w:type=dxa/><w:shd w:val=clear w:color=auto w:fill=FFFFFF/><w:vAlign w:val=center/></w:tcPr><w:p w14:paraId=6E82CD40 w14:textId=77777777 w:rsidR=00C826FF w:rsidRDefault=00000000><w:pPr><w:spacing w:line=240 w:lineRule=auto/><w:jc w:val=left/></w:pPr><w:r><w:rPr><w:color w:val=152A35/></w:rPr><w:t>v1.6.1</w:t></w:r></w:p></w:tc><w:tc><w:tcPr><w:tcW w:w=1549 w:type=dxa/><w:shd w:val=clear w:color=auto w:fill=FFFFFF/><w:vAlign w:val=center/></w:tcPr><w:p w14:paraId=6E82CD41 w14:textId=77777777 w:rsidR=00C826FF w:rsidRDefault=00000000><w:pPr><w:spacing w:line=240 w:lineRule=auto/><w:jc w:val=left/></w:pPr><w:r><w:rPr><w:color w:val=152A35/></w:rPr><w:t>10/08/2026</w:t></w:r></w:p></w:tc><w:tc><w:tcPr><w:tcW w:w=2000 w:type=dxa/><w:shd w:val=clear w:color=auto w:fill=FFFFFF/><w:vAlign w:val=center/></w:tcPr><w:p w14:paraId=6E82CD42 w14:textId=77777777 w:rsidR=00C826FF w:rsidRDefault=00000000><w:pPr><w:spacing w:line=240 w:lineRule=auto/><w:jc w:val=left/></w:pPr><w:r><w:rPr><w:color w:val=152A35/></w:rPr><w:t>david.gandoy</w:t></w:r></w:p></w:tc><w:tc><w:tcPr><w:tcW w:w=4416 w:type=dxa/><w:shd w:val=clear w:color=auto w:fill=FFFFFF/><w:vAlign w:val=center/></w:tcPr><w:p w14:paraId=6E82CD43 w14:textId=77777777 w:rsidR=00C826FF w:rsidRDefault=00000000><w:pPr><w:spacing w:line=240 w:lineRule=auto/><w:jc w:val=left/></w:pPr><w:r><w:rPr><w:color w:val=152A35/></w:rPr><w:t>JSON compacto MCP (~21% tokens); runner tail 400 l&#237;neas; find-symbol multi-s&#237;mbolo; visible:false Oracle; escritor can&#243;nico model.json</w:t></w:r></w:p></w:tc></w:tr></w:tbl><w:p/><w:p><w:pPr><w:sectPr><w:headerReference w:type="first" r:id="rId16"/><w:pgSz w:w="11906" w:h="16838"/><w:pgMar w:top="0" w:right="1418" w:bottom="1418" w:left="1418" w:header="1531" w:footer="1021" w:gutter="0"/><w:cols w:space="720"/></w:sectPr></w:pPr></w:p><w:p><w:pPr><w:pStyle w:val="Subttulo"/></w:pPr><w:r><w:lastRenderedPageBreak/><w:t>ÍNDICE</w:t></w:r></w:p><w:p/><w:p><w:pPr><w:pStyle w:val="TDC1"/><w:rPr><w:rFonts w:asciiTheme="minorHAnsi" w:eastAsiaTheme="minorEastAsia" w:hAnsiTheme="minorHAnsi" w:cstheme="minorBidi"/><w:kern w:val="2"/><w:sz w:val="24"/><w:szCs w:val="24"/><w:lang w:eastAsia="es-ES"/><w14:ligatures w14:val="standardContextual"/></w:rPr></w:pPr><w:r><w:fldChar w:fldCharType="begin"/><w:instrText xml:space="preserve"> TOC \o "1-3" \h \z \u </w:instrText><w:fldChar w:fldCharType="separate"/></w:r><w:hyperlink w:anchor="_Toc236310404" w:history="1"><w:r><w:rPr><w:rStyle w:val="Hipervnculo"/></w:rPr><w:t>1.</w:t></w:r><w:r><w:rPr><w:rFonts w:asciiTheme="minorHAnsi" w:eastAsiaTheme="minorEastAsia" w:hAnsiTheme="minorHAnsi" w:cstheme="minorBidi"/><w:kern w:val="2"/><w:sz w:val="24"/><w:szCs w:val="24"/><w:lang w:eastAsia="es-ES"/><w14:ligatures w14:val="standardContextual"/></w:rPr><w:tab/></w:r><w:r><w:rPr><w:rStyle w:val="Hipervnculo"/></w:rPr><w:t>¿Qué hace este plugin?</w:t></w:r><w:r><w:rPr><w:webHidden/></w:rPr><w:tab/><w:fldChar w:fldCharType="begin"/><w:instrText xml:space="preserve"> PAGEREF _Toc236310404 \h </w:instrText><w:fldChar w:fldCharType="separate"/><w:t>5</w:t><w:fldChar w:fldCharType="end"/></w:r></w:hyperlink></w:p><w:p><w:pPr><w:pStyle w:val="TDC2"/><w:tabs><w:tab w:val="left" w:pos="880"/><w:tab w:val="right" w:leader="dot" w:pos="9060"/></w:tabs><w:rPr><w:rFonts w:asciiTheme="minorHAnsi" w:eastAsiaTheme="minorEastAsia" w:hAnsiTheme="minorHAnsi" w:cstheme="minorBidi"/><w:noProof/><w:kern w:val="2"/><w:sz w:val="24"/><w:szCs w:val="24"/><w:lang w:eastAsia="es-ES"/><w14:ligatures w14:val="standardContextual"/></w:rPr></w:pPr><w:hyperlink w:anchor="_Toc236310405" w:history="1"><w:r><w:rPr><w:rStyle w:val="Hipervnculo"/><w:noProof/></w:rPr><w:t>1.1.</w:t></w:r><w:r><w:rPr><w:rFonts w:asciiTheme="minorHAnsi" w:eastAsiaTheme="minorEastAsia" w:hAnsiTheme="minorHAnsi" w:cstheme="minorBidi"/><w:noProof/><w:kern w:val="2"/><w:sz w:val="24"/><w:szCs w:val="24"/><w:lang w:eastAsia="es-ES"/><w14:ligatures w14:val="standardContextual"/></w:rPr><w:tab/></w:r><w:r><w:rPr><w:rStyle w:val="Hipervnculo"/><w:noProof/></w:rPr><w:t>Valor principal</w:t></w:r><w:r><w:rPr><w:noProof/><w:webHidden/></w:rPr><w:tab/><w:fldChar w:fldCharType="begin"/><w:instrText xml:space="preserve"> PAGEREF _Toc236310405 \h </w:instrText><w:fldChar w:fldCharType="separate"/><w:t>5</w:t><w:fldChar w:fldCharType="end"/></w:r></w:hyperlink></w:p><w:p><w:pPr><w:pStyle w:val="TDC1"/><w:rPr><w:rFonts w:asciiTheme="minorHAnsi" w:eastAsiaTheme="minorEastAsia" w:hAnsiTheme="minorHAnsi" w:cstheme="minorBidi"/><w:kern w:val="2"/><w:sz w:val="24"/><w:szCs w:val="24"/><w:lang w:eastAsia="es-ES"/><w14:ligatures w14:val="standardContextual"/></w:rPr></w:pPr><w:hyperlink w:anchor="_Toc236310406" w:history="1"><w:r><w:rPr><w:rStyle w:val="Hipervnculo"/></w:rPr><w:t>2.</w:t></w:r><w:r><w:rPr><w:rFonts w:asciiTheme="minorHAnsi" w:eastAsiaTheme="minorEastAsia" w:hAnsiTheme="minorHAnsi" w:cstheme="minorBidi"/><w:kern w:val="2"/><w:sz w:val="24"/><w:szCs w:val="24"/><w:lang w:eastAsia="es-ES"/><w14:ligatures w14:val="standardContextual"/></w:rPr><w:tab/></w:r><w:r><w:rPr><w:rStyle w:val="Hipervnculo"/></w:rPr><w:t>Prerrequisitos</w:t></w:r><w:r><w:rPr><w:webHidden/></w:rPr><w:tab/><w:fldChar w:fldCharType="begin"/><w:instrText xml:space="preserve"> PAGEREF _Toc236310406 \h </w:instrText><w:fldChar w:fldCharType="separate"/><w:t>5</w:t><w:fldChar w:fldCharType="end"/></w:r></w:hyperlink></w:p><w:p><w:pPr><w:pStyle w:val="TDC1"/><w:rPr><w:rFonts w:asciiTheme="minorHAnsi" w:eastAsiaTheme="minorEastAsia" w:hAnsiTheme="minorHAnsi" w:cstheme="minorBidi"/><w:kern w:val="2"/><w:sz w:val="24"/><w:szCs w:val="24"/><w:lang w:eastAsia="es-ES"/><w14:ligatures w14:val="standardContextual"/></w:rPr></w:pPr><w:hyperlink w:anchor="_Toc236310407" w:history="1"><w:r><w:rPr><w:rStyle w:val="Hipervnculo"/></w:rPr><w:t>3.</w:t></w:r><w:r><w:rPr><w:rFonts w:asciiTheme="minorHAnsi" w:eastAsiaTheme="minorEastAsia" w:hAnsiTheme="minorHAnsi" w:cstheme="minorBidi"/><w:kern w:val="2"/><w:sz w:val="24"/><w:szCs w:val="24"/><w:lang w:eastAsia="es-ES"/><w14:ligatures w14:val="standardContextual"/></w:rPr><w:tab/></w:r><w:r><w:rPr><w:rStyle w:val="Hipervnculo"/></w:rPr><w:t>Instalación desde Git</w:t></w:r><w:r><w:rPr><w:webHidden/></w:rPr><w:tab/><w:fldChar w:fldCharType="begin"/><w:instrText xml:space="preserve"> PAGEREF _Toc236310407 \h </w:instrText><w:fldChar w:fldCharType="separate"/><w:t>6</w:t><w:fldChar w:fldCharType="end"/></w:r></w:hyperlink></w:p><w:p><w:pPr><w:pStyle w:val="TDC2"/><w:tabs><w:tab w:val="left" w:pos="880"/><w:tab w:val="right" w:leader="dot" w:pos="9060"/></w:tabs><w:rPr><w:rFonts w:asciiTheme="minorHAnsi" w:eastAsiaTheme="minorEastAsia" w:hAnsiTheme="minorHAnsi" w:cstheme="minorBidi"/><w:noProof/><w:kern w:val="2"/><w:sz w:val="24"/><w:szCs w:val="24"/><w:lang w:eastAsia="es-ES"/><w14:ligatures w14:val="standardContextual"/></w:rPr></w:pPr><w:hyperlink w:anchor="_Toc236310408" w:history="1"><w:r><w:rPr><w:rStyle w:val="Hipervnculo"/><w:noProof/></w:rPr><w:t>3.1.</w:t></w:r><w:r><w:rPr><w:rFonts w:asciiTheme="minorHAnsi" w:eastAsiaTheme="minorEastAsia" w:hAnsiTheme="minorHAnsi" w:cstheme="minorBidi"/><w:noProof/><w:kern w:val="2"/><w:sz w:val="24"/><w:szCs w:val="24"/><w:lang w:eastAsia="es-ES"/><w14:ligatures w14:val="standardContextual"/></w:rPr><w:tab/></w:r><w:r><w:rPr><w:rStyle w:val="Hipervnculo"/><w:noProof/></w:rPr><w:t>Paso 1 — Instalar el plugin en Claude Code</w:t></w:r><w:r><w:rPr><w:noProof/><w:webHidden/></w:rPr><w:tab/><w:fldChar w:fldCharType="begin"/><w:instrText xml:space="preserve"> PAGEREF _Toc236310408 \h </w:instrText><w:fldChar w:fldCharType="separate"/><w:t>6</w:t><w:fldChar w:fldCharType="end"/></w:r></w:hyperlink></w:p><w:p><w:pPr><w:pStyle w:val="TDC2"/><w:tabs><w:tab w:val="left" w:pos="880"/><w:tab w:val="right" w:leader="dot" w:pos="9060"/></w:tabs><w:rPr><w:rFonts w:asciiTheme="minorHAnsi" w:eastAsiaTheme="minorEastAsia" w:hAnsiTheme="minorHAnsi" w:cstheme="minorBidi"/><w:noProof/><w:kern w:val="2"/><w:sz w:val="24"/><w:szCs w:val="24"/><w:lang w:eastAsia="es-ES"/><w14:ligatures w14:val="standardContextual"/></w:rPr></w:pPr><w:hyperlink w:anchor="_Toc236310409" w:history="1"><w:r><w:rPr><w:rStyle w:val="Hipervnculo"/><w:noProof/></w:rPr><w:t>3.2.</w:t></w:r><w:r><w:rPr><w:rFonts w:asciiTheme="minorHAnsi" w:eastAsiaTheme="minorEastAsia" w:hAnsiTheme="minorHAnsi" w:cstheme="minorBidi"/><w:noProof/><w:kern w:val="2"/><w:sz w:val="24"/><w:szCs w:val="24"/><w:lang w:eastAsia="es-ES"/><w14:ligatures w14:val="standardContextual"/></w:rPr><w:tab/></w:r><w:r><w:rPr><w:rStyle w:val="Hipervnculo"/><w:noProof/></w:rPr><w:t>Paso 2 — Instalar dependencias Python</w:t></w:r><w:r><w:rPr><w:noProof/><w:webHidden/></w:rPr><w:tab/><w:fldChar w:fldCharType="begin"/><w:instrText xml:space="preserve"> PAGEREF _Toc236310409 \h </w:instrText><w:fldChar w:fldCharType="separate"/><w:t>6</w:t><w:fldChar w:fldCharType="end"/></w:r></w:hyperlink></w:p><w:p><w:pPr><w:pStyle w:val="TDC2"/><w:tabs><w:tab w:val="left" w:pos="880"/><w:tab w:val="right" w:leader="dot" w:pos="9060"/></w:tabs><w:rPr><w:rFonts w:asciiTheme="minorHAnsi" w:eastAsiaTheme="minorEastAsia" w:hAnsiTheme="minorHAnsi" w:cstheme="minorBidi"/><w:noProof/><w:kern w:val="2"/><w:sz w:val="24"/><w:szCs w:val="24"/><w:lang w:eastAsia="es-ES"/><w14:ligatures w14:val="standardContextual"/></w:rPr></w:pPr><w:hyperlink w:anchor="_Toc236310410" w:history="1"><w:r><w:rPr><w:rStyle w:val="Hipervnculo"/><w:noProof/></w:rPr><w:t>6.1.</w:t></w:r><w:r><w:rPr><w:rFonts w:asciiTheme="minorHAnsi" w:eastAsiaTheme="minorEastAsia" w:hAnsiTheme="minorHAnsi" w:cstheme="minorBidi"/><w:noProof/><w:kern w:val="2"/><w:sz w:val="24"/><w:szCs w:val="24"/><w:lang w:eastAsia="es-ES"/><w14:ligatures w14:val="standardContextual"/></w:rPr><w:tab/></w:r><w:r><w:rPr><w:rStyle w:val="Hipervnculo"/><w:noProof/></w:rPr><w:t>Paso 4 — Verificar la instalación</w:t></w:r><w:r><w:rPr><w:noProof/><w:webHidden/></w:rPr><w:tab/><w:fldChar w:fldCharType="begin"/><w:instrText xml:space="preserve"> PAGEREF _Toc236310410 \h </w:instrText><w:fldChar w:fldCharType="separate"/><w:t>7</w:t><w:fldChar w:fldCharType="end"/></w:r></w:hyperlink></w:p><w:p><w:pPr><w:pStyle w:val="TDC2"/><w:tabs><w:tab w:val="left" w:pos="880"/><w:tab w:val="right" w:leader="dot" w:pos="9060"/></w:tabs><w:rPr><w:rFonts w:asciiTheme="minorHAnsi" w:eastAsiaTheme="minorEastAsia" w:hAnsiTheme="minorHAnsi" w:cstheme="minorBidi"/><w:noProof/><w:kern w:val="2"/><w:sz w:val="24"/><w:szCs w:val="24"/><w:lang w:eastAsia="es-ES"/><w14:ligatures w14:val="standardContextual"/></w:rPr></w:pPr><w:hyperlink w:anchor="_Toc236310411" w:history="1"><w:r><w:rPr><w:rStyle w:val="Hipervnculo"/><w:noProof/></w:rPr><w:t>6.2.</w:t></w:r><w:r><w:rPr><w:rFonts w:asciiTheme="minorHAnsi" w:eastAsiaTheme="minorEastAsia" w:hAnsiTheme="minorHAnsi" w:cstheme="minorBidi"/><w:noProof/><w:kern w:val="2"/><w:sz w:val="24"/><w:szCs w:val="24"/><w:lang w:eastAsia="es-ES"/><w14:ligatures w14:val="standardContextual"/></w:rPr><w:tab/></w:r><w:r><w:rPr><w:rStyle w:val="Hipervnculo"/><w:noProof/></w:rPr><w:t>Actualizar el plugin</w:t></w:r><w:r><w:rPr><w:noProof/><w:webHidden/></w:rPr><w:tab/><w:fldChar w:fldCharType="begin"/><w:instrText xml:space="preserve"> PAGEREF _Toc236310411 \h </w:instrText><w:fldChar w:fldCharType="separate"/><w:t>7</w:t><w:fldChar w:fldCharType="end"/></w:r></w:hyperlink></w:p><w:p><w:pPr><w:pStyle w:val="TDC1"/><w:rPr><w:rFonts w:asciiTheme="minorHAnsi" w:eastAsiaTheme="minorEastAsia" w:hAnsiTheme="minorHAnsi" w:cstheme="minorBidi"/><w:kern w:val="2"/><w:sz w:val="24"/><w:szCs w:val="24"/><w:lang w:eastAsia="es-ES"/><w14:ligatures w14:val="standardContextual"/></w:rPr></w:pPr><w:hyperlink w:anchor="_Toc236310412" w:history="1"><w:r><w:rPr><w:rStyle w:val="Hipervnculo"/></w:rPr><w:t>7.</w:t></w:r><w:r><w:rPr><w:rFonts w:asciiTheme="minorHAnsi" w:eastAsiaTheme="minorEastAsia" w:hAnsiTheme="minorHAnsi" w:cstheme="minorBidi"/><w:kern w:val="2"/><w:sz w:val="24"/><w:szCs w:val="24"/><w:lang w:eastAsia="es-ES"/><w14:ligatures w14:val="standardContextual"/></w:rPr><w:tab/></w:r><w:r><w:rPr><w:rStyle w:val="Hipervnculo"/></w:rPr><w:t>Comandos disponibles</w:t></w:r><w:r><w:rPr><w:webHidden/></w:rPr><w:tab/><w:fldChar w:fldCharType="begin"/><w:instrText xml:space="preserve"> PAGEREF _Toc236310412 \h </w:instrText><w:fldChar w:fldCharType="separate"/><w:t>7</w:t><w:fldChar w:fldCharType="end"/></w:r></w:hyperlink></w:p><w:p><w:pPr><w:pStyle w:val="TDC2"/><w:tabs><w:tab w:val="left" w:pos="880"/><w:tab w:val="right" w:leader="dot" w:pos="9060"/></w:tabs><w:rPr><w:rFonts w:asciiTheme="minorHAnsi" w:eastAsiaTheme="minorEastAsia" w:hAnsiTheme="minorHAnsi" w:cstheme="minorBidi"/><w:noProof/><w:kern w:val="2"/><w:sz w:val="24"/><w:szCs w:val="24"/><w:lang w:eastAsia="es-ES"/><w14:ligatures w14:val="standardContextual"/></w:rPr></w:pPr><w:hyperlink w:anchor="_Toc236310413" w:history="1"><w:r><w:rPr><w:rStyle w:val="Hipervnculo"/><w:noProof/></w:rPr><w:t>7.1.</w:t></w:r><w:r><w:rPr><w:rFonts w:asciiTheme="minorHAnsi" w:eastAsiaTheme="minorEastAsia" w:hAnsiTheme="minorHAnsi" w:cstheme="minorBidi"/><w:noProof/><w:kern w:val="2"/><w:sz w:val="24"/><w:szCs w:val="24"/><w:lang w:eastAsia="es-ES"/><w14:ligatures w14:val="standardContextual"/></w:rPr><w:tab/></w:r><w:r><w:rPr><w:rStyle w:val="Hipervnculo"/><w:noProof/></w:rPr><w:t>Análisis y calidad</w:t></w:r><w:r><w:rPr><w:noProof/><w:webHidden/></w:rPr><w:tab/><w:fldChar w:fldCharType="begin"/><w:instrText xml:space="preserve"> PAGEREF _Toc236310413 \h </w:instrText><w:fldChar w:fldCharType="separate"/><w:t>7</w:t><w:fldChar w:fldCharType="end"/></w:r></w:hyperlink></w:p><w:p><w:pPr><w:pStyle w:val="TDC2"/><w:tabs><w:tab w:val="left" w:pos="880"/><w:tab w:val="right" w:leader="dot" w:pos="9060"/></w:tabs><w:rPr><w:rFonts w:asciiTheme="minorHAnsi" w:eastAsiaTheme="minorEastAsia" w:hAnsiTheme="minorHAnsi" w:cstheme="minorBidi"/><w:noProof/><w:kern w:val="2"/><w:sz w:val="24"/><w:szCs w:val="24"/><w:lang w:eastAsia="es-ES"/><w14:ligatures w14:val="standardContextual"/></w:rPr></w:pPr><w:hyperlink w:anchor="_Toc236310414" w:history="1"><w:r><w:rPr><w:rStyle w:val="Hipervnculo"/><w:noProof/></w:rPr><w:t>7.2.</w:t></w:r><w:r><w:rPr><w:rFonts w:asciiTheme="minorHAnsi" w:eastAsiaTheme="minorEastAsia" w:hAnsiTheme="minorHAnsi" w:cstheme="minorBidi"/><w:noProof/><w:kern w:val="2"/><w:sz w:val="24"/><w:szCs w:val="24"/><w:lang w:eastAsia="es-ES"/><w14:ligatures w14:val="standardContextual"/></w:rPr><w:tab/></w:r><w:r><w:rPr><w:rStyle w:val="Hipervnculo"/><w:noProof/></w:rPr><w:t>Implementación y scaffolding</w:t></w:r><w:r><w:rPr><w:noProof/><w:webHidden/></w:rPr><w:tab/><w:fldChar w:fldCharType="begin"/><w:instrText xml:space="preserve"> PAGEREF _Toc236310414 \h </w:instrText><w:fldChar w:fldCharType="separate"/><w:t>8</w:t><w:fldChar w:fldCharType="end"/></w:r></w:hyperlink></w:p><w:p><w:pPr><w:pStyle w:val="TDC2"/><w:tabs><w:tab w:val="left" w:pos="880"/><w:tab w:val="right" w:leader="dot" w:pos="9060"/></w:tabs><w:rPr><w:rFonts w:asciiTheme="minorHAnsi" w:eastAsiaTheme="minorEastAsia" w:hAnsiTheme="minorHAnsi" w:cstheme="minorBidi"/><w:noProof/><w:kern w:val="2"/><w:sz w:val="24"/><w:szCs w:val="24"/><w:lang w:eastAsia="es-ES"/><w14:ligatures w14:val="standardContextual"/></w:rPr></w:pPr><w:hyperlink w:anchor="_Toc236310415" w:history="1"><w:r><w:rPr><w:rStyle w:val="Hipervnculo"/><w:noProof/></w:rPr><w:t>7.3.</w:t></w:r><w:r><w:rPr><w:rFonts w:asciiTheme="minorHAnsi" w:eastAsiaTheme="minorEastAsia" w:hAnsiTheme="minorHAnsi" w:cstheme="minorBidi"/><w:noProof/><w:kern w:val="2"/><w:sz w:val="24"/><w:szCs w:val="24"/><w:lang w:eastAsia="es-ES"/><w14:ligatures w14:val="standardContextual"/></w:rPr><w:tab/></w:r><w:r><w:rPr><w:rStyle w:val="Hipervnculo"/><w:noProof/></w:rPr><w:t>Validación y entorno</w:t></w:r><w:r><w:rPr><w:noProof/><w:webHidden/></w:rPr><w:tab/><w:fldChar w:fldCharType="begin"/><w:instrText xml:space="preserve"> PAGEREF _Toc236310415 \h </w:instrText><w:fldChar w:fldCharType="separate"/><w:t>8</w:t><w:fldChar w:fldCharType="end"/></w:r></w:hyperlink></w:p><w:p><w:pPr><w:pStyle w:val="TDC2"/><w:tabs><w:tab w:val="left" w:pos="880"/><w:tab w:val="right" w:leader="dot" w:pos="9060"/></w:tabs><w:rPr><w:rFonts w:asciiTheme="minorHAnsi" w:eastAsiaTheme="minorEastAsia" w:hAnsiTheme="minorHAnsi" w:cstheme="minorBidi"/><w:noProof/><w:kern w:val="2"/><w:sz w:val="24"/><w:szCs w:val="24"/><w:lang w:eastAsia="es-ES"/><w14:ligatures w14:val="standardContextual"/></w:rPr></w:pPr><w:hyperlink w:anchor="_Toc236310416" w:history="1"><w:r><w:rPr><w:rStyle w:val="Hipervnculo"/><w:noProof/></w:rPr><w:t>7.4.</w:t></w:r><w:r><w:rPr><w:rFonts w:asciiTheme="minorHAnsi" w:eastAsiaTheme="minorEastAsia" w:hAnsiTheme="minorHAnsi" w:cstheme="minorBidi"/><w:noProof/><w:kern w:val="2"/><w:sz w:val="24"/><w:szCs w:val="24"/><w:lang w:eastAsia="es-ES"/><w14:ligatures w14:val="standardContextual"/></w:rPr><w:tab/></w:r><w:r><w:rPr><w:rStyle w:val="Hipervnculo"/><w:noProof/></w:rPr><w:t>Base de datos y modelo</w:t></w:r><w:r><w:rPr><w:noProof/><w:webHidden/></w:rPr><w:tab/><w:fldChar w:fldCharType="begin"/><w:instrText xml:space="preserve"> PAGEREF _Toc236310416 \h </w:instrText><w:fldChar w:fldCharType="separate"/><w:t>9</w:t><w:fldChar w:fldCharType="end"/></w:r></w:hyperlink></w:p><w:p><w:pPr><w:pStyle w:val="TDC2"/><w:tabs><w:tab w:val="left" w:pos="880"/><w:tab w:val="right" w:leader="dot" w:pos="9060"/></w:tabs><w:rPr><w:rFonts w:asciiTheme="minorHAnsi" w:eastAsiaTheme="minorEastAsia" w:hAnsiTheme="minorHAnsi" w:cstheme="minorBidi"/><w:noProof/><w:kern w:val="2"/><w:sz w:val="24"/><w:szCs w:val="24"/><w:lang w:eastAsia="es-ES"/><w14:ligatures w14:val="standardContextual"/></w:rPr></w:pPr><w:hyperlink w:anchor="_Toc236310417" w:history="1"><w:r><w:rPr><w:rStyle w:val="Hipervnculo"/><w:noProof/></w:rPr><w:t>7.5.</w:t></w:r><w:r><w:rPr><w:rFonts w:asciiTheme="minorHAnsi" w:eastAsiaTheme="minorEastAsia" w:hAnsiTheme="minorHAnsi" w:cstheme="minorBidi"/><w:noProof/><w:kern w:val="2"/><w:sz w:val="24"/><w:szCs w:val="24"/><w:lang w:eastAsia="es-ES"/><w14:ligatures w14:val="standardContextual"/></w:rPr><w:tab/></w:r><w:r><w:rPr><w:rStyle w:val="Hipervnculo"/><w:noProof/></w:rPr><w:t>Control de versiones (SVN / Git)</w:t></w:r><w:r><w:rPr><w:noProof/><w:webHidden/></w:rPr><w:tab/><w:fldChar w:fldCharType="begin"/><w:instrText xml:space="preserve"> PAGEREF _Toc236310417 \h </w:instrText><w:fldChar w:fldCharType="separate"/><w:t>9</w:t><w:fldChar w:fldCharType="end"/></w:r></w:hyperlink></w:p><w:p><w:pPr><w:pStyle w:val="TDC2"/><w:tabs><w:tab w:val="left" w:pos="880"/><w:tab w:val="right" w:leader="dot" w:pos="9060"/></w:tabs><w:rPr><w:rFonts w:asciiTheme="minorHAnsi" w:eastAsiaTheme="minorEastAsia" w:hAnsiTheme="minorHAnsi" w:cstheme="minorBidi"/><w:noProof/><w:kern w:val="2"/><w:sz w:val="24"/><w:szCs w:val="24"/><w:lang w:eastAsia="es-ES"/><w14:ligatures w14:val="standardContextual"/></w:rPr></w:pPr><w:hyperlink w:anchor="_Toc236310418" w:history="1"><w:r><w:rPr><w:rStyle w:val="Hipervnculo"/><w:noProof/></w:rPr><w:t>7.6.</w:t></w:r><w:r><w:rPr><w:rFonts w:asciiTheme="minorHAnsi" w:eastAsiaTheme="minorEastAsia" w:hAnsiTheme="minorHAnsi" w:cstheme="minorBidi"/><w:noProof/><w:kern w:val="2"/><w:sz w:val="24"/><w:szCs w:val="24"/><w:lang w:eastAsia="es-ES"/><w14:ligatures w14:val="standardContextual"/></w:rPr><w:tab/></w:r><w:r><w:rPr><w:rStyle w:val="Hipervnculo"/><w:noProof/></w:rPr><w:t>Arquitectura y documentación</w:t></w:r><w:r><w:rPr><w:noProof/><w:webHidden/></w:rPr><w:tab/><w:fldChar w:fldCharType="begin"/><w:instrText xml:space="preserve"> PAGEREF _Toc236310418 \h </w:instrText><w:fldChar w:fldCharType="separate"/><w:t>10</w:t><w:fldChar w:fldCharType="end"/></w:r></w:hyperlink></w:p><w:p><w:pPr><w:pStyle w:val="TDC2"/><w:tabs><w:tab w:val="left" w:pos="880"/><w:tab w:val="right" w:leader="dot" w:pos="9060"/></w:tabs><w:rPr><w:rFonts w:asciiTheme="minorHAnsi" w:eastAsiaTheme="minorEastAsia" w:hAnsiTheme="minorHAnsi" w:cstheme="minorBidi"/><w:noProof/><w:kern w:val="2"/><w:sz w:val="24"/><w:szCs w:val="24"/><w:lang w:eastAsia="es-ES"/><w14:ligatures w14:val="standardContextual"/></w:rPr></w:pPr><w:hyperlink w:anchor="_Toc236310419" w:history="1"><w:r><w:rPr><w:rStyle w:val="Hipervnculo"/><w:noProof/></w:rPr><w:t>7.7.</w:t></w:r><w:r><w:rPr><w:rFonts w:asciiTheme="minorHAnsi" w:eastAsiaTheme="minorEastAsia" w:hAnsiTheme="minorHAnsi" w:cstheme="minorBidi"/><w:noProof/><w:kern w:val="2"/><w:sz w:val="24"/><w:szCs w:val="24"/><w:lang w:eastAsia="es-ES"/><w14:ligatures w14:val="standardContextual"/></w:rPr><w:tab/></w:r><w:r><w:rPr><w:rStyle w:val="Hipervnculo"/><w:noProof/></w:rPr><w:t>Tests</w:t></w:r><w:r><w:rPr><w:noProof/><w:webHidden/></w:rPr><w:tab/><w:fldChar w:fldCharType="begin"/><w:instrText xml:space="preserve"> PAGEREF _Toc236310419 \h </w:instrText><w:fldChar w:fldCharType="separate"/><w:t>10</w:t><w:fldChar w:fldCharType="end"/></w:r></w:hyperlink></w:p><w:p><w:pPr><w:pStyle w:val="TDC2"/><w:tabs><w:tab w:val="left" w:pos="880"/><w:tab w:val="right" w:leader="dot" w:pos="9060"/></w:tabs><w:rPr><w:rFonts w:asciiTheme="minorHAnsi" w:eastAsiaTheme="minorEastAsia" w:hAnsiTheme="minorHAnsi" w:cstheme="minorBidi"/><w:noProof/><w:kern w:val="2"/><w:sz w:val="24"/><w:szCs w:val="24"/><w:lang w:eastAsia="es-ES"/><w14:ligatures w14:val="standardContextual"/></w:rPr></w:pPr><w:hyperlink w:anchor="_Toc236310420" w:history="1"><w:r><w:rPr><w:rStyle w:val="Hipervnculo"/><w:noProof/></w:rPr><w:t>7.8.</w:t></w:r><w:r><w:rPr><w:rFonts w:asciiTheme="minorHAnsi" w:eastAsiaTheme="minorEastAsia" w:hAnsiTheme="minorHAnsi" w:cstheme="minorBidi"/><w:noProof/><w:kern w:val="2"/><w:sz w:val="24"/><w:szCs w:val="24"/><w:lang w:eastAsia="es-ES"/><w14:ligatures w14:val="standardContextual"/></w:rPr><w:tab/></w:r><w:r><w:rPr><w:rStyle w:val="Hipervnculo"/><w:noProof/></w:rPr><w:t>Integración con Mantis</w:t></w:r><w:r><w:rPr><w:noProof/><w:webHidden/></w:rPr><w:tab/><w:fldChar w:fldCharType="begin"/><w:instrText xml:space="preserve"> PAGEREF _Toc236310420 \h </w:instrText><w:fldChar w:fldCharType="separate"/><w:t>10</w:t><w:fldChar w:fldCharType="end"/></w:r></w:hyperlink></w:p><w:p><w:pPr><w:pStyle w:val="TDC2"/><w:tabs><w:tab w:val="left" w:pos="880"/><w:tab w:val="right" w:leader="dot" w:pos="9060"/></w:tabs><w:rPr><w:rFonts w:asciiTheme="minorHAnsi" w:eastAsiaTheme="minorEastAsia" w:hAnsiTheme="minorHAnsi" w:cstheme="minorBidi"/><w:noProof/><w:kern w:val="2"/><w:sz w:val="24"/><w:szCs w:val="24"/><w:lang w:eastAsia="es-ES"/><w14:ligatures w14:val="standardContextual"/></w:rPr></w:pPr><w:hyperlink w:anchor="_Toc236310421" w:history="1"><w:r><w:rPr><w:rStyle w:val="Hipervnculo"/><w:noProof/></w:rPr><w:t>7.9.</w:t></w:r><w:r><w:rPr><w:rFonts w:asciiTheme="minorHAnsi" w:eastAsiaTheme="minorEastAsia" w:hAnsiTheme="minorHAnsi" w:cstheme="minorBidi"/><w:noProof/><w:kern w:val="2"/><w:sz w:val="24"/><w:szCs w:val="24"/><w:lang w:eastAsia="es-ES"/><w14:ligatures w14:val="standardContextual"/></w:rPr><w:tab/></w:r><w:r><w:rPr><w:rStyle w:val="Hipervnculo"/><w:noProof/></w:rPr><w:t>Estadísticas y utilidades</w:t></w:r><w:r><w:rPr><w:noProof/><w:webHidden/></w:rPr><w:tab/><w:fldChar w:fldCharType="begin"/><w:instrText xml:space="preserve"> PAGEREF _Toc236310421 \h </w:instrText><w:fldChar w:fldCharType="separate"/><w:t>11</w:t><w:fldChar w:fldCharType="end"/></w:r></w:hyperlink></w:p><w:p><w:pPr><w:pStyle w:val="TDC1"/><w:rPr><w:rFonts w:asciiTheme="minorHAnsi" w:eastAsiaTheme="minorEastAsia" w:hAnsiTheme="minorHAnsi" w:cstheme="minorBidi"/><w:kern w:val="2"/><w:sz w:val="24"/><w:szCs w:val="24"/><w:lang w:eastAsia="es-ES"/><w14:ligatures w14:val="standardContextual"/></w:rPr></w:pPr><w:hyperlink w:anchor="_Toc236310422" w:history="1"><w:r><w:rPr><w:rStyle w:val="Hipervnculo"/></w:rPr><w:t>8.</w:t></w:r><w:r><w:rPr><w:rFonts w:asciiTheme="minorHAnsi" w:eastAsiaTheme="minorEastAsia" w:hAnsiTheme="minorHAnsi" w:cstheme="minorBidi"/><w:kern w:val="2"/><w:sz w:val="24"/><w:szCs w:val="24"/><w:lang w:eastAsia="es-ES"/><w14:ligatures w14:val="standardContextual"/></w:rPr><w:tab/></w:r><w:r><w:rPr><w:rStyle w:val="Hipervnculo"/></w:rPr><w:t>Servidor MCP — orchestrator-workspace</w:t></w:r><w:r><w:rPr><w:webHidden/></w:rPr><w:tab/><w:fldChar w:fldCharType="begin"/><w:instrText xml:space="preserve"> PAGEREF _Toc236310422 \h </w:instrText><w:fldChar w:fldCharType="separate"/><w:t>11</w:t><w:fldChar w:fldCharType="end"/></w:r></w:hyperlink></w:p><w:p><w:pPr><w:pStyle w:val="TDC2"/><w:tabs><w:tab w:val="left" w:pos="880"/><w:tab w:val="right" w:leader="dot" w:pos="9060"/></w:tabs><w:rPr><w:rFonts w:asciiTheme="minorHAnsi" w:eastAsiaTheme="minorEastAsia" w:hAnsiTheme="minorHAnsi" w:cstheme="minorBidi"/><w:noProof/><w:kern w:val="2"/><w:sz w:val="24"/><w:szCs w:val="24"/><w:lang w:eastAsia="es-ES"/><w14:ligatures w14:val="standardContextual"/></w:rPr></w:pPr><w:hyperlink w:anchor="_Toc236310423" w:history="1"><w:r><w:rPr><w:rStyle w:val="Hipervnculo"/><w:noProof/></w:rPr><w:t>8.1.</w:t></w:r><w:r><w:rPr><w:rFonts w:asciiTheme="minorHAnsi" w:eastAsiaTheme="minorEastAsia" w:hAnsiTheme="minorHAnsi" w:cstheme="minorBidi"/><w:noProof/><w:kern w:val="2"/><w:sz w:val="24"/><w:szCs w:val="24"/><w:lang w:eastAsia="es-ES"/><w14:ligatures w14:val="standardContextual"/></w:rPr><w:tab/></w:r><w:r><w:rPr><w:rStyle w:val="Hipervnculo"/><w:noProof/></w:rPr><w:t>Herramientas disponibles</w:t></w:r><w:r><w:rPr><w:noProof/><w:webHidden/></w:rPr><w:tab/><w:fldChar w:fldCharType="begin"/><w:instrText xml:space="preserve"> PAGEREF _Toc236310423 \h </w:instrText><w:fldChar w:fldCharType="separate"/><w:t>11</w:t><w:fldChar w:fldCharType="end"/></w:r></w:hyperlink></w:p><w:p><w:pPr><w:pStyle w:val="TDC1"/><w:rPr><w:rFonts w:asciiTheme="minorHAnsi" w:eastAsiaTheme="minorEastAsia" w:hAnsiTheme="minorHAnsi" w:cstheme="minorBidi"/><w:kern w:val="2"/><w:sz w:val="24"/><w:szCs w:val="24"/><w:lang w:eastAsia="es-ES"/><w14:ligatures w14:val="standardContextual"/></w:rPr></w:pPr><w:hyperlink w:anchor="_Toc236310424" w:history="1"><w:r><w:rPr><w:rStyle w:val="Hipervnculo"/></w:rPr><w:t>9.</w:t></w:r><w:r><w:rPr><w:rFonts w:asciiTheme="minorHAnsi" w:eastAsiaTheme="minorEastAsia" w:hAnsiTheme="minorHAnsi" w:cstheme="minorBidi"/><w:kern w:val="2"/><w:sz w:val="24"/><w:szCs w:val="24"/><w:lang w:eastAsia="es-ES"/><w14:ligatures w14:val="standardContextual"/></w:rPr><w:tab/></w:r><w:r><w:rPr><w:rStyle w:val="Hipervnculo"/></w:rPr><w:t>Arquitectura ScacsWeb asumida</w:t></w:r><w:r><w:rPr><w:webHidden/></w:rPr><w:tab/><w:fldChar w:fldCharType="begin"/><w:instrText xml:space="preserve"> PAGEREF _Toc236310424 \h </w:instrText><w:fldChar w:fldCharType="separate"/><w:t>13</w:t><w:fldChar w:fldCharType="end"/></w:r></w:hyperlink></w:p><w:p><w:pPr><w:pStyle w:val="TDC2"/><w:tabs><w:tab w:val="left" w:pos="880"/><w:tab w:val="right" w:leader="dot" w:pos="9060"/></w:tabs><w:rPr><w:rFonts w:asciiTheme="minorHAnsi" w:eastAsiaTheme="minorEastAsia" w:hAnsiTheme="minorHAnsi" w:cstheme="minorBidi"/><w:noProof/><w:kern w:val="2"/><w:sz w:val="24"/><w:szCs w:val="24"/><w:lang w:eastAsia="es-ES"/><w14:ligatures w14:val="standardContextual"/></w:rPr></w:pPr><w:hyperlink w:anchor="_Toc236310425" w:history="1"><w:r><w:rPr><w:rStyle w:val="Hipervnculo"/><w:noProof/></w:rPr><w:t>9.1.</w:t></w:r><w:r><w:rPr><w:rFonts w:asciiTheme="minorHAnsi" w:eastAsiaTheme="minorEastAsia" w:hAnsiTheme="minorHAnsi" w:cstheme="minorBidi"/><w:noProof/><w:kern w:val="2"/><w:sz w:val="24"/><w:szCs w:val="24"/><w:lang w:eastAsia="es-ES"/><w14:ligatures w14:val="standardContextual"/></w:rPr><w:tab/></w:r><w:r><w:rPr><w:rStyle w:val="Hipervnculo"/><w:noProof/></w:rPr><w:t>Estructura de carpetas</w:t></w:r><w:r><w:rPr><w:noProof/><w:webHidden/></w:rPr><w:tab/><w:fldChar w:fldCharType="begin"/><w:instrText xml:space="preserve"> PAGEREF _Toc236310425 \h </w:instrText><w:fldChar w:fldCharType="separate"/><w:t>13</w:t><w:fldChar w:fldCharType="end"/></w:r></w:hyperlink></w:p><w:p><w:pPr><w:pStyle w:val="TDC2"/><w:tabs><w:tab w:val="left" w:pos="880"/><w:tab w:val="right" w:leader="dot" w:pos="9060"/></w:tabs><w:rPr><w:rFonts w:asciiTheme="minorHAnsi" w:eastAsiaTheme="minorEastAsia" w:hAnsiTheme="minorHAnsi" w:cstheme="minorBidi"/><w:noProof/><w:kern w:val="2"/><w:sz w:val="24"/><w:szCs w:val="24"/><w:lang w:eastAsia="es-ES"/><w14:ligatures w14:val="standardContextual"/></w:rPr></w:pPr><w:hyperlink w:anchor="_Toc236310426" w:history="1"><w:r><w:rPr><w:rStyle w:val="Hipervnculo"/><w:noProof/></w:rPr><w:t>9.2.</w:t></w:r><w:r><w:rPr><w:rFonts w:asciiTheme="minorHAnsi" w:eastAsiaTheme="minorEastAsia" w:hAnsiTheme="minorHAnsi" w:cstheme="minorBidi"/><w:noProof/><w:kern w:val="2"/><w:sz w:val="24"/><w:szCs w:val="24"/><w:lang w:eastAsia="es-ES"/><w14:ligatures w14:val="standardContextual"/></w:rPr><w:tab/></w:r><w:r><w:rPr><w:rStyle w:val="Hipervnculo"/><w:noProof/></w:rPr><w:t>Convenciones</w:t></w:r><w:r><w:rPr><w:noProof/><w:webHidden/></w:rPr><w:tab/><w:fldChar w:fldCharType="begin"/><w:instrText xml:space="preserve"> PAGEREF _Toc236310426 \h </w:instrText><w:fldChar w:fldCharType="separate"/><w:t>13</w:t><w:fldChar w:fldCharType="end"/></w:r></w:hyperlink></w:p><w:p><w:pPr><w:pStyle w:val="TDC1"/><w:rPr><w:rFonts w:asciiTheme="minorHAnsi" w:eastAsiaTheme="minorEastAsia" w:hAnsiTheme="minorHAnsi" w:cstheme="minorBidi"/><w:kern w:val="2"/><w:sz w:val="24"/><w:szCs w:val="24"/><w:lang w:eastAsia="es-ES"/><w14:ligatures w14:val="standardContextual"/></w:rPr></w:pPr><w:hyperlink w:anchor="_Toc236310427" w:history="1"><w:r><w:rPr><w:rStyle w:val="Hipervnculo"/></w:rPr><w:t>10.</w:t></w:r><w:r><w:rPr><w:rFonts w:asciiTheme="minorHAnsi" w:eastAsiaTheme="minorEastAsia" w:hAnsiTheme="minorHAnsi" w:cstheme="minorBidi"/><w:kern w:val="2"/><w:sz w:val="24"/><w:szCs w:val="24"/><w:lang w:eastAsia="es-ES"/><w14:ligatures w14:val="standardContextual"/></w:rPr><w:tab/></w:r><w:r><w:rPr><w:rStyle w:val="Hipervnculo"/></w:rPr><w:t>Flujo de trabajo típico</w:t></w:r><w:r><w:rPr><w:webHidden/></w:rPr><w:tab/><w:fldChar w:fldCharType="begin"/><w:instrText xml:space="preserve"> PAGEREF _Toc236310427 \h </w:instrText><w:fldChar w:fldCharType="separate"/><w:t>13</w:t><w:fldChar w:fldCharType="end"/></w:r></w:hyperlink></w:p><w:p><w:pPr><w:pStyle w:val="TDC1"/><w:rPr><w:rFonts w:asciiTheme="minorHAnsi" w:eastAsiaTheme="minorEastAsia" w:hAnsiTheme="minorHAnsi" w:cstheme="minorBidi"/><w:kern w:val="2"/><w:sz w:val="24"/><w:szCs w:val="24"/><w:lang w:eastAsia="es-ES"/><w14:ligatures w14:val="standardContextual"/></w:rPr></w:pPr><w:hyperlink w:anchor="_Toc236310428" w:history="1"><w:r><w:rPr><w:rStyle w:val="Hipervnculo"/></w:rPr><w:t>11.</w:t></w:r><w:r><w:rPr><w:rFonts w:asciiTheme="minorHAnsi" w:eastAsiaTheme="minorEastAsia" w:hAnsiTheme="minorHAnsi" w:cstheme="minorBidi"/><w:kern w:val="2"/><w:sz w:val="24"/><w:szCs w:val="24"/><w:lang w:eastAsia="es-ES"/><w14:ligatures w14:val="standardContextual"/></w:rPr><w:tab/></w:r><w:r><w:rPr><w:rStyle w:val="Hipervnculo"/></w:rPr><w:t>Preguntas frecuentes</w:t></w:r><w:r><w:rPr><w:webHidden/></w:rPr><w:tab/><w:fldChar w:fldCharType="begin"/><w:instrText xml:space="preserve"> PAGEREF _Toc236310428 \h </w:instrText><w:fldChar w:fldCharType="separate"/><w:t>14</w:t><w:fldChar w:fldCharType="end"/></w:r></w:hyperlink></w:p><w:p><w:pPr><w:pStyle w:val="TDC2"/><w:tabs><w:tab w:val="left" w:pos="880"/><w:tab w:val="right" w:leader="dot" w:pos="9060"/></w:tabs><w:rPr><w:rFonts w:asciiTheme="minorHAnsi" w:eastAsiaTheme="minorEastAsia" w:hAnsiTheme="minorHAnsi" w:cstheme="minorBidi"/><w:noProof/><w:kern w:val="2"/><w:sz w:val="24"/><w:szCs w:val="24"/><w:lang w:eastAsia="es-ES"/><w14:ligatures w14:val="standardContextual"/></w:rPr></w:pPr><w:hyperlink w:anchor="_Toc236310429" w:history="1"><w:r><w:rPr><w:rStyle w:val="Hipervnculo"/><w:noProof/></w:rPr><w:t>11.1.</w:t></w:r><w:r><w:rPr><w:rFonts w:asciiTheme="minorHAnsi" w:eastAsiaTheme="minorEastAsia" w:hAnsiTheme="minorHAnsi" w:cstheme="minorBidi"/><w:noProof/><w:kern w:val="2"/><w:sz w:val="24"/><w:szCs w:val="24"/><w:lang w:eastAsia="es-ES"/><w14:ligatures w14:val="standardContextual"/></w:rPr><w:tab/></w:r><w:r><w:rPr><w:rStyle w:val="Hipervnculo"/><w:noProof/></w:rPr><w:t>¿El servidor MCP consume recursos en segundo plano?</w:t></w:r><w:r><w:rPr><w:noProof/><w:webHidden/></w:rPr><w:tab/><w:fldChar w:fldCharType="begin"/><w:instrText xml:space="preserve"> PAGEREF _Toc236310429 \h </w:instrText><w:fldChar w:fldCharType="separate"/><w:t>14</w:t><w:fldChar w:fldCharType="end"/></w:r></w:hyperlink></w:p><w:p><w:pPr><w:pStyle w:val="TDC2"/><w:tabs><w:tab w:val="left" w:pos="880"/><w:tab w:val="right" w:leader="dot" w:pos="9060"/></w:tabs><w:rPr><w:rFonts w:asciiTheme="minorHAnsi" w:eastAsiaTheme="minorEastAsia" w:hAnsiTheme="minorHAnsi" w:cstheme="minorBidi"/><w:noProof/><w:kern w:val="2"/><w:sz w:val="24"/><w:szCs w:val="24"/><w:lang w:eastAsia="es-ES"/><w14:ligatures w14:val="standardContextual"/></w:rPr></w:pPr><w:hyperlink w:anchor="_Toc236310430" w:history="1"><w:r><w:rPr><w:rStyle w:val="Hipervnculo"/><w:noProof/></w:rPr><w:t>11.2.</w:t></w:r><w:r><w:rPr><w:rFonts w:asciiTheme="minorHAnsi" w:eastAsiaTheme="minorEastAsia" w:hAnsiTheme="minorHAnsi" w:cstheme="minorBidi"/><w:noProof/><w:kern w:val="2"/><w:sz w:val="24"/><w:szCs w:val="24"/><w:lang w:eastAsia="es-ES"/><w14:ligatures w14:val="standardContextual"/></w:rPr><w:tab/></w:r><w:r><w:rPr><w:rStyle w:val="Hipervnculo"/><w:noProof/></w:rPr><w:t>¿Puedo usar el plugin en proyectos que no son ScacsWeb?</w:t></w:r><w:r><w:rPr><w:noProof/><w:webHidden/></w:rPr><w:tab/><w:fldChar w:fldCharType="begin"/><w:instrText xml:space="preserve"> PAGEREF _Toc236310430 \h </w:instrText><w:fldChar w:fldCharType="separate"/><w:t>14</w:t><w:fldChar w:fldCharType="end"/></w:r></w:hyperlink></w:p><w:p><w:pPr><w:pStyle w:val="TDC2"/><w:tabs><w:tab w:val="left" w:pos="880"/><w:tab w:val="right" w:leader="dot" w:pos="9060"/></w:tabs><w:rPr><w:rFonts w:asciiTheme="minorHAnsi" w:eastAsiaTheme="minorEastAsia" w:hAnsiTheme="minorHAnsi" w:cstheme="minorBidi"/><w:noProof/><w:kern w:val="2"/><w:sz w:val="24"/><w:szCs w:val="24"/><w:lang w:eastAsia="es-ES"/><w14:ligatures w14:val="standardContextual"/></w:rPr></w:pPr><w:hyperlink w:anchor="_Toc236310431" w:history="1"><w:r><w:rPr><w:rStyle w:val="Hipervnculo"/><w:noProof/></w:rPr><w:t>11.3.</w:t></w:r><w:r><w:rPr><w:rFonts w:asciiTheme="minorHAnsi" w:eastAsiaTheme="minorEastAsia" w:hAnsiTheme="minorHAnsi" w:cstheme="minorBidi"/><w:noProof/><w:kern w:val="2"/><w:sz w:val="24"/><w:szCs w:val="24"/><w:lang w:eastAsia="es-ES"/><w14:ligatures w14:val="standardContextual"/></w:rPr><w:tab/></w:r><w:r><w:rPr><w:rStyle w:val="Hipervnculo"/><w:noProof/></w:rPr><w:t>¿El plugin accede a Internet?</w:t></w:r><w:r><w:rPr><w:noProof/><w:webHidden/></w:rPr><w:tab/><w:fldChar w:fldCharType="begin"/><w:instrText xml:space="preserve"> PAGEREF _Toc236310431 \h </w:instrText><w:fldChar w:fldCharType="separate"/><w:t>14</w:t><w:fldChar w:fldCharType="end"/></w:r></w:hyperlink></w:p><w:p><w:pPr><w:pStyle w:val="TDC1"/><w:rPr><w:rFonts w:asciiTheme="minorHAnsi" w:eastAsiaTheme="minorEastAsia" w:hAnsiTheme="minorHAnsi" w:cstheme="minorBidi"/><w:kern w:val="2"/><w:sz w:val="24"/><w:szCs w:val="24"/><w:lang w:eastAsia="es-ES"/><w14:ligatures w14:val="standardContextual"/></w:rPr></w:pPr><w:hyperlink w:anchor="_Toc236310432" w:history="1"><w:r><w:rPr><w:rStyle w:val="Hipervnculo"/></w:rPr><w:t>12.</w:t></w:r><w:r><w:rPr><w:rFonts w:asciiTheme="minorHAnsi" w:eastAsiaTheme="minorEastAsia" w:hAnsiTheme="minorHAnsi" w:cstheme="minorBidi"/><w:kern w:val="2"/><w:sz w:val="24"/><w:szCs w:val="24"/><w:lang w:eastAsia="es-ES"/><w14:ligatures w14:val="standardContextual"/></w:rPr><w:tab/></w:r><w:r><w:rPr><w:rStyle w:val="Hipervnculo"/></w:rPr><w:t>Soporte</w:t></w:r><w:r><w:rPr><w:webHidden/></w:rPr><w:tab/><w:fldChar w:fldCharType="begin"/><w:instrText xml:space="preserve"> PAGEREF _Toc236310432 \h </w:instrText><w:fldChar w:fldCharType="separate"/><w:t>14</w:t><w:fldChar w:fldCharType="end"/></w:r></w:hyperlink></w:p><w:p><w:pPr><w:pStyle w:val="TDC1"/></w:pPr><w:r><w:fldChar w:fldCharType="end"/></w:r></w:p><w:p/><w:p><w:pPr><w:sectPr><w:headerReference w:type="first" r:id="rId17"/><w:pgSz w:w="11906" w:h="16838"/><w:pgMar w:top="0" w:right="1418" w:bottom="1418" w:left="1418" w:header="1531" w:footer="1021" w:gutter="0"/><w:cols w:space="720"/></w:sectPr></w:pPr></w:p><w:p><w:pPr><w:pStyle w:val="Ttulo1"/></w:pPr><w:bookmarkStart w:id="1" w:name="_Toc236310404"/><w:r><w:lastRenderedPageBreak/><w:t>¿Qué hace este plugin?</w:t></w:r><w:bookmarkEnd w:id="1"/></w:p><w:p><w:r><w:t>El plugin Orchestrator Skill Full extiende Claude Code con 41 comandos de barra (/orchestrator-*) y un servidor MCP local (orchestrator-workspace) que conecta Claude con las herramientas nativas del proyecto: compilador .NET, SVN/Git, Oracle/SQL Server y el modelo de base de datos en JSON.</w:t></w:r></w:p><w:p/><w:p><w:r><w:t>Está diseñado específicamente para proyectos ScacsWeb (ASP.NET WebForms / .NET Framework 4.0 / C# 7.3) y proporciona un pipeline completo de desarrollo asistido por IA: análisis, implementación, validación, build y gestión de modelo de base de datos, con soporte SVN y Oracle/SQL Server.</w:t></w:r></w:p><w:p/><w:p><w:pPr><w:pStyle w:val="Ttulo2"/></w:pPr><w:bookmarkStart w:id="2" w:name="_Toc236310405"/><w:r><w:t>Valor principal</w:t></w:r><w:bookmarkEnd w:id="2"/></w:p><w:tbl><w:tblPr><w:tblStyle w:val="a"/><w:tblW w:w="9578" w:type="dxa"/><w:jc w:val="center"/><w:tblBorders><w:top w:val="single" w:sz="4" w:space="0" w:color="DDDDDD"/><w:left w:val="single" w:sz="4" w:space="0" w:color="DDDDDD"/><w:bottom w:val="single" w:sz="4" w:space="0" w:color="DDDDDD"/><w:right w:val="single" w:sz="4" w:space="0" w:color="DDDDDD"/><w:insideH w:val="single" w:sz="4" w:space="0" w:color="DDDDDD"/><w:insideV w:val="single" w:sz="4" w:space="0" w:color="DDDDDD"/></w:tblBorders><w:tblLayout w:type="fixed"/><w:tblLook w:val="04A0" w:firstRow="1" w:lastRow="0" w:firstColumn="1" w:lastColumn="0" w:noHBand="0" w:noVBand="1"/></w:tblPr><w:tblGrid><w:gridCol w:w="4789"/><w:gridCol w:w="4789"/></w:tblGrid><w:tr><w:trPr><w:trHeight w:val="500"/><w:jc w:val="center"/></w:trPr><w:tc><w:tcPr><w:tcW w:w="4789" w:type="dxa"/><w:shd w:val="clear" w:color="auto" w:fill="00F7BC"/><w:vAlign w:val="center"/></w:tcPr><w:p><w:pPr><w:spacing w:line="240" w:lineRule="auto"/><w:jc w:val="left"/></w:pPr><w:r><w:rPr><w:b/><w:bCs/><w:color w:val="152A35"/></w:rPr><w:t>SIN EL PLUGIN</w:t></w:r></w:p></w:tc><w:tc><w:tcPr><w:tcW w:w="4789" w:type="dxa"/><w:shd w:val="clear" w:color="auto" w:fill="00F7BC"/><w:vAlign w:val="center"/></w:tcPr><w:p><w:pPr><w:spacing w:line="240" w:lineRule="auto"/><w:jc w:val="left"/></w:pPr><w:r><w:rPr><w:b/><w:bCs/><w:color w:val="152A35"/></w:rPr><w:t>CON EL PLUGIN</w:t></w:r></w:p></w:tc></w:tr><w:tr><w:trPr><w:trHeight w:val="500"/><w:jc w:val="center"/></w:trPr><w:tc><w:tcPr><w:tcW w:w="4789" w:type="dxa"/><w:shd w:val="clear" w:color="auto" w:fill="FFFFFF"/><w:vAlign w:val="center"/></w:tcPr><w:p><w:pPr><w:spacing w:line="240" w:lineRule="auto"/><w:jc w:val="left"/></w:pPr><w:r><w:rPr><w:color w:val="152A35"/></w:rPr><w:t>Claude no conoce la estructura ScacsWeb</w:t></w:r></w:p></w:tc><w:tc><w:tcPr><w:tcW w:w="4789" w:type="dxa"/><w:shd w:val="clear" w:color="auto" w:fill="FFFFFF"/><w:vAlign w:val="center"/></w:tcPr><w:p><w:pPr><w:spacing w:line="240" w:lineRule="auto"/><w:jc w:val="left"/></w:pPr><w:r><w:rPr><w:color w:val="152A35"/></w:rPr><w:t>Entiende BPC + BE + DALC, capas, rutas AIS</w:t></w:r></w:p></w:tc></w:tr><w:tr><w:trPr><w:trHeight w:val="500"/><w:jc w:val="center"/></w:trPr><w:tc><w:tcPr><w:tcW w:w="4789" w:type="dxa"/><w:shd w:val="clear" w:color="auto" w:fill="F0F0F0"/><w:vAlign w:val="center"/></w:tcPr><w:p><w:pPr><w:spacing w:line="240" w:lineRule="auto"/><w:jc w:val="left"/></w:pPr><w:r><w:rPr><w:color w:val="152A35"/></w:rPr><w:t>Sin acceso a la base de datos</w:t></w:r></w:p></w:tc><w:tc><w:tcPr><w:tcW w:w="4789" w:type="dxa"/><w:shd w:val="clear" w:color="auto" w:fill="F0F0F0"/><w:vAlign w:val="center"/></w:tcPr><w:p><w:pPr><w:spacing w:line="240" w:lineRule="auto"/><w:jc w:val="left"/></w:pPr><w:r><w:rPr><w:color w:val="152A35"/></w:rPr><w:t>Consulta Oracle/SQL Server vía XMLConfig.xml</w:t></w:r></w:p></w:tc></w:tr><w:tr><w:trPr><w:trHeight w:val="500"/><w:jc w:val="center"/></w:trPr><w:tc><w:tcPr><w:tcW w:w="4789" w:type="dxa"/><w:shd w:val="clear" w:color="auto" w:fill="FFFFFF"/><w:vAlign w:val="center"/></w:tcPr><w:p><w:pPr><w:spacing w:line="240" w:lineRule="auto"/><w:jc w:val="left"/></w:pPr><w:r><w:rPr><w:color w:val="152A35"/></w:rPr><w:t>Sin acceso a SVN</w:t></w:r></w:p></w:tc><w:tc><w:tcPr><w:tcW w:w="4789" w:type="dxa"/><w:shd w:val="clear" w:color="auto" w:fill="FFFFFF"/><w:vAlign w:val="center"/></w:tcPr><w:p><w:pPr><w:spacing w:line="240" w:lineRule="auto"/><w:jc w:val="left"/></w:pPr><w:r><w:rPr><w:color w:val="152A35"/></w:rPr><w:t>Lee diff, log y estado SVN/Git</w:t></w:r></w:p></w:tc></w:tr><w:tr><w:trPr><w:trHeight w:val="500"/><w:jc w:val="center"/></w:trPr><w:tc><w:tcPr><w:tcW w:w="4789" w:type="dxa"/><w:shd w:val="clear" w:color="auto" w:fill="F0F0F0"/><w:vAlign w:val="center"/></w:tcPr><w:p><w:pPr><w:spacing w:line="240" w:lineRule="auto"/><w:jc w:val="left"/></w:pPr><w:r><w:rPr><w:color w:val="152A35"/></w:rPr><w:t>Sin compilador</w:t></w:r></w:p></w:tc><w:tc><w:tcPr><w:tcW w:w="4789" w:type="dxa"/><w:shd w:val="clear" w:color="auto" w:fill="F0F0F0"/><w:vAlign w:val="center"/></w:tcPr><w:p><w:pPr><w:spacing w:line="240" w:lineRule="auto"/><w:jc w:val="left"/></w:pPr><w:r><w:rPr><w:color w:val="152A35"/></w:rPr><w:t>Invoca MSBuild y valida errores</w:t></w:r></w:p></w:tc></w:tr><w:tr><w:trPr><w:trHeight w:val="500"/><w:jc w:val="center"/></w:trPr><w:tc><w:tcPr><w:tcW w:w="4789" w:type="dxa"/><w:shd w:val="clear" w:color="auto" w:fill="FFFFFF"/><w:vAlign w:val="center"/></w:tcPr><w:p><w:pPr><w:spacing w:line="240" w:lineRule="auto"/><w:jc w:val="left"/></w:pPr><w:r><w:rPr><w:color w:val="152A35"/></w:rPr><w:t>Sin modelo de BD</w:t></w:r></w:p></w:tc><w:tc><w:tcPr><w:tcW w:w="4789" w:type="dxa"/><w:shd w:val="clear" w:color="auto" w:fill="FFFFFF"/><w:vAlign w:val="center"/></w:tcPr><w:p><w:pPr><w:spacing w:line="240" w:lineRule="auto"/><w:jc w:val="left"/></w:pPr><w:r><w:rPr><w:color w:val="152A35"/></w:rPr><w:t>Compara modelo JSON local vs esquema real</w:t></w:r></w:p></w:tc></w:tr><w:tr w14:paraId="BB0004010"><w:trPr><w:trHeight w:val="500"/><w:jc w:val="center"/></w:trPr><w:tc><w:tcPr><w:tcW w:w="4789" w:type="dxa"/><w:shd w:val="clear" w:color="auto" w:fill="F0F0F0"/><w:vAlign w:val="center"/></w:tcPr><w:p><w:pPr><w:spacing w:line="240" w:lineRule="auto"/><w:jc w:val="left"/></w:pPr><w:r><w:rPr><w:color w:val="152A35"/></w:rPr><w:t xml:space="preserve">Contexto BBDD en skill externo</w:t></w:r></w:p></w:tc><w:tc><w:tcPr><w:tcW w:w="4789" w:type="dxa"/><w:shd w:val="clear" w:color="auto" w:fill="F0F0F0"/><w:vAlign w:val="center"/></w:tcPr><w:p><w:pPr><w:spacing w:line="240" w:lineRule="auto"/><w:jc w:val="left"/></w:pPr><w:r><w:rPr><w:color w:val="152A35"/></w:rPr><w:t xml:space="preserve">Contexto BBDD integrado en el plugin (env.json)</w:t></w:r></w:p></w:tc></w:tr></w:tbl><w:p/><w:p><w:pPr><w:pStyle w:val="Ttulo1"/></w:pPr><w:bookmarkStart w:id="3" w:name="_Toc236310406"/><w:r><w:t>Prerrequisitos</w:t></w:r><w:bookmarkEnd w:id="3"/></w:p><w:tbl><w:tblPr><w:tblStyle w:val="a"/><w:tblW w:w="9578" w:type="dxa"/><w:jc w:val="center"/><w:tblBorders><w:top w:val="single" w:sz="4" w:space="0" w:color="DDDDDD"/><w:left w:val="single" w:sz="4" w:space="0" w:color="DDDDDD"/><w:bottom w:val="single" w:sz="4" w:space="0" w:color="DDDDDD"/><w:right w:val="single" w:sz="4" w:space="0" w:color="DDDDDD"/><w:insideH w:val="single" w:sz="4" w:space="0" w:color="DDDDDD"/><w:insideV w:val="single" w:sz="4" w:space="0" w:color="DDDDDD"/></w:tblBorders><w:tblLayout w:type="fixed"/><w:tblLook w:val="04A0" w:firstRow="1" w:lastRow="0" w:firstColumn="1" w:lastColumn="0" w:noHBand="0" w:noVBand="1"/></w:tblPr><w:tblGrid><w:gridCol w:w="2500"/><w:gridCol w:w="3000"/><w:gridCol w:w="4078"/></w:tblGrid><w:tr><w:trPr><w:trHeight w:val="500"/><w:jc w:val="center"/></w:trPr><w:tc><w:tcPr><w:tcW w:w="2500" w:type="dxa"/><w:shd w:val="clear" w:color="auto" w:fill="00F7BC"/><w:vAlign w:val="center"/></w:tcPr><w:p><w:pPr><w:spacing w:line="240" w:lineRule="auto"/><w:jc w:val="left"/></w:pPr><w:r><w:rPr><w:b/><w:bCs/><w:color w:val="152A35"/></w:rPr><w:t>REQUISITO</w:t></w:r></w:p></w:tc><w:tc><w:tcPr><w:tcW w:w="3000" w:type="dxa"/><w:shd w:val="clear" w:color="auto" w:fill="00F7BC"/><w:vAlign w:val="center"/></w:tcPr><w:p><w:pPr><w:spacing w:line="240" w:lineRule="auto"/><w:jc w:val="left"/></w:pPr><w:r><w:rPr><w:b/><w:bCs/><w:color w:val="152A35"/></w:rPr><w:t>VERSIÓN MÍNIMA</w:t></w:r></w:p></w:tc><w:tc><w:tcPr><w:tcW w:w="4078" w:type="dxa"/><w:shd w:val="clear" w:color="auto" w:fill="00F7BC"/><w:vAlign w:val="center"/></w:tcPr><w:p><w:pPr><w:spacing w:line="240" w:lineRule="auto"/><w:jc w:val="left"/></w:pPr><w:r><w:rPr><w:b/><w:bCs/><w:color w:val="152A35"/></w:rPr><w:t>CÓMO VERIFICAR</w:t></w:r></w:p></w:tc></w:tr><w:tr><w:trPr><w:trHeight w:val="500"/><w:jc w:val="center"/></w:trPr><w:tc><w:tcPr><w:tcW w:w="2500" w:type="dxa"/><w:shd w:val="clear" w:color="auto" w:fill="FFFFFF"/><w:vAlign w:val="center"/></w:tcPr><w:p><w:pPr><w:spacing w:line="240" w:lineRule="auto"/><w:jc w:val="left"/></w:pPr><w:r><w:rPr><w:color w:val="152A35"/></w:rPr><w:t>Claude Code</w:t></w:r></w:p></w:tc><w:tc><w:tcPr><w:tcW w:w="3000" w:type="dxa"/><w:shd w:val="clear" w:color="auto" w:fill="FFFFFF"/><w:vAlign w:val="center"/></w:tcPr><w:p><w:pPr><w:spacing w:line="240" w:lineRule="auto"/><w:jc w:val="left"/></w:pPr><w:r><w:rPr><w:color w:val="152A35"/></w:rPr><w:t>Última disponible</w:t></w:r></w:p></w:tc><w:tc><w:tcPr><w:tcW w:w="4078" w:type="dxa"/><w:shd w:val="clear" w:color="auto" w:fill="FFFFFF"/><w:vAlign w:val="center"/></w:tcPr><w:p><w:pPr><w:spacing w:line="240" w:lineRule="auto"/><w:jc w:val="left"/></w:pPr><w:r><w:rPr><w:color w:val="152A35"/></w:rPr><w:t>claude --version</w:t></w:r></w:p></w:tc></w:tr><w:tr><w:trPr><w:trHeight w:val="500"/><w:jc w:val="center"/></w:trPr><w:tc><w:tcPr><w:tcW w:w="2500" w:type="dxa"/><w:shd w:val="clear" w:color="auto" w:fill="F0F0F0"/><w:vAlign w:val="center"/></w:tcPr><w:p><w:pPr><w:spacing w:line="240" w:lineRule="auto"/><w:jc w:val="left"/></w:pPr><w:r><w:rPr><w:color w:val="152A35"/></w:rPr><w:t>Python</w:t></w:r></w:p></w:tc><w:tc><w:tcPr><w:tcW w:w="3000" w:type="dxa"/><w:shd w:val="clear" w:color="auto" w:fill="F0F0F0"/><w:vAlign w:val="center"/></w:tcPr><w:p><w:pPr><w:spacing w:line="240" w:lineRule="auto"/><w:jc w:val="left"/></w:pPr><w:r><w:rPr><w:color w:val="152A35"/></w:rPr><w:t>3.9 o superior</w:t></w:r></w:p></w:tc><w:tc><w:tcPr><w:tcW w:w="4078" w:type="dxa"/><w:shd w:val="clear" w:color="auto" w:fill="F0F0F0"/><w:vAlign w:val="center"/></w:tcPr><w:p><w:pPr><w:spacing w:line="240" w:lineRule="auto"/><w:jc w:val="left"/></w:pPr><w:r><w:rPr><w:color w:val="152A35"/></w:rPr><w:t>python --version</w:t></w:r></w:p></w:tc></w:tr><w:tr><w:trPr><w:trHeight w:val="500"/><w:jc w:val="center"/></w:trPr><w:tc><w:tcPr><w:tcW w:w="2500" w:type="dxa"/><w:shd w:val="clear" w:color="auto" w:fill="FFFFFF"/><w:vAlign w:val="center"/></w:tcPr><w:p><w:pPr><w:spacing w:line="240" w:lineRule="auto"/><w:jc w:val="left"/></w:pPr><w:r><w:rPr><w:color w:val="152A35"/></w:rPr><w:lastRenderedPageBreak/><w:t>Git</w:t></w:r></w:p></w:tc><w:tc><w:tcPr><w:tcW w:w="3000" w:type="dxa"/><w:shd w:val="clear" w:color="auto" w:fill="FFFFFF"/><w:vAlign w:val="center"/></w:tcPr><w:p><w:pPr><w:spacing w:line="240" w:lineRule="auto"/><w:jc w:val="left"/></w:pPr><w:r><w:rPr><w:color w:val="152A35"/></w:rPr><w:t>Cualquier versión reciente</w:t></w:r></w:p></w:tc><w:tc><w:tcPr><w:tcW w:w="4078" w:type="dxa"/><w:shd w:val="clear" w:color="auto" w:fill="FFFFFF"/><w:vAlign w:val="center"/></w:tcPr><w:p><w:pPr><w:spacing w:line="240" w:lineRule="auto"/><w:jc w:val="left"/></w:pPr><w:r><w:rPr><w:color w:val="152A35"/></w:rPr><w:t>git --version</w:t></w:r></w:p></w:tc></w:tr><w:tr><w:trPr><w:trHeight w:val="500"/><w:jc w:val="center"/></w:trPr><w:tc><w:tcPr><w:tcW w:w="2500" w:type="dxa"/><w:shd w:val="clear" w:color="auto" w:fill="F0F0F0"/><w:vAlign w:val="center"/></w:tcPr><w:p><w:pPr><w:spacing w:line="240" w:lineRule="auto"/><w:jc w:val="left"/></w:pPr><w:r><w:rPr><w:color w:val="152A35"/></w:rPr><w:t>PowerShell</w:t></w:r></w:p></w:tc><w:tc><w:tcPr><w:tcW w:w="3000" w:type="dxa"/><w:shd w:val="clear" w:color="auto" w:fill="F0F0F0"/><w:vAlign w:val="center"/></w:tcPr><w:p><w:pPr><w:spacing w:line="240" w:lineRule="auto"/><w:jc w:val="left"/></w:pPr><w:r><w:rPr><w:color w:val="152A35"/></w:rPr><w:t>5.1 (incluido en Windows 10/11)</w:t></w:r></w:p></w:tc><w:tc><w:tcPr><w:tcW w:w="4078" w:type="dxa"/><w:shd w:val="clear" w:color="auto" w:fill="F0F0F0"/><w:vAlign w:val="center"/></w:tcPr><w:p><w:pPr><w:spacing w:line="240" w:lineRule="auto"/><w:jc w:val="left"/></w:pPr><w:r><w:rPr><w:color w:val="152A35"/></w:rPr><w:t>—</w:t></w:r></w:p></w:tc></w:tr><w:tr><w:trPr><w:trHeight w:val="500"/><w:jc w:val="center"/></w:trPr><w:tc><w:tcPr><w:tcW w:w="2500" w:type="dxa"/><w:shd w:val="clear" w:color="auto" w:fill="FFFFFF"/><w:vAlign w:val="center"/></w:tcPr><w:p><w:pPr><w:spacing w:line="240" w:lineRule="auto"/><w:jc w:val="left"/></w:pPr><w:r><w:rPr><w:color w:val="152A35"/></w:rPr><w:t>SVN CLI</w:t></w:r></w:p></w:tc><w:tc><w:tcPr><w:tcW w:w="3000" w:type="dxa"/><w:shd w:val="clear" w:color="auto" w:fill="FFFFFF"/><w:vAlign w:val="center"/></w:tcPr><w:p><w:pPr><w:spacing w:line="240" w:lineRule="auto"/><w:jc w:val="left"/></w:pPr><w:r><w:rPr><w:color w:val="152A35"/></w:rPr><w:t>Opcional (comandos SVN)</w:t></w:r></w:p></w:tc><w:tc><w:tcPr><w:tcW w:w="4078" w:type="dxa"/><w:shd w:val="clear" w:color="auto" w:fill="FFFFFF"/><w:vAlign w:val="center"/></w:tcPr><w:p><w:pPr><w:spacing w:line="240" w:lineRule="auto"/><w:jc w:val="left"/></w:pPr><w:r><w:rPr><w:color w:val="152A35"/></w:rPr><w:t>svn --version</w:t></w:r></w:p></w:tc></w:tr><w:tr><w:trPr><w:trHeight w:val="500"/><w:jc w:val="center"/></w:trPr><w:tc><w:tcPr><w:tcW w:w="2500" w:type="dxa"/><w:shd w:val="clear" w:color="auto" w:fill="F0F0F0"/><w:vAlign w:val="center"/></w:tcPr><w:p><w:pPr><w:spacing w:line="240" w:lineRule="auto"/><w:jc w:val="left"/></w:pPr><w:r><w:rPr><w:color w:val="152A35"/></w:rPr><w:t>dotnet / MSBuild</w:t></w:r></w:p></w:tc><w:tc><w:tcPr><w:tcW w:w="3000" w:type="dxa"/><w:shd w:val="clear" w:color="auto" w:fill="F0F0F0"/><w:vAlign w:val="center"/></w:tcPr><w:p><w:pPr><w:spacing w:line="240" w:lineRule="auto"/><w:jc w:val="left"/></w:pPr><w:r><w:rPr><w:color w:val="152A35"/></w:rPr><w:t>.NET Framework 4.0+</w:t></w:r></w:p></w:tc><w:tc><w:tcPr><w:tcW w:w="4078" w:type="dxa"/><w:shd w:val="clear" w:color="auto" w:fill="F0F0F0"/><w:vAlign w:val="center"/></w:tcPr><w:p><w:pPr><w:spacing w:line="240" w:lineRule="auto"/><w:jc w:val="left"/></w:pPr><w:r><w:rPr><w:color w:val="152A35"/></w:rPr><w:t>dotnet --version</w:t></w:r></w:p></w:tc></w:tr></w:tbl><w:p/><w:p><w:pPr><w:pStyle w:val="Ttulo1"/></w:pPr><w:bookmarkStart w:id="4" w:name="_Toc236310407"/><w:r><w:t>Instalación desde Git</w:t></w:r><w:bookmarkEnd w:id="4"/></w:p><w:p><w:r><w:t>El plugin se instala directamente desde el repositorio Git con un único comando en Claude Code. No se requiere clonar el repositorio manualmente.</w:t></w:r></w:p><w:p><w:pPr><w:pStyle w:val="Ttulo2"/></w:pPr><w:bookmarkStart w:id="5" w:name="_Toc236310408"/><w:r><w:t>Paso 1 — Instalar el plugin en Claude Code</w:t></w:r><w:bookmarkEnd w:id="5"/></w:p><w:p><w:r><w:t>Abre Claude Code y ejecuta el siguiente comando de barra:</w:t></w:r></w:p><w:p><w:pPr><w:shd w:val="clear" w:color="auto" w:fill="F5F5F5"/><w:spacing w:after="0" w:line="240" w:lineRule="auto"/></w:pPr><w:r><w:rPr><w:rFonts w:ascii="Courier New" w:hAnsi="Courier New" w:cs="Courier New"/><w:color w:val="152A35"/><w:sz w:val="18"/><w:szCs w:val="18"/></w:rPr><w:t>/plugin install https://github.com/aisaplica/Orchestrator-Agent.git</w:t></w:r></w:p><w:p/><w:p><w:r><w:t>Claude Code clonará el repositorio e instalará el plugin y el servidor MCP automáticamente. Si la red corporativa requiere proxy o certificado SSL personalizado, configúralo en Git antes de ejecutar este comando.</w:t></w:r></w:p><w:p><w:pPr><w:pStyle w:val="Ttulo2"/></w:pPr><w:bookmarkStart w:id="6" w:name="_Toc236310409"/><w:r><w:t>Paso 2 — Instalar dependencias Python</w:t></w:r><w:bookmarkEnd w:id="6"/></w:p><w:p><w:r><w:t>Ejecutar una sola vez por máquina. Abre PowerShell en el directorio donde Claude Code instaló el plugin:</w:t></w:r></w:p><w:p><w:pPr><w:shd w:val="clear" w:color="auto" w:fill="F5F5F5"/><w:spacing w:after="0" w:line="240" w:lineRule="auto"/></w:pPr><w:r><w:rPr><w:rFonts w:ascii="Courier New" w:hAnsi="Courier New" w:cs="Courier New"/><w:color w:val="152A35"/><w:sz w:val="18"/><w:szCs w:val="18"/></w:rPr><w:t>cd C:\Users\&lt;tu-usuario&gt;\.claude\plugins\cache\aisaplica\orchestrator-skill-full\</w:t></w:r></w:p><w:p><w:pPr><w:shd w:val="clear" w:color="auto" w:fill="F5F5F5"/><w:spacing w:after="0" w:line="240" w:lineRule="auto"/></w:pPr><w:r><w:rPr><w:rFonts w:ascii="Courier New" w:hAnsi="Courier New" w:cs="Courier New"/><w:color w:val="152A35"/><w:sz w:val="18"/><w:szCs w:val="18"/></w:rPr><w:t>.\setup.ps1</w:t></w:r></w:p><w:p/><w:p><w:r><w:t>El script realiza automáticamente:</w:t></w:r></w:p><w:p><w:pPr><w:numPr><w:ilvl w:val="0"/><w:numId w:val="1"/></w:numPr><w:spacing w:after="60"/></w:pPr><w:r><w:t>Verifica que Python 3.9+ esté disponible</w:t></w:r></w:p><w:p><w:pPr><w:numPr><w:ilvl w:val="0"/><w:numId w:val="1"/></w:numPr><w:spacing w:after="60"/></w:pPr><w:r><w:t>Instala los paquetes mcp y fastmcp</w:t></w:r></w:p><w:p><w:pPr><w:numPr><w:ilvl w:val="0"/><w:numId w:val="1"/></w:numPr><w:spacing w:after="60"/></w:pPr><w:r><w:t>Configura el servidor MCP local</w:t></w:r></w:p><w:p/><w:p><w:pPr><w:pStyle w:val="Ttulo2"/></w:pPr><w:r><w:t>Paso 3 &#x2014; Configurar credenciales (env.json)</w:t></w:r></w:p><w:p><w:r><w:t xml:space="preserve">El plugin incluye un archivo env.template.json con la estructura de configuraci&#xF3;n de entorno. Debes crear tu propio env.json (ignorado por Git, nunca se sube) con tus credenciales reales:</w:t></w:r></w:p><w:p><w:pPr><w:shd w:val="clear" w:color="auto" w:fill="F5F5F5"/><w:spacing w:after="0" w:line="240" w:lineRule="auto"/></w:pPr><w:r><w:rPr><w:rFonts w:ascii="Courier New" w:hAnsi="Courier New" w:cs="Courier New"/><w:color w:val="152A35"/><w:sz w:val="18"/><w:szCs w:val="18"/></w:rPr><w:t xml:space="preserve">Copy-Item env.template.json env.json</w:t></w:r></w:p><w:p><w:r><w:t xml:space="preserve">Abre env.json y rellena los valores marcados con &lt;COMPLETAR&gt;:</w:t></w:r></w:p><w:p><w:pPr><w:numPr><w:ilvl w:val="0"/><w:numId w:val="1"/></w:numPr><w:spacing w:after="60"/></w:pPr><w:r><w:t xml:space="preserve">herramientas.mantis &#x2014; URL y API key de MantisBT corporativo</w:t></w:r></w:p><w:p><w:pPr><w:numPr><w:ilvl w:val="0"/><w:numId w:val="1"/></w:numPr><w:spacing w:after="60"/></w:pPr><w:r><w:t xml:space="preserve">herramientas.svn &#x2014; URL y credenciales del repositorio SVN</w:t></w:r></w:p><w:p><w:pPr><w:numPr><w:ilvl w:val="0"/><w:numId w:val="1"/></w:numPr><w:spacing w:after="60"/></w:pPr><w:r><w:t xml:space="preserve">credenciales_bbdd &#x2014; usuarios y passwords por proyecto (Ingenieros, bancamarch...)</w:t></w:r></w:p><w:p><w:pPr><w:numPr><w:ilvl w:val="0"/><w:numId w:val="1"/></w:numPr><w:spacing w:after="60"/></w:pPr><w:r><w:t xml:space="preserve">entornos &#x2014; connection strings completas por proyecto y entorno (DEV/PRE/PRO)</w:t></w:r></w:p><w:p><w:pPr><w:numPr><w:ilvl w:val="0"/><w:numId w:val="1"/></w:numPr><w:spacing w:after="60"/></w:pPr><w:r><w:t xml:space="preserve">contexto_personal &#x2014; tu nombre, rol y equipo</w:t></w:r></w:p><w:p><w:r><w:t xml:space="preserve">Nota: Si no tienes env.json, el agente lo crear&#xE1; autom&#xE1;ticamente desde la plantilla la primera vez que uses un comando de base de datos, y te pedir&#xE1; que lo rellenes antes de continuar.</w:t></w:r></w:p><w:p><w:pPr><w:pStyle w:val="Ttulo2"/></w:pPr><w:bookmarkStart w:id="7" w:name="_Toc236310410"/><w:r><w:t>Paso 4 — Verificar la instalación</w:t></w:r><w:bookmarkEnd w:id="7"/></w:p><w:p><w:r><w:t>En Claude Code, escribe:</w:t></w:r></w:p><w:p><w:pPr><w:shd w:val="clear" w:color="auto" w:fill="F5F5F5"/><w:spacing w:after="0" w:line="240" w:lineRule="auto"/></w:pPr><w:r><w:rPr><w:rFonts w:ascii="Courier New" w:hAnsi="Courier New" w:cs="Courier New"/><w:color w:val="152A35"/><w:sz w:val="18"/><w:szCs w:val="18"/></w:rPr><w:t>/orchestrator-historial</w:t></w:r></w:p><w:p/><w:p><w:r><w:t>Si el plugin está activo, el agente responderá con el historial SVN/Git del workspace actual. El servidor MCP orchestrator-workspace arranca automáticamente en el primer uso.</w:t></w:r></w:p><w:p><w:pPr><w:pStyle w:val="Ttulo2"/></w:pPr><w:bookmarkStart w:id="8" w:name="_Toc236310411"/><w:r><w:t>Actualizar el plugin</w:t></w:r><w:bookmarkEnd w:id="8"/></w:p><w:p><w:pPr><w:shd w:val="clear" w:color="auto" w:fill="F5F5F5"/><w:spacing w:after="0" w:line="240" w:lineRule="auto"/></w:pPr><w:r><w:rPr><w:rFonts w:ascii="Courier New" w:hAnsi="Courier New" w:cs="Courier New"/><w:color w:val="152A35"/><w:sz w:val="18"/><w:szCs w:val="18"/></w:rPr><w:t>/plugin update orchestrator-skill-full</w:t></w:r></w:p><w:p/><w:p><w:pPr><w:pStyle w:val="Ttulo1"/></w:pPr><w:bookmarkStart w:id="9" w:name="_Toc236310412"/><w:r><w:t>Comandos disponibles</w:t></w:r><w:bookmarkEnd w:id="9"/></w:p><w:p><w:r><w:t>El plugin expone 41 comandos de barra agrupados por categoría. Todos siguen el patrón /orchestrator-&lt;nombre&gt;.</w:t></w:r></w:p><w:p/><w:p><w:pPr><w:pStyle w:val="Ttulo2"/></w:pPr><w:bookmarkStart w:id="10" w:name="_Toc236310413"/><w:r><w:t>Análisis y calidad</w:t></w:r><w:bookmarkEnd w:id="10"/></w:p><w:tbl><w:tblPr><w:tblStyle w:val="a"/><w:tblW w:w="9578" w:type="dxa"/><w:jc w:val="center"/><w:tblBorders><w:top w:val="single" w:sz="4" w:space="0" w:color="DDDDDD"/><w:left w:val="single" w:sz="4" w:space="0" w:color="DDDDDD"/><w:bottom w:val="single" w:sz="4" w:space="0" w:color="DDDDDD"/><w:right w:val="single" w:sz="4" w:space="0" w:color="DDDDDD"/><w:insideH w:val="single" w:sz="4" w:space="0" w:color="DDDDDD"/><w:insideV w:val="single" w:sz="4" w:space="0" w:color="DDDDDD"/></w:tblBorders><w:tblLayout w:type="fixed"/><w:tblLook w:val="04A0" w:firstRow="1" w:lastRow="0" w:firstColumn="1" w:lastColumn="0" w:noHBand="0" w:noVBand="1"/></w:tblPr><w:tblGrid><w:gridCol w:w="3500"/><w:gridCol w:w="6078"/></w:tblGrid><w:tr><w:trPr><w:trHeight w:val="500"/><w:jc w:val="center"/></w:trPr><w:tc><w:tcPr><w:tcW w:w="3500" w:type="dxa"/><w:shd w:val="clear" w:color="auto" w:fill="00F7BC"/><w:vAlign w:val="center"/></w:tcPr><w:p><w:pPr><w:spacing w:line="240" w:lineRule="auto"/><w:jc w:val="left"/></w:pPr><w:r><w:rPr><w:b/><w:bCs/><w:color w:val="152A35"/></w:rPr><w:t>COMANDO</w:t></w:r></w:p></w:tc><w:tc><w:tcPr><w:tcW w:w="6078" w:type="dxa"/><w:shd w:val="clear" w:color="auto" w:fill="00F7BC"/><w:vAlign w:val="center"/></w:tcPr><w:p><w:pPr><w:spacing w:line="240" w:lineRule="auto"/><w:jc w:val="left"/></w:pPr><w:r><w:rPr><w:b/><w:bCs/><w:color w:val="152A35"/></w:rPr><w:t>QUÉ HACE</w:t></w:r></w:p></w:tc></w:tr><w:tr><w:trPr><w:trHeight w:val="500"/><w:jc w:val="center"/></w:trPr><w:tc><w:tcPr><w:tcW w:w="3500" w:type="dxa"/><w:shd w:val="clear" w:color="auto" w:fill="FFFFFF"/><w:vAlign w:val="center"/></w:tcPr><w:p><w:pPr><w:spacing w:line="240" w:lineRule="auto"/><w:jc w:val="left"/></w:pPr><w:r><w:rPr><w:color w:val="152A35"/></w:rPr><w:t>/orchestrator-analizar &lt;Solucion&gt;.sln [rev|ficheros]</w:t></w:r></w:p></w:tc><w:tc><w:tcPr><w:tcW w:w="6078" w:type="dxa"/><w:shd w:val="clear" w:color="auto" w:fill="FFFFFF"/><w:vAlign w:val="center"/></w:tcPr><w:p><w:pPr><w:spacing w:line="240" w:lineRule="auto"/><w:jc w:val="left"/></w:pPr><w:r><w:rPr><w:color w:val="152A35"/></w:rPr><w:t>Análisis estático de calidad y riesgo de un diff o cambio concreto</w:t></w:r></w:p></w:tc></w:tr><w:tr><w:trPr><w:trHeight w:val="500"/><w:jc w:val="center"/></w:trPr><w:tc><w:tcPr><w:tcW w:w="3500" w:type="dxa"/><w:shd w:val="clear" w:color="auto" w:fill="F0F0F0"/><w:vAlign w:val="center"/></w:tcPr><w:p><w:pPr><w:spacing w:line="240" w:lineRule="auto"/><w:jc w:val="left"/></w:pPr><w:r><w:rPr><w:color w:val="152A35"/></w:rPr><w:t>/orchestrator-auditoria</w:t></w:r></w:p></w:tc><w:tc><w:tcPr><w:tcW w:w="6078" w:type="dxa"/><w:shd w:val="clear" w:color="auto" w:fill="F0F0F0"/><w:vAlign w:val="center"/></w:tcPr><w:p><w:pPr><w:spacing w:line="240" w:lineRule="auto"/><w:jc w:val="left"/></w:pPr><w:r><w:rPr><w:color w:val="152A35"/></w:rPr><w:t>Revisión de calidad y convenciones ScacsWeb (BPC, DALC, naming)</w:t></w:r></w:p></w:tc></w:tr><w:tr><w:trPr><w:trHeight w:val="500"/><w:jc w:val="center"/></w:trPr><w:tc><w:tcPr><w:tcW w:w="3500" w:type="dxa"/><w:shd w:val="clear" w:color="auto" w:fill="FFFFFF"/><w:vAlign w:val="center"/></w:tcPr><w:p><w:pPr><w:spacing w:line="240" w:lineRule="auto"/><w:jc w:val="left"/></w:pPr><w:r><w:rPr><w:color w:val="152A35"/></w:rPr><w:t>/orchestrator-security</w:t></w:r></w:p></w:tc><w:tc><w:tcPr><w:tcW w:w="6078" w:type="dxa"/><w:shd w:val="clear" w:color="auto" w:fill="FFFFFF"/><w:vAlign w:val="center"/></w:tcPr><w:p><w:pPr><w:spacing w:line="240" w:lineRule="auto"/><w:jc w:val="left"/></w:pPr><w:r><w:rPr><w:color w:val="152A35"/></w:rPr><w:t>Auditoría de seguridad: SQL injection, XSS, secretos en código</w:t></w:r></w:p></w:tc></w:tr><w:tr><w:trPr><w:trHeight w:val="500"/><w:jc w:val="center"/></w:trPr><w:tc><w:tcPr><w:tcW w:w="3500" w:type="dxa"/><w:shd w:val="clear" w:color="auto" w:fill="F0F0F0"/><w:vAlign w:val="center"/></w:tcPr><w:p><w:pPr><w:spacing w:line="240" w:lineRule="auto"/><w:jc w:val="left"/></w:pPr><w:r><w:rPr><w:color w:val="152A35"/></w:rPr><w:t>/orchestrator-review</w:t></w:r></w:p></w:tc><w:tc><w:tcPr><w:tcW w:w="6078" w:type="dxa"/><w:shd w:val="clear" w:color="auto" w:fill="F0F0F0"/><w:vAlign w:val="center"/></w:tcPr><w:p><w:pPr><w:spacing w:line="240" w:lineRule="auto"/><w:jc w:val="left"/></w:pPr><w:r><w:rPr><w:color w:val="152A35"/></w:rPr><w:t>Revisión de código del diff actual antes de commit</w:t></w:r></w:p></w:tc></w:tr><w:tr><w:trPr><w:trHeight w:val="500"/><w:jc w:val="center"/></w:trPr><w:tc><w:tcPr><w:tcW w:w="3500" w:type="dxa"/><w:shd w:val="clear" w:color="auto" w:fill="FFFFFF"/><w:vAlign w:val="center"/></w:tcPr><w:p><w:pPr><w:spacing w:line="240" w:lineRule="auto"/><w:jc w:val="left"/></w:pPr><w:r><w:rPr><w:color w:val="152A35"/></w:rPr><w:t>/orchestrator-hotspots</w:t></w:r></w:p></w:tc><w:tc><w:tcPr><w:tcW w:w="6078" w:type="dxa"/><w:shd w:val="clear" w:color="auto" w:fill="FFFFFF"/><w:vAlign w:val="center"/></w:tcPr><w:p><w:pPr><w:spacing w:line="240" w:lineRule="auto"/><w:jc w:val="left"/></w:pPr><w:r><w:rPr><w:color w:val="152A35"/></w:rPr><w:t>Detecta los ficheros con más cambios y mayor riesgo acumulado</w:t></w:r></w:p></w:tc></w:tr><w:tr><w:trPr><w:trHeight w:val="500"/><w:jc w:val="center"/></w:trPr><w:tc><w:tcPr><w:tcW w:w="3500" w:type="dxa"/><w:shd w:val="clear" w:color="auto" w:fill="F0F0F0"/><w:vAlign w:val="center"/></w:tcPr><w:p><w:pPr><w:spacing w:line="240" w:lineRule="auto"/><w:jc w:val="left"/></w:pPr><w:r><w:rPr><w:color w:val="152A35"/></w:rPr><w:lastRenderedPageBreak/><w:t>/orchestrator-dead-code</w:t></w:r></w:p></w:tc><w:tc><w:tcPr><w:tcW w:w="6078" w:type="dxa"/><w:shd w:val="clear" w:color="auto" w:fill="F0F0F0"/><w:vAlign w:val="center"/></w:tcPr><w:p><w:pPr><w:spacing w:line="240" w:lineRule="auto"/><w:jc w:val="left"/></w:pPr><w:r><w:rPr><w:color w:val="152A35"/></w:rPr><w:t>Localiza código muerto: métodos, clases y referencias sin uso</w:t></w:r></w:p></w:tc></w:tr><w:tr><w:trPr><w:trHeight w:val="500"/><w:jc w:val="center"/></w:trPr><w:tc><w:tcPr><w:tcW w:w="3500" w:type="dxa"/><w:shd w:val="clear" w:color="auto" w:fill="FFFFFF"/><w:vAlign w:val="center"/></w:tcPr><w:p><w:pPr><w:spacing w:line="240" w:lineRule="auto"/><w:jc w:val="left"/></w:pPr><w:r><w:rPr><w:color w:val="152A35"/></w:rPr><w:t>/orchestrator-perf</w:t></w:r></w:p></w:tc><w:tc><w:tcPr><w:tcW w:w="6078" w:type="dxa"/><w:shd w:val="clear" w:color="auto" w:fill="FFFFFF"/><w:vAlign w:val="center"/></w:tcPr><w:p><w:pPr><w:spacing w:line="240" w:lineRule="auto"/><w:jc w:val="left"/></w:pPr><w:r><w:rPr><w:color w:val="152A35"/></w:rPr><w:t>Análisis de rendimiento: consultas lentas, N+1, allocations</w:t></w:r></w:p></w:tc></w:tr><w:tr><w:trPr><w:trHeight w:val="500"/><w:jc w:val="center"/></w:trPr><w:tc><w:tcPr><w:tcW w:w="3500" w:type="dxa"/><w:shd w:val="clear" w:color="auto" w:fill="F0F0F0"/><w:vAlign w:val="center"/></w:tcPr><w:p><w:pPr><w:spacing w:line="240" w:lineRule="auto"/><w:jc w:val="left"/></w:pPr><w:r><w:rPr><w:color w:val="152A35"/></w:rPr><w:t>/orchestrator-cobertura</w:t></w:r></w:p></w:tc><w:tc><w:tcPr><w:tcW w:w="6078" w:type="dxa"/><w:shd w:val="clear" w:color="auto" w:fill="F0F0F0"/><w:vAlign w:val="center"/></w:tcPr><w:p><w:pPr><w:spacing w:line="240" w:lineRule="auto"/><w:jc w:val="left"/></w:pPr><w:r><w:rPr><w:color w:val="152A35"/></w:rPr><w:t>Informe de cobertura de tests del proyecto</w:t></w:r></w:p></w:tc></w:tr></w:tbl><w:p/><w:p><w:pPr><w:pStyle w:val="Ttulo2"/></w:pPr><w:bookmarkStart w:id="11" w:name="_Toc236310414"/><w:r><w:t>Implementación y scaffolding</w:t></w:r><w:bookmarkEnd w:id="11"/></w:p><w:tbl><w:tblPr><w:tblStyle w:val="a"/><w:tblW w:w="9578" w:type="dxa"/><w:jc w:val="center"/><w:tblBorders><w:top w:val="single" w:sz="4" w:space="0" w:color="DDDDDD"/><w:left w:val="single" w:sz="4" w:space="0" w:color="DDDDDD"/><w:bottom w:val="single" w:sz="4" w:space="0" w:color="DDDDDD"/><w:right w:val="single" w:sz="4" w:space="0" w:color="DDDDDD"/><w:insideH w:val="single" w:sz="4" w:space="0" w:color="DDDDDD"/><w:insideV w:val="single" w:sz="4" w:space="0" w:color="DDDDDD"/></w:tblBorders><w:tblLayout w:type="fixed"/><w:tblLook w:val="04A0" w:firstRow="1" w:lastRow="0" w:firstColumn="1" w:lastColumn="0" w:noHBand="0" w:noVBand="1"/></w:tblPr><w:tblGrid><w:gridCol w:w="3500"/><w:gridCol w:w="6078"/></w:tblGrid><w:tr><w:trPr><w:trHeight w:val="500"/><w:jc w:val="center"/></w:trPr><w:tc><w:tcPr><w:tcW w:w="3500" w:type="dxa"/><w:shd w:val="clear" w:color="auto" w:fill="00F7BC"/><w:vAlign w:val="center"/></w:tcPr><w:p><w:pPr><w:spacing w:line="240" w:lineRule="auto"/><w:jc w:val="left"/></w:pPr><w:r><w:rPr><w:b/><w:bCs/><w:color w:val="152A35"/></w:rPr><w:t>COMANDO</w:t></w:r></w:p></w:tc><w:tc><w:tcPr><w:tcW w:w="6078" w:type="dxa"/><w:shd w:val="clear" w:color="auto" w:fill="00F7BC"/><w:vAlign w:val="center"/></w:tcPr><w:p><w:pPr><w:spacing w:line="240" w:lineRule="auto"/><w:jc w:val="left"/></w:pPr><w:r><w:rPr><w:b/><w:bCs/><w:color w:val="152A35"/></w:rPr><w:t>QUÉ HACE</w:t></w:r></w:p></w:tc></w:tr><w:tr><w:trPr><w:trHeight w:val="500"/><w:jc w:val="center"/></w:trPr><w:tc><w:tcPr><w:tcW w:w="3500" w:type="dxa"/><w:shd w:val="clear" w:color="auto" w:fill="FFFFFF"/><w:vAlign w:val="center"/></w:tcPr><w:p><w:pPr><w:spacing w:line="240" w:lineRule="auto"/><w:jc w:val="left"/></w:pPr><w:r><w:rPr><w:color w:val="152A35"/></w:rPr><w:t>/orchestrator-init [workspace_path]</w:t></w:r></w:p></w:tc><w:tc><w:tcPr><w:tcW w:w="6078" w:type="dxa"/><w:shd w:val="clear" w:color="auto" w:fill="FFFFFF"/><w:vAlign w:val="center"/></w:tcPr><w:p><w:pPr><w:spacing w:line="240" w:lineRule="auto"/><w:jc w:val="left"/></w:pPr><w:r><w:rPr><w:color w:val="152A35"/></w:rPr><w:t>Bootstrap de workspace ScacsWeb: crea config BD, carpetas y modelo inicial</w:t></w:r></w:p></w:tc></w:tr><w:tr><w:trPr><w:trHeight w:val="500"/><w:jc w:val="center"/></w:trPr><w:tc><w:tcPr><w:tcW w:w="3500" w:type="dxa"/><w:shd w:val="clear" w:color="auto" w:fill="F0F0F0"/><w:vAlign w:val="center"/></w:tcPr><w:p><w:pPr><w:spacing w:line="240" w:lineRule="auto"/><w:jc w:val="left"/></w:pPr><w:r><w:rPr><w:color w:val="152A35"/></w:rPr><w:t>/orchestrator-generar-dalc</w:t></w:r></w:p></w:tc><w:tc><w:tcPr><w:tcW w:w="6078" w:type="dxa"/><w:shd w:val="clear" w:color="auto" w:fill="F0F0F0"/><w:vAlign w:val="center"/></w:tcPr><w:p><w:pPr><w:spacing w:line="240" w:lineRule="auto"/><w:jc w:val="left"/></w:pPr><w:r><w:rPr><w:color w:val="152A35"/></w:rPr><w:t>Genera clases DALC para Oracle/SQL Server a partir del modelo BD</w:t></w:r></w:p></w:tc></w:tr><w:tr><w:trPr><w:trHeight w:val="500"/><w:jc w:val="center"/></w:trPr><w:tc><w:tcPr><w:tcW w:w="3500" w:type="dxa"/><w:shd w:val="clear" w:color="auto" w:fill="FFFFFF"/><w:vAlign w:val="center"/></w:tcPr><w:p><w:pPr><w:spacing w:line="240" w:lineRule="auto"/><w:jc w:val="left"/></w:pPr><w:r><w:rPr><w:color w:val="152A35"/></w:rPr><w:t>/orchestrator-migrar</w:t></w:r></w:p></w:tc><w:tc><w:tcPr><w:tcW w:w="6078" w:type="dxa"/><w:shd w:val="clear" w:color="auto" w:fill="FFFFFF"/><w:vAlign w:val="center"/></w:tcPr><w:p><w:pPr><w:spacing w:line="240" w:lineRule="auto"/><w:jc w:val="left"/></w:pPr><w:r><w:rPr><w:color w:val="152A35"/></w:rPr><w:t>Genera y aplica migraciones SQL desde el modelo JSON local</w:t></w:r></w:p></w:tc></w:tr><w:tr><w:trPr><w:trHeight w:val="500"/><w:jc w:val="center"/></w:trPr><w:tc><w:tcPr><w:tcW w:w="3500" w:type="dxa"/><w:shd w:val="clear" w:color="auto" w:fill="F0F0F0"/><w:vAlign w:val="center"/></w:tcPr><w:p><w:pPr><w:spacing w:line="240" w:lineRule="auto"/><w:jc w:val="left"/></w:pPr><w:r><w:rPr><w:color w:val="152A35"/></w:rPr><w:t>/orchestrator-seed</w:t></w:r></w:p></w:tc><w:tc><w:tcPr><w:tcW w:w="6078" w:type="dxa"/><w:shd w:val="clear" w:color="auto" w:fill="F0F0F0"/><w:vAlign w:val="center"/></w:tcPr><w:p><w:pPr><w:spacing w:line="240" w:lineRule="auto"/><w:jc w:val="left"/></w:pPr><w:r><w:rPr><w:color w:val="152A35"/></w:rPr><w:t>Genera scripts SQL de datos iniciales (seed) para tablas de catálogo</w:t></w:r></w:p></w:tc></w:tr><w:tr><w:trPr><w:trHeight w:val="500"/><w:jc w:val="center"/></w:trPr><w:tc><w:tcPr><w:tcW w:w="3500" w:type="dxa"/><w:shd w:val="clear" w:color="auto" w:fill="FFFFFF"/><w:vAlign w:val="center"/></w:tcPr><w:p><w:pPr><w:spacing w:line="240" w:lineRule="auto"/><w:jc w:val="left"/></w:pPr><w:r><w:rPr><w:color w:val="152A35"/></w:rPr><w:t>/orchestrator-format</w:t></w:r></w:p></w:tc><w:tc><w:tcPr><w:tcW w:w="6078" w:type="dxa"/><w:shd w:val="clear" w:color="auto" w:fill="FFFFFF"/><w:vAlign w:val="center"/></w:tcPr><w:p><w:pPr><w:spacing w:line="240" w:lineRule="auto"/><w:jc w:val="left"/></w:pPr><w:r><w:rPr><w:color w:val="152A35"/></w:rPr><w:t>Aplica formato y convenciones de estilo al código fuente</w:t></w:r></w:p></w:tc></w:tr><w:tr><w:trPr><w:trHeight w:val="500"/><w:jc w:val="center"/></w:trPr><w:tc><w:tcPr><w:tcW w:w="3500" w:type="dxa"/><w:shd w:val="clear" w:color="auto" w:fill="F0F0F0"/><w:vAlign w:val="center"/></w:tcPr><w:p><w:pPr><w:spacing w:line="240" w:lineRule="auto"/><w:jc w:val="left"/></w:pPr><w:r><w:rPr><w:color w:val="152A35"/></w:rPr><w:t>/orchestrator-rename</w:t></w:r></w:p></w:tc><w:tc><w:tcPr><w:tcW w:w="6078" w:type="dxa"/><w:shd w:val="clear" w:color="auto" w:fill="F0F0F0"/><w:vAlign w:val="center"/></w:tcPr><w:p><w:pPr><w:spacing w:line="240" w:lineRule="auto"/><w:jc w:val="left"/></w:pPr><w:r><w:rPr><w:color w:val="152A35"/></w:rPr><w:t>Renombra símbolo (clase, método, tabla) propagando todos los usos</w:t></w:r></w:p></w:tc></w:tr></w:tbl><w:p/><w:p><w:pPr><w:pStyle w:val="Ttulo2"/></w:pPr><w:bookmarkStart w:id="12" w:name="_Toc236310415"/><w:r><w:t>Validación y entorno</w:t></w:r><w:bookmarkEnd w:id="12"/></w:p><w:tbl><w:tblPr><w:tblStyle w:val="a"/><w:tblW w:w="9578" w:type="dxa"/><w:jc w:val="center"/><w:tblBorders><w:top w:val="single" w:sz="4" w:space="0" w:color="DDDDDD"/><w:left w:val="single" w:sz="4" w:space="0" w:color="DDDDDD"/><w:bottom w:val="single" w:sz="4" w:space="0" w:color="DDDDDD"/><w:right w:val="single" w:sz="4" w:space="0" w:color="DDDDDD"/><w:insideH w:val="single" w:sz="4" w:space="0" w:color="DDDDDD"/><w:insideV w:val="single" w:sz="4" w:space="0" w:color="DDDDDD"/></w:tblBorders><w:tblLayout w:type="fixed"/><w:tblLook w:val="04A0" w:firstRow="1" w:lastRow="0" w:firstColumn="1" w:lastColumn="0" w:noHBand="0" w:noVBand="1"/></w:tblPr><w:tblGrid><w:gridCol w:w="3500"/><w:gridCol w:w="6078"/></w:tblGrid><w:tr><w:trPr><w:trHeight w:val="500"/><w:jc w:val="center"/></w:trPr><w:tc><w:tcPr><w:tcW w:w="3500" w:type="dxa"/><w:shd w:val="clear" w:color="auto" w:fill="00F7BC"/><w:vAlign w:val="center"/></w:tcPr><w:p><w:pPr><w:spacing w:line="240" w:lineRule="auto"/><w:jc w:val="left"/></w:pPr><w:r><w:rPr><w:b/><w:bCs/><w:color w:val="152A35"/></w:rPr><w:t>COMANDO</w:t></w:r></w:p></w:tc><w:tc><w:tcPr><w:tcW w:w="6078" w:type="dxa"/><w:shd w:val="clear" w:color="auto" w:fill="00F7BC"/><w:vAlign w:val="center"/></w:tcPr><w:p><w:pPr><w:spacing w:line="240" w:lineRule="auto"/><w:jc w:val="left"/></w:pPr><w:r><w:rPr><w:b/><w:bCs/><w:color w:val="152A35"/></w:rPr><w:t>QUÉ HACE</w:t></w:r></w:p></w:tc></w:tr><w:tr><w:trPr><w:trHeight w:val="500"/><w:jc w:val="center"/></w:trPr><w:tc><w:tcPr><w:tcW w:w="3500" w:type="dxa"/><w:shd w:val="clear" w:color="auto" w:fill="FFFFFF"/><w:vAlign w:val="center"/></w:tcPr><w:p><w:pPr><w:spacing w:line="240" w:lineRule="auto"/><w:jc w:val="left"/></w:pPr><w:r><w:rPr><w:color w:val="152A35"/></w:rPr><w:t>/orchestrator-validator</w:t></w:r></w:p></w:tc><w:tc><w:tcPr><w:tcW w:w="6078" w:type="dxa"/><w:shd w:val="clear" w:color="auto" w:fill="FFFFFF"/><w:vAlign w:val="center"/></w:tcPr><w:p><w:pPr><w:spacing w:line="240" w:lineRule="auto"/><w:jc w:val="left"/></w:pPr><w:r><w:rPr><w:color w:val="152A35"/></w:rPr><w:t>Valida compilación y coherencia lógica del código</w:t></w:r></w:p></w:tc></w:tr><w:tr><w:trPr><w:trHeight w:val="500"/><w:jc w:val="center"/></w:trPr><w:tc><w:tcPr><w:tcW w:w="3500" w:type="dxa"/><w:shd w:val="clear" w:color="auto" w:fill="F0F0F0"/><w:vAlign w:val="center"/></w:tcPr><w:p><w:pPr><w:spacing w:line="240" w:lineRule="auto"/><w:jc w:val="left"/></w:pPr><w:r><w:rPr><w:color w:val="152A35"/></w:rPr><w:t>/orchestrator-validar-entorno</w:t></w:r></w:p></w:tc><w:tc><w:tcPr><w:tcW w:w="6078" w:type="dxa"/><w:shd w:val="clear" w:color="auto" w:fill="F0F0F0"/><w:vAlign w:val="center"/></w:tcPr><w:p><w:pPr><w:spacing w:line="240" w:lineRule="auto"/><w:jc w:val="left"/></w:pPr><w:r><w:rPr><w:color w:val="152A35"/></w:rPr><w:t>Verifica entorno: AIS, SVN, dotnet, modelo BD</w:t></w:r></w:p></w:tc></w:tr><w:tr><w:trPr><w:trHeight w:val="500"/><w:jc w:val="center"/></w:trPr><w:tc><w:tcPr><w:tcW w:w="3500" w:type="dxa"/><w:shd w:val="clear" w:color="auto" w:fill="FFFFFF"/><w:vAlign w:val="center"/></w:tcPr><w:p><w:pPr><w:spacing w:line="240" w:lineRule="auto"/><w:jc w:val="left"/></w:pPr><w:r><w:rPr><w:color w:val="152A35"/></w:rPr><w:t>/orchestrator-validar-req</w:t></w:r></w:p></w:tc><w:tc><w:tcPr><w:tcW w:w="6078" w:type="dxa"/><w:shd w:val="clear" w:color="auto" w:fill="FFFFFF"/><w:vAlign w:val="center"/></w:tcPr><w:p><w:pPr><w:spacing w:line="240" w:lineRule="auto"/><w:jc w:val="left"/></w:pPr><w:r><w:rPr><w:color w:val="152A35"/></w:rPr><w:t>Valida si un commit SVN/Git cumple el requerimiento de Mantis</w:t></w:r></w:p></w:tc></w:tr><w:tr><w:trPr><w:trHeight w:val="500"/><w:jc w:val="center"/></w:trPr><w:tc><w:tcPr><w:tcW w:w="3500" w:type="dxa"/><w:shd w:val="clear" w:color="auto" w:fill="F0F0F0"/><w:vAlign w:val="center"/></w:tcPr><w:p><w:pPr><w:spacing w:line="240" w:lineRule="auto"/><w:jc w:val="left"/></w:pPr><w:r><w:rPr><w:color w:val="152A35"/></w:rPr><w:t>/orchestrator-comparar-modelo</w:t></w:r></w:p></w:tc><w:tc><w:tcPr><w:tcW w:w="6078" w:type="dxa"/><w:shd w:val="clear" w:color="auto" w:fill="F0F0F0"/><w:vAlign w:val="center"/></w:tcPr><w:p><w:pPr><w:spacing w:line="240" w:lineRule="auto"/><w:jc w:val="left"/></w:pPr><w:r><w:rPr><w:color w:val="152A35"/></w:rPr><w:t>Compara modelo BD JSON local con esquema real de la BD</w:t></w:r></w:p></w:tc></w:tr><w:tr><w:trPr><w:trHeight w:val="500"/><w:jc w:val="center"/></w:trPr><w:tc><w:tcPr><w:tcW w:w="3500" w:type="dxa"/><w:shd w:val="clear" w:color="auto" w:fill="FFFFFF"/><w:vAlign w:val="center"/></w:tcPr><w:p><w:pPr><w:spacing w:line="240" w:lineRule="auto"/><w:jc w:val="left"/></w:pPr><w:r><w:rPr><w:color w:val="152A35"/></w:rPr><w:lastRenderedPageBreak/><w:t>/orchestrator-comparar-entornos</w:t></w:r></w:p></w:tc><w:tc><w:tcPr><w:tcW w:w="6078" w:type="dxa"/><w:shd w:val="clear" w:color="auto" w:fill="FFFFFF"/><w:vAlign w:val="center"/></w:tcPr><w:p><w:pPr><w:spacing w:line="240" w:lineRule="auto"/><w:jc w:val="left"/></w:pPr><w:r><w:rPr><w:color w:val="152A35"/></w:rPr><w:t>Compara configuración entre entornos (dev, pre, pro)</w:t></w:r></w:p></w:tc></w:tr><w:tr><w:trPr><w:trHeight w:val="500"/><w:jc w:val="center"/></w:trPr><w:tc><w:tcPr><w:tcW w:w="3500" w:type="dxa"/><w:shd w:val="clear" w:color="auto" w:fill="F0F0F0"/><w:vAlign w:val="center"/></w:tcPr><w:p><w:pPr><w:spacing w:line="240" w:lineRule="auto"/><w:jc w:val="left"/></w:pPr><w:r><w:rPr><w:color w:val="152A35"/></w:rPr><w:t>/orchestrator-sync-indexes</w:t></w:r></w:p></w:tc><w:tc><w:tcPr><w:tcW w:w="6078" w:type="dxa"/><w:shd w:val="clear" w:color="auto" w:fill="F0F0F0"/><w:vAlign w:val="center"/></w:tcPr><w:p><w:pPr><w:spacing w:line="240" w:lineRule="auto"/><w:jc w:val="left"/></w:pPr><w:r><w:rPr><w:color w:val="152A35"/></w:rPr><w:t>Sincroniza índices del modelo JSON con los índices reales de la BD</w:t></w:r></w:p></w:tc></w:tr></w:tbl><w:p/><w:p><w:pPr><w:pStyle w:val="Ttulo2"/></w:pPr><w:bookmarkStart w:id="13" w:name="_Toc236310416"/><w:r><w:t>Base de datos y modelo</w:t></w:r><w:bookmarkEnd w:id="13"/></w:p><w:tbl><w:tblPr><w:tblStyle w:val="a"/><w:tblW w:w="9578" w:type="dxa"/><w:jc w:val="center"/><w:tblBorders><w:top w:val="single" w:sz="4" w:space="0" w:color="DDDDDD"/><w:left w:val="single" w:sz="4" w:space="0" w:color="DDDDDD"/><w:bottom w:val="single" w:sz="4" w:space="0" w:color="DDDDDD"/><w:right w:val="single" w:sz="4" w:space="0" w:color="DDDDDD"/><w:insideH w:val="single" w:sz="4" w:space="0" w:color="DDDDDD"/><w:insideV w:val="single" w:sz="4" w:space="0" w:color="DDDDDD"/></w:tblBorders><w:tblLayout w:type="fixed"/><w:tblLook w:val="04A0" w:firstRow="1" w:lastRow="0" w:firstColumn="1" w:lastColumn="0" w:noHBand="0" w:noVBand="1"/></w:tblPr><w:tblGrid><w:gridCol w:w="3500"/><w:gridCol w:w="6078"/></w:tblGrid><w:tr><w:trPr><w:trHeight w:val="500"/><w:jc w:val="center"/></w:trPr><w:tc><w:tcPr><w:tcW w:w="3500" w:type="dxa"/><w:shd w:val="clear" w:color="auto" w:fill="00F7BC"/><w:vAlign w:val="center"/></w:tcPr><w:p><w:pPr><w:spacing w:line="240" w:lineRule="auto"/><w:jc w:val="left"/></w:pPr><w:r><w:rPr><w:b/><w:bCs/><w:color w:val="152A35"/></w:rPr><w:t>COMANDO</w:t></w:r></w:p></w:tc><w:tc><w:tcPr><w:tcW w:w="6078" w:type="dxa"/><w:shd w:val="clear" w:color="auto" w:fill="00F7BC"/><w:vAlign w:val="center"/></w:tcPr><w:p><w:pPr><w:spacing w:line="240" w:lineRule="auto"/><w:jc w:val="left"/></w:pPr><w:r><w:rPr><w:b/><w:bCs/><w:color w:val="152A35"/></w:rPr><w:t>QUÉ HACE</w:t></w:r></w:p></w:tc></w:tr><w:tr><w:trPr><w:trHeight w:val="500"/><w:jc w:val="center"/></w:trPr><w:tc><w:tcPr><w:tcW w:w="3500" w:type="dxa"/><w:shd w:val="clear" w:color="auto" w:fill="FFFFFF"/><w:vAlign w:val="center"/></w:tcPr><w:p><w:pPr><w:spacing w:line="240" w:lineRule="auto"/><w:jc w:val="left"/></w:pPr><w:r><w:rPr><w:color w:val="152A35"/></w:rPr><w:t>/orchestrator-schema [tabla]</w:t></w:r></w:p></w:tc><w:tc><w:tcPr><w:tcW w:w="6078" w:type="dxa"/><w:shd w:val="clear" w:color="auto" w:fill="FFFFFF"/><w:vAlign w:val="center"/></w:tcPr><w:p><w:pPr><w:spacing w:line="240" w:lineRule="auto"/><w:jc w:val="left"/></w:pPr><w:r><w:rPr><w:color w:val="152A35"/></w:rPr><w:t>Muestra esquema detallado de una tabla: columnas, tipos, PKs, índices</w:t></w:r></w:p></w:tc></w:tr><w:tr><w:trPr><w:trHeight w:val="500"/><w:jc w:val="center"/></w:trPr><w:tc><w:tcPr><w:tcW w:w="3500" w:type="dxa"/><w:shd w:val="clear" w:color="auto" w:fill="F0F0F0"/><w:vAlign w:val="center"/></w:tcPr><w:p><w:pPr><w:spacing w:line="240" w:lineRule="auto"/><w:jc w:val="left"/></w:pPr><w:r><w:rPr><w:color w:val="152A35"/></w:rPr><w:t>/orchestrator-erd</w:t></w:r></w:p></w:tc><w:tc><w:tcPr><w:tcW w:w="6078" w:type="dxa"/><w:shd w:val="clear" w:color="auto" w:fill="F0F0F0"/><w:vAlign w:val="center"/></w:tcPr><w:p><w:pPr><w:spacing w:line="240" w:lineRule="auto"/><w:jc w:val="left"/></w:pPr><w:r><w:rPr><w:color w:val="152A35"/></w:rPr><w:t>Genera diagrama ERD del modelo BD en formato Mermaid</w:t></w:r></w:p></w:tc></w:tr><w:tr><w:trPr><w:trHeight w:val="500"/><w:jc w:val="center"/></w:trPr><w:tc><w:tcPr><w:tcW w:w="3500" w:type="dxa"/><w:shd w:val="clear" w:color="auto" w:fill="FFFFFF"/><w:vAlign w:val="center"/></w:tcPr><w:p><w:pPr><w:spacing w:line="240" w:lineRule="auto"/><w:jc w:val="left"/></w:pPr><w:r><w:rPr><w:color w:val="152A35"/></w:rPr><w:t>/orchestrator-db-env</w:t></w:r></w:p></w:tc><w:tc><w:tcPr><w:tcW w:w="6078" w:type="dxa"/><w:shd w:val="clear" w:color="auto" w:fill="FFFFFF"/><w:vAlign w:val="center"/></w:tcPr><w:p><w:pPr><w:spacing w:line="240" w:lineRule="auto"/><w:jc w:val="left"/></w:pPr><w:r><w:rPr><w:color w:val="152A35"/></w:rPr><w:t>Muestra configuración de conexión BD del workspace activo</w:t></w:r></w:p></w:tc></w:tr></w:tbl><w:p/><w:p><w:pPr><w:pStyle w:val="Ttulo2"/></w:pPr><w:bookmarkStart w:id="14" w:name="_Toc236310417"/><w:r><w:t>Control de versiones (SVN / Git)</w:t></w:r><w:bookmarkEnd w:id="14"/></w:p><w:tbl><w:tblPr><w:tblStyle w:val="a"/><w:tblW w:w="9578" w:type="dxa"/><w:jc w:val="center"/><w:tblBorders><w:top w:val="single" w:sz="4" w:space="0" w:color="DDDDDD"/><w:left w:val="single" w:sz="4" w:space="0" w:color="DDDDDD"/><w:bottom w:val="single" w:sz="4" w:space="0" w:color="DDDDDD"/><w:right w:val="single" w:sz="4" w:space="0" w:color="DDDDDD"/><w:insideH w:val="single" w:sz="4" w:space="0" w:color="DDDDDD"/><w:insideV w:val="single" w:sz="4" w:space="0" w:color="DDDDDD"/></w:tblBorders><w:tblLayout w:type="fixed"/><w:tblLook w:val="04A0" w:firstRow="1" w:lastRow="0" w:firstColumn="1" w:lastColumn="0" w:noHBand="0" w:noVBand="1"/></w:tblPr><w:tblGrid><w:gridCol w:w="3500"/><w:gridCol w:w="6078"/></w:tblGrid><w:tr><w:trPr><w:trHeight w:val="500"/><w:jc w:val="center"/></w:trPr><w:tc><w:tcPr><w:tcW w:w="3500" w:type="dxa"/><w:shd w:val="clear" w:color="auto" w:fill="00F7BC"/><w:vAlign w:val="center"/></w:tcPr><w:p><w:pPr><w:spacing w:line="240" w:lineRule="auto"/><w:jc w:val="left"/></w:pPr><w:r><w:rPr><w:b/><w:bCs/><w:color w:val="152A35"/></w:rPr><w:t>COMANDO</w:t></w:r></w:p></w:tc><w:tc><w:tcPr><w:tcW w:w="6078" w:type="dxa"/><w:shd w:val="clear" w:color="auto" w:fill="00F7BC"/><w:vAlign w:val="center"/></w:tcPr><w:p><w:pPr><w:spacing w:line="240" w:lineRule="auto"/><w:jc w:val="left"/></w:pPr><w:r><w:rPr><w:b/><w:bCs/><w:color w:val="152A35"/></w:rPr><w:t>QUÉ HACE</w:t></w:r></w:p></w:tc></w:tr><w:tr><w:trPr><w:trHeight w:val="500"/><w:jc w:val="center"/></w:trPr><w:tc><w:tcPr><w:tcW w:w="3500" w:type="dxa"/><w:shd w:val="clear" w:color="auto" w:fill="FFFFFF"/><w:vAlign w:val="center"/></w:tcPr><w:p><w:pPr><w:spacing w:line="240" w:lineRule="auto"/><w:jc w:val="left"/></w:pPr><w:r><w:rPr><w:color w:val="152A35"/></w:rPr><w:t>/orchestrator-historial</w:t></w:r></w:p></w:tc><w:tc><w:tcPr><w:tcW w:w="6078" w:type="dxa"/><w:shd w:val="clear" w:color="auto" w:fill="FFFFFF"/><w:vAlign w:val="center"/></w:tcPr><w:p><w:pPr><w:spacing w:line="240" w:lineRule="auto"/><w:jc w:val="left"/></w:pPr><w:r><w:rPr><w:color w:val="152A35"/></w:rPr><w:t>Historial SVN/Git con autor, fecha y mensaje por revisión</w:t></w:r></w:p></w:tc></w:tr><w:tr><w:trPr><w:trHeight w:val="500"/><w:jc w:val="center"/></w:trPr><w:tc><w:tcPr><w:tcW w:w="3500" w:type="dxa"/><w:shd w:val="clear" w:color="auto" w:fill="F0F0F0"/><w:vAlign w:val="center"/></w:tcPr><w:p><w:pPr><w:spacing w:line="240" w:lineRule="auto"/><w:jc w:val="left"/></w:pPr><w:r><w:rPr><w:color w:val="152A35"/></w:rPr><w:t>/orchestrator-diff</w:t></w:r></w:p></w:tc><w:tc><w:tcPr><w:tcW w:w="6078" w:type="dxa"/><w:shd w:val="clear" w:color="auto" w:fill="F0F0F0"/><w:vAlign w:val="center"/></w:tcPr><w:p><w:pPr><w:spacing w:line="240" w:lineRule="auto"/><w:jc w:val="left"/></w:pPr><w:r><w:rPr><w:color w:val="152A35"/></w:rPr><w:t>Diff del workspace actual o de una revisión concreta</w:t></w:r></w:p></w:tc></w:tr><w:tr><w:trPr><w:trHeight w:val="500"/><w:jc w:val="center"/></w:trPr><w:tc><w:tcPr><w:tcW w:w="3500" w:type="dxa"/><w:shd w:val="clear" w:color="auto" w:fill="FFFFFF"/><w:vAlign w:val="center"/></w:tcPr><w:p><w:pPr><w:spacing w:line="240" w:lineRule="auto"/><w:jc w:val="left"/></w:pPr><w:r><w:rPr><w:color w:val="152A35"/></w:rPr><w:t>/orchestrator-commit</w:t></w:r></w:p></w:tc><w:tc><w:tcPr><w:tcW w:w="6078" w:type="dxa"/><w:shd w:val="clear" w:color="auto" w:fill="FFFFFF"/><w:vAlign w:val="center"/></w:tcPr><w:p><w:pPr><w:spacing w:line="240" w:lineRule="auto"/><w:jc w:val="left"/></w:pPr><w:r><w:rPr><w:color w:val="152A35"/></w:rPr><w:t>Prepara y ejecuta commit SVN/Git con mensaje estructurado</w:t></w:r></w:p></w:tc></w:tr><w:tr><w:trPr><w:trHeight w:val="500"/><w:jc w:val="center"/></w:trPr><w:tc><w:tcPr><w:tcW w:w="3500" w:type="dxa"/><w:shd w:val="clear" w:color="auto" w:fill="F0F0F0"/><w:vAlign w:val="center"/></w:tcPr><w:p><w:pPr><w:spacing w:line="240" w:lineRule="auto"/><w:jc w:val="left"/></w:pPr><w:r><w:rPr><w:color w:val="152A35"/></w:rPr><w:t>/orchestrator-deshacer</w:t></w:r></w:p></w:tc><w:tc><w:tcPr><w:tcW w:w="6078" w:type="dxa"/><w:shd w:val="clear" w:color="auto" w:fill="F0F0F0"/><w:vAlign w:val="center"/></w:tcPr><w:p><w:pPr><w:spacing w:line="240" w:lineRule="auto"/><w:jc w:val="left"/></w:pPr><w:r><w:rPr><w:color w:val="152A35"/></w:rPr><w:t>Deshace cambios locales o revierte una revisión SVN/Git</w:t></w:r></w:p></w:tc></w:tr><w:tr><w:trPr><w:trHeight w:val="500"/><w:jc w:val="center"/></w:trPr><w:tc><w:tcPr><w:tcW w:w="3500" w:type="dxa"/><w:shd w:val="clear" w:color="auto" w:fill="FFFFFF"/><w:vAlign w:val="center"/></w:tcPr><w:p><w:pPr><w:spacing w:line="240" w:lineRule="auto"/><w:jc w:val="left"/></w:pPr><w:r><w:rPr><w:color w:val="152A35"/></w:rPr><w:t>/orchestrator-release-notes</w:t></w:r></w:p></w:tc><w:tc><w:tcPr><w:tcW w:w="6078" w:type="dxa"/><w:shd w:val="clear" w:color="auto" w:fill="FFFFFF"/><w:vAlign w:val="center"/></w:tcPr><w:p><w:pPr><w:spacing w:line="240" w:lineRule="auto"/><w:jc w:val="left"/></w:pPr><w:r><w:rPr><w:color w:val="152A35"/></w:rPr><w:t>Genera release notes a partir del historial de commits</w:t></w:r></w:p></w:tc></w:tr></w:tbl><w:p/><w:p><w:pPr><w:pStyle w:val="Ttulo2"/></w:pPr><w:bookmarkStart w:id="15" w:name="_Toc236310418"/><w:r><w:t>Arquitectura y documentación</w:t></w:r><w:bookmarkEnd w:id="15"/></w:p><w:tbl><w:tblPr><w:tblStyle w:val="a"/><w:tblW w:w="9578" w:type="dxa"/><w:jc w:val="center"/><w:tblBorders><w:top w:val="single" w:sz="4" w:space="0" w:color="DDDDDD"/><w:left w:val="single" w:sz="4" w:space="0" w:color="DDDDDD"/><w:bottom w:val="single" w:sz="4" w:space="0" w:color="DDDDDD"/><w:right w:val="single" w:sz="4" w:space="0" w:color="DDDDDD"/><w:insideH w:val="single" w:sz="4" w:space="0" w:color="DDDDDD"/><w:insideV w:val="single" w:sz="4" w:space="0" w:color="DDDDDD"/></w:tblBorders><w:tblLayout w:type="fixed"/><w:tblLook w:val="04A0" w:firstRow="1" w:lastRow="0" w:firstColumn="1" w:lastColumn="0" w:noHBand="0" w:noVBand="1"/></w:tblPr><w:tblGrid><w:gridCol w:w="3500"/><w:gridCol w:w="6078"/></w:tblGrid><w:tr><w:trPr><w:trHeight w:val="500"/><w:jc w:val="center"/></w:trPr><w:tc><w:tcPr><w:tcW w:w="3500" w:type="dxa"/><w:shd w:val="clear" w:color="auto" w:fill="00F7BC"/><w:vAlign w:val="center"/></w:tcPr><w:p><w:pPr><w:spacing w:line="240" w:lineRule="auto"/><w:jc w:val="left"/></w:pPr><w:r><w:rPr><w:b/><w:bCs/><w:color w:val="152A35"/></w:rPr><w:t>COMANDO</w:t></w:r></w:p></w:tc><w:tc><w:tcPr><w:tcW w:w="6078" w:type="dxa"/><w:shd w:val="clear" w:color="auto" w:fill="00F7BC"/><w:vAlign w:val="center"/></w:tcPr><w:p><w:pPr><w:spacing w:line="240" w:lineRule="auto"/><w:jc w:val="left"/></w:pPr><w:r><w:rPr><w:b/><w:bCs/><w:color w:val="152A35"/></w:rPr><w:t>QUÉ HACE</w:t></w:r></w:p></w:tc></w:tr><w:tr><w:trPr><w:trHeight w:val="500"/><w:jc w:val="center"/></w:trPr><w:tc><w:tcPr><w:tcW w:w="3500" w:type="dxa"/><w:shd w:val="clear" w:color="auto" w:fill="FFFFFF"/><w:vAlign w:val="center"/></w:tcPr><w:p><w:pPr><w:spacing w:line="240" w:lineRule="auto"/><w:jc w:val="left"/></w:pPr><w:r><w:rPr><w:color w:val="152A35"/></w:rPr><w:lastRenderedPageBreak/><w:t>/orchestrator-estructura</w:t></w:r></w:p></w:tc><w:tc><w:tcPr><w:tcW w:w="6078" w:type="dxa"/><w:shd w:val="clear" w:color="auto" w:fill="FFFFFF"/><w:vAlign w:val="center"/></w:tcPr><w:p><w:pPr><w:spacing w:line="240" w:lineRule="auto"/><w:jc w:val="left"/></w:pPr><w:r><w:rPr><w:color w:val="152A35"/></w:rPr><w:t>Visualiza capas y dependencias de una solución ScacsWeb</w:t></w:r></w:p></w:tc></w:tr><w:tr><w:trPr><w:trHeight w:val="500"/><w:jc w:val="center"/></w:trPr><w:tc><w:tcPr><w:tcW w:w="3500" w:type="dxa"/><w:shd w:val="clear" w:color="auto" w:fill="F0F0F0"/><w:vAlign w:val="center"/></w:tcPr><w:p><w:pPr><w:spacing w:line="240" w:lineRule="auto"/><w:jc w:val="left"/></w:pPr><w:r><w:rPr><w:color w:val="152A35"/></w:rPr><w:t>/orchestrator-deps</w:t></w:r></w:p></w:tc><w:tc><w:tcPr><w:tcW w:w="6078" w:type="dxa"/><w:shd w:val="clear" w:color="auto" w:fill="F0F0F0"/><w:vAlign w:val="center"/></w:tcPr><w:p><w:pPr><w:spacing w:line="240" w:lineRule="auto"/><w:jc w:val="left"/></w:pPr><w:r><w:rPr><w:color w:val="152A35"/></w:rPr><w:t>Mapa de dependencias entre proyectos de una solución</w:t></w:r></w:p></w:tc></w:tr><w:tr><w:trPr><w:trHeight w:val="500"/><w:jc w:val="center"/></w:trPr><w:tc><w:tcPr><w:tcW w:w="3500" w:type="dxa"/><w:shd w:val="clear" w:color="auto" w:fill="FFFFFF"/><w:vAlign w:val="center"/></w:tcPr><w:p><w:pPr><w:spacing w:line="240" w:lineRule="auto"/><w:jc w:val="left"/></w:pPr><w:r><w:rPr><w:color w:val="152A35"/></w:rPr><w:t>/orchestrator-impacto</w:t></w:r></w:p></w:tc><w:tc><w:tcPr><w:tcW w:w="6078" w:type="dxa"/><w:shd w:val="clear" w:color="auto" w:fill="FFFFFF"/><w:vAlign w:val="center"/></w:tcPr><w:p><w:pPr><w:spacing w:line="240" w:lineRule="auto"/><w:jc w:val="left"/></w:pPr><w:r><w:rPr><w:color w:val="152A35"/></w:rPr><w:t>Mapa de impacto de un cambio propuesto: qué puede romperse</w:t></w:r></w:p></w:tc></w:tr><w:tr><w:trPr><w:trHeight w:val="500"/><w:jc w:val="center"/></w:trPr><w:tc><w:tcPr><w:tcW w:w="3500" w:type="dxa"/><w:shd w:val="clear" w:color="auto" w:fill="F0F0F0"/><w:vAlign w:val="center"/></w:tcPr><w:p><w:pPr><w:spacing w:line="240" w:lineRule="auto"/><w:jc w:val="left"/></w:pPr><w:r><w:rPr><w:color w:val="152A35"/></w:rPr><w:t>/orchestrator-explicar [símbolo|fichero]</w:t></w:r></w:p></w:tc><w:tc><w:tcPr><w:tcW w:w="6078" w:type="dxa"/><w:shd w:val="clear" w:color="auto" w:fill="F0F0F0"/><w:vAlign w:val="center"/></w:tcPr><w:p><w:pPr><w:spacing w:line="240" w:lineRule="auto"/><w:jc w:val="left"/></w:pPr><w:r><w:rPr><w:color w:val="152A35"/></w:rPr><w:t>Explica en detalle una clase, método o fichero</w:t></w:r></w:p></w:tc></w:tr><w:tr><w:trPr><w:trHeight w:val="500"/><w:jc w:val="center"/></w:trPr><w:tc><w:tcPr><w:tcW w:w="3500" w:type="dxa"/><w:shd w:val="clear" w:color="auto" w:fill="FFFFFF"/><w:vAlign w:val="center"/></w:tcPr><w:p><w:pPr><w:spacing w:line="240" w:lineRule="auto"/><w:jc w:val="left"/></w:pPr><w:r><w:rPr><w:color w:val="152A35"/></w:rPr><w:t>/orchestrator-doc</w:t></w:r></w:p></w:tc><w:tc><w:tcPr><w:tcW w:w="6078" w:type="dxa"/><w:shd w:val="clear" w:color="auto" w:fill="FFFFFF"/><w:vAlign w:val="center"/></w:tcPr><w:p><w:pPr><w:spacing w:line="240" w:lineRule="auto"/><w:jc w:val="left"/></w:pPr><w:r><w:rPr><w:color w:val="152A35"/></w:rPr><w:t>Genera documentación técnica de un módulo o clase</w:t></w:r></w:p></w:tc></w:tr><w:tr><w:trPr><w:trHeight w:val="500"/><w:jc w:val="center"/></w:trPr><w:tc><w:tcPr><w:tcW w:w="3500" w:type="dxa"/><w:shd w:val="clear" w:color="auto" w:fill="F0F0F0"/><w:vAlign w:val="center"/></w:tcPr><w:p><w:pPr><w:spacing w:line="240" w:lineRule="auto"/><w:jc w:val="left"/></w:pPr><w:r><w:rPr><w:color w:val="152A35"/></w:rPr><w:t>/orchestrator-doc-drift</w:t></w:r></w:p></w:tc><w:tc><w:tcPr><w:tcW w:w="6078" w:type="dxa"/><w:shd w:val="clear" w:color="auto" w:fill="F0F0F0"/><w:vAlign w:val="center"/></w:tcPr><w:p><w:pPr><w:spacing w:line="240" w:lineRule="auto"/><w:jc w:val="left"/></w:pPr><w:r><w:rPr><w:color w:val="152A35"/></w:rPr><w:t>Detecta divergencia entre documentación y código actual</w:t></w:r></w:p></w:tc></w:tr><w:tr><w:trPr><w:trHeight w:val="500"/><w:jc w:val="center"/></w:trPr><w:tc><w:tcPr><w:tcW w:w="3500" w:type="dxa"/><w:shd w:val="clear" w:color="auto" w:fill="FFFFFF"/><w:vAlign w:val="center"/></w:tcPr><w:p><w:pPr><w:spacing w:line="240" w:lineRule="auto"/><w:jc w:val="left"/></w:pPr><w:r><w:rPr><w:color w:val="152A35"/></w:rPr><w:t>/orchestrator-scacs-docs</w:t></w:r></w:p></w:tc><w:tc><w:tcPr><w:tcW w:w="6078" w:type="dxa"/><w:shd w:val="clear" w:color="auto" w:fill="FFFFFF"/><w:vAlign w:val="center"/></w:tcPr><w:p><w:pPr><w:spacing w:line="240" w:lineRule="auto"/><w:jc w:val="left"/></w:pPr><w:r><w:rPr><w:color w:val="152A35"/></w:rPr><w:t>Consulta la base de conocimiento ScacsWeb integrada</w:t></w:r></w:p></w:tc></w:tr><w:tr><w:trPr><w:trHeight w:val="500"/><w:jc w:val="center"/></w:trPr><w:tc><w:tcPr><w:tcW w:w="3500" w:type="dxa"/><w:shd w:val="clear" w:color="auto" w:fill="F0F0F0"/><w:vAlign w:val="center"/></w:tcPr><w:p><w:pPr><w:spacing w:line="240" w:lineRule="auto"/><w:jc w:val="left"/></w:pPr><w:r><w:rPr><w:color w:val="152A35"/></w:rPr><w:t>/orchestrator-dashboard</w:t></w:r></w:p></w:tc><w:tc><w:tcPr><w:tcW w:w="6078" w:type="dxa"/><w:shd w:val="clear" w:color="auto" w:fill="F0F0F0"/><w:vAlign w:val="center"/></w:tcPr><w:p><w:pPr><w:spacing w:line="240" w:lineRule="auto"/><w:jc w:val="left"/></w:pPr><w:r><w:rPr><w:color w:val="152A35"/></w:rPr><w:t>Panel resumen del estado del workspace: build, tests, cobertura</w:t></w:r></w:p></w:tc></w:tr></w:tbl><w:p/><w:p><w:pPr><w:pStyle w:val="Ttulo2"/></w:pPr><w:bookmarkStart w:id="16" w:name="_Toc236310419"/><w:r><w:t>Tests</w:t></w:r><w:bookmarkEnd w:id="16"/></w:p><w:tbl><w:tblPr><w:tblStyle w:val="a"/><w:tblW w:w="9578" w:type="dxa"/><w:jc w:val="center"/><w:tblBorders><w:top w:val="single" w:sz="4" w:space="0" w:color="DDDDDD"/><w:left w:val="single" w:sz="4" w:space="0" w:color="DDDDDD"/><w:bottom w:val="single" w:sz="4" w:space="0" w:color="DDDDDD"/><w:right w:val="single" w:sz="4" w:space="0" w:color="DDDDDD"/><w:insideH w:val="single" w:sz="4" w:space="0" w:color="DDDDDD"/><w:insideV w:val="single" w:sz="4" w:space="0" w:color="DDDDDD"/></w:tblBorders><w:tblLayout w:type="fixed"/><w:tblLook w:val="04A0" w:firstRow="1" w:lastRow="0" w:firstColumn="1" w:lastColumn="0" w:noHBand="0" w:noVBand="1"/></w:tblPr><w:tblGrid><w:gridCol w:w="3500"/><w:gridCol w:w="6078"/></w:tblGrid><w:tr><w:trPr><w:trHeight w:val="500"/><w:jc w:val="center"/></w:trPr><w:tc><w:tcPr><w:tcW w:w="3500" w:type="dxa"/><w:shd w:val="clear" w:color="auto" w:fill="00F7BC"/><w:vAlign w:val="center"/></w:tcPr><w:p><w:pPr><w:spacing w:line="240" w:lineRule="auto"/><w:jc w:val="left"/></w:pPr><w:r><w:rPr><w:b/><w:bCs/><w:color w:val="152A35"/></w:rPr><w:t>COMANDO</w:t></w:r></w:p></w:tc><w:tc><w:tcPr><w:tcW w:w="6078" w:type="dxa"/><w:shd w:val="clear" w:color="auto" w:fill="00F7BC"/><w:vAlign w:val="center"/></w:tcPr><w:p><w:pPr><w:spacing w:line="240" w:lineRule="auto"/><w:jc w:val="left"/></w:pPr><w:r><w:rPr><w:b/><w:bCs/><w:color w:val="152A35"/></w:rPr><w:t>QUÉ HACE</w:t></w:r></w:p></w:tc></w:tr><w:tr><w:trPr><w:trHeight w:val="500"/><w:jc w:val="center"/></w:trPr><w:tc><w:tcPr><w:tcW w:w="3500" w:type="dxa"/><w:shd w:val="clear" w:color="auto" w:fill="FFFFFF"/><w:vAlign w:val="center"/></w:tcPr><w:p><w:pPr><w:spacing w:line="240" w:lineRule="auto"/><w:jc w:val="left"/></w:pPr><w:r><w:rPr><w:color w:val="152A35"/></w:rPr><w:t>/orchestrator-test</w:t></w:r></w:p></w:tc><w:tc><w:tcPr><w:tcW w:w="6078" w:type="dxa"/><w:shd w:val="clear" w:color="auto" w:fill="FFFFFF"/><w:vAlign w:val="center"/></w:tcPr><w:p><w:pPr><w:spacing w:line="240" w:lineRule="auto"/><w:jc w:val="left"/></w:pPr><w:r><w:rPr><w:color w:val="152A35"/></w:rPr><w:t>Ejecuta la suite de tests del proyecto</w:t></w:r></w:p></w:tc></w:tr><w:tr><w:trPr><w:trHeight w:val="500"/><w:jc w:val="center"/></w:trPr><w:tc><w:tcPr><w:tcW w:w="3500" w:type="dxa"/><w:shd w:val="clear" w:color="auto" w:fill="F0F0F0"/><w:vAlign w:val="center"/></w:tcPr><w:p><w:pPr><w:spacing w:line="240" w:lineRule="auto"/><w:jc w:val="left"/></w:pPr><w:r><w:rPr><w:color w:val="152A35"/></w:rPr><w:t>/orchestrator-crear-tests</w:t></w:r></w:p></w:tc><w:tc><w:tcPr><w:tcW w:w="6078" w:type="dxa"/><w:shd w:val="clear" w:color="auto" w:fill="F0F0F0"/><w:vAlign w:val="center"/></w:tcPr><w:p><w:pPr><w:spacing w:line="240" w:lineRule="auto"/><w:jc w:val="left"/></w:pPr><w:r><w:rPr><w:color w:val="152A35"/></w:rPr><w:t>Genera tests unitarios para una clase o método concreto</w:t></w:r></w:p></w:tc></w:tr></w:tbl><w:p/><w:p><w:pPr><w:pStyle w:val="Ttulo2"/></w:pPr><w:bookmarkStart w:id="17" w:name="_Toc236310420"/><w:r><w:t>Integración con Mantis</w:t></w:r><w:bookmarkEnd w:id="17"/></w:p><w:tbl><w:tblPr><w:tblStyle w:val="a"/><w:tblW w:w="9578" w:type="dxa"/><w:jc w:val="center"/><w:tblBorders><w:top w:val="single" w:sz="4" w:space="0" w:color="DDDDDD"/><w:left w:val="single" w:sz="4" w:space="0" w:color="DDDDDD"/><w:bottom w:val="single" w:sz="4" w:space="0" w:color="DDDDDD"/><w:right w:val="single" w:sz="4" w:space="0" w:color="DDDDDD"/><w:insideH w:val="single" w:sz="4" w:space="0" w:color="DDDDDD"/><w:insideV w:val="single" w:sz="4" w:space="0" w:color="DDDDDD"/></w:tblBorders><w:tblLayout w:type="fixed"/><w:tblLook w:val="04A0" w:firstRow="1" w:lastRow="0" w:firstColumn="1" w:lastColumn="0" w:noHBand="0" w:noVBand="1"/></w:tblPr><w:tblGrid><w:gridCol w:w="3500"/><w:gridCol w:w="6078"/></w:tblGrid><w:tr><w:trPr><w:trHeight w:val="500"/><w:jc w:val="center"/></w:trPr><w:tc><w:tcPr><w:tcW w:w="3500" w:type="dxa"/><w:shd w:val="clear" w:color="auto" w:fill="00F7BC"/><w:vAlign w:val="center"/></w:tcPr><w:p><w:pPr><w:spacing w:line="240" w:lineRule="auto"/><w:jc w:val="left"/></w:pPr><w:r><w:rPr><w:b/><w:bCs/><w:color w:val="152A35"/></w:rPr><w:t>COMANDO</w:t></w:r></w:p></w:tc><w:tc><w:tcPr><w:tcW w:w="6078" w:type="dxa"/><w:shd w:val="clear" w:color="auto" w:fill="00F7BC"/><w:vAlign w:val="center"/></w:tcPr><w:p><w:pPr><w:spacing w:line="240" w:lineRule="auto"/><w:jc w:val="left"/></w:pPr><w:r><w:rPr><w:b/><w:bCs/><w:color w:val="152A35"/></w:rPr><w:t>QUÉ HACE</w:t></w:r></w:p></w:tc></w:tr><w:tr><w:trPr><w:trHeight w:val="500"/><w:jc w:val="center"/></w:trPr><w:tc><w:tcPr><w:tcW w:w="3500" w:type="dxa"/><w:shd w:val="clear" w:color="auto" w:fill="FFFFFF"/><w:vAlign w:val="center"/></w:tcPr><w:p><w:pPr><w:spacing w:line="240" w:lineRule="auto"/><w:jc w:val="left"/></w:pPr><w:r><w:rPr><w:color w:val="152A35"/></w:rPr><w:t>/orchestrator-mantis #NNNN</w:t></w:r></w:p></w:tc><w:tc><w:tcPr><w:tcW w:w="6078" w:type="dxa"/><w:shd w:val="clear" w:color="auto" w:fill="FFFFFF"/><w:vAlign w:val="center"/></w:tcPr><w:p><w:pPr><w:spacing w:line="240" w:lineRule="auto"/><w:jc w:val="left"/></w:pPr><w:r><w:rPr><w:color w:val="152A35"/></w:rPr><w:t>Consulta un issue de MantisBT por número</w:t></w:r></w:p></w:tc></w:tr><w:tr><w:trPr><w:trHeight w:val="500"/><w:jc w:val="center"/></w:trPr><w:tc><w:tcPr><w:tcW w:w="3500" w:type="dxa"/><w:shd w:val="clear" w:color="auto" w:fill="F0F0F0"/><w:vAlign w:val="center"/></w:tcPr><w:p><w:pPr><w:spacing w:line="240" w:lineRule="auto"/><w:jc w:val="left"/></w:pPr><w:r><w:rPr><w:color w:val="152A35"/></w:rPr><w:t>/orchestrator-mantis proyecto NNNN</w:t></w:r></w:p></w:tc><w:tc><w:tcPr><w:tcW w:w="6078" w:type="dxa"/><w:shd w:val="clear" w:color="auto" w:fill="F0F0F0"/><w:vAlign w:val="center"/></w:tcPr><w:p><w:pPr><w:spacing w:line="240" w:lineRule="auto"/><w:jc w:val="left"/></w:pPr><w:r><w:rPr><w:color w:val="152A35"/></w:rPr><w:t>Lista issues de un proyecto de MantisBT</w:t></w:r></w:p></w:tc></w:tr></w:tbl><w:p/><w:p><w:pPr><w:pStyle w:val="Ttulo2"/></w:pPr><w:bookmarkStart w:id="18" w:name="_Toc236310421"/><w:r><w:t>Estadísticas y utilidades</w:t></w:r><w:bookmarkEnd w:id="18"/></w:p><w:tbl><w:tblPr><w:tblStyle w:val="a"/><w:tblW w:w="9578" w:type="dxa"/><w:jc w:val="center"/><w:tblBorders><w:top w:val="single" w:sz="4" w:space="0" w:color="DDDDDD"/><w:left w:val="single" w:sz="4" w:space="0" w:color="DDDDDD"/><w:bottom w:val="single" w:sz="4" w:space="0" w:color="DDDDDD"/><w:right w:val="single" w:sz="4" w:space="0" w:color="DDDDDD"/><w:insideH w:val="single" w:sz="4" w:space="0" w:color="DDDDDD"/><w:insideV w:val="single" w:sz="4" w:space="0" w:color="DDDDDD"/></w:tblBorders><w:tblLayout w:type="fixed"/><w:tblLook w:val="04A0" w:firstRow="1" w:lastRow="0" w:firstColumn="1" w:lastColumn="0" w:noHBand="0" w:noVBand="1"/></w:tblPr><w:tblGrid><w:gridCol w:w="3500"/><w:gridCol w:w="6078"/></w:tblGrid><w:tr><w:trPr><w:trHeight w:val="500"/><w:jc w:val="center"/></w:trPr><w:tc><w:tcPr><w:tcW w:w="3500" w:type="dxa"/><w:shd w:val="clear" w:color="auto" w:fill="00F7BC"/><w:vAlign w:val="center"/></w:tcPr><w:p><w:pPr><w:spacing w:line="240" w:lineRule="auto"/><w:jc w:val="left"/></w:pPr><w:r><w:rPr><w:b/><w:bCs/><w:color w:val="152A35"/></w:rPr><w:lastRenderedPageBreak/><w:t>COMANDO</w:t></w:r></w:p></w:tc><w:tc><w:tcPr><w:tcW w:w="6078" w:type="dxa"/><w:shd w:val="clear" w:color="auto" w:fill="00F7BC"/><w:vAlign w:val="center"/></w:tcPr><w:p><w:pPr><w:spacing w:line="240" w:lineRule="auto"/><w:jc w:val="left"/></w:pPr><w:r><w:rPr><w:b/><w:bCs/><w:color w:val="152A35"/></w:rPr><w:t>QUÉ HACE</w:t></w:r></w:p></w:tc></w:tr><w:tr><w:trPr><w:trHeight w:val="500"/><w:jc w:val="center"/></w:trPr><w:tc><w:tcPr><w:tcW w:w="3500" w:type="dxa"/><w:shd w:val="clear" w:color="auto" w:fill="FFFFFF"/><w:vAlign w:val="center"/></w:tcPr><w:p><w:pPr><w:spacing w:line="240" w:lineRule="auto"/><w:jc w:val="left"/></w:pPr><w:r><w:rPr><w:color w:val="152A35"/></w:rPr><w:t>/orchestrator-stats</w:t></w:r></w:p></w:tc><w:tc><w:tcPr><w:tcW w:w="6078" w:type="dxa"/><w:shd w:val="clear" w:color="auto" w:fill="FFFFFF"/><w:vAlign w:val="center"/></w:tcPr><w:p><w:pPr><w:spacing w:line="240" w:lineRule="auto"/><w:jc w:val="left"/></w:pPr><w:r><w:rPr><w:color w:val="152A35"/></w:rPr><w:t>Estadísticas de uso del pipeline: comandos más usados, tiempos</w:t></w:r></w:p></w:tc></w:tr><w:tr><w:trPr><w:trHeight w:val="500"/><w:jc w:val="center"/></w:trPr><w:tc><w:tcPr><w:tcW w:w="3500" w:type="dxa"/><w:shd w:val="clear" w:color="auto" w:fill="F0F0F0"/><w:vAlign w:val="center"/></w:tcPr><w:p><w:pPr><w:spacing w:line="240" w:lineRule="auto"/><w:jc w:val="left"/></w:pPr><w:r><w:rPr><w:color w:val="152A35"/></w:rPr><w:t>/orchestrator-idiomas</w:t></w:r></w:p></w:tc><w:tc><w:tcPr><w:tcW w:w="6078" w:type="dxa"/><w:shd w:val="clear" w:color="auto" w:fill="F0F0F0"/><w:vAlign w:val="center"/></w:tcPr><w:p><w:pPr><w:spacing w:line="240" w:lineRule="auto"/><w:jc w:val="left"/></w:pPr><w:r><w:rPr><w:color w:val="152A35"/></w:rPr><w:t>Detecta mezcla de idiomas en nombres de variables y métodos</w:t></w:r></w:p></w:tc></w:tr><w:tr><w:trPr><w:trHeight w:val="500"/><w:jc w:val="center"/></w:trPr><w:tc><w:tcPr><w:tcW w:w="3500" w:type="dxa"/><w:shd w:val="clear" w:color="auto" w:fill="FFFFFF"/><w:vAlign w:val="center"/></w:tcPr><w:p><w:pPr><w:spacing w:line="240" w:lineRule="auto"/><w:jc w:val="left"/></w:pPr><w:r><w:rPr><w:color w:val="152A35"/></w:rPr><w:t>/orchestrator-agent</w:t></w:r></w:p></w:tc><w:tc><w:tcPr><w:tcW w:w="6078" w:type="dxa"/><w:shd w:val="clear" w:color="auto" w:fill="FFFFFF"/><w:vAlign w:val="center"/></w:tcPr><w:p><w:pPr><w:spacing w:line="240" w:lineRule="auto"/><w:jc w:val="left"/></w:pPr><w:r><w:rPr><w:color w:val="152A35"/></w:rPr><w:t>Punto de entrada genérico para tareas no cubiertas por otros comandos</w:t></w:r></w:p></w:tc></w:tr><w:tr><w:trPr><w:trHeight w:val="500"/><w:jc w:val="center"/></w:trPr><w:tc><w:tcPr><w:tcW w:w="3500" w:type="dxa"/><w:shd w:val="clear" w:color="auto" w:fill="F0F0F0"/><w:vAlign w:val="center"/></w:tcPr><w:p><w:pPr><w:spacing w:line="240" w:lineRule="auto"/><w:jc w:val="left"/></w:pPr><w:r><w:rPr><w:color w:val="152A35"/></w:rPr><w:t>/orchestrator-help</w:t></w:r></w:p></w:tc><w:tc><w:tcPr><w:tcW w:w="6078" w:type="dxa"/><w:shd w:val="clear" w:color="auto" w:fill="F0F0F0"/><w:vAlign w:val="center"/></w:tcPr><w:p><w:pPr><w:spacing w:line="240" w:lineRule="auto"/><w:jc w:val="left"/></w:pPr><w:r><w:rPr><w:color w:val="152A35"/></w:rPr><w:t>Muestra esta ayuda como página HTML navegable</w:t></w:r></w:p></w:tc></w:tr></w:tbl><w:p/><w:p><w:pPr><w:pStyle w:val="Ttulo1"/></w:pPr><w:bookmarkStart w:id="40" w:name="_TocEnvJson"/><w:r><w:t>Configuraci&#xF3;n de entorno (env.json)</w:t></w:r><w:bookmarkEnd w:id="40"/></w:p><w:p><w:r><w:t xml:space="preserve">El plugin gestiona el contexto de base de datos y herramientas de forma aut&#xF3;noma, sin depender de skills externos.</w:t></w:r></w:p><w:p><w:pPr><w:pStyle w:val="Ttulo2"/></w:pPr><w:r><w:t>Estructura de archivos</w:t></w:r></w:p><w:p><w:pPr><w:shd w:val="clear" w:color="auto" w:fill="F5F5F5"/><w:spacing w:after="0" w:line="240" w:lineRule="auto"/></w:pPr><w:r><w:rPr><w:rFonts w:ascii="Courier New" w:hAnsi="Courier New" w:cs="Courier New"/><w:color w:val="152A35"/><w:sz w:val="18"/><w:szCs w:val="18"/></w:rPr><w:t xml:space="preserve">&lt;directorio-del-plugin&gt;/</w:t></w:r></w:p><w:p><w:pPr><w:shd w:val="clear" w:color="auto" w:fill="F5F5F5"/><w:spacing w:after="0" w:line="240" w:lineRule="auto"/></w:pPr><w:r><w:rPr><w:rFonts w:ascii="Courier New" w:hAnsi="Courier New" w:cs="Courier New"/><w:color w:val="152A35"/><w:sz w:val="18"/><w:szCs w:val="18"/></w:rPr><w:t xml:space="preserve">&#x251C;&#x2500;&#x2500; env.json              &lt;-- TU configuraci&#xF3;n local (gitignored)</w:t></w:r></w:p><w:p><w:pPr><w:shd w:val="clear" w:color="auto" w:fill="F5F5F5"/><w:spacing w:after="0" w:line="240" w:lineRule="auto"/></w:pPr><w:r><w:rPr><w:rFonts w:ascii="Courier New" w:hAnsi="Courier New" w:cs="Courier New"/><w:color w:val="152A35"/><w:sz w:val="18"/><w:szCs w:val="18"/></w:rPr><w:t xml:space="preserve">&#x251C;&#x2500;&#x2500; env.template.json     &lt;-- Plantilla vac&#xED;a (incluida en el repositorio)</w:t></w:r></w:p><w:p><w:pPr><w:shd w:val="clear" w:color="auto" w:fill="F5F5F5"/><w:spacing w:after="0" w:line="240" w:lineRule="auto"/></w:pPr><w:r><w:rPr><w:rFonts w:ascii="Courier New" w:hAnsi="Courier New" w:cs="Courier New"/><w:color w:val="152A35"/><w:sz w:val="18"/><w:szCs w:val="18"/></w:rPr><w:t xml:space="preserve">&#x2514;&#x2500;&#x2500; projects/</w:t></w:r></w:p><w:p><w:pPr><w:shd w:val="clear" w:color="auto" w:fill="F5F5F5"/><w:spacing w:after="0" w:line="240" w:lineRule="auto"/></w:pPr><w:r><w:rPr><w:rFonts w:ascii="Courier New" w:hAnsi="Courier New" w:cs="Courier New"/><w:color w:val="152A35"/><w:sz w:val="18"/><w:szCs w:val="18"/></w:rPr><w:t xml:space="preserve">    &#x251C;&#x2500;&#x2500; Ingenieros/</w:t></w:r></w:p><w:p><w:pPr><w:shd w:val="clear" w:color="auto" w:fill="F5F5F5"/><w:spacing w:after="0" w:line="240" w:lineRule="auto"/></w:pPr><w:r><w:rPr><w:rFonts w:ascii="Courier New" w:hAnsi="Courier New" w:cs="Courier New"/><w:color w:val="152A35"/><w:sz w:val="18"/><w:szCs w:val="18"/></w:rPr><w:t xml:space="preserve">    &#x2502;   &#x251C;&#x2500;&#x2500; config.json   &lt;-- Metadatos del proyecto (motor, host, TNS alias...)</w:t></w:r></w:p><w:p><w:pPr><w:shd w:val="clear" w:color="auto" w:fill="F5F5F5"/><w:spacing w:after="0" w:line="240" w:lineRule="auto"/></w:pPr><w:r><w:rPr><w:rFonts w:ascii="Courier New" w:hAnsi="Courier New" w:cs="Courier New"/><w:color w:val="152A35"/><w:sz w:val="18"/><w:szCs w:val="18"/></w:rPr><w:t xml:space="preserve">    &#x2502;   &#x2514;&#x2500;&#x2500; schema.md     &lt;-- Esquema completo BD (gitignored por tama&#xF1;o)</w:t></w:r></w:p><w:p><w:pPr><w:shd w:val="clear" w:color="auto" w:fill="F5F5F5"/><w:spacing w:after="0" w:line="240" w:lineRule="auto"/></w:pPr><w:r><w:rPr><w:rFonts w:ascii="Courier New" w:hAnsi="Courier New" w:cs="Courier New"/><w:color w:val="152A35"/><w:sz w:val="18"/><w:szCs w:val="18"/></w:rPr><w:t xml:space="preserve">    &#x2514;&#x2500;&#x2500; bancamarch/</w:t></w:r></w:p><w:p><w:pPr><w:shd w:val="clear" w:color="auto" w:fill="F5F5F5"/><w:spacing w:after="0" w:line="240" w:lineRule="auto"/></w:pPr><w:r><w:rPr><w:rFonts w:ascii="Courier New" w:hAnsi="Courier New" w:cs="Courier New"/><w:color w:val="152A35"/><w:sz w:val="18"/><w:szCs w:val="18"/></w:rPr><w:t xml:space="preserve">        &#x251C;&#x2500;&#x2500; config.json</w:t></w:r></w:p><w:p><w:pPr><w:shd w:val="clear" w:color="auto" w:fill="F5F5F5"/><w:spacing w:after="0" w:line="240" w:lineRule="auto"/></w:pPr><w:r><w:rPr><w:rFonts w:ascii="Courier New" w:hAnsi="Courier New" w:cs="Courier New"/><w:color w:val="152A35"/><w:sz w:val="18"/><w:szCs w:val="18"/></w:rPr><w:t xml:space="preserve">        &#x2514;&#x2500;&#x2500; schema.md</w:t></w:r></w:p><w:p><w:pPr><w:pStyle w:val="Ttulo2"/></w:pPr><w:r><w:t>Secciones principales de env.json</w:t></w:r></w:p><w:tbl><w:tblPr><w:tblStyle w:val="Tablaconestilo1"/><w:tblW w:w="9578" w:type="dxa"/><w:tblLook w:val="04A0" w:firstRow="1" w:lastRow="0" w:firstColumn="1" w:lastColumn="0" w:noHBand="0" w:noVBand="1"/></w:tblPr><w:tblGrid><w:gridCol w:w="4789"/><w:gridCol w:w="4789"/></w:tblGrid><w:tr w14:paraId="BB0002H0"><w:trPr><w:trHeight w:val="500"/><w:jc w:val="center"/></w:trPr><w:tc><w:tcPr><w:tcW w:w="4789" w:type="dxa"/><w:shd w:val="clear" w:color="auto" w:fill="152A35"/><w:vAlign w:val="center"/></w:tcPr><w:p w14:paraId="BB0002H1"><w:pPr><w:spacing w:line="240" w:lineRule="auto"/><w:jc w:val="left"/></w:pPr><w:r><w:rPr><w:b/><w:color w:val="FFFFFF"/></w:rPr><w:t>Secci&#xF3;n</w:t></w:r></w:p></w:tc><w:tc><w:tcPr><w:tcW w:w="4789" w:type="dxa"/><w:shd w:val="clear" w:color="auto" w:fill="152A35"/><w:vAlign w:val="center"/></w:tcPr><w:p w14:paraId="BB0002H2"><w:pPr><w:spacing w:line="240" w:lineRule="auto"/><w:jc w:val="left"/></w:pPr><w:r><w:rPr><w:b/><w:color w:val="FFFFFF"/></w:rPr><w:t>Contenido</w:t></w:r></w:p></w:tc></w:tr><w:tr w14:paraId="BB0002R0A0"><w:trPr><w:trHeight w:val="500"/><w:jc w:val="center"/></w:trPr><w:tc><w:tcPr><w:tcW w:w="4789" w:type="dxa"/><w:shd w:val="clear" w:color="auto" w:fill="F0F0F0"/><w:vAlign w:val="center"/></w:tcPr><w:p w14:paraId="BB0002R0A"><w:pPr><w:spacing w:line="240" w:lineRule="auto"/><w:jc w:val="left"/></w:pPr><w:r><w:rPr><w:color w:val="152A35"/></w:rPr><w:t xml:space="preserve">herramientas.mantis</w:t></w:r></w:p></w:tc><w:tc><w:tcPr><w:tcW w:w="4789" w:type="dxa"/><w:shd w:val="clear" w:color="auto" w:fill="F0F0F0"/><w:vAlign w:val="center"/></w:tcPr><w:p w14:paraId="BB0002R0B"><w:pPr><w:spacing w:line="240" w:lineRule="auto"/><w:jc w:val="left"/></w:pPr><w:r><w:rPr><w:color w:val="152A35"/></w:rPr><w:t xml:space="preserve">URL, usuario y API key de MantisBT</w:t></w:r></w:p></w:tc></w:tr><w:tr w14:paraId="BB0002R1A0"><w:trPr><w:trHeight w:val="500"/><w:jc w:val="center"/></w:trPr><w:tc><w:tcPr><w:tcW w:w="4789" w:type="dxa"/><w:shd w:val="clear" w:color="auto" w:fill="FFFFFF"/><w:vAlign w:val="center"/></w:tcPr><w:p w14:paraId="BB0002R1A"><w:pPr><w:spacing w:line="240" w:lineRule="auto"/><w:jc w:val="left"/></w:pPr><w:r><w:rPr><w:color w:val="152A35"/></w:rPr><w:t xml:space="preserve">herramientas.svn</w:t></w:r></w:p></w:tc><w:tc><w:tcPr><w:tcW w:w="4789" w:type="dxa"/><w:shd w:val="clear" w:color="auto" w:fill="FFFFFF"/><w:vAlign w:val="center"/></w:tcPr><w:p w14:paraId="BB0002R1B"><w:pPr><w:spacing w:line="240" w:lineRule="auto"/><w:jc w:val="left"/></w:pPr><w:r><w:rPr><w:color w:val="152A35"/></w:rPr><w:t xml:space="preserve">URL y credenciales del repositorio SVN</w:t></w:r></w:p></w:tc></w:tr><w:tr w14:paraId="BB0002R2A0"><w:trPr><w:trHeight w:val="500"/><w:jc w:val="center"/></w:trPr><w:tc><w:tcPr><w:tcW w:w="4789" w:type="dxa"/><w:shd w:val="clear" w:color="auto" w:fill="F0F0F0"/><w:vAlign w:val="center"/></w:tcPr><w:p w14:paraId="BB0002R2A"><w:pPr><w:spacing w:line="240" w:lineRule="auto"/><w:jc w:val="left"/></w:pPr><w:r><w:rPr><w:color w:val="152A35"/></w:rPr><w:t xml:space="preserve">herramientas.correo</w:t></w:r></w:p></w:tc><w:tc><w:tcPr><w:tcW w:w="4789" w:type="dxa"/><w:shd w:val="clear" w:color="auto" w:fill="F0F0F0"/><w:vAlign w:val="center"/></w:tcPr><w:p w14:paraId="BB0002R2B"><w:pPr><w:spacing w:line="240" w:lineRule="auto"/><w:jc w:val="left"/></w:pPr><w:r><w:rPr><w:color w:val="152A35"/></w:rPr><w:t xml:space="preserve">SMTP para ejemplos de env&#xED;o desde C#</w:t></w:r></w:p></w:tc></w:tr><w:tr w14:paraId="BB0002R3A0"><w:trPr><w:trHeight w:val="500"/><w:jc w:val="center"/></w:trPr><w:tc><w:tcPr><w:tcW w:w="4789" w:type="dxa"/><w:shd w:val="clear" w:color="auto" w:fill="FFFFFF"/><w:vAlign w:val="center"/></w:tcPr><w:p w14:paraId="BB0002R3A"><w:pPr><w:spacing w:line="240" w:lineRule="auto"/><w:jc w:val="left"/></w:pPr><w:r><w:rPr><w:color w:val="152A35"/></w:rPr><w:t xml:space="preserve">credenciales_bbdd</w:t></w:r></w:p></w:tc><w:tc><w:tcPr><w:tcW w:w="4789" w:type="dxa"/><w:shd w:val="clear" w:color="auto" w:fill="FFFFFF"/><w:vAlign w:val="center"/></w:tcPr><w:p w14:paraId="BB0002R3B"><w:pPr><w:spacing w:line="240" w:lineRule="auto"/><w:jc w:val="left"/></w:pPr><w:r><w:rPr><w:color w:val="152A35"/></w:rPr><w:t xml:space="preserve">Usuarios y passwords por proyecto y entorno</w:t></w:r></w:p></w:tc></w:tr><w:tr w14:paraId="BB0002R4A0"><w:trPr><w:trHeight w:val="500"/><w:jc w:val="center"/></w:trPr><w:tc><w:tcPr><w:tcW w:w="4789" w:type="dxa"/><w:shd w:val="clear" w:color="auto" w:fill="F0F0F0"/><w:vAlign w:val="center"/></w:tcPr><w:p w14:paraId="BB0002R4A"><w:pPr><w:spacing w:line="240" w:lineRule="auto"/><w:jc w:val="left"/></w:pPr><w:r><w:rPr><w:color w:val="152A35"/></w:rPr><w:t xml:space="preserve">entornos</w:t></w:r></w:p></w:tc><w:tc><w:tcPr><w:tcW w:w="4789" w:type="dxa"/><w:shd w:val="clear" w:color="auto" w:fill="F0F0F0"/><w:vAlign w:val="center"/></w:tcPr><w:p w14:paraId="BB0002R4B"><w:pPr><w:spacing w:line="240" w:lineRule="auto"/><w:jc w:val="left"/></w:pPr><w:r><w:rPr><w:color w:val="152A35"/></w:rPr><w:t xml:space="preserve">Connection strings Oracle/SQL Server por proyecto (DEV/PRE/PRO)</w:t></w:r></w:p></w:tc></w:tr><w:tr w14:paraId="BB0002R5A0"><w:trPr><w:trHeight w:val="500"/><w:jc w:val="center"/></w:trPr><w:tc><w:tcPr><w:tcW w:w="4789" w:type="dxa"/><w:shd w:val="clear" w:color="auto" w:fill="FFFFFF"/><w:vAlign w:val="center"/></w:tcPr><w:p w14:paraId="BB0002R5A"><w:pPr><w:spacing w:line="240" w:lineRule="auto"/><w:jc w:val="left"/></w:pPr><w:r><w:rPr><w:color w:val="152A35"/></w:rPr><w:t xml:space="preserve">contexto_personal</w:t></w:r></w:p></w:tc><w:tc><w:tcPr><w:tcW w:w="4789" w:type="dxa"/><w:shd w:val="clear" w:color="auto" w:fill="FFFFFF"/><w:vAlign w:val="center"/></w:tcPr><w:p w14:paraId="BB0002R5B"><w:pPr><w:spacing w:line="240" w:lineRule="auto"/><w:jc w:val="left"/></w:pPr><w:r><w:rPr><w:color w:val="152A35"/></w:rPr><w:t xml:space="preserve">Nombre, rol, empresa y equipo del desarrollador</w:t></w:r></w:p></w:tc></w:tr></w:tbl><w:p><w:pPr><w:pStyle w:val="Ttulo2"/></w:pPr><w:r><w:t>Comportamiento si env.json no existe</w:t></w:r></w:p><w:p><w:r><w:t xml:space="preserve">El agente detecta la ausencia autom&#xE1;ticamente:</w:t></w:r></w:p><w:p><w:pPr><w:numPr><w:ilvl w:val="0"/><w:numId w:val="1"/></w:numPr><w:spacing w:after="60"/></w:pPr><w:r><w:t xml:space="preserve">Copia env.template.json &#x2192; env.json</w:t></w:r></w:p><w:p><w:pPr><w:numPr><w:ilvl w:val="0"/><w:numId w:val="1"/></w:numPr><w:spacing w:after="60"/></w:pPr><w:r><w:t xml:space="preserve">Informa al usuario con la ruta del archivo creado</w:t></w:r></w:p><w:p><w:pPr><w:numPr><w:ilvl w:val="0"/><w:numId w:val="1"/></w:numPr><w:spacing w:after="60"/></w:pPr><w:r><w:t xml:space="preserve">Se detiene hasta que el usuario confirme que ha rellenado las credenciales</w:t></w:r></w:p><w:p><w:r><w:t xml:space="preserve">El comando /orchestrator-validar-entorno tambi&#xE9;n verifica el estado de env.json y reporta si quedan placeholders &lt;COMPLETAR&gt; sin rellenar.</w:t></w:r></w:p><w:p><w:pPr><w:pStyle w:val="Ttulo1"/></w:pPr><w:bookmarkStart w:id="19" w:name="_Toc236310422"/><w:r><w:t>Servidor MCP — orchestrator-workspace</w:t></w:r><w:bookmarkEnd w:id="19"/></w:p><w:p><w:r><w:t>El plugin incluye un servidor MCP Python que corre en local (stdio) y expone herramientas nativas. Claude las invoca automáticamente al ejecutar los comandos. El servidor arranca en el primer uso y se detiene al cerrar Claude Code.</w:t></w:r></w:p><w:p><w:pPr><w:pStyle w:val="Ttulo2"/></w:pPr><w:bookmarkStart w:id="20" w:name="_Toc236310423"/><w:r><w:t>Herramientas disponibles</w:t></w:r><w:bookmarkEnd w:id="20"/></w:p><w:tbl><w:tblPr><w:tblStyle w:val="a"/><w:tblW w:w="9578" w:type="dxa"/><w:jc w:val="center"/><w:tblBorders><w:top w:val="single" w:sz="4" w:space="0" w:color="DDDDDD"/><w:left w:val="single" w:sz="4" w:space="0" w:color="DDDDDD"/><w:bottom w:val="single" w:sz="4" w:space="0" w:color="DDDDDD"/><w:right w:val="single" w:sz="4" w:space="0" w:color="DDDDDD"/><w:insideH w:val="single" w:sz="4" w:space="0" w:color="DDDDDD"/><w:insideV w:val="single" w:sz="4" w:space="0" w:color="DDDDDD"/></w:tblBorders><w:tblLayout w:type="fixed"/><w:tblLook w:val="04A0" w:firstRow="1" w:lastRow="0" w:firstColumn="1" w:lastColumn="0" w:noHBand="0" w:noVBand="1"/></w:tblPr><w:tblGrid><w:gridCol w:w="4000"/><w:gridCol w:w="5578"/></w:tblGrid><w:tr><w:trPr><w:trHeight w:val="500"/><w:jc w:val="center"/></w:trPr><w:tc><w:tcPr><w:tcW w:w="4000" w:type="dxa"/><w:shd w:val="clear" w:color="auto" w:fill="00F7BC"/><w:vAlign w:val="center"/></w:tcPr><w:p><w:pPr><w:spacing w:line="240" w:lineRule="auto"/><w:jc w:val="left"/></w:pPr><w:r><w:rPr><w:b/><w:bCs/><w:color w:val="152A35"/></w:rPr><w:t>HERRAMIENTA MCP</w:t></w:r></w:p></w:tc><w:tc><w:tcPr><w:tcW w:w="5578" w:type="dxa"/><w:shd w:val="clear" w:color="auto" w:fill="00F7BC"/><w:vAlign w:val="center"/></w:tcPr><w:p><w:pPr><w:spacing w:line="240" w:lineRule="auto"/><w:jc w:val="left"/></w:pPr><w:r><w:rPr><w:b/><w:bCs/><w:color w:val="152A35"/></w:rPr><w:t>PROPÓSITO</w:t></w:r></w:p></w:tc></w:tr><w:tr><w:trPr><w:trHeight w:val="500"/><w:jc w:val="center"/></w:trPr><w:tc><w:tcPr><w:tcW w:w="4000" w:type="dxa"/><w:shd w:val="clear" w:color="auto" w:fill="FFFFFF"/><w:vAlign w:val="center"/></w:tcPr><w:p><w:pPr><w:spacing w:line="240" w:lineRule="auto"/><w:jc w:val="left"/></w:pPr><w:r><w:rPr><w:color w:val="152A35"/></w:rPr><w:t>detect_vcs</w:t></w:r></w:p></w:tc><w:tc><w:tcPr><w:tcW w:w="5578" w:type="dxa"/><w:shd w:val="clear" w:color="auto" w:fill="FFFFFF"/><w:vAlign w:val="center"/></w:tcPr><w:p><w:pPr><w:spacing w:line="240" w:lineRule="auto"/><w:jc w:val="left"/></w:pPr><w:r><w:rPr><w:color w:val="152A35"/></w:rPr><w:t>Detecta si el workspace usa SVN, Git o ambos</w:t></w:r></w:p></w:tc></w:tr><w:tr><w:trPr><w:trHeight w:val="500"/><w:jc w:val="center"/></w:trPr><w:tc><w:tcPr><w:tcW w:w="4000" w:type="dxa"/><w:shd w:val="clear" w:color="auto" w:fill="F0F0F0"/><w:vAlign w:val="center"/></w:tcPr><w:p><w:pPr><w:spacing w:line="240" w:lineRule="auto"/><w:jc w:val="left"/></w:pPr><w:r><w:rPr><w:color w:val="152A35"/></w:rPr><w:t>svn_log / git_log</w:t></w:r></w:p></w:tc><w:tc><w:tcPr><w:tcW w:w="5578" w:type="dxa"/><w:shd w:val="clear" w:color="auto" w:fill="F0F0F0"/><w:vAlign w:val="center"/></w:tcPr><w:p><w:pPr><w:spacing w:line="240" w:lineRule="auto"/><w:jc w:val="left"/></w:pPr><w:r><w:rPr><w:color w:val="152A35"/></w:rPr><w:t>Historial de commits/revisiones</w:t></w:r></w:p></w:tc></w:tr><w:tr><w:trPr><w:trHeight w:val="500"/><w:jc w:val="center"/></w:trPr><w:tc><w:tcPr><w:tcW w:w="4000" w:type="dxa"/><w:shd w:val="clear" w:color="auto" w:fill="FFFFFF"/><w:vAlign w:val="center"/></w:tcPr><w:p><w:pPr><w:spacing w:line="240" w:lineRule="auto"/><w:jc w:val="left"/></w:pPr><w:r><w:rPr><w:color w:val="152A35"/></w:rPr><w:t>svn_diff_revision / git_diff_revision</w:t></w:r></w:p></w:tc><w:tc><w:tcPr><w:tcW w:w="5578" w:type="dxa"/><w:shd w:val="clear" w:color="auto" w:fill="FFFFFF"/><w:vAlign w:val="center"/></w:tcPr><w:p><w:pPr><w:spacing w:line="240" w:lineRule="auto"/><w:jc w:val="left"/></w:pPr><w:r><w:rPr><w:color w:val="152A35"/></w:rPr><w:t>Diff de una revisión concreta</w:t></w:r></w:p></w:tc></w:tr><w:tr><w:trPr><w:trHeight w:val="500"/><w:jc w:val="center"/></w:trPr><w:tc><w:tcPr><w:tcW w:w="4000" w:type="dxa"/><w:shd w:val="clear" w:color="auto" w:fill="F0F0F0"/><w:vAlign w:val="center"/></w:tcPr><w:p><w:pPr><w:spacing w:line="240" w:lineRule="auto"/><w:jc w:val="left"/></w:pPr><w:r><w:rPr><w:color w:val="152A35"/></w:rPr><w:t>svn_status / git_status</w:t></w:r></w:p></w:tc><w:tc><w:tcPr><w:tcW w:w="5578" w:type="dxa"/><w:shd w:val="clear" w:color="auto" w:fill="F0F0F0"/><w:vAlign w:val="center"/></w:tcPr><w:p><w:pPr><w:spacing w:line="240" w:lineRule="auto"/><w:jc w:val="left"/></w:pPr><w:r><w:rPr><w:color w:val="152A35"/></w:rPr><w:t>Estado de cambios pendientes</w:t></w:r></w:p></w:tc></w:tr><w:tr><w:trPr><w:trHeight w:val="500"/><w:jc w:val="center"/></w:trPr><w:tc><w:tcPr><w:tcW w:w="4000" w:type="dxa"/><w:shd w:val="clear" w:color="auto" w:fill="FFFFFF"/><w:vAlign w:val="center"/></w:tcPr><w:p><w:pPr><w:spacing w:line="240" w:lineRule="auto"/><w:jc w:val="left"/></w:pPr><w:r><w:rPr><w:color w:val="152A35"/></w:rPr><w:t>compile_check</w:t></w:r></w:p></w:tc><w:tc><w:tcPr><w:tcW w:w="5578" w:type="dxa"/><w:shd w:val="clear" w:color="auto" w:fill="FFFFFF"/><w:vAlign w:val="center"/></w:tcPr><w:p><w:pPr><w:spacing w:line="240" w:lineRule="auto"/><w:jc w:val="left"/></w:pPr><w:r><w:rPr><w:color w:val="152A35"/></w:rPr><w:t>Invoca MSBuild y devuelve errores/warnings</w:t></w:r></w:p></w:tc></w:tr><w:tr><w:trPr><w:trHeight w:val="500"/><w:jc w:val="center"/></w:trPr><w:tc><w:tcPr><w:tcW w:w="4000" w:type="dxa"/><w:shd w:val="clear" w:color="auto" w:fill="F0F0F0"/><w:vAlign w:val="center"/></w:tcPr><w:p><w:pPr><w:spacing w:line="240" w:lineRule="auto"/><w:jc w:val="left"/></w:pPr><w:r><w:rPr><w:color w:val="152A35"/></w:rPr><w:t>validate_solution</w:t></w:r></w:p></w:tc><w:tc><w:tcPr><w:tcW w:w="5578" w:type="dxa"/><w:shd w:val="clear" w:color="auto" w:fill="F0F0F0"/><w:vAlign w:val="center"/></w:tcPr><w:p><w:pPr><w:spacing w:line="240" w:lineRule="auto"/><w:jc w:val="left"/></w:pPr><w:r><w:rPr><w:color w:val="152A35"/></w:rPr><w:t>Validación completa de la solución .sln</w:t></w:r></w:p></w:tc></w:tr><w:tr><w:trPr><w:trHeight w:val="500"/><w:jc w:val="center"/></w:trPr><w:tc><w:tcPr><w:tcW w:w="4000" w:type="dxa"/><w:shd w:val="clear" w:color="auto" w:fill="FFFFFF"/><w:vAlign w:val="center"/></w:tcPr><w:p><w:pPr><w:spacing w:line="240" w:lineRule="auto"/><w:jc w:val="left"/></w:pPr><w:r><w:rPr><w:color w:val="152A35"/></w:rPr><w:t>run_tests</w:t></w:r></w:p></w:tc><w:tc><w:tcPr><w:tcW w:w="5578" w:type="dxa"/><w:shd w:val="clear" w:color="auto" w:fill="FFFFFF"/><w:vAlign w:val="center"/></w:tcPr><w:p><w:pPr><w:spacing w:line="240" w:lineRule="auto"/><w:jc w:val="left"/></w:pPr><w:r><w:rPr><w:color w:val="152A35"/></w:rPr><w:t>Ejecuta tests .NET y devuelve resultados</w:t></w:r></w:p></w:tc></w:tr><w:tr><w:trPr><w:trHeight w:val="500"/><w:jc w:val="center"/></w:trPr><w:tc><w:tcPr><w:tcW w:w="4000" w:type="dxa"/><w:shd w:val="clear" w:color="auto" w:fill="F0F0F0"/><w:vAlign w:val="center"/></w:tcPr><w:p><w:pPr><w:spacing w:line="240" w:lineRule="auto"/><w:jc w:val="left"/></w:pPr><w:r><w:rPr><w:color w:val="152A35"/></w:rPr><w:t>db_query</w:t></w:r></w:p></w:tc><w:tc><w:tcPr><w:tcW w:w="5578" w:type="dxa"/><w:shd w:val="clear" w:color="auto" w:fill="F0F0F0"/><w:vAlign w:val="center"/></w:tcPr><w:p><w:pPr><w:spacing w:line="240" w:lineRule="auto"/><w:jc w:val="left"/></w:pPr><w:r><w:rPr><w:color w:val="152A35"/></w:rPr><w:t>Consulta Oracle/SQL Server vía XMLConfig.xml</w:t></w:r></w:p></w:tc></w:tr><w:tr><w:trPr><w:trHeight w:val="500"/><w:jc w:val="center"/></w:trPr><w:tc><w:tcPr><w:tcW w:w="4000" w:type="dxa"/><w:shd w:val="clear" w:color="auto" w:fill="FFFFFF"/><w:vAlign w:val="center"/></w:tcPr><w:p><w:pPr><w:spacing w:line="240" w:lineRule="auto"/><w:jc w:val="left"/></w:pPr><w:r><w:rPr><w:color w:val="152A35"/></w:rPr><w:t>get_db_config</w:t></w:r></w:p></w:tc><w:tc><w:tcPr><w:tcW w:w="5578" w:type="dxa"/><w:shd w:val="clear" w:color="auto" w:fill="FFFFFF"/><w:vAlign w:val="center"/></w:tcPr><w:p><w:pPr><w:spacing w:line="240" w:lineRule="auto"/><w:jc w:val="left"/></w:pPr><w:r><w:rPr><w:color w:val="152A35"/></w:rPr><w:t>Lee configuración de conexión del workspace</w:t></w:r></w:p></w:tc></w:tr><w:tr><w:trPr><w:trHeight w:val="500"/><w:jc w:val="center"/></w:trPr><w:tc><w:tcPr><w:tcW w:w="4000" w:type="dxa"/><w:shd w:val="clear" w:color="auto" w:fill="F0F0F0"/><w:vAlign w:val="center"/></w:tcPr><w:p><w:pPr><w:spacing w:line="240" w:lineRule="auto"/><w:jc w:val="left"/></w:pPr><w:r><w:rPr><w:color w:val="152A35"/></w:rPr><w:t>get_table_schema</w:t></w:r></w:p></w:tc><w:tc><w:tcPr><w:tcW w:w="5578" w:type="dxa"/><w:shd w:val="clear" w:color="auto" w:fill="F0F0F0"/><w:vAlign w:val="center"/></w:tcPr><w:p><w:pPr><w:spacing w:line="240" w:lineRule="auto"/><w:jc w:val="left"/></w:pPr><w:r><w:rPr><w:color w:val="152A35"/></w:rPr><w:t>Esquema detallado de una tabla</w:t></w:r></w:p></w:tc></w:tr><w:tr><w:trPr><w:trHeight w:val="500"/><w:jc w:val="center"/></w:trPr><w:tc><w:tcPr><w:tcW w:w="4000" w:type="dxa"/><w:shd w:val="clear" w:color="auto" w:fill="FFFFFF"/><w:vAlign w:val="center"/></w:tcPr><w:p><w:pPr><w:spacing w:line="240" w:lineRule="auto"/><w:jc w:val="left"/></w:pPr><w:r><w:rPr><w:color w:val="152A35"/></w:rPr><w:t>get_model_index / search_model</w:t></w:r></w:p></w:tc><w:tc><w:tcPr><w:tcW w:w="5578" w:type="dxa"/><w:shd w:val="clear" w:color="auto" w:fill="FFFFFF"/><w:vAlign w:val="center"/></w:tcPr><w:p><w:pPr><w:spacing w:line="240" w:lineRule="auto"/><w:jc w:val="left"/></w:pPr><w:r><w:rPr><w:color w:val="152A35"/></w:rPr><w:t>Búsqueda en modelo BD JSON local</w:t></w:r></w:p></w:tc></w:tr><w:tr><w:trPr><w:trHeight w:val="500"/><w:jc w:val="center"/></w:trPr><w:tc><w:tcPr><w:tcW w:w="4000" w:type="dxa"/><w:shd w:val="clear" w:color="auto" w:fill="F0F0F0"/><w:vAlign w:val="center"/></w:tcPr><w:p><w:pPr><w:spacing w:line="240" w:lineRule="auto"/><w:jc w:val="left"/></w:pPr><w:r><w:rPr><w:color w:val="152A35"/></w:rPr><w:lastRenderedPageBreak/><w:t>compare_model / compare_model_tables</w:t></w:r></w:p></w:tc><w:tc><w:tcPr><w:tcW w:w="5578" w:type="dxa"/><w:shd w:val="clear" w:color="auto" w:fill="F0F0F0"/><w:vAlign w:val="center"/></w:tcPr><w:p><w:pPr><w:spacing w:line="240" w:lineRule="auto"/><w:jc w:val="left"/></w:pPr><w:r><w:rPr><w:color w:val="152A35"/></w:rPr><w:t>Compara modelo local vs BD real</w:t></w:r></w:p></w:tc></w:tr><w:tr><w:trPr><w:trHeight w:val="500"/><w:jc w:val="center"/></w:trPr><w:tc><w:tcPr><w:tcW w:w="4000" w:type="dxa"/><w:shd w:val="clear" w:color="auto" w:fill="FFFFFF"/><w:vAlign w:val="center"/></w:tcPr><w:p><w:pPr><w:spacing w:line="240" w:lineRule="auto"/><w:jc w:val="left"/></w:pPr><w:r><w:rPr><w:color w:val="152A35"/></w:rPr><w:t>sync_from_db / sync_model_tables</w:t></w:r></w:p></w:tc><w:tc><w:tcPr><w:tcW w:w="5578" w:type="dxa"/><w:shd w:val="clear" w:color="auto" w:fill="FFFFFF"/><w:vAlign w:val="center"/></w:tcPr><w:p><w:pPr><w:spacing w:line="240" w:lineRule="auto"/><w:jc w:val="left"/></w:pPr><w:r><w:rPr><w:color w:val="152A35"/></w:rPr><w:t>Sincroniza modelo JSON desde la BD</w:t></w:r></w:p></w:tc></w:tr><w:tr><w:trPr><w:trHeight w:val="500"/><w:jc w:val="center"/></w:trPr><w:tc><w:tcPr><w:tcW w:w="4000" w:type="dxa"/><w:shd w:val="clear" w:color="auto" w:fill="F0F0F0"/><w:vAlign w:val="center"/></w:tcPr><w:p><w:pPr><w:spacing w:line="240" w:lineRule="auto"/><w:jc w:val="left"/></w:pPr><w:r><w:rPr><w:color w:val="152A35"/></w:rPr><w:t>sync_indexes</w:t></w:r></w:p></w:tc><w:tc><w:tcPr><w:tcW w:w="5578" w:type="dxa"/><w:shd w:val="clear" w:color="auto" w:fill="F0F0F0"/><w:vAlign w:val="center"/></w:tcPr><w:p><w:pPr><w:spacing w:line="240" w:lineRule="auto"/><w:jc w:val="left"/></w:pPr><w:r><w:rPr><w:color w:val="152A35"/></w:rPr><w:t>Sincroniza índices del modelo</w:t></w:r></w:p></w:tc></w:tr><w:tr><w:trPr><w:trHeight w:val="500"/><w:jc w:val="center"/></w:trPr><w:tc><w:tcPr><w:tcW w:w="4000" w:type="dxa"/><w:shd w:val="clear" w:color="auto" w:fill="FFFFFF"/><w:vAlign w:val="center"/></w:tcPr><w:p><w:pPr><w:spacing w:line="240" w:lineRule="auto"/><w:jc w:val="left"/></w:pPr><w:r><w:rPr><w:color w:val="152A35"/></w:rPr><w:t>export_dmd</w:t></w:r></w:p></w:tc><w:tc><w:tcPr><w:tcW w:w="5578" w:type="dxa"/><w:shd w:val="clear" w:color="auto" w:fill="FFFFFF"/><w:vAlign w:val="center"/></w:tcPr><w:p><w:pPr><w:spacing w:line="240" w:lineRule="auto"/><w:jc w:val="left"/></w:pPr><w:r><w:rPr><w:color w:val="152A35"/></w:rPr><w:t>Exporta modelo al formato Oracle Data Modeler (.dmd)</w:t></w:r></w:p></w:tc></w:tr><w:tr><w:trPr><w:trHeight w:val="500"/><w:jc w:val="center"/></w:trPr><w:tc><w:tcPr><w:tcW w:w="4000" w:type="dxa"/><w:shd w:val="clear" w:color="auto" w:fill="F0F0F0"/><w:vAlign w:val="center"/></w:tcPr><w:p><w:pPr><w:spacing w:line="240" w:lineRule="auto"/><w:jc w:val="left"/></w:pPr><w:r><w:rPr><w:color w:val="152A35"/></w:rPr><w:t>generate_migration / generate_sql</w:t></w:r></w:p></w:tc><w:tc><w:tcPr><w:tcW w:w="5578" w:type="dxa"/><w:shd w:val="clear" w:color="auto" w:fill="F0F0F0"/><w:vAlign w:val="center"/></w:tcPr><w:p><w:pPr><w:spacing w:line="240" w:lineRule="auto"/><w:jc w:val="left"/></w:pPr><w:r><w:rPr><w:color w:val="152A35"/></w:rPr><w:t>Genera SQL de migración desde el modelo</w:t></w:r></w:p></w:tc></w:tr><w:tr><w:trPr><w:trHeight w:val="500"/><w:jc w:val="center"/></w:trPr><w:tc><w:tcPr><w:tcW w:w="4000" w:type="dxa"/><w:shd w:val="clear" w:color="auto" w:fill="FFFFFF"/><w:vAlign w:val="center"/></w:tcPr><w:p><w:pPr><w:spacing w:line="240" w:lineRule="auto"/><w:jc w:val="left"/></w:pPr><w:r><w:rPr><w:color w:val="152A35"/></w:rPr><w:t>find_symbol / batch_find_symbols</w:t></w:r></w:p></w:tc><w:tc><w:tcPr><w:tcW w:w="5578" w:type="dxa"/><w:shd w:val="clear" w:color="auto" w:fill="FFFFFF"/><w:vAlign w:val="center"/></w:tcPr><w:p><w:pPr><w:spacing w:line="240" w:lineRule="auto"/><w:jc w:val="left"/></w:pPr><w:r><w:rPr><w:color w:val="152A35"/></w:rPr><w:t>Localiza clases, métodos o propiedades en el código</w:t></w:r></w:p></w:tc></w:tr><w:tr><w:trPr><w:trHeight w:val="500"/><w:jc w:val="center"/></w:trPr><w:tc><w:tcPr><w:tcW w:w="4000" w:type="dxa"/><w:shd w:val="clear" w:color="auto" w:fill="F0F0F0"/><w:vAlign w:val="center"/></w:tcPr><w:p><w:pPr><w:spacing w:line="240" w:lineRule="auto"/><w:jc w:val="left"/></w:pPr><w:r><w:rPr><w:color w:val="152A35"/></w:rPr><w:t>search_code</w:t></w:r></w:p></w:tc><w:tc><w:tcPr><w:tcW w:w="5578" w:type="dxa"/><w:shd w:val="clear" w:color="auto" w:fill="F0F0F0"/><w:vAlign w:val="center"/></w:tcPr><w:p><w:pPr><w:spacing w:line="240" w:lineRule="auto"/><w:jc w:val="left"/></w:pPr><w:r><w:rPr><w:color w:val="152A35"/></w:rPr><w:t>Búsqueda full-text en el código fuente</w:t></w:r></w:p></w:tc></w:tr><w:tr><w:trPr><w:trHeight w:val="500"/><w:jc w:val="center"/></w:trPr><w:tc><w:tcPr><w:tcW w:w="4000" w:type="dxa"/><w:shd w:val="clear" w:color="auto" w:fill="FFFFFF"/><w:vAlign w:val="center"/></w:tcPr><w:p><w:pPr><w:spacing w:line="240" w:lineRule="auto"/><w:jc w:val="left"/></w:pPr><w:r><w:rPr><w:color w:val="152A35"/></w:rPr><w:t>scan_aspx</w:t></w:r></w:p></w:tc><w:tc><w:tcPr><w:tcW w:w="5578" w:type="dxa"/><w:shd w:val="clear" w:color="auto" w:fill="FFFFFF"/><w:vAlign w:val="center"/></w:tcPr><w:p><w:pPr><w:spacing w:line="240" w:lineRule="auto"/><w:jc w:val="left"/></w:pPr><w:r><w:rPr><w:color w:val="152A35"/></w:rPr><w:t>Escanea ficheros ASPX/ASCX de la solución</w:t></w:r></w:p></w:tc></w:tr><w:tr><w:trPr><w:trHeight w:val="500"/><w:jc w:val="center"/></w:trPr><w:tc><w:tcPr><w:tcW w:w="4000" w:type="dxa"/><w:shd w:val="clear" w:color="auto" w:fill="F0F0F0"/><w:vAlign w:val="center"/></w:tcPr><w:p><w:pPr><w:spacing w:line="240" w:lineRule="auto"/><w:jc w:val="left"/></w:pPr><w:r><w:rPr><w:color w:val="152A35"/></w:rPr><w:t>analyze_dalc</w:t></w:r></w:p></w:tc><w:tc><w:tcPr><w:tcW w:w="5578" w:type="dxa"/><w:shd w:val="clear" w:color="auto" w:fill="F0F0F0"/><w:vAlign w:val="center"/></w:tcPr><w:p><w:pPr><w:spacing w:line="240" w:lineRule="auto"/><w:jc w:val="left"/></w:pPr><w:r><w:rPr><w:color w:val="152A35"/></w:rPr><w:t>Analiza clases DALC: queries SQL embebidas, parámetros</w:t></w:r></w:p></w:tc></w:tr><w:tr><w:trPr><w:trHeight w:val="500"/><w:jc w:val="center"/></w:trPr><w:tc><w:tcPr><w:tcW w:w="4000" w:type="dxa"/><w:shd w:val="clear" w:color="auto" w:fill="FFFFFF"/><w:vAlign w:val="center"/></w:tcPr><w:p><w:pPr><w:spacing w:line="240" w:lineRule="auto"/><w:jc w:val="left"/></w:pPr><w:r><w:rPr><w:color w:val="152A35"/></w:rPr><w:t>map_dependencies</w:t></w:r></w:p></w:tc><w:tc><w:tcPr><w:tcW w:w="5578" w:type="dxa"/><w:shd w:val="clear" w:color="auto" w:fill="FFFFFF"/><w:vAlign w:val="center"/></w:tcPr><w:p><w:pPr><w:spacing w:line="240" w:lineRule="auto"/><w:jc w:val="left"/></w:pPr><w:r><w:rPr><w:color w:val="152A35"/></w:rPr><w:t>Grafo de dependencias entre proyectos</w:t></w:r></w:p></w:tc></w:tr><w:tr><w:trPr><w:trHeight w:val="500"/><w:jc w:val="center"/></w:trPr><w:tc><w:tcPr><w:tcW w:w="4000" w:type="dxa"/><w:shd w:val="clear" w:color="auto" w:fill="F0F0F0"/><w:vAlign w:val="center"/></w:tcPr><w:p><w:pPr><w:spacing w:line="240" w:lineRule="auto"/><w:jc w:val="left"/></w:pPr><w:r><w:rPr><w:color w:val="152A35"/></w:rPr><w:t>render_erd</w:t></w:r></w:p></w:tc><w:tc><w:tcPr><w:tcW w:w="5578" w:type="dxa"/><w:shd w:val="clear" w:color="auto" w:fill="F0F0F0"/><w:vAlign w:val="center"/></w:tcPr><w:p><w:pPr><w:spacing w:line="240" w:lineRule="auto"/><w:jc w:val="left"/></w:pPr><w:r><w:rPr><w:color w:val="152A35"/></w:rPr><w:t>Diagrama ERD en Mermaid</w:t></w:r></w:p></w:tc></w:tr><w:tr><w:trPr><w:trHeight w:val="500"/><w:jc w:val="center"/></w:trPr><w:tc><w:tcPr><w:tcW w:w="4000" w:type="dxa"/><w:shd w:val="clear" w:color="auto" w:fill="FFFFFF"/><w:vAlign w:val="center"/></w:tcPr><w:p><w:pPr><w:spacing w:line="240" w:lineRule="auto"/><w:jc w:val="left"/></w:pPr><w:r><w:rPr><w:color w:val="152A35"/></w:rPr><w:t>security_scan</w:t></w:r></w:p></w:tc><w:tc><w:tcPr><w:tcW w:w="5578" w:type="dxa"/><w:shd w:val="clear" w:color="auto" w:fill="FFFFFF"/><w:vAlign w:val="center"/></w:tcPr><w:p><w:pPr><w:spacing w:line="240" w:lineRule="auto"/><w:jc w:val="left"/></w:pPr><w:r><w:rPr><w:color w:val="152A35"/></w:rPr><w:t>Escanea el código en busca de vulnerabilidades</w:t></w:r></w:p></w:tc></w:tr><w:tr><w:trPr><w:trHeight w:val="500"/><w:jc w:val="center"/></w:trPr><w:tc><w:tcPr><w:tcW w:w="4000" w:type="dxa"/><w:shd w:val="clear" w:color="auto" w:fill="F0F0F0"/><w:vAlign w:val="center"/></w:tcPr><w:p><w:pPr><w:spacing w:line="240" w:lineRule="auto"/><w:jc w:val="left"/></w:pPr><w:r><w:rPr><w:color w:val="152A35"/></w:rPr><w:t>check_env</w:t></w:r></w:p></w:tc><w:tc><w:tcPr><w:tcW w:w="5578" w:type="dxa"/><w:shd w:val="clear" w:color="auto" w:fill="F0F0F0"/><w:vAlign w:val="center"/></w:tcPr><w:p><w:pPr><w:spacing w:line="240" w:lineRule="auto"/><w:jc w:val="left"/></w:pPr><w:r><w:rPr><w:color w:val="152A35"/></w:rPr><w:t>Verifica entorno: AIS, SVN, dotnet, Python, BD</w:t></w:r></w:p></w:tc></w:tr><w:tr><w:trPr><w:trHeight w:val="500"/><w:jc w:val="center"/></w:trPr><w:tc><w:tcPr><w:tcW w:w="4000" w:type="dxa"/><w:shd w:val="clear" w:color="auto" w:fill="FFFFFF"/><w:vAlign w:val="center"/></w:tcPr><w:p><w:pPr><w:spacing w:line="240" w:lineRule="auto"/><w:jc w:val="left"/></w:pPr><w:r><w:rPr><w:color w:val="152A35"/></w:rPr><w:t>get_scope</w:t></w:r></w:p></w:tc><w:tc><w:tcPr><w:tcW w:w="5578" w:type="dxa"/><w:shd w:val="clear" w:color="auto" w:fill="FFFFFF"/><w:vAlign w:val="center"/></w:tcPr><w:p><w:pPr><w:spacing w:line="240" w:lineRule="auto"/><w:jc w:val="left"/></w:pPr><w:r><w:rPr><w:color w:val="152A35"/></w:rPr><w:t>Parsea el .sln y devuelve proyectos y rutas</w:t></w:r></w:p></w:tc></w:tr><w:tr><w:trPr><w:trHeight w:val="500"/><w:jc w:val="center"/></w:trPr><w:tc><w:tcPr><w:tcW w:w="4000" w:type="dxa"/><w:shd w:val="clear" w:color="auto" w:fill="F0F0F0"/><w:vAlign w:val="center"/></w:tcPr><w:p><w:pPr><w:spacing w:line="240" w:lineRule="auto"/><w:jc w:val="left"/></w:pPr><w:r><w:rPr><w:color w:val="152A35"/></w:rPr><w:t>ping</w:t></w:r></w:p></w:tc><w:tc><w:tcPr><w:tcW w:w="5578" w:type="dxa"/><w:shd w:val="clear" w:color="auto" w:fill="F0F0F0"/><w:vAlign w:val="center"/></w:tcPr><w:p><w:pPr><w:spacing w:line="240" w:lineRule="auto"/><w:jc w:val="left"/></w:pPr><w:r><w:rPr><w:color w:val="152A35"/></w:rPr><w:t>Test de conectividad del servidor MCP</w:t></w:r></w:p></w:tc></w:tr></w:tbl><w:p/><w:p><w:pPr><w:pStyle w:val="Ttulo1"/></w:pPr><w:bookmarkStart w:id="21" w:name="_Toc236310424"/><w:r><w:t>Arquitectura ScacsWeb asumida</w:t></w:r><w:bookmarkEnd w:id="21"/></w:p><w:p><w:r><w:t>El plugin asume la estructura estándar de proyectos ScacsWeb. Si el proyecto sigue una arquitectura diferente, algunos comandos pueden requerir ajuste manual.</w:t></w:r></w:p><w:p><w:pPr><w:pStyle w:val="Ttulo2"/></w:pPr><w:bookmarkStart w:id="22" w:name="_Toc236310425"/><w:r><w:t>Estructura de carpetas</w:t></w:r><w:bookmarkEnd w:id="22"/></w:p><w:p><w:pPr><w:shd w:val="clear" w:color="auto" w:fill="F5F5F5"/><w:spacing w:after="0" w:line="240" w:lineRule="auto"/></w:pPr><w:r><w:rPr><w:rFonts w:ascii="Courier New" w:hAnsi="Courier New" w:cs="Courier New"/><w:color w:val="152A35"/><w:sz w:val="18"/><w:szCs w:val="18"/></w:rPr><w:t>&lt;workspace&gt;/</w:t></w:r></w:p><w:p><w:pPr><w:shd w:val="clear" w:color="auto" w:fill="F5F5F5"/><w:spacing w:after="0" w:line="240" w:lineRule="auto"/></w:pPr><w:r><w:rPr><w:rFonts w:ascii="Courier New" w:hAnsi="Courier New" w:cs="Courier New"/><w:color w:val="152A35"/><w:sz w:val="18"/><w:szCs w:val="18"/></w:rPr><w:t>├── &lt;Proyecto&gt;.sln</w:t></w:r></w:p><w:p><w:pPr><w:shd w:val="clear" w:color="auto" w:fill="F5F5F5"/><w:spacing w:after="0" w:line="240" w:lineRule="auto"/></w:pPr><w:r><w:rPr><w:rFonts w:ascii="Courier New" w:hAnsi="Courier New" w:cs="Courier New"/><w:color w:val="152A35"/><w:sz w:val="18"/><w:szCs w:val="18"/></w:rPr><w:t>├── &lt;modulo&gt;/</w:t></w:r></w:p><w:p><w:pPr><w:shd w:val="clear" w:color="auto" w:fill="F5F5F5"/><w:spacing w:after="0" w:line="240" w:lineRule="auto"/></w:pPr><w:r><w:rPr><w:rFonts w:ascii="Courier New" w:hAnsi="Courier New" w:cs="Courier New"/><w:color w:val="152A35"/><w:sz w:val="18"/><w:szCs w:val="18"/></w:rPr><w:t>│   ├── BPC/          ← Business Process Classes</w:t></w:r></w:p><w:p><w:pPr><w:shd w:val="clear" w:color="auto" w:fill="F5F5F5"/><w:spacing w:after="0" w:line="240" w:lineRule="auto"/></w:pPr><w:r><w:rPr><w:rFonts w:ascii="Courier New" w:hAnsi="Courier New" w:cs="Courier New"/><w:color w:val="152A35"/><w:sz w:val="18"/><w:szCs w:val="18"/></w:rPr><w:t>│   ├── BE/           ← Business Entities</w:t></w:r></w:p><w:p><w:pPr><w:shd w:val="clear" w:color="auto" w:fill="F5F5F5"/><w:spacing w:after="0" w:line="240" w:lineRule="auto"/></w:pPr><w:r><w:rPr><w:rFonts w:ascii="Courier New" w:hAnsi="Courier New" w:cs="Courier New"/><w:color w:val="152A35"/><w:sz w:val="18"/><w:szCs w:val="18"/></w:rPr><w:lastRenderedPageBreak/><w:t>│   └── DALC/         ← Data Access Layer Classes</w:t></w:r></w:p><w:p><w:pPr><w:shd w:val="clear" w:color="auto" w:fill="F5F5F5"/><w:spacing w:after="0" w:line="240" w:lineRule="auto"/></w:pPr><w:r><w:rPr><w:rFonts w:ascii="Courier New" w:hAnsi="Courier New" w:cs="Courier New"/><w:color w:val="152A35"/><w:sz w:val="18"/><w:szCs w:val="18"/></w:rPr><w:t>├── XMLConfig.xml     ← Configuración de conexión BD</w:t></w:r></w:p><w:p><w:pPr><w:shd w:val="clear" w:color="auto" w:fill="F5F5F5"/><w:spacing w:after="0" w:line="240" w:lineRule="auto"/></w:pPr><w:r><w:rPr><w:rFonts w:ascii="Courier New" w:hAnsi="Courier New" w:cs="Courier New"/><w:color w:val="152A35"/><w:sz w:val="18"/><w:szCs w:val="18"/></w:rPr><w:t>└── model.json        ← Modelo BD en JSON (sincronizado por el plugin)</w:t></w:r></w:p><w:p/><w:p><w:pPr><w:pStyle w:val="Ttulo2"/></w:pPr><w:bookmarkStart w:id="23" w:name="_Toc236310426"/><w:r><w:t>Convenciones</w:t></w:r><w:bookmarkEnd w:id="23"/></w:p><w:tbl><w:tblPr><w:tblStyle w:val="a"/><w:tblW w:w="9578" w:type="dxa"/><w:jc w:val="center"/><w:tblBorders><w:top w:val="single" w:sz="4" w:space="0" w:color="DDDDDD"/><w:left w:val="single" w:sz="4" w:space="0" w:color="DDDDDD"/><w:bottom w:val="single" w:sz="4" w:space="0" w:color="DDDDDD"/><w:right w:val="single" w:sz="4" w:space="0" w:color="DDDDDD"/><w:insideH w:val="single" w:sz="4" w:space="0" w:color="DDDDDD"/><w:insideV w:val="single" w:sz="4" w:space="0" w:color="DDDDDD"/></w:tblBorders><w:tblLayout w:type="fixed"/><w:tblLook w:val="04A0" w:firstRow="1" w:lastRow="0" w:firstColumn="1" w:lastColumn="0" w:noHBand="0" w:noVBand="1"/></w:tblPr><w:tblGrid><w:gridCol w:w="3000"/><w:gridCol w:w="6578"/></w:tblGrid><w:tr><w:trPr><w:trHeight w:val="500"/><w:jc w:val="center"/></w:trPr><w:tc><w:tcPr><w:tcW w:w="3000" w:type="dxa"/><w:shd w:val="clear" w:color="auto" w:fill="00F7BC"/><w:vAlign w:val="center"/></w:tcPr><w:p><w:pPr><w:spacing w:line="240" w:lineRule="auto"/><w:jc w:val="left"/></w:pPr><w:r><w:rPr><w:b/><w:bCs/><w:color w:val="152A35"/></w:rPr><w:t>ELEMENTO</w:t></w:r></w:p></w:tc><w:tc><w:tcPr><w:tcW w:w="6578" w:type="dxa"/><w:shd w:val="clear" w:color="auto" w:fill="00F7BC"/><w:vAlign w:val="center"/></w:tcPr><w:p><w:pPr><w:spacing w:line="240" w:lineRule="auto"/><w:jc w:val="left"/></w:pPr><w:r><w:rPr><w:b/><w:bCs/><w:color w:val="152A35"/></w:rPr><w:t>VALOR</w:t></w:r></w:p></w:tc></w:tr><w:tr><w:trPr><w:trHeight w:val="500"/><w:jc w:val="center"/></w:trPr><w:tc><w:tcPr><w:tcW w:w="3000" w:type="dxa"/><w:shd w:val="clear" w:color="auto" w:fill="FFFFFF"/><w:vAlign w:val="center"/></w:tcPr><w:p><w:pPr><w:spacing w:line="240" w:lineRule="auto"/><w:jc w:val="left"/></w:pPr><w:r><w:rPr><w:color w:val="152A35"/></w:rPr><w:t>Framework</w:t></w:r></w:p></w:tc><w:tc><w:tcPr><w:tcW w:w="6578" w:type="dxa"/><w:shd w:val="clear" w:color="auto" w:fill="FFFFFF"/><w:vAlign w:val="center"/></w:tcPr><w:p><w:pPr><w:spacing w:line="240" w:lineRule="auto"/><w:jc w:val="left"/></w:pPr><w:r><w:rPr><w:color w:val="152A35"/></w:rPr><w:t>ASP.NET WebForms / .NET Framework 4.0 / C# 7.3</w:t></w:r></w:p></w:tc></w:tr><w:tr><w:trPr><w:trHeight w:val="500"/><w:jc w:val="center"/></w:trPr><w:tc><w:tcPr><w:tcW w:w="3000" w:type="dxa"/><w:shd w:val="clear" w:color="auto" w:fill="F0F0F0"/><w:vAlign w:val="center"/></w:tcPr><w:p><w:pPr><w:spacing w:line="240" w:lineRule="auto"/><w:jc w:val="left"/></w:pPr><w:r><w:rPr><w:color w:val="152A35"/></w:rPr><w:t>VCS</w:t></w:r></w:p></w:tc><w:tc><w:tcPr><w:tcW w:w="6578" w:type="dxa"/><w:shd w:val="clear" w:color="auto" w:fill="F0F0F0"/><w:vAlign w:val="center"/></w:tcPr><w:p><w:pPr><w:spacing w:line="240" w:lineRule="auto"/><w:jc w:val="left"/></w:pPr><w:r><w:rPr><w:color w:val="152A35"/></w:rPr><w:t>SVN (TortoiseSVN primario) + Git secundario</w:t></w:r></w:p></w:tc></w:tr><w:tr><w:trPr><w:trHeight w:val="500"/><w:jc w:val="center"/></w:trPr><w:tc><w:tcPr><w:tcW w:w="3000" w:type="dxa"/><w:shd w:val="clear" w:color="auto" w:fill="FFFFFF"/><w:vAlign w:val="center"/></w:tcPr><w:p><w:pPr><w:spacing w:line="240" w:lineRule="auto"/><w:jc w:val="left"/></w:pPr><w:r><w:rPr><w:color w:val="152A35"/></w:rPr><w:t>Bases de datos</w:t></w:r></w:p></w:tc><w:tc><w:tcPr><w:tcW w:w="6578" w:type="dxa"/><w:shd w:val="clear" w:color="auto" w:fill="FFFFFF"/><w:vAlign w:val="center"/></w:tcPr><w:p><w:pPr><w:spacing w:line="240" w:lineRule="auto"/><w:jc w:val="left"/></w:pPr><w:r><w:rPr><w:color w:val="152A35"/></w:rPr><w:t>Oracle 19c y/o SQL Server</w:t></w:r></w:p></w:tc></w:tr><w:tr><w:trPr><w:trHeight w:val="500"/><w:jc w:val="center"/></w:trPr><w:tc><w:tcPr><w:tcW w:w="3000" w:type="dxa"/><w:shd w:val="clear" w:color="auto" w:fill="F0F0F0"/><w:vAlign w:val="center"/></w:tcPr><w:p><w:pPr><w:spacing w:line="240" w:lineRule="auto"/><w:jc w:val="left"/></w:pPr><w:r><w:rPr><w:color w:val="152A35"/></w:rPr><w:t>Naming de módulos</w:t></w:r></w:p></w:tc><w:tc><w:tcPr><w:tcW w:w="6578" w:type="dxa"/><w:shd w:val="clear" w:color="auto" w:fill="F0F0F0"/><w:vAlign w:val="center"/></w:tcPr><w:p><w:pPr><w:spacing w:line="240" w:lineRule="auto"/><w:jc w:val="left"/></w:pPr><w:r><w:rPr><w:color w:val="152A35"/></w:rPr><w:t>AIS.PR.BR.EC.CL</w:t></w:r></w:p></w:tc></w:tr><w:tr><w:trPr><w:trHeight w:val="500"/><w:jc w:val="center"/></w:trPr><w:tc><w:tcPr><w:tcW w:w="3000" w:type="dxa"/><w:shd w:val="clear" w:color="auto" w:fill="FFFFFF"/><w:vAlign w:val="center"/></w:tcPr><w:p><w:pPr><w:spacing w:line="240" w:lineRule="auto"/><w:jc w:val="left"/></w:pPr><w:r><w:rPr><w:color w:val="152A35"/></w:rPr><w:t>Rutas AIS Batch</w:t></w:r></w:p></w:tc><w:tc><w:tcPr><w:tcW w:w="6578" w:type="dxa"/><w:shd w:val="clear" w:color="auto" w:fill="FFFFFF"/><w:vAlign w:val="center"/></w:tcPr><w:p><w:pPr><w:spacing w:line="240" w:lineRule="auto"/><w:jc w:val="left"/></w:pPr><w:r><w:rPr><w:color w:val="152A35"/></w:rPr><w:t>C:\AIS\&lt;proyecto&gt;\bin\</w:t></w:r></w:p></w:tc></w:tr><w:tr><w:trPr><w:trHeight w:val="500"/><w:jc w:val="center"/></w:trPr><w:tc><w:tcPr><w:tcW w:w="3000" w:type="dxa"/><w:shd w:val="clear" w:color="auto" w:fill="F0F0F0"/><w:vAlign w:val="center"/></w:tcPr><w:p><w:pPr><w:spacing w:line="240" w:lineRule="auto"/><w:jc w:val="left"/></w:pPr><w:r><w:rPr><w:color w:val="152A35"/></w:rPr><w:t>Rutas AIS Online</w:t></w:r></w:p></w:tc><w:tc><w:tcPr><w:tcW w:w="6578" w:type="dxa"/><w:shd w:val="clear" w:color="auto" w:fill="F0F0F0"/><w:vAlign w:val="center"/></w:tcPr><w:p><w:pPr><w:spacing w:line="240" w:lineRule="auto"/><w:jc w:val="left"/></w:pPr><w:r><w:rPr><w:color w:val="152A35"/></w:rPr><w:t>C:\AIS\&lt;proyecto&gt;\Web\</w:t></w:r></w:p></w:tc></w:tr></w:tbl><w:p/><w:p><w:pPr><w:pStyle w:val="Ttulo1"/></w:pPr><w:bookmarkStart w:id="24" w:name="_Toc236310427"/><w:r><w:t>Flujo de trabajo típico</w:t></w:r><w:bookmarkEnd w:id="24"/></w:p><w:tbl><w:tblPr><w:tblStyle w:val="a"/><w:tblW w:w="9578" w:type="dxa"/><w:jc w:val="center"/><w:tblBorders><w:top w:val="single" w:sz="4" w:space="0" w:color="DDDDDD"/><w:left w:val="single" w:sz="4" w:space="0" w:color="DDDDDD"/><w:bottom w:val="single" w:sz="4" w:space="0" w:color="DDDDDD"/><w:right w:val="single" w:sz="4" w:space="0" w:color="DDDDDD"/><w:insideH w:val="single" w:sz="4" w:space="0" w:color="DDDDDD"/><w:insideV w:val="single" w:sz="4" w:space="0" w:color="DDDDDD"/></w:tblBorders><w:tblLayout w:type="fixed"/><w:tblLook w:val="04A0" w:firstRow="1" w:lastRow="0" w:firstColumn="1" w:lastColumn="0" w:noHBand="0" w:noVBand="1"/></w:tblPr><w:tblGrid><w:gridCol w:w="800"/><w:gridCol w:w="3500"/><w:gridCol w:w="5278"/></w:tblGrid><w:tr><w:trPr><w:trHeight w:val="500"/><w:jc w:val="center"/></w:trPr><w:tc><w:tcPr><w:tcW w:w="800" w:type="dxa"/><w:shd w:val="clear" w:color="auto" w:fill="00F7BC"/><w:vAlign w:val="center"/></w:tcPr><w:p><w:pPr><w:spacing w:line="240" w:lineRule="auto"/><w:jc w:val="left"/></w:pPr><w:r><w:rPr><w:b/><w:bCs/><w:color w:val="152A35"/></w:rPr><w:t>PASO</w:t></w:r></w:p></w:tc><w:tc><w:tcPr><w:tcW w:w="3500" w:type="dxa"/><w:shd w:val="clear" w:color="auto" w:fill="00F7BC"/><w:vAlign w:val="center"/></w:tcPr><w:p><w:pPr><w:spacing w:line="240" w:lineRule="auto"/><w:jc w:val="left"/></w:pPr><w:r><w:rPr><w:b/><w:bCs/><w:color w:val="152A35"/></w:rPr><w:t>COMANDO</w:t></w:r></w:p></w:tc><w:tc><w:tcPr><w:tcW w:w="5278" w:type="dxa"/><w:shd w:val="clear" w:color="auto" w:fill="00F7BC"/><w:vAlign w:val="center"/></w:tcPr><w:p><w:pPr><w:spacing w:line="240" w:lineRule="auto"/><w:jc w:val="left"/></w:pPr><w:r><w:rPr><w:b/><w:bCs/><w:color w:val="152A35"/></w:rPr><w:t>CUÁNDO</w:t></w:r></w:p></w:tc></w:tr><w:tr><w:trPr><w:trHeight w:val="500"/><w:jc w:val="center"/></w:trPr><w:tc><w:tcPr><w:tcW w:w="800" w:type="dxa"/><w:shd w:val="clear" w:color="auto" w:fill="FFFFFF"/><w:vAlign w:val="center"/></w:tcPr><w:p><w:pPr><w:spacing w:line="240" w:lineRule="auto"/><w:jc w:val="left"/></w:pPr><w:r><w:rPr><w:color w:val="152A35"/></w:rPr><w:t>1</w:t></w:r></w:p></w:tc><w:tc><w:tcPr><w:tcW w:w="3500" w:type="dxa"/><w:shd w:val="clear" w:color="auto" w:fill="FFFFFF"/><w:vAlign w:val="center"/></w:tcPr><w:p><w:pPr><w:spacing w:line="240" w:lineRule="auto"/><w:jc w:val="left"/></w:pPr><w:r><w:rPr><w:color w:val="152A35"/></w:rPr><w:t>/orchestrator-init</w:t></w:r></w:p></w:tc><w:tc><w:tcPr><w:tcW w:w="5278" w:type="dxa"/><w:shd w:val="clear" w:color="auto" w:fill="FFFFFF"/><w:vAlign w:val="center"/></w:tcPr><w:p><w:pPr><w:spacing w:line="240" w:lineRule="auto"/><w:jc w:val="left"/></w:pPr><w:r><w:rPr><w:color w:val="152A35"/></w:rPr><w:t>Bootstrap inicial del workspace (una vez)</w:t></w:r></w:p></w:tc></w:tr><w:tr><w:trPr><w:trHeight w:val="500"/><w:jc w:val="center"/></w:trPr><w:tc><w:tcPr><w:tcW w:w="800" w:type="dxa"/><w:shd w:val="clear" w:color="auto" w:fill="F0F0F0"/><w:vAlign w:val="center"/></w:tcPr><w:p><w:pPr><w:spacing w:line="240" w:lineRule="auto"/><w:jc w:val="left"/></w:pPr><w:r><w:rPr><w:color w:val="152A35"/></w:rPr><w:t>2</w:t></w:r></w:p></w:tc><w:tc><w:tcPr><w:tcW w:w="3500" w:type="dxa"/><w:shd w:val="clear" w:color="auto" w:fill="F0F0F0"/><w:vAlign w:val="center"/></w:tcPr><w:p><w:pPr><w:spacing w:line="240" w:lineRule="auto"/><w:jc w:val="left"/></w:pPr><w:r><w:rPr><w:color w:val="152A35"/></w:rPr><w:t>/orchestrator-validar-entorno</w:t></w:r></w:p></w:tc><w:tc><w:tcPr><w:tcW w:w="5278" w:type="dxa"/><w:shd w:val="clear" w:color="auto" w:fill="F0F0F0"/><w:vAlign w:val="center"/></w:tcPr><w:p><w:pPr><w:spacing w:line="240" w:lineRule="auto"/><w:jc w:val="left"/></w:pPr><w:r><w:rPr><w:color w:val="152A35"/></w:rPr><w:t>Comprueba que todo esté OK</w:t></w:r></w:p></w:tc></w:tr><w:tr><w:trPr><w:trHeight w:val="500"/><w:jc w:val="center"/></w:trPr><w:tc><w:tcPr><w:tcW w:w="800" w:type="dxa"/><w:shd w:val="clear" w:color="auto" w:fill="FFFFFF"/><w:vAlign w:val="center"/></w:tcPr><w:p><w:pPr><w:spacing w:line="240" w:lineRule="auto"/><w:jc w:val="left"/></w:pPr><w:r><w:rPr><w:color w:val="152A35"/></w:rPr><w:t>3</w:t></w:r></w:p></w:tc><w:tc><w:tcPr><w:tcW w:w="3500" w:type="dxa"/><w:shd w:val="clear" w:color="auto" w:fill="FFFFFF"/><w:vAlign w:val="center"/></w:tcPr><w:p><w:pPr><w:spacing w:line="240" w:lineRule="auto"/><w:jc w:val="left"/></w:pPr><w:r><w:rPr><w:color w:val="152A35"/></w:rPr><w:t>—</w:t></w:r></w:p></w:tc><w:tc><w:tcPr><w:tcW w:w="5278" w:type="dxa"/><w:shd w:val="clear" w:color="auto" w:fill="FFFFFF"/><w:vAlign w:val="center"/></w:tcPr><w:p><w:pPr><w:spacing w:line="240" w:lineRule="auto"/><w:jc w:val="left"/></w:pPr><w:r><w:rPr><w:color w:val="152A35"/></w:rPr><w:t>Desarrollar el cambio</w:t></w:r></w:p></w:tc></w:tr><w:tr><w:trPr><w:trHeight w:val="500"/><w:jc w:val="center"/></w:trPr><w:tc><w:tcPr><w:tcW w:w="800" w:type="dxa"/><w:shd w:val="clear" w:color="auto" w:fill="F0F0F0"/><w:vAlign w:val="center"/></w:tcPr><w:p><w:pPr><w:spacing w:line="240" w:lineRule="auto"/><w:jc w:val="left"/></w:pPr><w:r><w:rPr><w:color w:val="152A35"/></w:rPr><w:t>4</w:t></w:r></w:p></w:tc><w:tc><w:tcPr><w:tcW w:w="3500" w:type="dxa"/><w:shd w:val="clear" w:color="auto" w:fill="F0F0F0"/><w:vAlign w:val="center"/></w:tcPr><w:p><w:pPr><w:spacing w:line="240" w:lineRule="auto"/><w:jc w:val="left"/></w:pPr><w:r><w:rPr><w:color w:val="152A35"/></w:rPr><w:t>/orchestrator-analizar</w:t></w:r></w:p></w:tc><w:tc><w:tcPr><w:tcW w:w="5278" w:type="dxa"/><w:shd w:val="clear" w:color="auto" w:fill="F0F0F0"/><w:vAlign w:val="center"/></w:tcPr><w:p><w:pPr><w:spacing w:line="240" w:lineRule="auto"/><w:jc w:val="left"/></w:pPr><w:r><w:rPr><w:color w:val="152A35"/></w:rPr><w:t>Análisis de calidad del diff</w:t></w:r></w:p></w:tc></w:tr><w:tr><w:trPr><w:trHeight w:val="500"/><w:jc w:val="center"/></w:trPr><w:tc><w:tcPr><w:tcW w:w="800" w:type="dxa"/><w:shd w:val="clear" w:color="auto" w:fill="FFFFFF"/><w:vAlign w:val="center"/></w:tcPr><w:p><w:pPr><w:spacing w:line="240" w:lineRule="auto"/><w:jc w:val="left"/></w:pPr><w:r><w:rPr><w:color w:val="152A35"/></w:rPr><w:t>5</w:t></w:r></w:p></w:tc><w:tc><w:tcPr><w:tcW w:w="3500" w:type="dxa"/><w:shd w:val="clear" w:color="auto" w:fill="FFFFFF"/><w:vAlign w:val="center"/></w:tcPr><w:p><w:pPr><w:spacing w:line="240" w:lineRule="auto"/><w:jc w:val="left"/></w:pPr><w:r><w:rPr><w:color w:val="152A35"/></w:rPr><w:t>/orchestrator-validator</w:t></w:r></w:p></w:tc><w:tc><w:tcPr><w:tcW w:w="5278" w:type="dxa"/><w:shd w:val="clear" w:color="auto" w:fill="FFFFFF"/><w:vAlign w:val="center"/></w:tcPr><w:p><w:pPr><w:spacing w:line="240" w:lineRule="auto"/><w:jc w:val="left"/></w:pPr><w:r><w:rPr><w:color w:val="152A35"/></w:rPr><w:t>Valida compilación</w:t></w:r></w:p></w:tc></w:tr><w:tr><w:trPr><w:trHeight w:val="500"/><w:jc w:val="center"/></w:trPr><w:tc><w:tcPr><w:tcW w:w="800" w:type="dxa"/><w:shd w:val="clear" w:color="auto" w:fill="F0F0F0"/><w:vAlign w:val="center"/></w:tcPr><w:p><w:pPr><w:spacing w:line="240" w:lineRule="auto"/><w:jc w:val="left"/></w:pPr><w:r><w:rPr><w:color w:val="152A35"/></w:rPr><w:t>6</w:t></w:r></w:p></w:tc><w:tc><w:tcPr><w:tcW w:w="3500" w:type="dxa"/><w:shd w:val="clear" w:color="auto" w:fill="F0F0F0"/><w:vAlign w:val="center"/></w:tcPr><w:p><w:pPr><w:spacing w:line="240" w:lineRule="auto"/><w:jc w:val="left"/></w:pPr><w:r><w:rPr><w:color w:val="152A35"/></w:rPr><w:t>/orchestrator-review</w:t></w:r></w:p></w:tc><w:tc><w:tcPr><w:tcW w:w="5278" w:type="dxa"/><w:shd w:val="clear" w:color="auto" w:fill="F0F0F0"/><w:vAlign w:val="center"/></w:tcPr><w:p><w:pPr><w:spacing w:line="240" w:lineRule="auto"/><w:jc w:val="left"/></w:pPr><w:r><w:rPr><w:color w:val="152A35"/></w:rPr><w:t>Revisión pre-commit</w:t></w:r></w:p></w:tc></w:tr><w:tr><w:trPr><w:trHeight w:val="500"/><w:jc w:val="center"/></w:trPr><w:tc><w:tcPr><w:tcW w:w="800" w:type="dxa"/><w:shd w:val="clear" w:color="auto" w:fill="FFFFFF"/><w:vAlign w:val="center"/></w:tcPr><w:p><w:pPr><w:spacing w:line="240" w:lineRule="auto"/><w:jc w:val="left"/></w:pPr><w:r><w:rPr><w:color w:val="152A35"/></w:rPr><w:t>7</w:t></w:r></w:p></w:tc><w:tc><w:tcPr><w:tcW w:w="3500" w:type="dxa"/><w:shd w:val="clear" w:color="auto" w:fill="FFFFFF"/><w:vAlign w:val="center"/></w:tcPr><w:p><w:pPr><w:spacing w:line="240" w:lineRule="auto"/><w:jc w:val="left"/></w:pPr><w:r><w:rPr><w:color w:val="152A35"/></w:rPr><w:t>/orchestrator-commit</w:t></w:r></w:p></w:tc><w:tc><w:tcPr><w:tcW w:w="5278" w:type="dxa"/><w:shd w:val="clear" w:color="auto" w:fill="FFFFFF"/><w:vAlign w:val="center"/></w:tcPr><w:p><w:pPr><w:spacing w:line="240" w:lineRule="auto"/><w:jc w:val="left"/></w:pPr><w:r><w:rPr><w:color w:val="152A35"/></w:rPr><w:t>Commit estructurado SVN/Git</w:t></w:r></w:p></w:tc></w:tr></w:tbl><w:p/><w:p><w:pPr><w:pStyle w:val="Ttulo1"/></w:pPr><w:bookmarkStart w:id="25" w:name="_Toc236310428"/><w:r><w:t>Preguntas frecuentes</w:t></w:r><w:bookmarkEnd w:id="25"/></w:p><w:p><w:pPr><w:pStyle w:val="Ttulo2"/></w:pPr><w:bookmarkStart w:id="26" w:name="_Toc236310429"/><w:r><w:t>¿El servidor MCP consume recursos en segundo plano?</w:t></w:r><w:bookmarkEnd w:id="26"/></w:p><w:p><w:r><w:lastRenderedPageBreak/><w:t>No. Arranca únicamente cuando se ejecuta el primer comando /orchestrator-* en la sesión y se detiene al cerrar Claude Code.</w:t></w:r></w:p><w:p><w:pPr><w:pStyle w:val="Ttulo2"/></w:pPr><w:bookmarkStart w:id="27" w:name="_Toc236310430"/><w:r><w:t>¿Puedo usar el plugin en proyectos que no son ScacsWeb?</w:t></w:r><w:bookmarkEnd w:id="27"/></w:p><w:p><w:r><w:t>Los comandos de análisis, revisión e historial son agnósticos y funcionan en cualquier proyecto .NET. Los comandos de scaffolding (DALC, migrar, init) están pensados para ScacsWeb y pueden requerir adaptación.</w:t></w:r></w:p><w:p><w:pPr><w:pStyle w:val="Ttulo2"/></w:pPr><w:bookmarkStart w:id="28" w:name="_Toc236310431"/><w:r><w:t>¿El plugin accede a Internet?</w:t></w:r><w:bookmarkEnd w:id="28"/></w:p><w:p><w:r><w:t>No. Todo corre en local. El único acceso de red es a la BD del proyecto (si está en un servidor) y a MantisBT (si se usan los comandos /orchestrator-mantis).</w:t></w:r></w:p><w:p><w:pPr><w:pStyle w:val="Ttulo2"/></w:pPr><w:r><w:t>&#xBF;Debo tener la skill project-db-env instalada?</w:t></w:r></w:p><w:p><w:r><w:t xml:space="preserve">No. Desde v1.6.0 el contexto de base de datos est&#xE1; integrado directamente en el plugin (env.json, projects/*/config.json y projects/*/schema.md). Si ten&#xED;as la skill externa instalada puedes desinstalarla.</w:t></w:r></w:p><w:p><w:pPr><w:pStyle w:val="Ttulo2"/></w:pPr><w:r><w:t>&#xBF;env.json se sube al repositorio?</w:t></w:r></w:p><w:p><w:r><w:t xml:space="preserve">No. Est&#xE1; en .gitignore. Solo env.template.json (con placeholders) se versiona. Cada desarrollador crea su propio env.json local con sus credenciales reales.</w:t></w:r></w:p><w:p><w:pPr><w:pStyle w:val="Ttulo1"/></w:pPr><w:bookmarkStart w:id="29" w:name="_Toc236310432"/><w:r><w:t>Soporte</w:t></w:r><w:bookmarkEnd w:id="29"/></w:p><w:tbl><w:tblPr><w:tblStyle w:val="a"/><w:tblW w:w="9578" w:type="dxa"/><w:jc w:val="center"/><w:tblBorders><w:top w:val="single" w:sz="4" w:space="0" w:color="DDDDDD"/><w:left w:val="single" w:sz="4" w:space="0" w:color="DDDDDD"/><w:bottom w:val="single" w:sz="4" w:space="0" w:color="DDDDDD"/><w:right w:val="single" w:sz="4" w:space="0" w:color="DDDDDD"/><w:insideH w:val="single" w:sz="4" w:space="0" w:color="DDDDDD"/><w:insideV w:val="single" w:sz="4" w:space="0" w:color="DDDDDD"/></w:tblBorders><w:tblLayout w:type="fixed"/><w:tblLook w:val="04A0" w:firstRow="1" w:lastRow="0" w:firstColumn="1" w:lastColumn="0" w:noHBand="0" w:noVBand="1"/></w:tblPr><w:tblGrid><w:gridCol w:w="2500"/><w:gridCol w:w="7078"/></w:tblGrid><w:tr><w:trPr><w:trHeight w:val="500"/><w:jc w:val="center"/></w:trPr><w:tc><w:tcPr><w:tcW w:w="2500" w:type="dxa"/><w:shd w:val="clear" w:color="auto" w:fill="00F7BC"/><w:vAlign w:val="center"/></w:tcPr><w:p><w:pPr><w:spacing w:line="240" w:lineRule="auto"/><w:jc w:val="left"/></w:pPr><w:r><w:rPr><w:b/><w:bCs/><w:color w:val="152A35"/></w:rPr><w:t>INFORMACIÓN</w:t></w:r></w:p></w:tc><w:tc><w:tcPr><w:tcW w:w="7078" w:type="dxa"/><w:shd w:val="clear" w:color="auto" w:fill="00F7BC"/><w:vAlign w:val="center"/></w:tcPr><w:p><w:pPr><w:spacing w:line="240" w:lineRule="auto"/><w:jc w:val="left"/></w:pPr><w:r><w:rPr><w:b/><w:bCs/><w:color w:val="152A35"/></w:rPr><w:t>DETALLE</w:t></w:r></w:p></w:tc></w:tr><w:tr><w:trPr><w:trHeight w:val="500"/><w:jc w:val="center"/></w:trPr><w:tc><w:tcPr><w:tcW w:w="2500" w:type="dxa"/><w:shd w:val="clear" w:color="auto" w:fill="FFFFFF"/><w:vAlign w:val="center"/></w:tcPr><w:p><w:pPr><w:spacing w:line="240" w:lineRule="auto"/><w:jc w:val="left"/></w:pPr><w:r><w:rPr><w:color w:val="152A35"/></w:rPr><w:t>Repositorio</w:t></w:r></w:p></w:tc><w:tc><w:tcPr><w:tcW w:w="7078" w:type="dxa"/><w:shd w:val="clear" w:color="auto" w:fill="FFFFFF"/><w:vAlign w:val="center"/></w:tcPr><w:p><w:pPr><w:spacing w:line="240" w:lineRule="auto"/><w:jc w:val="left"/></w:pPr><w:r><w:rPr><w:color w:val="152A35"/></w:rPr><w:t>https://github.com/aisaplica/Orchestrator-Agent.git</w:t></w:r></w:p></w:tc></w:tr><w:tr><w:trPr><w:trHeight w:val="500"/><w:jc w:val="center"/></w:trPr><w:tc><w:tcPr><w:tcW w:w="2500" w:type="dxa"/><w:shd w:val="clear" w:color="auto" w:fill="F0F0F0"/><w:vAlign w:val="center"/></w:tcPr><w:p><w:pPr><w:spacing w:line="240" w:lineRule="auto"/><w:jc w:val="left"/></w:pPr><w:r><w:rPr><w:color w:val="152A35"/></w:rPr><w:t>Versión actual</w:t></w:r></w:p></w:tc><w:tc><w:tcPr><w:tcW w:w="7078" w:type="dxa"/><w:shd w:val="clear" w:color="auto" w:fill="F0F0F0"/><w:vAlign w:val="center"/></w:tcPr><w:p><w:pPr><w:spacing w:line="240" w:lineRule="auto"/><w:jc w:val="left"/></w:pPr><w:r><w:rPr><w:color w:val="152A35"/></w:rPr><w:t>v1.6.0 (2026-08-07)</w:t></w:r></w:p></w:tc></w:tr><w:tr><w:trPr><w:trHeight w:val="500"/><w:jc w:val="center"/></w:trPr><w:tc><w:tcPr><w:tcW w:w="2500" w:type="dxa"/><w:shd w:val="clear" w:color="auto" w:fill="FFFFFF"/><w:vAlign w:val="center"/></w:tcPr><w:p><w:pPr><w:spacing w:line="240" w:lineRule="auto"/><w:jc w:val="left"/></w:pPr><w:r><w:rPr><w:color w:val="152A35"/></w:rPr><w:t>Incidencias</w:t></w:r></w:p></w:tc><w:tc><w:tcPr><w:tcW w:w="7078" w:type="dxa"/><w:shd w:val="clear" w:color="auto" w:fill="FFFFFF"/><w:vAlign w:val="center"/></w:tcPr><w:p><w:pPr><w:spacing w:line="240" w:lineRule="auto"/><w:jc w:val="left"/></w:pPr><w:r><w:rPr><w:color w:val="152A35"/></w:rPr><w:t>Abrir issue en el repositorio o contactar con el equipo de IA</w:t></w:r></w:p></w:tc></w:tr></w:tbl><w:p/><w:sectPr><w:headerReference w:type="default" r:id="rId18"/><w:footerReference w:type="default" r:id="rId19"/><w:headerReference w:type="first" r:id="rId20"/><w:pgSz w:w="11906" w:h="16838"/><w:pgMar w:top="0" w:right="1418" w:bottom="1418" w:left="1418" w:header="1531" w:footer="1021" w:gutter="0"/><w:cols w:space="720"/></w:sectPr></w:body></w:document>
 </file>
 
-<file path=customXml\item2.xml><?xml version="1.0" encoding="utf-8"?>
-<?mso-contentType ?>
-<FormTemplates xmlns="http://schemas.microsoft.com/sharepoint/v3/contenttype/forms">
-  <Display>DocumentLibraryForm</Display>
-  <Edit>DocumentLibraryForm</Edit>
-  <New>DocumentLibraryForm</New>
-</FormTemplates>
-</file>
-
-<file path=customXml\item3.xml><?xml version="1.0" encoding="utf-8"?>
-<ct:contentTypeSchema xmlns:ct="http://schemas.microsoft.com/office/2006/metadata/contentType" xmlns:ma="http://schemas.microsoft.com/office/2006/metadata/properties/metaAttributes" ct:_="" ma:_="" ma:contentTypeName="Documento" ma:contentTypeID="0x010100C8291F31F3626C49B9133A54AB20600E" ma:contentTypeVersion="14" ma:contentTypeDescription="Crear nuevo documento." ma:contentTypeScope="" ma:versionID="71e3dccd26ff4776d5df6e7d7680c420">
-  <xsd:schema xmlns:xsd="http://www.w3.org/2001/XMLSchema" xmlns:xs="http://www.w3.org/2001/XMLSchema" xmlns:p="http://schemas.microsoft.com/office/2006/metadata/properties" xmlns:ns2="f1689d43-db92-4d41-9290-788a2bd6b1cb" xmlns:ns3="d83dd17e-c5f7-4957-b193-176974e4cd52" targetNamespace="http://schemas.microsoft.com/office/2006/metadata/properties" ma:root="true" ma:fieldsID="9e63ba60d085ec9e2dd9da848c345d63" ns2:_="" ns3:_="">
-    <xsd:import namespace="f1689d43-db92-4d41-9290-788a2bd6b1cb"/>
-    <xsd:import namespace="d83dd17e-c5f7-4957-b193-176974e4cd52"/>
-    <xsd:element name="properties">
-      <xsd:complexType>
-        <xsd:sequence>
-          <xsd:element name="documentManagement">
-            <xsd:complexType>
-              <xsd:all>
-                <xsd:element ref="ns2:MediaServiceMetadata" minOccurs="0"/>
-                <xsd:element ref="ns2:MediaServiceFastMetadata" minOccurs="0"/>
-                <xsd:element ref="ns2:MediaServiceSearchProperties" minOccurs="0"/>
-                <xsd:element ref="ns2:MediaServiceDateTaken" minOccurs="0"/>
-                <xsd:element ref="ns2:MediaServiceGenerationTime" minOccurs="0"/>
-                <xsd:element ref="ns2:MediaServiceEventHashCode" minOccurs="0"/>
-                <xsd:element ref="ns2:MediaLengthInSeconds" minOccurs="0"/>
-                <xsd:element ref="ns2:lcf76f155ced4ddcb4097134ff3c332f" minOccurs="0"/>
-                <xsd:element ref="ns3:TaxCatchAll" minOccurs="0"/>
-                <xsd:element ref="ns2:MediaServiceOCR" minOccurs="0"/>
-                <xsd:element ref="ns2:MediaServiceLocation" minOccurs="0"/>
-                <xsd:element ref="ns2:MediaServiceBillingMetadata" minOccurs="0"/>
-                <xsd:element ref="ns2:CLIENTE" minOccurs="0"/>
-              </xsd:all>
-            </xsd:complexType>
-          </xsd:element>
-        </xsd:sequence>
-      </xsd:complexType>
-    </xsd:element>
-  </xsd:schema>
-  <xsd:schema xmlns:xsd="http://www.w3.org/2001/XMLSchema" xmlns:xs="http://www.w3.org/2001/XMLSchema" xmlns:dms="http://schemas.microsoft.com/office/2006/documentManagement/types" xmlns:pc="http://schemas.microsoft.com/office/infopath/2007/PartnerControls" targetNamespace="f1689d43-db92-4d41-9290-788a2bd6b1cb" elementFormDefault="qualified">
-    <xsd:import namespace="http://schemas.microsoft.com/office/2006/documentManagement/types"/>
-    <xsd:import namespace="http://schemas.microsoft.com/office/infopath/2007/PartnerControls"/>
-    <xsd:element name="MediaServiceMetadata" ma:index="8" nillable="true" ma:displayName="MediaServiceMetadata" ma:hidden="true" ma:internalName="MediaServiceMetadata" ma:readOnly="true">
-      <xsd:simpleType>
-        <xsd:restriction base="dms:Note"/>
-      </xsd:simpleType>
-    </xsd:element>
-    <xsd:element name="MediaServiceFastMetadata" ma:index="9" nillable="true" ma:displayName="MediaServiceFastMetadata" ma:hidden="true" ma:internalName="MediaServiceFastMetadata" ma:readOnly="true">
-      <xsd:simpleType>
-        <xsd:restriction base="dms:Note"/>
-      </xsd:simpleType>
-    </xsd:element>
-    <xsd:element name="MediaServiceSearchProperties" ma:index="10" nillable="true" ma:displayName="MediaServiceSearchProperties" ma:hidden="true" ma:internalName="MediaServiceSearchProperties" ma:readOnly="true">
-      <xsd:simpleType>
-        <xsd:restriction base="dms:Note"/>
-      </xsd:simpleType>
-    </xsd:element>
-    <xsd:element name="MediaServiceDateTaken" ma:index="11" nillable="true" ma:displayName="MediaServiceDateTaken" ma:hidden="true" ma:indexed="true" ma:internalName="MediaServiceDateTaken" ma:readOnly="true">
-      <xsd:simpleType>
-        <xsd:restriction base="dms:Text"/>
-      </xsd:simpleType>
-    </xsd:element>
-    <xsd:element name="MediaServiceGenerationTime" ma:index="12" nillable="true" ma:displayName="MediaServiceGenerationTime" ma:hidden="true" ma:internalName="MediaServiceGenerationTime" ma:readOnly="true">
-      <xsd:simpleType>
-        <xsd:restriction base="dms:Text"/>
-      </xsd:simpleType>
-    </xsd:element>
-    <xsd:element name="MediaServiceEventHashCode" ma:index="13" nillable="true" ma:displayName="MediaServiceEventHashCode" ma:hidden="true" ma:internalName="MediaServiceEventHashCode" ma:readOnly="true">
-      <xsd:simpleType>
-        <xsd:restriction base="dms:Text"/>
-      </xsd:simpleType>
-    </xsd:element>
-    <xsd:element name="MediaLengthInSeconds" ma:index="14" nillable="true" ma:displayName="MediaLengthInSeconds" ma:hidden="true" ma:internalName="MediaLengthInSeconds" ma:readOnly="true">
-      <xsd:simpleType>
-        <xsd:restriction base="dms:Unknown"/>
-      </xsd:simpleType>
-    </xsd:element>
-    <xsd:element name="lcf76f155ced4ddcb4097134ff3c332f" ma:index="16" nillable="true" ma:taxonomy="true" ma:internalName="lcf76f155ced4ddcb4097134ff3c332f" ma:taxonomyFieldName="MediaServiceImageTags" ma:displayName="Etiquetas de imagen" ma:readOnly="false" ma:fieldId="{5cf76f15-5ced-4ddc-b409-7134ff3c332f}" ma:taxonomyMulti="true" ma:sspId="2894ce86-53e5-4b8d-b8f4-b17e556a7740" ma:termSetId="09814cd3-568e-fe90-9814-8d621ff8fb84" ma:anchorId="fba54fb3-c3e1-fe81-a776-ca4b69148c4d" ma:open="true" ma:isKeyword="false">
-      <xsd:complexType>
-        <xsd:sequence>
-          <xsd:element ref="pc:Terms" minOccurs="0" maxOccurs="1"/>
-        </xsd:sequence>
-      </xsd:complexType>
-    </xsd:element>
-    <xsd:element name="MediaServiceOCR" ma:index="18" nillable="true" ma:displayName="Extracted Text" ma:internalName="MediaServiceOCR" ma:readOnly="true">
-      <xsd:simpleType>
-        <xsd:restriction base="dms:Note">
-          <xsd:maxLength value="255"/>
-        </xsd:restriction>
-      </xsd:simpleType>
-    </xsd:element>
-    <xsd:element name="MediaServiceLocation" ma:index="19" nillable="true" ma:displayName="Location" ma:indexed="true" ma:internalName="MediaServiceLocation" ma:readOnly="true">
-      <xsd:simpleType>
-        <xsd:restriction base="dms:Text"/>
-      </xsd:simpleType>
-    </xsd:element>
-    <xsd:element name="MediaServiceBillingMetadata" ma:index="20" nillable="true" ma:displayName="MediaServiceBillingMetadata" ma:hidden="true" ma:internalName="MediaServiceBillingMetadata" ma:readOnly="true">
-      <xsd:simpleType>
-        <xsd:restriction base="dms:Note"/>
-      </xsd:simpleType>
-    </xsd:element>
-    <xsd:element name="CLIENTE" ma:index="21" nillable="true" ma:displayName="CLIENTE" ma:format="Dropdown" ma:internalName="CLIENTE">
-      <xsd:simpleType>
-        <xsd:restriction base="dms:Text">
-          <xsd:maxLength value="255"/>
-        </xsd:restriction>
-      </xsd:simpleType>
-    </xsd:element>
-  </xsd:schema>
-  <xsd:schema xmlns:xsd="http://www.w3.org/2001/XMLSchema" xmlns:xs="http://www.w3.org/2001/XMLSchema" xmlns:dms="http://schemas.microsoft.com/office/2006/documentManagement/types" xmlns:pc="http://schemas.microsoft.com/office/infopath/2007/PartnerControls" targetNamespace="d83dd17e-c5f7-4957-b193-176974e4cd52" elementFormDefault="qualified">
-    <xsd:import namespace="http://schemas.microsoft.com/office/2006/documentManagement/types"/>
-    <xsd:import namespace="http://schemas.microsoft.com/office/infopath/2007/PartnerControls"/>
-    <xsd:element name="TaxCatchAll" ma:index="17" nillable="true" ma:displayName="Taxonomy Catch All Column" ma:hidden="true" ma:list="{5fa6894e-e209-4042-a415-d151a74eb029}" ma:internalName="TaxCatchAll" ma:showField="CatchAllData" ma:web="d83dd17e-c5f7-4957-b193-176974e4cd52">
-      <xsd:complexType>
-        <xsd:complexContent>
-          <xsd:extension base="dms:MultiChoiceLookup">
-            <xsd:sequence>
-              <xsd:element name="Value" type="dms:Lookup" maxOccurs="unbounded" minOccurs="0" nillable="true"/>
-            </xsd:sequence>
-          </xsd:extension>
-        </xsd:complexContent>
-      </xsd:complexType>
-    </xsd:element>
-  </xsd:schema>
-  <xsd:schema xmlns="http://schemas.openxmlformats.org/package/2006/metadata/core-properties" xmlns:xsd="http://www.w3.org/2001/XMLSchema" xmlns:xsi="http://www.w3.org/2001/XMLSchema-instance" xmlns:dc="http://purl.org/dc/elements/1.1/" xmlns:dcterms="http://purl.org/dc/terms/" xmlns:odoc="http://schemas.microsoft.com/internal/obd" targetNamespace="http://schemas.openxmlformats.org/package/2006/metadata/core-properties" elementFormDefault="qualified" attributeFormDefault="unqualified" blockDefault="#all">
-    <xsd:import namespace="http://purl.org/dc/elements/1.1/" schemaLocation="http://dublincore.org/schemas/xmls/qdc/2003/04/02/dc.xsd"/>
-    <xsd:import namespace="http://purl.org/dc/terms/" schemaLocation="http://dublincore.org/schemas/xmls/qdc/2003/04/02/dcterms.xsd"/>
-    <xsd:element name="coreProperties" type="CT_coreProperties"/>
-    <xsd:complexType name="CT_coreProperties">
-      <xsd:all>
-        <xsd:element ref="dc:creator" minOccurs="0" maxOccurs="1"/>
-        <xsd:element ref="dcterms:created" minOccurs="0" maxOccurs="1"/>
-        <xsd:element ref="dc:identifier" minOccurs="0" maxOccurs="1"/>
-        <xsd:element name="contentType" minOccurs="0" maxOccurs="1" type="xsd:string" ma:index="0" ma:displayName="Tipo de contenido"/>
-        <xsd:element ref="dc:title" minOccurs="0" maxOccurs="1" ma:index="4" ma:displayName="Título"/>
-        <xsd:element ref="dc:subject" minOccurs="0" maxOccurs="1"/>
-        <xsd:element ref="dc:description" minOccurs="0" maxOccurs="1"/>
-        <xsd:element name="keywords" minOccurs="0" maxOccurs="1" type="xsd:string"/>
-        <xsd:element ref="dc:language" minOccurs="0" maxOccurs="1"/>
-        <xsd:element name="category" minOccurs="0" maxOccurs="1" type="xsd:string"/>
-        <xsd:element name="version" minOccurs="0" maxOccurs="1" type="xsd:string"/>
-        <xsd:element name="revision" minOccurs="0" maxOccurs="1" type="xsd:string">
-          <xsd:annotation>
-            <xsd:documentation>
-                        This value indicates the number of saves or revisions. The application is responsible for updating this value after each revision.
-                    </xsd:documentation>
-          </xsd:annotation>
-        </xsd:element>
-        <xsd:element name="lastModifiedBy" minOccurs="0" maxOccurs="1" type="xsd:string"/>
-        <xsd:element ref="dcterms:modified" minOccurs="0" maxOccurs="1"/>
-        <xsd:element name="contentStatus" minOccurs="0" maxOccurs="1" type="xsd:string"/>
-      </xsd:all>
-    </xsd:complexType>
-  </xsd:schema>
-  <xs:schema xmlns:pc="http://schemas.microsoft.com/office/infopath/2007/PartnerControls" xmlns:xs="http://www.w3.org/2001/XMLSchema" targetNamespace="http://schemas.microsoft.com/office/infopath/2007/PartnerControls" elementFormDefault="qualified" attributeFormDefault="unqualified">
-    <xs:element name="Person">
-      <xs:complexType>
-        <xs:sequence>
-          <xs:element ref="pc:DisplayName" minOccurs="0"/>
-          <xs:element ref="pc:AccountId" minOccurs="0"/>
-          <xs:element ref="pc:AccountType" minOccurs="0"/>
-        </xs:sequence>
-      </xs:complexType>
-    </xs:element>
-    <xs:element name="DisplayName" type="xs:string"/>
-    <xs:element name="AccountId" type="xs:string"/>
-    <xs:element name="AccountType" type="xs:string"/>
-    <xs:element name="BDCAssociatedEntity">
-      <xs:complexType>
-        <xs:sequence>
-          <xs:element ref="pc:BDCEntity" minOccurs="0" maxOccurs="unbounded"/>
-        </xs:sequence>
-        <xs:attribute ref="pc:EntityNamespace"/>
-        <xs:attribute ref="pc:EntityName"/>
-        <xs:attribute ref="pc:SystemInstanceName"/>
-        <xs:attribute ref="pc:AssociationName"/>
-      </xs:complexType>
-    </xs:element>
-    <xs:attribute name="EntityNamespace" type="xs:string"/>
-    <xs:attribute name="EntityName" type="xs:string"/>
-    <xs:attribute name="SystemInstanceName" type="xs:string"/>
-    <xs:attribute name="AssociationName" type="xs:string"/>
-    <xs:element name="BDCEntity">
-      <xs:complexType>
-        <xs:sequence>
-          <xs:element ref="pc:EntityDisplayName" minOccurs="0"/>
-          <xs:element ref="pc:EntityInstanceReference" minOccurs="0"/>
-          <xs:element ref="pc:EntityId1" minOccurs="0"/>
-          <xs:element ref="pc:EntityId2" minOccurs="0"/>
-          <xs:element ref="pc:EntityId3" minOccurs="0"/>
-          <xs:element ref="pc:EntityId4" minOccurs="0"/>
-          <xs:element ref="pc:EntityId5" minOccurs="0"/>
-        </xs:sequence>
-      </xs:complexType>
-    </xs:element>
-    <xs:element name="EntityDisplayName" type="xs:string"/>
-    <xs:element name="EntityInstanceReference" type="xs:string"/>
-    <xs:element name="EntityId1" type="xs:string"/>
-    <xs:element name="EntityId2" type="xs:string"/>
-    <xs:element name="EntityId3" type="xs:string"/>
-    <xs:element name="EntityId4" type="xs:string"/>
-    <xs:element name="EntityId5" type="xs:string"/>
-    <xs:element name="Terms">
-      <xs:complexType>
-        <xs:sequence>
-          <xs:element ref="pc:TermInfo" minOccurs="0" maxOccurs="unbounded"/>
-        </xs:sequence>
-      </xs:complexType>
-    </xs:element>
-    <xs:element name="TermInfo">
-      <xs:complexType>
-        <xs:sequence>
-          <xs:element ref="pc:TermName" minOccurs="0"/>
-          <xs:element ref="pc:TermId" minOccurs="0"/>
-        </xs:sequence>
-      </xs:complexType>
-    </xs:element>
-    <xs:element name="TermName" type="xs:string"/>
-    <xs:element name="TermId" type="xs:string"/>
-  </xs:schema>
-</ct:contentTypeSchema>
-</file>
-
-<file path=customXml\itemProps1.xml><?xml version="1.0" encoding="utf-8"?>
-<ds:datastoreItem xmlns:ds="http://schemas.openxmlformats.org/officeDocument/2006/customXml" ds:itemID="{E65C59FA-E8AC-4836-893D-09B7E8280B41}">
-  <ds:schemaRefs>
-    <ds:schemaRef ds:uri="http://schemas.microsoft.com/office/2006/metadata/properties"/>
-    <ds:schemaRef ds:uri="http://schemas.microsoft.com/office/infopath/2007/PartnerControls"/>
-    <ds:schemaRef ds:uri="f1689d43-db92-4d41-9290-788a2bd6b1cb"/>
-    <ds:schemaRef ds:uri="d83dd17e-c5f7-4957-b193-176974e4cd52"/>
-  </ds:schemaRefs>
-</ds:datastoreItem>
-</file>
-
-<file path=customXml\itemProps2.xml><?xml version="1.0" encoding="utf-8"?>
-<ds:datastoreItem xmlns:ds="http://schemas.openxmlformats.org/officeDocument/2006/customXml" ds:itemID="{2325E047-6935-4A21-BA98-A8AE9E5E5F07}">
-  <ds:schemaRefs>
-    <ds:schemaRef ds:uri="http://schemas.microsoft.com/sharepoint/v3/contenttype/forms"/>
-  </ds:schemaRefs>
-</ds:datastoreItem>
-</file>
-
-<file path=customXml\itemProps3.xml><?xml version="1.0" encoding="utf-8"?>
-<ds:datastoreItem xmlns:ds="http://schemas.openxmlformats.org/officeDocument/2006/customXml" ds:itemID="{E0DC93EC-43FE-46E5-83EE-FD8AC0D2D599}">
-  <ds:schemaRefs>
-    <ds:schemaRef ds:uri="http://schemas.microsoft.com/office/2006/metadata/contentType"/>
-    <ds:schemaRef ds:uri="http://schemas.microsoft.com/office/2006/metadata/properties/metaAttributes"/>
-    <ds:schemaRef ds:uri="http://www.w3.org/2001/XMLSchema"/>
-    <ds:schemaRef ds:uri="http://schemas.microsoft.com/office/2006/metadata/properties"/>
-    <ds:schemaRef ds:uri="f1689d43-db92-4d41-9290-788a2bd6b1cb"/>
-    <ds:schemaRef ds:uri="d83dd17e-c5f7-4957-b193-176974e4cd52"/>
-    <ds:schemaRef ds:uri="http://schemas.microsoft.com/office/2006/documentManagement/types"/>
-    <ds:schemaRef ds:uri="http://schemas.microsoft.com/office/infopath/2007/PartnerControls"/>
-    <ds:schemaRef ds:uri="http://schemas.openxmlformats.org/package/2006/metadata/core-properties"/>
-    <ds:schemaRef ds:uri="http://purl.org/dc/elements/1.1/"/>
-    <ds:schemaRef ds:uri="http://purl.org/dc/terms/"/>
-    <ds:schemaRef ds:uri="http://schemas.microsoft.com/internal/obd"/>
-  </ds:schemaRefs>
-</ds:datastoreItem>
-</file>
-
-<file path=docMetadata\LabelInfo.xml><?xml version="1.0" encoding="utf-8"?>
-<clbl:labelList xmlns:clbl="http://schemas.microsoft.com/office/2020/mipLabelMetadata">
-  <clbl:label id="{7d833f38-eb62-4252-b2d1-5e3a5d5cfcd6}" enabled="0" method="" siteId="{7d833f38-eb62-4252-b2d1-5e3a5d5cfcd6}" removed="1"/>
-</clbl:labelList>
-</file>
-
-<file path=docProps\app.xml><?xml version="1.0" encoding="utf-8"?>
-<Properties xmlns="http://schemas.openxmlformats.org/officeDocument/2006/extended-properties" xmlns:vt="http://schemas.openxmlformats.org/officeDocument/2006/docPropsVTypes">
-  <Template>Normal.dotm</Template>
-  <TotalTime>3</TotalTime>
-  <Pages>14</Pages>
-  <Words>2120</Words>
-  <Characters>11660</Characters>
-  <Application>Microsoft Office Word</Application>
-  <DocSecurity>0</DocSecurity>
-  <Lines>97</Lines>
-  <Paragraphs>27</Paragraphs>
-  <ScaleCrop>false</ScaleCrop>
-  <HeadingPairs>
-    <vt:vector size="2" baseType="variant">
-      <vt:variant>
-        <vt:lpstr>Título</vt:lpstr>
-      </vt:variant>
-      <vt:variant>
-        <vt:i4>1</vt:i4>
-      </vt:variant>
-    </vt:vector>
-  </HeadingPairs>
-  <TitlesOfParts>
-    <vt:vector size="1" baseType="lpstr">
-      <vt:lpstr/>
-    </vt:vector>
-  </TitlesOfParts>
-  <Company/>
-  <LinksUpToDate>false</LinksUpToDate>
-  <CharactersWithSpaces>13753</CharactersWithSpaces>
-  <SharedDoc>false</SharedDoc>
-  <HyperlinksChanged>false</HyperlinksChanged>
-  <AppVersion>16.0000</AppVersion>
-</Properties>
-</file>
-
-<file path=docProps\core.xml><?xml version="1.0" encoding="utf-8"?>
-<cp:coreProperties xmlns:cp="http://schemas.openxmlformats.org/package/2006/metadata/core-properties" xmlns:dc="http://purl.org/dc/elements/1.1/" xmlns:dcterms="http://purl.org/dc/terms/" xmlns:dcmitype="http://purl.org/dc/dcmitype/" xmlns:xsi="http://www.w3.org/2001/XMLSchema-instance">
-  <dc:title/>
-  <dc:creator>Maria Garcia</dc:creator>
-  <cp:lastModifiedBy>David Gandoy</cp:lastModifiedBy>
-  <cp:revision>3</cp:revision>
-  <cp:lastPrinted>2025-11-19T09:21:00Z</cp:lastPrinted>
-  <dcterms:created xsi:type="dcterms:W3CDTF">2026-04-09T14:35:00Z</dcterms:created>
-  <dcterms:modified xsi:type="dcterms:W3CDTF">2026-07-30T11:28:00Z</dcterms:modified>
-</cp:coreProperties>
-</file>
-
-<file path=docProps\custom.xml><?xml version="1.0" encoding="utf-8"?>
-<Properties xmlns="http://schemas.openxmlformats.org/officeDocument/2006/custom-properties" xmlns:vt="http://schemas.openxmlformats.org/officeDocument/2006/docPropsVTypes">
-  <property fmtid="{D5CDD505-2E9C-101B-9397-08002B2CF9AE}" pid="2" name="ContentTypeId">
-    <vt:lpwstr>0x010100C8291F31F3626C49B9133A54AB20600E</vt:lpwstr>
-  </property>
-  <property fmtid="{D5CDD505-2E9C-101B-9397-08002B2CF9AE}" pid="3" name="Order">
-    <vt:r8>791900</vt:r8>
-  </property>
-  <property fmtid="{D5CDD505-2E9C-101B-9397-08002B2CF9AE}" pid="4" name="MigrationWizIdVersion">
-    <vt:lpwstr>1lJinfOz9Y-iuMg9ixf4awXWjV8rfyAh219dC7--F2Yg-638180075260000000</vt:lpwstr>
-  </property>
-  <property fmtid="{D5CDD505-2E9C-101B-9397-08002B2CF9AE}" pid="5" name="_ColorTag">
-    <vt:lpwstr/>
-  </property>
-  <property fmtid="{D5CDD505-2E9C-101B-9397-08002B2CF9AE}" pid="6" name="_ExtendedDescription">
-    <vt:lpwstr/>
-  </property>
-  <property fmtid="{D5CDD505-2E9C-101B-9397-08002B2CF9AE}" pid="7" name="MigrationWizId">
-    <vt:lpwstr>1lJinfOz9Y-iuMg9ixf4awXWjV8rfyAh219dC7--F2Yg</vt:lpwstr>
-  </property>
-  <property fmtid="{D5CDD505-2E9C-101B-9397-08002B2CF9AE}" pid="8" name="MigrationWizIdPermissions">
-    <vt:lpwstr>1lJinfOz9Y-iuMg9ixf4awXWjV8rfyAh219dC7--F2Yg</vt:lpwstr>
-  </property>
-  <property fmtid="{D5CDD505-2E9C-101B-9397-08002B2CF9AE}" pid="9" name="TriggerFlowInfo">
-    <vt:lpwstr/>
-  </property>
-  <property fmtid="{D5CDD505-2E9C-101B-9397-08002B2CF9AE}" pid="10" name="_ColorHex">
-    <vt:lpwstr/>
-  </property>
-  <property fmtid="{D5CDD505-2E9C-101B-9397-08002B2CF9AE}" pid="11" name="_Emoji">
-    <vt:lpwstr/>
-  </property>
-  <property fmtid="{D5CDD505-2E9C-101B-9397-08002B2CF9AE}" pid="12" name="ComplianceAssetId">
-    <vt:lpwstr/>
-  </property>
-  <property fmtid="{D5CDD505-2E9C-101B-9397-08002B2CF9AE}" pid="13" name="xd_Signature">
-    <vt:bool>false</vt:bool>
-  </property>
-  <property fmtid="{D5CDD505-2E9C-101B-9397-08002B2CF9AE}" pid="14" name="xd_ProgID">
-    <vt:lpwstr/>
-  </property>
-  <property fmtid="{D5CDD505-2E9C-101B-9397-08002B2CF9AE}" pid="15" name="TemplateUrl">
-    <vt:lpwstr/>
-  </property>
-  <property fmtid="{D5CDD505-2E9C-101B-9397-08002B2CF9AE}" pid="16" name="MediaServiceImageTags">
-    <vt:lpwstr/>
-  </property>
-  <property fmtid="{D5CDD505-2E9C-101B-9397-08002B2CF9AE}" pid="17" name="_SourceUrl">
-    <vt:lpwstr/>
-  </property>
-  <property fmtid="{D5CDD505-2E9C-101B-9397-08002B2CF9AE}" pid="18" name="_SharedFileIndex">
-    <vt:lpwstr/>
-  </property>
-</Properties>
-</file>
-
-<file path=word\document.xml>﻿<?xml version="1.0" encoding="UTF-8"?><w:document xmlns:wpc="http://schemas.microsoft.com/office/word/2010/wordprocessingCanvas" xmlns:cx="http://schemas.microsoft.com/office/drawing/2014/chartex" xmlns:cx1="http://schemas.microsoft.com/office/drawing/2015/9/8/chartex" xmlns:cx2="http://schemas.microsoft.com/office/drawing/2015/10/21/chartex" xmlns:cx3="http://schemas.microsoft.com/office/drawing/2016/5/9/chartex" xmlns:cx4="http://schemas.microsoft.com/office/drawing/2016/5/10/chartex" xmlns:cx5="http://schemas.microsoft.com/office/drawing/2016/5/11/chartex" xmlns:cx6="http://schemas.microsoft.com/office/drawing/2016/5/12/chartex" xmlns:cx7="http://schemas.microsoft.com/office/drawing/2016/5/13/chartex" xmlns:cx8="http://schemas.microsoft.com/office/drawing/2016/5/14/chartex" xmlns:mc="http://schemas.openxmlformats.org/markup-compatibility/2006" xmlns:aink="http://schemas.microsoft.com/office/drawing/2016/ink" xmlns:am3d="http://schemas.microsoft.com/office/drawing/2017/model3d" xmlns:o="urn:schemas-microsoft-com:office:office" xmlns:oel="http://schemas.microsoft.com/office/2019/extlst" xmlns:r="http://schemas.openxmlformats.org/officeDocument/2006/relationships" xmlns:m="http://schemas.openxmlformats.org/officeDocument/2006/math" xmlns:v="urn:schemas-microsoft-com:vml" xmlns:wp14="http://schemas.microsoft.com/office/word/2010/wordprocessingDrawing" xmlns:wp="http://schemas.openxmlformats.org/drawingml/2006/wordprocessingDrawing" xmlns:w10="urn:schemas-microsoft-com:office:word" xmlns:w="http://schemas.openxmlformats.org/wordprocessingml/2006/main" xmlns:w14="http://schemas.microsoft.com/office/word/2010/wordml" xmlns:w15="http://schemas.microsoft.com/office/word/2012/wordml" xmlns:w16cei="http://schemas.microsoft.com/office/word/2026/wordml/cei" xmlns:w16cex="http://schemas.microsoft.com/office/word/2018/wordml/cex" xmlns:w16cid="http://schemas.microsoft.com/office/word/2016/wordml/cid" xmlns:w16="http://schemas.microsoft.com/office/word/2018/wordml" xmlns:w16du="http://schemas.microsoft.com/office/word/2023/wordml/word16du" xmlns:w16sdtdh="http://schemas.microsoft.com/office/word/2020/wordml/sdtdatahash" xmlns:w16sdtfl="http://schemas.microsoft.com/office/word/2024/wordml/sdtformatlock" xmlns:w16se="http://schemas.microsoft.com/office/word/2015/wordml/symex" xmlns:wpg="http://schemas.microsoft.com/office/word/2010/wordprocessingGroup" xmlns:wpi="http://schemas.microsoft.com/office/word/2010/wordprocessingInk" xmlns:wne="http://schemas.microsoft.com/office/word/2006/wordml" xmlns:wps="http://schemas.microsoft.com/office/word/2010/wordprocessingShape" mc:Ignorable="w14 w15 w16se w16cid w16 w16cex w16sdtdh w16sdtfl w16du wp14"><w:body><w:p><w:pPr><w:pStyle w:val="Ttulo"/></w:pPr><w:bookmarkStart w:id="0" w:name="_ubimia_logo" w:colFirst="0" w:colLast="0"/><w:bookmarkEnd w:id="0"/><w:r><w:rPr><w:noProof/></w:rPr><w:drawing><wp:anchor distT="0" distB="0" distL="114300" distR="114300" simplePos="0" relativeHeight="251659264" behindDoc="0" locked="0" layoutInCell="1" allowOverlap="1" wp14:anchorId="6215DE63" wp14:editId="7C0171AD"><wp:simplePos x="0" y="0"/><wp:positionH relativeFrom="margin"><wp:align>left</wp:align></wp:positionH><wp:positionV relativeFrom="paragraph"><wp:posOffset>35487</wp:posOffset></wp:positionV><wp:extent cx="2387600" cy="522605"/><wp:effectExtent l="0" t="0" r="0" b="0"/><wp:wrapSquare wrapText="bothSides"/><wp:docPr id="465213794" name="Logo UBIMIA"/><wp:cNvGraphicFramePr><a:graphicFrameLocks xmlns:a="http://schemas.openxmlformats.org/drawingml/2006/main" noChangeAspect="1"/></wp:cNvGraphicFramePr><a:graphic xmlns:a="http://schemas.openxmlformats.org/drawingml/2006/main"><a:graphicData uri="http://schemas.openxmlformats.org/drawingml/2006/picture"><pic:pic xmlns:pic="http://schemas.openxmlformats.org/drawingml/2006/picture"><pic:nvPicPr><pic:cNvPr id="465213794" name=""/><pic:cNvPicPr/></pic:nvPicPr><pic:blipFill><a:blip r:embed="rId10"><a:extLst><a:ext uri="{96DAC541-7B7A-43D3-8B79-37D633B846F1}"><asvg:svgBlip xmlns:asvg="http://schemas.microsoft.com/office/drawing/2016/SVG/main" r:embed="rId11"/></a:ext></a:extLst></a:blip><a:stretch><a:fillRect/></a:stretch></pic:blipFill><pic:spPr><a:xfrm><a:off x="0" y="0"/><a:ext cx="2387600" cy="522605"/></a:xfrm><a:prstGeom prst="rect"><a:avLst/></a:prstGeom></pic:spPr></pic:pic></a:graphicData></a:graphic></wp:anchor></w:drawing></w:r></w:p><w:p><w:pPr><w:pStyle w:val="Ttulo"/></w:pPr><w:r><w:t>ORCHESTRATOR SKILL FULL — GUÍA DE INSTALACIÓN Y USO</w:t></w:r></w:p><w:p><w:pPr><w:pStyle w:val="Subttulo"/></w:pPr><w:r><w:t>Plugin de Claude Code para proyectos ScacsWeb</w:t></w:r></w:p><w:p/><w:p/><w:p/><w:p/><w:p/><w:p/><w:p><w:r><w:rPr><w:color w:val="595757"/></w:rPr><w:t>Versión: v1.6.1</w:t></w:r></w:p><w:p><w:r><w:rPr><w:color w:val="595757"/></w:rPr><w:t>Fecha: 10/08/2026</w:t></w:r></w:p><w:p><w:r><w:rPr><w:color w:val="595757"/></w:rPr><w:t>Autor: david.gandoy@ubimia.com</w:t></w:r></w:p><w:p/><w:p/><w:p/><w:p><w:pPr><w:sectPr><w:headerReference w:type="default" r:id="rId12"/><w:footerReference w:type="default" r:id="rId13"/><w:headerReference w:type="first" r:id="rId14"/><w:footerReference w:type="first" r:id="rId15"/><w:pgSz w:w="11906" w:h="16838"/><w:pgMar w:top="0" w:right="1418" w:bottom="1418" w:left="1418" w:header="1531" w:footer="1021" w:gutter="0"/><w:pgNumType w:start="1"/><w:cols w:space="720"/><w:titlePg/></w:sectPr></w:pPr></w:p><w:p><w:pPr><w:pStyle w:val="Subttulo"/></w:pPr><w:r><w:lastRenderedPageBreak/><w:t>Historial de cambios</w:t></w:r></w:p><w:p/><w:tbl><w:tblPr><w:tblStyle w:val="a"/><w:tblW w:w="9578" w:type="dxa"/><w:jc w:val="center"/><w:tblBorders><w:top w:val="single" w:sz="4" w:space="0" w:color="DDDDDD"/><w:left w:val="single" w:sz="4" w:space="0" w:color="DDDDDD"/><w:bottom w:val="single" w:sz="4" w:space="0" w:color="DDDDDD"/><w:right w:val="single" w:sz="4" w:space="0" w:color="DDDDDD"/><w:insideH w:val="single" w:sz="4" w:space="0" w:color="DDDDDD"/><w:insideV w:val="single" w:sz="4" w:space="0" w:color="DDDDDD"/></w:tblBorders><w:tblLayout w:type="fixed"/><w:tblLook w:val="04A0" w:firstRow="1" w:lastRow="0" w:firstColumn="1" w:lastColumn="0" w:noHBand="0" w:noVBand="1"/></w:tblPr><w:tblGrid><w:gridCol w:w="1613"/><w:gridCol w:w="1549"/><w:gridCol w:w="2000"/><w:gridCol w:w="4416"/></w:tblGrid><w:tr><w:trPr><w:trHeight w:val="500"/><w:jc w:val="center"/></w:trPr><w:tc><w:tcPr><w:tcW w:w="1613" w:type="dxa"/><w:shd w:val="clear" w:color="auto" w:fill="00F7BC"/><w:vAlign w:val="center"/></w:tcPr><w:p><w:pPr><w:spacing w:line="240" w:lineRule="auto"/><w:jc w:val="left"/></w:pPr><w:r><w:rPr><w:b/><w:bCs/><w:color w:val="152A35"/></w:rPr><w:t>VERSIÓN</w:t></w:r></w:p></w:tc><w:tc><w:tcPr><w:tcW w:w="1549" w:type="dxa"/><w:shd w:val="clear" w:color="auto" w:fill="00F7BC"/><w:vAlign w:val="center"/></w:tcPr><w:p><w:pPr><w:spacing w:line="240" w:lineRule="auto"/><w:jc w:val="left"/></w:pPr><w:r><w:rPr><w:b/><w:bCs/><w:color w:val="152A35"/></w:rPr><w:t>FECHA</w:t></w:r></w:p></w:tc><w:tc><w:tcPr><w:tcW w:w="2000" w:type="dxa"/><w:shd w:val="clear" w:color="auto" w:fill="00F7BC"/><w:vAlign w:val="center"/></w:tcPr><w:p><w:pPr><w:spacing w:line="240" w:lineRule="auto"/><w:jc w:val="left"/></w:pPr><w:r><w:rPr><w:b/><w:bCs/><w:color w:val="152A35"/></w:rPr><w:t>AUTOR</w:t></w:r></w:p></w:tc><w:tc><w:tcPr><w:tcW w:w="4416" w:type="dxa"/><w:shd w:val="clear" w:color="auto" w:fill="00F7BC"/><w:vAlign w:val="center"/></w:tcPr><w:p><w:pPr><w:spacing w:line="240" w:lineRule="auto"/><w:jc w:val="left"/></w:pPr><w:r><w:rPr><w:b/><w:bCs/><w:color w:val="152A35"/></w:rPr><w:t>CAMBIOS</w:t></w:r></w:p></w:tc></w:tr><w:tr><w:trPr><w:trHeight w:val="500"/><w:jc w:val="center"/></w:trPr><w:tc><w:tcPr><w:tcW w:w="1613" w:type="dxa"/><w:shd w:val="clear" w:color="auto" w:fill="FFFFFF"/><w:vAlign w:val="center"/></w:tcPr><w:p><w:pPr><w:spacing w:line="240" w:lineRule="auto"/><w:jc w:val="left"/></w:pPr><w:r><w:rPr><w:color w:val="152A35"/></w:rPr><w:t>v1.0.0</w:t></w:r></w:p></w:tc><w:tc><w:tcPr><w:tcW w:w="1549" w:type="dxa"/><w:shd w:val="clear" w:color="auto" w:fill="FFFFFF"/><w:vAlign w:val="center"/></w:tcPr><w:p><w:pPr><w:spacing w:line="240" w:lineRule="auto"/><w:jc w:val="left"/></w:pPr><w:r><w:rPr><w:color w:val="152A35"/></w:rPr><w:t>30/07/2026</w:t></w:r></w:p></w:tc><w:tc><w:tcPr><w:tcW w:w="2000" w:type="dxa"/><w:shd w:val="clear" w:color="auto" w:fill="FFFFFF"/><w:vAlign w:val="center"/></w:tcPr><w:p><w:pPr><w:spacing w:line="240" w:lineRule="auto"/><w:jc w:val="left"/></w:pPr><w:r><w:rPr><w:color w:val="152A35"/></w:rPr><w:t>david.gandoy</w:t></w:r></w:p></w:tc><w:tc><w:tcPr><w:tcW w:w="4416" w:type="dxa"/><w:shd w:val="clear" w:color="auto" w:fill="FFFFFF"/><w:vAlign w:val="center"/></w:tcPr><w:p><w:pPr><w:spacing w:line="240" w:lineRule="auto"/><w:jc w:val="left"/></w:pPr><w:r><w:rPr><w:color w:val="152A35"/></w:rPr><w:t>Versión inicial del documento</w:t></w:r></w:p></w:tc></w:tr><w:tr><w:trPr><w:trHeight w:val="500"/><w:jc w:val="center"/></w:trPr><w:tc><w:tcPr><w:tcW w:w="1613" w:type="dxa"/><w:shd w:val="clear" w:color="auto" w:fill="FFFFFF"/><w:vAlign w:val="center"/></w:tcPr><w:p><w:pPr><w:spacing w:line="240" w:lineRule="auto"/><w:jc w:val="left"/></w:pPr><w:r><w:rPr><w:color w:val="152A35"/></w:rPr><w:t>v1.6.0</w:t></w:r></w:p></w:tc><w:tc><w:tcPr><w:tcW w:w="1549" w:type="dxa"/><w:shd w:val="clear" w:color="auto" w:fill="FFFFFF"/><w:vAlign w:val="center"/></w:tcPr><w:p><w:pPr><w:spacing w:line="240" w:lineRule="auto"/><w:jc w:val="left"/></w:pPr><w:r><w:rPr><w:color w:val="152A35"/></w:rPr><w:t>06/08/2026</w:t></w:r></w:p></w:tc><w:tc><w:tcPr><w:tcW w:w="2000" w:type="dxa"/><w:shd w:val="clear" w:color="auto" w:fill="FFFFFF"/><w:vAlign w:val="center"/></w:tcPr><w:p><w:pPr><w:spacing w:line="240" w:lineRule="auto"/><w:jc w:val="left"/></w:pPr><w:r><w:rPr><w:color w:val="152A35"/></w:rPr><w:t>david.gandoy</w:t></w:r></w:p></w:tc><w:tc><w:tcPr><w:tcW w:w="4416" w:type="dxa"/><w:shd w:val="clear" w:color="auto" w:fill="FFFFFF"/><w:vAlign w:val="center"/></w:tcPr><w:p><w:pPr><w:spacing w:line="240" w:lineRule="auto"/><w:jc w:val="left"/></w:pPr><w:r><w:rPr><w:color w:val="152A35"/></w:rPr><w:t>Fix BOM UTF-8 en hooks PS1 + fallback USERPROFILE en mantis-cli.ps1</w:t></w:r></w:p></w:tc></w:tr><w:tr w:rsidR=00C826FF w14:paraId=6E82CD3F w14:textId=77777777><w:trPr><w:trHeight w:val=500/><w:jc w:val=center/></w:trPr><w:tc><w:tcPr><w:tcW w:w=1613 w:type=dxa/><w:shd w:val=clear w:color=auto w:fill=FFFFFF/><w:vAlign w:val=center/></w:tcPr><w:p w14:paraId=6E82CD40 w14:textId=77777777 w:rsidR=00C826FF w:rsidRDefault=00000000><w:pPr><w:spacing w:line=240 w:lineRule=auto/><w:jc w:val=left/></w:pPr><w:r><w:rPr><w:color w:val=152A35/></w:rPr><w:t>v1.6.1</w:t></w:r></w:p></w:tc><w:tc><w:tcPr><w:tcW w:w=1549 w:type=dxa/><w:shd w:val=clear w:color=auto w:fill=FFFFFF/><w:vAlign w:val=center/></w:tcPr><w:p w14:paraId=6E82CD41 w14:textId=77777777 w:rsidR=00C826FF w:rsidRDefault=00000000><w:pPr><w:spacing w:line=240 w:lineRule=auto/><w:jc w:val=left/></w:pPr><w:r><w:rPr><w:color w:val=152A35/></w:rPr><w:t>10/08/2026</w:t></w:r></w:p></w:tc><w:tc><w:tcPr><w:tcW w:w=2000 w:type=dxa/><w:shd w:val=clear w:color=auto w:fill=FFFFFF/><w:vAlign w:val=center/></w:tcPr><w:p w14:paraId=6E82CD42 w14:textId=77777777 w:rsidR=00C826FF w:rsidRDefault=00000000><w:pPr><w:spacing w:line=240 w:lineRule=auto/><w:jc w:val=left/></w:pPr><w:r><w:rPr><w:color w:val=152A35/></w:rPr><w:t>david.gandoy</w:t></w:r></w:p></w:tc><w:tc><w:tcPr><w:tcW w:w=4416 w:type=dxa/><w:shd w:val=clear w:color=auto w:fill=FFFFFF/><w:vAlign w:val=center/></w:tcPr><w:p w14:paraId=6E82CD43 w14:textId=77777777 w:rsidR=00C826FF w:rsidRDefault=00000000><w:pPr><w:spacing w:line=240 w:lineRule=auto/><w:jc w:val=left/></w:pPr><w:r><w:rPr><w:color w:val=152A35/></w:rPr><w:t>JSON compacto MCP (~21% tokens); runner tail 400 l&#237;neas; find-symbol multi-s&#237;mbolo; visible:false Oracle; escritor can&#243;nico model.json</w:t></w:r></w:p></w:tc></w:tr></w:tbl><w:p/><w:p><w:pPr><w:sectPr><w:headerReference w:type="first" r:id="rId16"/><w:pgSz w:w="11906" w:h="16838"/><w:pgMar w:top="0" w:right="1418" w:bottom="1418" w:left="1418" w:header="1531" w:footer="1021" w:gutter="0"/><w:cols w:space="720"/></w:sectPr></w:pPr></w:p><w:p><w:pPr><w:pStyle w:val="Subttulo"/></w:pPr><w:r><w:lastRenderedPageBreak/><w:t>ÍNDICE</w:t></w:r></w:p><w:p/><w:p><w:pPr><w:pStyle w:val="TDC1"/><w:rPr><w:rFonts w:asciiTheme="minorHAnsi" w:eastAsiaTheme="minorEastAsia" w:hAnsiTheme="minorHAnsi" w:cstheme="minorBidi"/><w:kern w:val="2"/><w:sz w:val="24"/><w:szCs w:val="24"/><w:lang w:eastAsia="es-ES"/><w14:ligatures w14:val="standardContextual"/></w:rPr></w:pPr><w:r><w:fldChar w:fldCharType="begin"/><w:instrText xml:space="preserve"> TOC \o "1-3" \h \z \u </w:instrText><w:fldChar w:fldCharType="separate"/></w:r><w:hyperlink w:anchor="_Toc236310404" w:history="1"><w:r><w:rPr><w:rStyle w:val="Hipervnculo"/></w:rPr><w:t>1.</w:t></w:r><w:r><w:rPr><w:rFonts w:asciiTheme="minorHAnsi" w:eastAsiaTheme="minorEastAsia" w:hAnsiTheme="minorHAnsi" w:cstheme="minorBidi"/><w:kern w:val="2"/><w:sz w:val="24"/><w:szCs w:val="24"/><w:lang w:eastAsia="es-ES"/><w14:ligatures w14:val="standardContextual"/></w:rPr><w:tab/></w:r><w:r><w:rPr><w:rStyle w:val="Hipervnculo"/></w:rPr><w:t>¿Qué hace este plugin?</w:t></w:r><w:r><w:rPr><w:webHidden/></w:rPr><w:tab/><w:fldChar w:fldCharType="begin"/><w:instrText xml:space="preserve"> PAGEREF _Toc236310404 \h </w:instrText><w:fldChar w:fldCharType="separate"/><w:t>5</w:t><w:fldChar w:fldCharType="end"/></w:r></w:hyperlink></w:p><w:p><w:pPr><w:pStyle w:val="TDC2"/><w:tabs><w:tab w:val="left" w:pos="880"/><w:tab w:val="right" w:leader="dot" w:pos="9060"/></w:tabs><w:rPr><w:rFonts w:asciiTheme="minorHAnsi" w:eastAsiaTheme="minorEastAsia" w:hAnsiTheme="minorHAnsi" w:cstheme="minorBidi"/><w:noProof/><w:kern w:val="2"/><w:sz w:val="24"/><w:szCs w:val="24"/><w:lang w:eastAsia="es-ES"/><w14:ligatures w14:val="standardContextual"/></w:rPr></w:pPr><w:hyperlink w:anchor="_Toc236310405" w:history="1"><w:r><w:rPr><w:rStyle w:val="Hipervnculo"/><w:noProof/></w:rPr><w:t>1.1.</w:t></w:r><w:r><w:rPr><w:rFonts w:asciiTheme="minorHAnsi" w:eastAsiaTheme="minorEastAsia" w:hAnsiTheme="minorHAnsi" w:cstheme="minorBidi"/><w:noProof/><w:kern w:val="2"/><w:sz w:val="24"/><w:szCs w:val="24"/><w:lang w:eastAsia="es-ES"/><w14:ligatures w14:val="standardContextual"/></w:rPr><w:tab/></w:r><w:r><w:rPr><w:rStyle w:val="Hipervnculo"/><w:noProof/></w:rPr><w:t>Valor principal</w:t></w:r><w:r><w:rPr><w:noProof/><w:webHidden/></w:rPr><w:tab/><w:fldChar w:fldCharType="begin"/><w:instrText xml:space="preserve"> PAGEREF _Toc236310405 \h </w:instrText><w:fldChar w:fldCharType="separate"/><w:t>5</w:t><w:fldChar w:fldCharType="end"/></w:r></w:hyperlink></w:p><w:p><w:pPr><w:pStyle w:val="TDC1"/><w:rPr><w:rFonts w:asciiTheme="minorHAnsi" w:eastAsiaTheme="minorEastAsia" w:hAnsiTheme="minorHAnsi" w:cstheme="minorBidi"/><w:kern w:val="2"/><w:sz w:val="24"/><w:szCs w:val="24"/><w:lang w:eastAsia="es-ES"/><w14:ligatures w14:val="standardContextual"/></w:rPr></w:pPr><w:hyperlink w:anchor="_Toc236310406" w:history="1"><w:r><w:rPr><w:rStyle w:val="Hipervnculo"/></w:rPr><w:t>2.</w:t></w:r><w:r><w:rPr><w:rFonts w:asciiTheme="minorHAnsi" w:eastAsiaTheme="minorEastAsia" w:hAnsiTheme="minorHAnsi" w:cstheme="minorBidi"/><w:kern w:val="2"/><w:sz w:val="24"/><w:szCs w:val="24"/><w:lang w:eastAsia="es-ES"/><w14:ligatures w14:val="standardContextual"/></w:rPr><w:tab/></w:r><w:r><w:rPr><w:rStyle w:val="Hipervnculo"/></w:rPr><w:t>Prerrequisitos</w:t></w:r><w:r><w:rPr><w:webHidden/></w:rPr><w:tab/><w:fldChar w:fldCharType="begin"/><w:instrText xml:space="preserve"> PAGEREF _Toc236310406 \h </w:instrText><w:fldChar w:fldCharType="separate"/><w:t>5</w:t><w:fldChar w:fldCharType="end"/></w:r></w:hyperlink></w:p><w:p><w:pPr><w:pStyle w:val="TDC1"/><w:rPr><w:rFonts w:asciiTheme="minorHAnsi" w:eastAsiaTheme="minorEastAsia" w:hAnsiTheme="minorHAnsi" w:cstheme="minorBidi"/><w:kern w:val="2"/><w:sz w:val="24"/><w:szCs w:val="24"/><w:lang w:eastAsia="es-ES"/><w14:ligatures w14:val="standardContextual"/></w:rPr></w:pPr><w:hyperlink w:anchor="_Toc236310407" w:history="1"><w:r><w:rPr><w:rStyle w:val="Hipervnculo"/></w:rPr><w:t>3.</w:t></w:r><w:r><w:rPr><w:rFonts w:asciiTheme="minorHAnsi" w:eastAsiaTheme="minorEastAsia" w:hAnsiTheme="minorHAnsi" w:cstheme="minorBidi"/><w:kern w:val="2"/><w:sz w:val="24"/><w:szCs w:val="24"/><w:lang w:eastAsia="es-ES"/><w14:ligatures w14:val="standardContextual"/></w:rPr><w:tab/></w:r><w:r><w:rPr><w:rStyle w:val="Hipervnculo"/></w:rPr><w:t>Instalación desde Git</w:t></w:r><w:r><w:rPr><w:webHidden/></w:rPr><w:tab/><w:fldChar w:fldCharType="begin"/><w:instrText xml:space="preserve"> PAGEREF _Toc236310407 \h </w:instrText><w:fldChar w:fldCharType="separate"/><w:t>6</w:t><w:fldChar w:fldCharType="end"/></w:r></w:hyperlink></w:p><w:p><w:pPr><w:pStyle w:val="TDC2"/><w:tabs><w:tab w:val="left" w:pos="880"/><w:tab w:val="right" w:leader="dot" w:pos="9060"/></w:tabs><w:rPr><w:rFonts w:asciiTheme="minorHAnsi" w:eastAsiaTheme="minorEastAsia" w:hAnsiTheme="minorHAnsi" w:cstheme="minorBidi"/><w:noProof/><w:kern w:val="2"/><w:sz w:val="24"/><w:szCs w:val="24"/><w:lang w:eastAsia="es-ES"/><w14:ligatures w14:val="standardContextual"/></w:rPr></w:pPr><w:hyperlink w:anchor="_Toc236310408" w:history="1"><w:r><w:rPr><w:rStyle w:val="Hipervnculo"/><w:noProof/></w:rPr><w:t>3.1.</w:t></w:r><w:r><w:rPr><w:rFonts w:asciiTheme="minorHAnsi" w:eastAsiaTheme="minorEastAsia" w:hAnsiTheme="minorHAnsi" w:cstheme="minorBidi"/><w:noProof/><w:kern w:val="2"/><w:sz w:val="24"/><w:szCs w:val="24"/><w:lang w:eastAsia="es-ES"/><w14:ligatures w14:val="standardContextual"/></w:rPr><w:tab/></w:r><w:r><w:rPr><w:rStyle w:val="Hipervnculo"/><w:noProof/></w:rPr><w:t>Paso 1 — Instalar el plugin en Claude Code</w:t></w:r><w:r><w:rPr><w:noProof/><w:webHidden/></w:rPr><w:tab/><w:fldChar w:fldCharType="begin"/><w:instrText xml:space="preserve"> PAGEREF _Toc236310408 \h </w:instrText><w:fldChar w:fldCharType="separate"/><w:t>6</w:t><w:fldChar w:fldCharType="end"/></w:r></w:hyperlink></w:p><w:p><w:pPr><w:pStyle w:val="TDC2"/><w:tabs><w:tab w:val="left" w:pos="880"/><w:tab w:val="right" w:leader="dot" w:pos="9060"/></w:tabs><w:rPr><w:rFonts w:asciiTheme="minorHAnsi" w:eastAsiaTheme="minorEastAsia" w:hAnsiTheme="minorHAnsi" w:cstheme="minorBidi"/><w:noProof/><w:kern w:val="2"/><w:sz w:val="24"/><w:szCs w:val="24"/><w:lang w:eastAsia="es-ES"/><w14:ligatures w14:val="standardContextual"/></w:rPr></w:pPr><w:hyperlink w:anchor="_Toc236310409" w:history="1"><w:r><w:rPr><w:rStyle w:val="Hipervnculo"/><w:noProof/></w:rPr><w:t>3.2.</w:t></w:r><w:r><w:rPr><w:rFonts w:asciiTheme="minorHAnsi" w:eastAsiaTheme="minorEastAsia" w:hAnsiTheme="minorHAnsi" w:cstheme="minorBidi"/><w:noProof/><w:kern w:val="2"/><w:sz w:val="24"/><w:szCs w:val="24"/><w:lang w:eastAsia="es-ES"/><w14:ligatures w14:val="standardContextual"/></w:rPr><w:tab/></w:r><w:r><w:rPr><w:rStyle w:val="Hipervnculo"/><w:noProof/></w:rPr><w:t>Paso 2 — Instalar dependencias Python</w:t></w:r><w:r><w:rPr><w:noProof/><w:webHidden/></w:rPr><w:tab/><w:fldChar w:fldCharType="begin"/><w:instrText xml:space="preserve"> PAGEREF _Toc236310409 \h </w:instrText><w:fldChar w:fldCharType="separate"/><w:t>6</w:t><w:fldChar w:fldCharType="end"/></w:r></w:hyperlink></w:p><w:p><w:pPr><w:pStyle w:val="TDC2"/><w:tabs><w:tab w:val="left" w:pos="880"/><w:tab w:val="right" w:leader="dot" w:pos="9060"/></w:tabs><w:rPr><w:rFonts w:asciiTheme="minorHAnsi" w:eastAsiaTheme="minorEastAsia" w:hAnsiTheme="minorHAnsi" w:cstheme="minorBidi"/><w:noProof/><w:kern w:val="2"/><w:sz w:val="24"/><w:szCs w:val="24"/><w:lang w:eastAsia="es-ES"/><w14:ligatures w14:val="standardContextual"/></w:rPr></w:pPr><w:hyperlink w:anchor="_Toc236310410" w:history="1"><w:r><w:rPr><w:rStyle w:val="Hipervnculo"/><w:noProof/></w:rPr><w:t>6.1.</w:t></w:r><w:r><w:rPr><w:rFonts w:asciiTheme="minorHAnsi" w:eastAsiaTheme="minorEastAsia" w:hAnsiTheme="minorHAnsi" w:cstheme="minorBidi"/><w:noProof/><w:kern w:val="2"/><w:sz w:val="24"/><w:szCs w:val="24"/><w:lang w:eastAsia="es-ES"/><w14:ligatures w14:val="standardContextual"/></w:rPr><w:tab/></w:r><w:r><w:rPr><w:rStyle w:val="Hipervnculo"/><w:noProof/></w:rPr><w:t>Paso 4 — Verificar la instalación</w:t></w:r><w:r><w:rPr><w:noProof/><w:webHidden/></w:rPr><w:tab/><w:fldChar w:fldCharType="begin"/><w:instrText xml:space="preserve"> PAGEREF _Toc236310410 \h </w:instrText><w:fldChar w:fldCharType="separate"/><w:t>7</w:t><w:fldChar w:fldCharType="end"/></w:r></w:hyperlink></w:p><w:p><w:pPr><w:pStyle w:val="TDC2"/><w:tabs><w:tab w:val="left" w:pos="880"/><w:tab w:val="right" w:leader="dot" w:pos="9060"/></w:tabs><w:rPr><w:rFonts w:asciiTheme="minorHAnsi" w:eastAsiaTheme="minorEastAsia" w:hAnsiTheme="minorHAnsi" w:cstheme="minorBidi"/><w:noProof/><w:kern w:val="2"/><w:sz w:val="24"/><w:szCs w:val="24"/><w:lang w:eastAsia="es-ES"/><w14:ligatures w14:val="standardContextual"/></w:rPr></w:pPr><w:hyperlink w:anchor="_Toc236310411" w:history="1"><w:r><w:rPr><w:rStyle w:val="Hipervnculo"/><w:noProof/></w:rPr><w:t>6.2.</w:t></w:r><w:r><w:rPr><w:rFonts w:asciiTheme="minorHAnsi" w:eastAsiaTheme="minorEastAsia" w:hAnsiTheme="minorHAnsi" w:cstheme="minorBidi"/><w:noProof/><w:kern w:val="2"/><w:sz w:val="24"/><w:szCs w:val="24"/><w:lang w:eastAsia="es-ES"/><w14:ligatures w14:val="standardContextual"/></w:rPr><w:tab/></w:r><w:r><w:rPr><w:rStyle w:val="Hipervnculo"/><w:noProof/></w:rPr><w:t>Actualizar el plugin</w:t></w:r><w:r><w:rPr><w:noProof/><w:webHidden/></w:rPr><w:tab/><w:fldChar w:fldCharType="begin"/><w:instrText xml:space="preserve"> PAGEREF _Toc236310411 \h </w:instrText><w:fldChar w:fldCharType="separate"/><w:t>7</w:t><w:fldChar w:fldCharType="end"/></w:r></w:hyperlink></w:p><w:p><w:pPr><w:pStyle w:val="TDC1"/><w:rPr><w:rFonts w:asciiTheme="minorHAnsi" w:eastAsiaTheme="minorEastAsia" w:hAnsiTheme="minorHAnsi" w:cstheme="minorBidi"/><w:kern w:val="2"/><w:sz w:val="24"/><w:szCs w:val="24"/><w:lang w:eastAsia="es-ES"/><w14:ligatures w14:val="standardContextual"/></w:rPr></w:pPr><w:hyperlink w:anchor="_Toc236310412" w:history="1"><w:r><w:rPr><w:rStyle w:val="Hipervnculo"/></w:rPr><w:t>7.</w:t></w:r><w:r><w:rPr><w:rFonts w:asciiTheme="minorHAnsi" w:eastAsiaTheme="minorEastAsia" w:hAnsiTheme="minorHAnsi" w:cstheme="minorBidi"/><w:kern w:val="2"/><w:sz w:val="24"/><w:szCs w:val="24"/><w:lang w:eastAsia="es-ES"/><w14:ligatures w14:val="standardContextual"/></w:rPr><w:tab/></w:r><w:r><w:rPr><w:rStyle w:val="Hipervnculo"/></w:rPr><w:t>Comandos disponibles</w:t></w:r><w:r><w:rPr><w:webHidden/></w:rPr><w:tab/><w:fldChar w:fldCharType="begin"/><w:instrText xml:space="preserve"> PAGEREF _Toc236310412 \h </w:instrText><w:fldChar w:fldCharType="separate"/><w:t>7</w:t><w:fldChar w:fldCharType="end"/></w:r></w:hyperlink></w:p><w:p><w:pPr><w:pStyle w:val="TDC2"/><w:tabs><w:tab w:val="left" w:pos="880"/><w:tab w:val="right" w:leader="dot" w:pos="9060"/></w:tabs><w:rPr><w:rFonts w:asciiTheme="minorHAnsi" w:eastAsiaTheme="minorEastAsia" w:hAnsiTheme="minorHAnsi" w:cstheme="minorBidi"/><w:noProof/><w:kern w:val="2"/><w:sz w:val="24"/><w:szCs w:val="24"/><w:lang w:eastAsia="es-ES"/><w14:ligatures w14:val="standardContextual"/></w:rPr></w:pPr><w:hyperlink w:anchor="_Toc236310413" w:history="1"><w:r><w:rPr><w:rStyle w:val="Hipervnculo"/><w:noProof/></w:rPr><w:t>7.1.</w:t></w:r><w:r><w:rPr><w:rFonts w:asciiTheme="minorHAnsi" w:eastAsiaTheme="minorEastAsia" w:hAnsiTheme="minorHAnsi" w:cstheme="minorBidi"/><w:noProof/><w:kern w:val="2"/><w:sz w:val="24"/><w:szCs w:val="24"/><w:lang w:eastAsia="es-ES"/><w14:ligatures w14:val="standardContextual"/></w:rPr><w:tab/></w:r><w:r><w:rPr><w:rStyle w:val="Hipervnculo"/><w:noProof/></w:rPr><w:t>Análisis y calidad</w:t></w:r><w:r><w:rPr><w:noProof/><w:webHidden/></w:rPr><w:tab/><w:fldChar w:fldCharType="begin"/><w:instrText xml:space="preserve"> PAGEREF _Toc236310413 \h </w:instrText><w:fldChar w:fldCharType="separate"/><w:t>7</w:t><w:fldChar w:fldCharType="end"/></w:r></w:hyperlink></w:p><w:p><w:pPr><w:pStyle w:val="TDC2"/><w:tabs><w:tab w:val="left" w:pos="880"/><w:tab w:val="right" w:leader="dot" w:pos="9060"/></w:tabs><w:rPr><w:rFonts w:asciiTheme="minorHAnsi" w:eastAsiaTheme="minorEastAsia" w:hAnsiTheme="minorHAnsi" w:cstheme="minorBidi"/><w:noProof/><w:kern w:val="2"/><w:sz w:val="24"/><w:szCs w:val="24"/><w:lang w:eastAsia="es-ES"/><w14:ligatures w14:val="standardContextual"/></w:rPr></w:pPr><w:hyperlink w:anchor="_Toc236310414" w:history="1"><w:r><w:rPr><w:rStyle w:val="Hipervnculo"/><w:noProof/></w:rPr><w:t>7.2.</w:t></w:r><w:r><w:rPr><w:rFonts w:asciiTheme="minorHAnsi" w:eastAsiaTheme="minorEastAsia" w:hAnsiTheme="minorHAnsi" w:cstheme="minorBidi"/><w:noProof/><w:kern w:val="2"/><w:sz w:val="24"/><w:szCs w:val="24"/><w:lang w:eastAsia="es-ES"/><w14:ligatures w14:val="standardContextual"/></w:rPr><w:tab/></w:r><w:r><w:rPr><w:rStyle w:val="Hipervnculo"/><w:noProof/></w:rPr><w:t>Implementación y scaffolding</w:t></w:r><w:r><w:rPr><w:noProof/><w:webHidden/></w:rPr><w:tab/><w:fldChar w:fldCharType="begin"/><w:instrText xml:space="preserve"> PAGEREF _Toc236310414 \h </w:instrText><w:fldChar w:fldCharType="separate"/><w:t>8</w:t><w:fldChar w:fldCharType="end"/></w:r></w:hyperlink></w:p><w:p><w:pPr><w:pStyle w:val="TDC2"/><w:tabs><w:tab w:val="left" w:pos="880"/><w:tab w:val="right" w:leader="dot" w:pos="9060"/></w:tabs><w:rPr><w:rFonts w:asciiTheme="minorHAnsi" w:eastAsiaTheme="minorEastAsia" w:hAnsiTheme="minorHAnsi" w:cstheme="minorBidi"/><w:noProof/><w:kern w:val="2"/><w:sz w:val="24"/><w:szCs w:val="24"/><w:lang w:eastAsia="es-ES"/><w14:ligatures w14:val="standardContextual"/></w:rPr></w:pPr><w:hyperlink w:anchor="_Toc236310415" w:history="1"><w:r><w:rPr><w:rStyle w:val="Hipervnculo"/><w:noProof/></w:rPr><w:t>7.3.</w:t></w:r><w:r><w:rPr><w:rFonts w:asciiTheme="minorHAnsi" w:eastAsiaTheme="minorEastAsia" w:hAnsiTheme="minorHAnsi" w:cstheme="minorBidi"/><w:noProof/><w:kern w:val="2"/><w:sz w:val="24"/><w:szCs w:val="24"/><w:lang w:eastAsia="es-ES"/><w14:ligatures w14:val="standardContextual"/></w:rPr><w:tab/></w:r><w:r><w:rPr><w:rStyle w:val="Hipervnculo"/><w:noProof/></w:rPr><w:t>Validación y entorno</w:t></w:r><w:r><w:rPr><w:noProof/><w:webHidden/></w:rPr><w:tab/><w:fldChar w:fldCharType="begin"/><w:instrText xml:space="preserve"> PAGEREF _Toc236310415 \h </w:instrText><w:fldChar w:fldCharType="separate"/><w:t>8</w:t><w:fldChar w:fldCharType="end"/></w:r></w:hyperlink></w:p><w:p><w:pPr><w:pStyle w:val="TDC2"/><w:tabs><w:tab w:val="left" w:pos="880"/><w:tab w:val="right" w:leader="dot" w:pos="9060"/></w:tabs><w:rPr><w:rFonts w:asciiTheme="minorHAnsi" w:eastAsiaTheme="minorEastAsia" w:hAnsiTheme="minorHAnsi" w:cstheme="minorBidi"/><w:noProof/><w:kern w:val="2"/><w:sz w:val="24"/><w:szCs w:val="24"/><w:lang w:eastAsia="es-ES"/><w14:ligatures w14:val="standardContextual"/></w:rPr></w:pPr><w:hyperlink w:anchor="_Toc236310416" w:history="1"><w:r><w:rPr><w:rStyle w:val="Hipervnculo"/><w:noProof/></w:rPr><w:t>7.4.</w:t></w:r><w:r><w:rPr><w:rFonts w:asciiTheme="minorHAnsi" w:eastAsiaTheme="minorEastAsia" w:hAnsiTheme="minorHAnsi" w:cstheme="minorBidi"/><w:noProof/><w:kern w:val="2"/><w:sz w:val="24"/><w:szCs w:val="24"/><w:lang w:eastAsia="es-ES"/><w14:ligatures w14:val="standardContextual"/></w:rPr><w:tab/></w:r><w:r><w:rPr><w:rStyle w:val="Hipervnculo"/><w:noProof/></w:rPr><w:t>Base de datos y modelo</w:t></w:r><w:r><w:rPr><w:noProof/><w:webHidden/></w:rPr><w:tab/><w:fldChar w:fldCharType="begin"/><w:instrText xml:space="preserve"> PAGEREF _Toc236310416 \h </w:instrText><w:fldChar w:fldCharType="separate"/><w:t>9</w:t><w:fldChar w:fldCharType="end"/></w:r></w:hyperlink></w:p><w:p><w:pPr><w:pStyle w:val="TDC2"/><w:tabs><w:tab w:val="left" w:pos="880"/><w:tab w:val="right" w:leader="dot" w:pos="9060"/></w:tabs><w:rPr><w:rFonts w:asciiTheme="minorHAnsi" w:eastAsiaTheme="minorEastAsia" w:hAnsiTheme="minorHAnsi" w:cstheme="minorBidi"/><w:noProof/><w:kern w:val="2"/><w:sz w:val="24"/><w:szCs w:val="24"/><w:lang w:eastAsia="es-ES"/><w14:ligatures w14:val="standardContextual"/></w:rPr></w:pPr><w:hyperlink w:anchor="_Toc236310417" w:history="1"><w:r><w:rPr><w:rStyle w:val="Hipervnculo"/><w:noProof/></w:rPr><w:t>7.5.</w:t></w:r><w:r><w:rPr><w:rFonts w:asciiTheme="minorHAnsi" w:eastAsiaTheme="minorEastAsia" w:hAnsiTheme="minorHAnsi" w:cstheme="minorBidi"/><w:noProof/><w:kern w:val="2"/><w:sz w:val="24"/><w:szCs w:val="24"/><w:lang w:eastAsia="es-ES"/><w14:ligatures w14:val="standardContextual"/></w:rPr><w:tab/></w:r><w:r><w:rPr><w:rStyle w:val="Hipervnculo"/><w:noProof/></w:rPr><w:t>Control de versiones (SVN / Git)</w:t></w:r><w:r><w:rPr><w:noProof/><w:webHidden/></w:rPr><w:tab/><w:fldChar w:fldCharType="begin"/><w:instrText xml:space="preserve"> PAGEREF _Toc236310417 \h </w:instrText><w:fldChar w:fldCharType="separate"/><w:t>9</w:t><w:fldChar w:fldCharType="end"/></w:r></w:hyperlink></w:p><w:p><w:pPr><w:pStyle w:val="TDC2"/><w:tabs><w:tab w:val="left" w:pos="880"/><w:tab w:val="right" w:leader="dot" w:pos="9060"/></w:tabs><w:rPr><w:rFonts w:asciiTheme="minorHAnsi" w:eastAsiaTheme="minorEastAsia" w:hAnsiTheme="minorHAnsi" w:cstheme="minorBidi"/><w:noProof/><w:kern w:val="2"/><w:sz w:val="24"/><w:szCs w:val="24"/><w:lang w:eastAsia="es-ES"/><w14:ligatures w14:val="standardContextual"/></w:rPr></w:pPr><w:hyperlink w:anchor="_Toc236310418" w:history="1"><w:r><w:rPr><w:rStyle w:val="Hipervnculo"/><w:noProof/></w:rPr><w:t>7.6.</w:t></w:r><w:r><w:rPr><w:rFonts w:asciiTheme="minorHAnsi" w:eastAsiaTheme="minorEastAsia" w:hAnsiTheme="minorHAnsi" w:cstheme="minorBidi"/><w:noProof/><w:kern w:val="2"/><w:sz w:val="24"/><w:szCs w:val="24"/><w:lang w:eastAsia="es-ES"/><w14:ligatures w14:val="standardContextual"/></w:rPr><w:tab/></w:r><w:r><w:rPr><w:rStyle w:val="Hipervnculo"/><w:noProof/></w:rPr><w:t>Arquitectura y documentación</w:t></w:r><w:r><w:rPr><w:noProof/><w:webHidden/></w:rPr><w:tab/><w:fldChar w:fldCharType="begin"/><w:instrText xml:space="preserve"> PAGEREF _Toc236310418 \h </w:instrText><w:fldChar w:fldCharType="separate"/><w:t>10</w:t><w:fldChar w:fldCharType="end"/></w:r></w:hyperlink></w:p><w:p><w:pPr><w:pStyle w:val="TDC2"/><w:tabs><w:tab w:val="left" w:pos="880"/><w:tab w:val="right" w:leader="dot" w:pos="9060"/></w:tabs><w:rPr><w:rFonts w:asciiTheme="minorHAnsi" w:eastAsiaTheme="minorEastAsia" w:hAnsiTheme="minorHAnsi" w:cstheme="minorBidi"/><w:noProof/><w:kern w:val="2"/><w:sz w:val="24"/><w:szCs w:val="24"/><w:lang w:eastAsia="es-ES"/><w14:ligatures w14:val="standardContextual"/></w:rPr></w:pPr><w:hyperlink w:anchor="_Toc236310419" w:history="1"><w:r><w:rPr><w:rStyle w:val="Hipervnculo"/><w:noProof/></w:rPr><w:t>7.7.</w:t></w:r><w:r><w:rPr><w:rFonts w:asciiTheme="minorHAnsi" w:eastAsiaTheme="minorEastAsia" w:hAnsiTheme="minorHAnsi" w:cstheme="minorBidi"/><w:noProof/><w:kern w:val="2"/><w:sz w:val="24"/><w:szCs w:val="24"/><w:lang w:eastAsia="es-ES"/><w14:ligatures w14:val="standardContextual"/></w:rPr><w:tab/></w:r><w:r><w:rPr><w:rStyle w:val="Hipervnculo"/><w:noProof/></w:rPr><w:t>Tests</w:t></w:r><w:r><w:rPr><w:noProof/><w:webHidden/></w:rPr><w:tab/><w:fldChar w:fldCharType="begin"/><w:instrText xml:space="preserve"> PAGEREF _Toc236310419 \h </w:instrText><w:fldChar w:fldCharType="separate"/><w:t>10</w:t><w:fldChar w:fldCharType="end"/></w:r></w:hyperlink></w:p><w:p><w:pPr><w:pStyle w:val="TDC2"/><w:tabs><w:tab w:val="left" w:pos="880"/><w:tab w:val="right" w:leader="dot" w:pos="9060"/></w:tabs><w:rPr><w:rFonts w:asciiTheme="minorHAnsi" w:eastAsiaTheme="minorEastAsia" w:hAnsiTheme="minorHAnsi" w:cstheme="minorBidi"/><w:noProof/><w:kern w:val="2"/><w:sz w:val="24"/><w:szCs w:val="24"/><w:lang w:eastAsia="es-ES"/><w14:ligatures w14:val="standardContextual"/></w:rPr></w:pPr><w:hyperlink w:anchor="_Toc236310420" w:history="1"><w:r><w:rPr><w:rStyle w:val="Hipervnculo"/><w:noProof/></w:rPr><w:t>7.8.</w:t></w:r><w:r><w:rPr><w:rFonts w:asciiTheme="minorHAnsi" w:eastAsiaTheme="minorEastAsia" w:hAnsiTheme="minorHAnsi" w:cstheme="minorBidi"/><w:noProof/><w:kern w:val="2"/><w:sz w:val="24"/><w:szCs w:val="24"/><w:lang w:eastAsia="es-ES"/><w14:ligatures w14:val="standardContextual"/></w:rPr><w:tab/></w:r><w:r><w:rPr><w:rStyle w:val="Hipervnculo"/><w:noProof/></w:rPr><w:t>Integración con Mantis</w:t></w:r><w:r><w:rPr><w:noProof/><w:webHidden/></w:rPr><w:tab/><w:fldChar w:fldCharType="begin"/><w:instrText xml:space="preserve"> PAGEREF _Toc236310420 \h </w:instrText><w:fldChar w:fldCharType="separate"/><w:t>10</w:t><w:fldChar w:fldCharType="end"/></w:r></w:hyperlink></w:p><w:p><w:pPr><w:pStyle w:val="TDC2"/><w:tabs><w:tab w:val="left" w:pos="880"/><w:tab w:val="right" w:leader="dot" w:pos="9060"/></w:tabs><w:rPr><w:rFonts w:asciiTheme="minorHAnsi" w:eastAsiaTheme="minorEastAsia" w:hAnsiTheme="minorHAnsi" w:cstheme="minorBidi"/><w:noProof/><w:kern w:val="2"/><w:sz w:val="24"/><w:szCs w:val="24"/><w:lang w:eastAsia="es-ES"/><w14:ligatures w14:val="standardContextual"/></w:rPr></w:pPr><w:hyperlink w:anchor="_Toc236310421" w:history="1"><w:r><w:rPr><w:rStyle w:val="Hipervnculo"/><w:noProof/></w:rPr><w:t>7.9.</w:t></w:r><w:r><w:rPr><w:rFonts w:asciiTheme="minorHAnsi" w:eastAsiaTheme="minorEastAsia" w:hAnsiTheme="minorHAnsi" w:cstheme="minorBidi"/><w:noProof/><w:kern w:val="2"/><w:sz w:val="24"/><w:szCs w:val="24"/><w:lang w:eastAsia="es-ES"/><w14:ligatures w14:val="standardContextual"/></w:rPr><w:tab/></w:r><w:r><w:rPr><w:rStyle w:val="Hipervnculo"/><w:noProof/></w:rPr><w:t>Estadísticas y utilidades</w:t></w:r><w:r><w:rPr><w:noProof/><w:webHidden/></w:rPr><w:tab/><w:fldChar w:fldCharType="begin"/><w:instrText xml:space="preserve"> PAGEREF _Toc236310421 \h </w:instrText><w:fldChar w:fldCharType="separate"/><w:t>11</w:t><w:fldChar w:fldCharType="end"/></w:r></w:hyperlink></w:p><w:p><w:pPr><w:pStyle w:val="TDC1"/><w:rPr><w:rFonts w:asciiTheme="minorHAnsi" w:eastAsiaTheme="minorEastAsia" w:hAnsiTheme="minorHAnsi" w:cstheme="minorBidi"/><w:kern w:val="2"/><w:sz w:val="24"/><w:szCs w:val="24"/><w:lang w:eastAsia="es-ES"/><w14:ligatures w14:val="standardContextual"/></w:rPr></w:pPr><w:hyperlink w:anchor="_Toc236310422" w:history="1"><w:r><w:rPr><w:rStyle w:val="Hipervnculo"/></w:rPr><w:t>8.</w:t></w:r><w:r><w:rPr><w:rFonts w:asciiTheme="minorHAnsi" w:eastAsiaTheme="minorEastAsia" w:hAnsiTheme="minorHAnsi" w:cstheme="minorBidi"/><w:kern w:val="2"/><w:sz w:val="24"/><w:szCs w:val="24"/><w:lang w:eastAsia="es-ES"/><w14:ligatures w14:val="standardContextual"/></w:rPr><w:tab/></w:r><w:r><w:rPr><w:rStyle w:val="Hipervnculo"/></w:rPr><w:t>Servidor MCP — orchestrator-workspace</w:t></w:r><w:r><w:rPr><w:webHidden/></w:rPr><w:tab/><w:fldChar w:fldCharType="begin"/><w:instrText xml:space="preserve"> PAGEREF _Toc236310422 \h </w:instrText><w:fldChar w:fldCharType="separate"/><w:t>11</w:t><w:fldChar w:fldCharType="end"/></w:r></w:hyperlink></w:p><w:p><w:pPr><w:pStyle w:val="TDC2"/><w:tabs><w:tab w:val="left" w:pos="880"/><w:tab w:val="right" w:leader="dot" w:pos="9060"/></w:tabs><w:rPr><w:rFonts w:asciiTheme="minorHAnsi" w:eastAsiaTheme="minorEastAsia" w:hAnsiTheme="minorHAnsi" w:cstheme="minorBidi"/><w:noProof/><w:kern w:val="2"/><w:sz w:val="24"/><w:szCs w:val="24"/><w:lang w:eastAsia="es-ES"/><w14:ligatures w14:val="standardContextual"/></w:rPr></w:pPr><w:hyperlink w:anchor="_Toc236310423" w:history="1"><w:r><w:rPr><w:rStyle w:val="Hipervnculo"/><w:noProof/></w:rPr><w:t>8.1.</w:t></w:r><w:r><w:rPr><w:rFonts w:asciiTheme="minorHAnsi" w:eastAsiaTheme="minorEastAsia" w:hAnsiTheme="minorHAnsi" w:cstheme="minorBidi"/><w:noProof/><w:kern w:val="2"/><w:sz w:val="24"/><w:szCs w:val="24"/><w:lang w:eastAsia="es-ES"/><w14:ligatures w14:val="standardContextual"/></w:rPr><w:tab/></w:r><w:r><w:rPr><w:rStyle w:val="Hipervnculo"/><w:noProof/></w:rPr><w:t>Herramientas disponibles</w:t></w:r><w:r><w:rPr><w:noProof/><w:webHidden/></w:rPr><w:tab/><w:fldChar w:fldCharType="begin"/><w:instrText xml:space="preserve"> PAGEREF _Toc236310423 \h </w:instrText><w:fldChar w:fldCharType="separate"/><w:t>11</w:t><w:fldChar w:fldCharType="end"/></w:r></w:hyperlink></w:p><w:p><w:pPr><w:pStyle w:val="TDC1"/><w:rPr><w:rFonts w:asciiTheme="minorHAnsi" w:eastAsiaTheme="minorEastAsia" w:hAnsiTheme="minorHAnsi" w:cstheme="minorBidi"/><w:kern w:val="2"/><w:sz w:val="24"/><w:szCs w:val="24"/><w:lang w:eastAsia="es-ES"/><w14:ligatures w14:val="standardContextual"/></w:rPr></w:pPr><w:hyperlink w:anchor="_Toc236310424" w:history="1"><w:r><w:rPr><w:rStyle w:val="Hipervnculo"/></w:rPr><w:t>9.</w:t></w:r><w:r><w:rPr><w:rFonts w:asciiTheme="minorHAnsi" w:eastAsiaTheme="minorEastAsia" w:hAnsiTheme="minorHAnsi" w:cstheme="minorBidi"/><w:kern w:val="2"/><w:sz w:val="24"/><w:szCs w:val="24"/><w:lang w:eastAsia="es-ES"/><w14:ligatures w14:val="standardContextual"/></w:rPr><w:tab/></w:r><w:r><w:rPr><w:rStyle w:val="Hipervnculo"/></w:rPr><w:t>Arquitectura ScacsWeb asumida</w:t></w:r><w:r><w:rPr><w:webHidden/></w:rPr><w:tab/><w:fldChar w:fldCharType="begin"/><w:instrText xml:space="preserve"> PAGEREF _Toc236310424 \h </w:instrText><w:fldChar w:fldCharType="separate"/><w:t>13</w:t><w:fldChar w:fldCharType="end"/></w:r></w:hyperlink></w:p><w:p><w:pPr><w:pStyle w:val="TDC2"/><w:tabs><w:tab w:val="left" w:pos="880"/><w:tab w:val="right" w:leader="dot" w:pos="9060"/></w:tabs><w:rPr><w:rFonts w:asciiTheme="minorHAnsi" w:eastAsiaTheme="minorEastAsia" w:hAnsiTheme="minorHAnsi" w:cstheme="minorBidi"/><w:noProof/><w:kern w:val="2"/><w:sz w:val="24"/><w:szCs w:val="24"/><w:lang w:eastAsia="es-ES"/><w14:ligatures w14:val="standardContextual"/></w:rPr></w:pPr><w:hyperlink w:anchor="_Toc236310425" w:history="1"><w:r><w:rPr><w:rStyle w:val="Hipervnculo"/><w:noProof/></w:rPr><w:t>9.1.</w:t></w:r><w:r><w:rPr><w:rFonts w:asciiTheme="minorHAnsi" w:eastAsiaTheme="minorEastAsia" w:hAnsiTheme="minorHAnsi" w:cstheme="minorBidi"/><w:noProof/><w:kern w:val="2"/><w:sz w:val="24"/><w:szCs w:val="24"/><w:lang w:eastAsia="es-ES"/><w14:ligatures w14:val="standardContextual"/></w:rPr><w:tab/></w:r><w:r><w:rPr><w:rStyle w:val="Hipervnculo"/><w:noProof/></w:rPr><w:t>Estructura de carpetas</w:t></w:r><w:r><w:rPr><w:noProof/><w:webHidden/></w:rPr><w:tab/><w:fldChar w:fldCharType="begin"/><w:instrText xml:space="preserve"> PAGEREF _Toc236310425 \h </w:instrText><w:fldChar w:fldCharType="separate"/><w:t>13</w:t><w:fldChar w:fldCharType="end"/></w:r></w:hyperlink></w:p><w:p><w:pPr><w:pStyle w:val="TDC2"/><w:tabs><w:tab w:val="left" w:pos="880"/><w:tab w:val="right" w:leader="dot" w:pos="9060"/></w:tabs><w:rPr><w:rFonts w:asciiTheme="minorHAnsi" w:eastAsiaTheme="minorEastAsia" w:hAnsiTheme="minorHAnsi" w:cstheme="minorBidi"/><w:noProof/><w:kern w:val="2"/><w:sz w:val="24"/><w:szCs w:val="24"/><w:lang w:eastAsia="es-ES"/><w14:ligatures w14:val="standardContextual"/></w:rPr></w:pPr><w:hyperlink w:anchor="_Toc236310426" w:history="1"><w:r><w:rPr><w:rStyle w:val="Hipervnculo"/><w:noProof/></w:rPr><w:t>9.2.</w:t></w:r><w:r><w:rPr><w:rFonts w:asciiTheme="minorHAnsi" w:eastAsiaTheme="minorEastAsia" w:hAnsiTheme="minorHAnsi" w:cstheme="minorBidi"/><w:noProof/><w:kern w:val="2"/><w:sz w:val="24"/><w:szCs w:val="24"/><w:lang w:eastAsia="es-ES"/><w14:ligatures w14:val="standardContextual"/></w:rPr><w:tab/></w:r><w:r><w:rPr><w:rStyle w:val="Hipervnculo"/><w:noProof/></w:rPr><w:t>Convenciones</w:t></w:r><w:r><w:rPr><w:noProof/><w:webHidden/></w:rPr><w:tab/><w:fldChar w:fldCharType="begin"/><w:instrText xml:space="preserve"> PAGEREF _Toc236310426 \h </w:instrText><w:fldChar w:fldCharType="separate"/><w:t>13</w:t><w:fldChar w:fldCharType="end"/></w:r></w:hyperlink></w:p><w:p><w:pPr><w:pStyle w:val="TDC1"/><w:rPr><w:rFonts w:asciiTheme="minorHAnsi" w:eastAsiaTheme="minorEastAsia" w:hAnsiTheme="minorHAnsi" w:cstheme="minorBidi"/><w:kern w:val="2"/><w:sz w:val="24"/><w:szCs w:val="24"/><w:lang w:eastAsia="es-ES"/><w14:ligatures w14:val="standardContextual"/></w:rPr></w:pPr><w:hyperlink w:anchor="_Toc236310427" w:history="1"><w:r><w:rPr><w:rStyle w:val="Hipervnculo"/></w:rPr><w:t>10.</w:t></w:r><w:r><w:rPr><w:rFonts w:asciiTheme="minorHAnsi" w:eastAsiaTheme="minorEastAsia" w:hAnsiTheme="minorHAnsi" w:cstheme="minorBidi"/><w:kern w:val="2"/><w:sz w:val="24"/><w:szCs w:val="24"/><w:lang w:eastAsia="es-ES"/><w14:ligatures w14:val="standardContextual"/></w:rPr><w:tab/></w:r><w:r><w:rPr><w:rStyle w:val="Hipervnculo"/></w:rPr><w:t>Flujo de trabajo típico</w:t></w:r><w:r><w:rPr><w:webHidden/></w:rPr><w:tab/><w:fldChar w:fldCharType="begin"/><w:instrText xml:space="preserve"> PAGEREF _Toc236310427 \h </w:instrText><w:fldChar w:fldCharType="separate"/><w:t>13</w:t><w:fldChar w:fldCharType="end"/></w:r></w:hyperlink></w:p><w:p><w:pPr><w:pStyle w:val="TDC1"/><w:rPr><w:rFonts w:asciiTheme="minorHAnsi" w:eastAsiaTheme="minorEastAsia" w:hAnsiTheme="minorHAnsi" w:cstheme="minorBidi"/><w:kern w:val="2"/><w:sz w:val="24"/><w:szCs w:val="24"/><w:lang w:eastAsia="es-ES"/><w14:ligatures w14:val="standardContextual"/></w:rPr></w:pPr><w:hyperlink w:anchor="_Toc236310428" w:history="1"><w:r><w:rPr><w:rStyle w:val="Hipervnculo"/></w:rPr><w:t>11.</w:t></w:r><w:r><w:rPr><w:rFonts w:asciiTheme="minorHAnsi" w:eastAsiaTheme="minorEastAsia" w:hAnsiTheme="minorHAnsi" w:cstheme="minorBidi"/><w:kern w:val="2"/><w:sz w:val="24"/><w:szCs w:val="24"/><w:lang w:eastAsia="es-ES"/><w14:ligatures w14:val="standardContextual"/></w:rPr><w:tab/></w:r><w:r><w:rPr><w:rStyle w:val="Hipervnculo"/></w:rPr><w:t>Preguntas frecuentes</w:t></w:r><w:r><w:rPr><w:webHidden/></w:rPr><w:tab/><w:fldChar w:fldCharType="begin"/><w:instrText xml:space="preserve"> PAGEREF _Toc236310428 \h </w:instrText><w:fldChar w:fldCharType="separate"/><w:t>14</w:t><w:fldChar w:fldCharType="end"/></w:r></w:hyperlink></w:p><w:p><w:pPr><w:pStyle w:val="TDC2"/><w:tabs><w:tab w:val="left" w:pos="880"/><w:tab w:val="right" w:leader="dot" w:pos="9060"/></w:tabs><w:rPr><w:rFonts w:asciiTheme="minorHAnsi" w:eastAsiaTheme="minorEastAsia" w:hAnsiTheme="minorHAnsi" w:cstheme="minorBidi"/><w:noProof/><w:kern w:val="2"/><w:sz w:val="24"/><w:szCs w:val="24"/><w:lang w:eastAsia="es-ES"/><w14:ligatures w14:val="standardContextual"/></w:rPr></w:pPr><w:hyperlink w:anchor="_Toc236310429" w:history="1"><w:r><w:rPr><w:rStyle w:val="Hipervnculo"/><w:noProof/></w:rPr><w:t>11.1.</w:t></w:r><w:r><w:rPr><w:rFonts w:asciiTheme="minorHAnsi" w:eastAsiaTheme="minorEastAsia" w:hAnsiTheme="minorHAnsi" w:cstheme="minorBidi"/><w:noProof/><w:kern w:val="2"/><w:sz w:val="24"/><w:szCs w:val="24"/><w:lang w:eastAsia="es-ES"/><w14:ligatures w14:val="standardContextual"/></w:rPr><w:tab/></w:r><w:r><w:rPr><w:rStyle w:val="Hipervnculo"/><w:noProof/></w:rPr><w:t>¿El servidor MCP consume recursos en segundo plano?</w:t></w:r><w:r><w:rPr><w:noProof/><w:webHidden/></w:rPr><w:tab/><w:fldChar w:fldCharType="begin"/><w:instrText xml:space="preserve"> PAGEREF _Toc236310429 \h </w:instrText><w:fldChar w:fldCharType="separate"/><w:t>14</w:t><w:fldChar w:fldCharType="end"/></w:r></w:hyperlink></w:p><w:p><w:pPr><w:pStyle w:val="TDC2"/><w:tabs><w:tab w:val="left" w:pos="880"/><w:tab w:val="right" w:leader="dot" w:pos="9060"/></w:tabs><w:rPr><w:rFonts w:asciiTheme="minorHAnsi" w:eastAsiaTheme="minorEastAsia" w:hAnsiTheme="minorHAnsi" w:cstheme="minorBidi"/><w:noProof/><w:kern w:val="2"/><w:sz w:val="24"/><w:szCs w:val="24"/><w:lang w:eastAsia="es-ES"/><w14:ligatures w14:val="standardContextual"/></w:rPr></w:pPr><w:hyperlink w:anchor="_Toc236310430" w:history="1"><w:r><w:rPr><w:rStyle w:val="Hipervnculo"/><w:noProof/></w:rPr><w:t>11.2.</w:t></w:r><w:r><w:rPr><w:rFonts w:asciiTheme="minorHAnsi" w:eastAsiaTheme="minorEastAsia" w:hAnsiTheme="minorHAnsi" w:cstheme="minorBidi"/><w:noProof/><w:kern w:val="2"/><w:sz w:val="24"/><w:szCs w:val="24"/><w:lang w:eastAsia="es-ES"/><w14:ligatures w14:val="standardContextual"/></w:rPr><w:tab/></w:r><w:r><w:rPr><w:rStyle w:val="Hipervnculo"/><w:noProof/></w:rPr><w:t>¿Puedo usar el plugin en proyectos que no son ScacsWeb?</w:t></w:r><w:r><w:rPr><w:noProof/><w:webHidden/></w:rPr><w:tab/><w:fldChar w:fldCharType="begin"/><w:instrText xml:space="preserve"> PAGEREF _Toc236310430 \h </w:instrText><w:fldChar w:fldCharType="separate"/><w:t>14</w:t><w:fldChar w:fldCharType="end"/></w:r></w:hyperlink></w:p><w:p><w:pPr><w:pStyle w:val="TDC2"/><w:tabs><w:tab w:val="left" w:pos="880"/><w:tab w:val="right" w:leader="dot" w:pos="9060"/></w:tabs><w:rPr><w:rFonts w:asciiTheme="minorHAnsi" w:eastAsiaTheme="minorEastAsia" w:hAnsiTheme="minorHAnsi" w:cstheme="minorBidi"/><w:noProof/><w:kern w:val="2"/><w:sz w:val="24"/><w:szCs w:val="24"/><w:lang w:eastAsia="es-ES"/><w14:ligatures w14:val="standardContextual"/></w:rPr></w:pPr><w:hyperlink w:anchor="_Toc236310431" w:history="1"><w:r><w:rPr><w:rStyle w:val="Hipervnculo"/><w:noProof/></w:rPr><w:t>11.3.</w:t></w:r><w:r><w:rPr><w:rFonts w:asciiTheme="minorHAnsi" w:eastAsiaTheme="minorEastAsia" w:hAnsiTheme="minorHAnsi" w:cstheme="minorBidi"/><w:noProof/><w:kern w:val="2"/><w:sz w:val="24"/><w:szCs w:val="24"/><w:lang w:eastAsia="es-ES"/><w14:ligatures w14:val="standardContextual"/></w:rPr><w:tab/></w:r><w:r><w:rPr><w:rStyle w:val="Hipervnculo"/><w:noProof/></w:rPr><w:t>¿El plugin accede a Internet?</w:t></w:r><w:r><w:rPr><w:noProof/><w:webHidden/></w:rPr><w:tab/><w:fldChar w:fldCharType="begin"/><w:instrText xml:space="preserve"> PAGEREF _Toc236310431 \h </w:instrText><w:fldChar w:fldCharType="separate"/><w:t>14</w:t><w:fldChar w:fldCharType="end"/></w:r></w:hyperlink></w:p><w:p><w:pPr><w:pStyle w:val="TDC1"/><w:rPr><w:rFonts w:asciiTheme="minorHAnsi" w:eastAsiaTheme="minorEastAsia" w:hAnsiTheme="minorHAnsi" w:cstheme="minorBidi"/><w:kern w:val="2"/><w:sz w:val="24"/><w:szCs w:val="24"/><w:lang w:eastAsia="es-ES"/><w14:ligatures w14:val="standardContextual"/></w:rPr></w:pPr><w:hyperlink w:anchor="_Toc236310432" w:history="1"><w:r><w:rPr><w:rStyle w:val="Hipervnculo"/></w:rPr><w:t>12.</w:t></w:r><w:r><w:rPr><w:rFonts w:asciiTheme="minorHAnsi" w:eastAsiaTheme="minorEastAsia" w:hAnsiTheme="minorHAnsi" w:cstheme="minorBidi"/><w:kern w:val="2"/><w:sz w:val="24"/><w:szCs w:val="24"/><w:lang w:eastAsia="es-ES"/><w14:ligatures w14:val="standardContextual"/></w:rPr><w:tab/></w:r><w:r><w:rPr><w:rStyle w:val="Hipervnculo"/></w:rPr><w:t>Soporte</w:t></w:r><w:r><w:rPr><w:webHidden/></w:rPr><w:tab/><w:fldChar w:fldCharType="begin"/><w:instrText xml:space="preserve"> PAGEREF _Toc236310432 \h </w:instrText><w:fldChar w:fldCharType="separate"/><w:t>14</w:t><w:fldChar w:fldCharType="end"/></w:r></w:hyperlink></w:p><w:p><w:pPr><w:pStyle w:val="TDC1"/></w:pPr><w:r><w:fldChar w:fldCharType="end"/></w:r></w:p><w:p/><w:p><w:pPr><w:sectPr><w:headerReference w:type="first" r:id="rId17"/><w:pgSz w:w="11906" w:h="16838"/><w:pgMar w:top="0" w:right="1418" w:bottom="1418" w:left="1418" w:header="1531" w:footer="1021" w:gutter="0"/><w:cols w:space="720"/></w:sectPr></w:pPr></w:p><w:p><w:pPr><w:pStyle w:val="Ttulo1"/></w:pPr><w:bookmarkStart w:id="1" w:name="_Toc236310404"/><w:r><w:lastRenderedPageBreak/><w:t>¿Qué hace este plugin?</w:t></w:r><w:bookmarkEnd w:id="1"/></w:p><w:p><w:r><w:t>El plugin Orchestrator Skill Full extiende Claude Code con 41 comandos de barra (/orchestrator-*) y un servidor MCP local (orchestrator-workspace) que conecta Claude con las herramientas nativas del proyecto: compilador .NET, SVN/Git, Oracle/SQL Server y el modelo de base de datos en JSON.</w:t></w:r></w:p><w:p/><w:p><w:r><w:t>Está diseñado específicamente para proyectos ScacsWeb (ASP.NET WebForms / .NET Framework 4.0 / C# 7.3) y proporciona un pipeline completo de desarrollo asistido por IA: análisis, implementación, validación, build y gestión de modelo de base de datos, con soporte SVN y Oracle/SQL Server.</w:t></w:r></w:p><w:p/><w:p><w:pPr><w:pStyle w:val="Ttulo2"/></w:pPr><w:bookmarkStart w:id="2" w:name="_Toc236310405"/><w:r><w:t>Valor principal</w:t></w:r><w:bookmarkEnd w:id="2"/></w:p><w:tbl><w:tblPr><w:tblStyle w:val="a"/><w:tblW w:w="9578" w:type="dxa"/><w:jc w:val="center"/><w:tblBorders><w:top w:val="single" w:sz="4" w:space="0" w:color="DDDDDD"/><w:left w:val="single" w:sz="4" w:space="0" w:color="DDDDDD"/><w:bottom w:val="single" w:sz="4" w:space="0" w:color="DDDDDD"/><w:right w:val="single" w:sz="4" w:space="0" w:color="DDDDDD"/><w:insideH w:val="single" w:sz="4" w:space="0" w:color="DDDDDD"/><w:insideV w:val="single" w:sz="4" w:space="0" w:color="DDDDDD"/></w:tblBorders><w:tblLayout w:type="fixed"/><w:tblLook w:val="04A0" w:firstRow="1" w:lastRow="0" w:firstColumn="1" w:lastColumn="0" w:noHBand="0" w:noVBand="1"/></w:tblPr><w:tblGrid><w:gridCol w:w="4789"/><w:gridCol w:w="4789"/></w:tblGrid><w:tr><w:trPr><w:trHeight w:val="500"/><w:jc w:val="center"/></w:trPr><w:tc><w:tcPr><w:tcW w:w="4789" w:type="dxa"/><w:shd w:val="clear" w:color="auto" w:fill="00F7BC"/><w:vAlign w:val="center"/></w:tcPr><w:p><w:pPr><w:spacing w:line="240" w:lineRule="auto"/><w:jc w:val="left"/></w:pPr><w:r><w:rPr><w:b/><w:bCs/><w:color w:val="152A35"/></w:rPr><w:t>SIN EL PLUGIN</w:t></w:r></w:p></w:tc><w:tc><w:tcPr><w:tcW w:w="4789" w:type="dxa"/><w:shd w:val="clear" w:color="auto" w:fill="00F7BC"/><w:vAlign w:val="center"/></w:tcPr><w:p><w:pPr><w:spacing w:line="240" w:lineRule="auto"/><w:jc w:val="left"/></w:pPr><w:r><w:rPr><w:b/><w:bCs/><w:color w:val="152A35"/></w:rPr><w:t>CON EL PLUGIN</w:t></w:r></w:p></w:tc></w:tr><w:tr><w:trPr><w:trHeight w:val="500"/><w:jc w:val="center"/></w:trPr><w:tc><w:tcPr><w:tcW w:w="4789" w:type="dxa"/><w:shd w:val="clear" w:color="auto" w:fill="FFFFFF"/><w:vAlign w:val="center"/></w:tcPr><w:p><w:pPr><w:spacing w:line="240" w:lineRule="auto"/><w:jc w:val="left"/></w:pPr><w:r><w:rPr><w:color w:val="152A35"/></w:rPr><w:t>Claude no conoce la estructura ScacsWeb</w:t></w:r></w:p></w:tc><w:tc><w:tcPr><w:tcW w:w="4789" w:type="dxa"/><w:shd w:val="clear" w:color="auto" w:fill="FFFFFF"/><w:vAlign w:val="center"/></w:tcPr><w:p><w:pPr><w:spacing w:line="240" w:lineRule="auto"/><w:jc w:val="left"/></w:pPr><w:r><w:rPr><w:color w:val="152A35"/></w:rPr><w:t>Entiende BPC + BE + DALC, capas, rutas AIS</w:t></w:r></w:p></w:tc></w:tr><w:tr><w:trPr><w:trHeight w:val="500"/><w:jc w:val="center"/></w:trPr><w:tc><w:tcPr><w:tcW w:w="4789" w:type="dxa"/><w:shd w:val="clear" w:color="auto" w:fill="F0F0F0"/><w:vAlign w:val="center"/></w:tcPr><w:p><w:pPr><w:spacing w:line="240" w:lineRule="auto"/><w:jc w:val="left"/></w:pPr><w:r><w:rPr><w:color w:val="152A35"/></w:rPr><w:t>Sin acceso a la base de datos</w:t></w:r></w:p></w:tc><w:tc><w:tcPr><w:tcW w:w="4789" w:type="dxa"/><w:shd w:val="clear" w:color="auto" w:fill="F0F0F0"/><w:vAlign w:val="center"/></w:tcPr><w:p><w:pPr><w:spacing w:line="240" w:lineRule="auto"/><w:jc w:val="left"/></w:pPr><w:r><w:rPr><w:color w:val="152A35"/></w:rPr><w:t>Consulta Oracle/SQL Server vía XMLConfig.xml</w:t></w:r></w:p></w:tc></w:tr><w:tr><w:trPr><w:trHeight w:val="500"/><w:jc w:val="center"/></w:trPr><w:tc><w:tcPr><w:tcW w:w="4789" w:type="dxa"/><w:shd w:val="clear" w:color="auto" w:fill="FFFFFF"/><w:vAlign w:val="center"/></w:tcPr><w:p><w:pPr><w:spacing w:line="240" w:lineRule="auto"/><w:jc w:val="left"/></w:pPr><w:r><w:rPr><w:color w:val="152A35"/></w:rPr><w:t>Sin acceso a SVN</w:t></w:r></w:p></w:tc><w:tc><w:tcPr><w:tcW w:w="4789" w:type="dxa"/><w:shd w:val="clear" w:color="auto" w:fill="FFFFFF"/><w:vAlign w:val="center"/></w:tcPr><w:p><w:pPr><w:spacing w:line="240" w:lineRule="auto"/><w:jc w:val="left"/></w:pPr><w:r><w:rPr><w:color w:val="152A35"/></w:rPr><w:t>Lee diff, log y estado SVN/Git</w:t></w:r></w:p></w:tc></w:tr><w:tr><w:trPr><w:trHeight w:val="500"/><w:jc w:val="center"/></w:trPr><w:tc><w:tcPr><w:tcW w:w="4789" w:type="dxa"/><w:shd w:val="clear" w:color="auto" w:fill="F0F0F0"/><w:vAlign w:val="center"/></w:tcPr><w:p><w:pPr><w:spacing w:line="240" w:lineRule="auto"/><w:jc w:val="left"/></w:pPr><w:r><w:rPr><w:color w:val="152A35"/></w:rPr><w:t>Sin compilador</w:t></w:r></w:p></w:tc><w:tc><w:tcPr><w:tcW w:w="4789" w:type="dxa"/><w:shd w:val="clear" w:color="auto" w:fill="F0F0F0"/><w:vAlign w:val="center"/></w:tcPr><w:p><w:pPr><w:spacing w:line="240" w:lineRule="auto"/><w:jc w:val="left"/></w:pPr><w:r><w:rPr><w:color w:val="152A35"/></w:rPr><w:t>Invoca MSBuild y valida errores</w:t></w:r></w:p></w:tc></w:tr><w:tr><w:trPr><w:trHeight w:val="500"/><w:jc w:val="center"/></w:trPr><w:tc><w:tcPr><w:tcW w:w="4789" w:type="dxa"/><w:shd w:val="clear" w:color="auto" w:fill="FFFFFF"/><w:vAlign w:val="center"/></w:tcPr><w:p><w:pPr><w:spacing w:line="240" w:lineRule="auto"/><w:jc w:val="left"/></w:pPr><w:r><w:rPr><w:color w:val="152A35"/></w:rPr><w:t>Sin modelo de BD</w:t></w:r></w:p></w:tc><w:tc><w:tcPr><w:tcW w:w="4789" w:type="dxa"/><w:shd w:val="clear" w:color="auto" w:fill="FFFFFF"/><w:vAlign w:val="center"/></w:tcPr><w:p><w:pPr><w:spacing w:line="240" w:lineRule="auto"/><w:jc w:val="left"/></w:pPr><w:r><w:rPr><w:color w:val="152A35"/></w:rPr><w:t>Compara modelo JSON local vs esquema real</w:t></w:r></w:p></w:tc></w:tr><w:tr w14:paraId="BB0004010"><w:trPr><w:trHeight w:val="500"/><w:jc w:val="center"/></w:trPr><w:tc><w:tcPr><w:tcW w:w="4789" w:type="dxa"/><w:shd w:val="clear" w:color="auto" w:fill="F0F0F0"/><w:vAlign w:val="center"/></w:tcPr><w:p><w:pPr><w:spacing w:line="240" w:lineRule="auto"/><w:jc w:val="left"/></w:pPr><w:r><w:rPr><w:color w:val="152A35"/></w:rPr><w:t xml:space="preserve">Contexto BBDD en skill externo</w:t></w:r></w:p></w:tc><w:tc><w:tcPr><w:tcW w:w="4789" w:type="dxa"/><w:shd w:val="clear" w:color="auto" w:fill="F0F0F0"/><w:vAlign w:val="center"/></w:tcPr><w:p><w:pPr><w:spacing w:line="240" w:lineRule="auto"/><w:jc w:val="left"/></w:pPr><w:r><w:rPr><w:color w:val="152A35"/></w:rPr><w:t xml:space="preserve">Contexto BBDD integrado en el plugin (env.json)</w:t></w:r></w:p></w:tc></w:tr></w:tbl><w:p/><w:p><w:pPr><w:pStyle w:val="Ttulo1"/></w:pPr><w:bookmarkStart w:id="3" w:name="_Toc236310406"/><w:r><w:t>Prerrequisitos</w:t></w:r><w:bookmarkEnd w:id="3"/></w:p><w:tbl><w:tblPr><w:tblStyle w:val="a"/><w:tblW w:w="9578" w:type="dxa"/><w:jc w:val="center"/><w:tblBorders><w:top w:val="single" w:sz="4" w:space="0" w:color="DDDDDD"/><w:left w:val="single" w:sz="4" w:space="0" w:color="DDDDDD"/><w:bottom w:val="single" w:sz="4" w:space="0" w:color="DDDDDD"/><w:right w:val="single" w:sz="4" w:space="0" w:color="DDDDDD"/><w:insideH w:val="single" w:sz="4" w:space="0" w:color="DDDDDD"/><w:insideV w:val="single" w:sz="4" w:space="0" w:color="DDDDDD"/></w:tblBorders><w:tblLayout w:type="fixed"/><w:tblLook w:val="04A0" w:firstRow="1" w:lastRow="0" w:firstColumn="1" w:lastColumn="0" w:noHBand="0" w:noVBand="1"/></w:tblPr><w:tblGrid><w:gridCol w:w="2500"/><w:gridCol w:w="3000"/><w:gridCol w:w="4078"/></w:tblGrid><w:tr><w:trPr><w:trHeight w:val="500"/><w:jc w:val="center"/></w:trPr><w:tc><w:tcPr><w:tcW w:w="2500" w:type="dxa"/><w:shd w:val="clear" w:color="auto" w:fill="00F7BC"/><w:vAlign w:val="center"/></w:tcPr><w:p><w:pPr><w:spacing w:line="240" w:lineRule="auto"/><w:jc w:val="left"/></w:pPr><w:r><w:rPr><w:b/><w:bCs/><w:color w:val="152A35"/></w:rPr><w:t>REQUISITO</w:t></w:r></w:p></w:tc><w:tc><w:tcPr><w:tcW w:w="3000" w:type="dxa"/><w:shd w:val="clear" w:color="auto" w:fill="00F7BC"/><w:vAlign w:val="center"/></w:tcPr><w:p><w:pPr><w:spacing w:line="240" w:lineRule="auto"/><w:jc w:val="left"/></w:pPr><w:r><w:rPr><w:b/><w:bCs/><w:color w:val="152A35"/></w:rPr><w:t>VERSIÓN MÍNIMA</w:t></w:r></w:p></w:tc><w:tc><w:tcPr><w:tcW w:w="4078" w:type="dxa"/><w:shd w:val="clear" w:color="auto" w:fill="00F7BC"/><w:vAlign w:val="center"/></w:tcPr><w:p><w:pPr><w:spacing w:line="240" w:lineRule="auto"/><w:jc w:val="left"/></w:pPr><w:r><w:rPr><w:b/><w:bCs/><w:color w:val="152A35"/></w:rPr><w:t>CÓMO VERIFICAR</w:t></w:r></w:p></w:tc></w:tr><w:tr><w:trPr><w:trHeight w:val="500"/><w:jc w:val="center"/></w:trPr><w:tc><w:tcPr><w:tcW w:w="2500" w:type="dxa"/><w:shd w:val="clear" w:color="auto" w:fill="FFFFFF"/><w:vAlign w:val="center"/></w:tcPr><w:p><w:pPr><w:spacing w:line="240" w:lineRule="auto"/><w:jc w:val="left"/></w:pPr><w:r><w:rPr><w:color w:val="152A35"/></w:rPr><w:t>Claude Code</w:t></w:r></w:p></w:tc><w:tc><w:tcPr><w:tcW w:w="3000" w:type="dxa"/><w:shd w:val="clear" w:color="auto" w:fill="FFFFFF"/><w:vAlign w:val="center"/></w:tcPr><w:p><w:pPr><w:spacing w:line="240" w:lineRule="auto"/><w:jc w:val="left"/></w:pPr><w:r><w:rPr><w:color w:val="152A35"/></w:rPr><w:t>Última disponible</w:t></w:r></w:p></w:tc><w:tc><w:tcPr><w:tcW w:w="4078" w:type="dxa"/><w:shd w:val="clear" w:color="auto" w:fill="FFFFFF"/><w:vAlign w:val="center"/></w:tcPr><w:p><w:pPr><w:spacing w:line="240" w:lineRule="auto"/><w:jc w:val="left"/></w:pPr><w:r><w:rPr><w:color w:val="152A35"/></w:rPr><w:t>claude --version</w:t></w:r></w:p></w:tc></w:tr><w:tr><w:trPr><w:trHeight w:val="500"/><w:jc w:val="center"/></w:trPr><w:tc><w:tcPr><w:tcW w:w="2500" w:type="dxa"/><w:shd w:val="clear" w:color="auto" w:fill="F0F0F0"/><w:vAlign w:val="center"/></w:tcPr><w:p><w:pPr><w:spacing w:line="240" w:lineRule="auto"/><w:jc w:val="left"/></w:pPr><w:r><w:rPr><w:color w:val="152A35"/></w:rPr><w:t>Python</w:t></w:r></w:p></w:tc><w:tc><w:tcPr><w:tcW w:w="3000" w:type="dxa"/><w:shd w:val="clear" w:color="auto" w:fill="F0F0F0"/><w:vAlign w:val="center"/></w:tcPr><w:p><w:pPr><w:spacing w:line="240" w:lineRule="auto"/><w:jc w:val="left"/></w:pPr><w:r><w:rPr><w:color w:val="152A35"/></w:rPr><w:t>3.9 o superior</w:t></w:r></w:p></w:tc><w:tc><w:tcPr><w:tcW w:w="4078" w:type="dxa"/><w:shd w:val="clear" w:color="auto" w:fill="F0F0F0"/><w:vAlign w:val="center"/></w:tcPr><w:p><w:pPr><w:spacing w:line="240" w:lineRule="auto"/><w:jc w:val="left"/></w:pPr><w:r><w:rPr><w:color w:val="152A35"/></w:rPr><w:t>python --version</w:t></w:r></w:p></w:tc></w:tr><w:tr><w:trPr><w:trHeight w:val="500"/><w:jc w:val="center"/></w:trPr><w:tc><w:tcPr><w:tcW w:w="2500" w:type="dxa"/><w:shd w:val="clear" w:color="auto" w:fill="FFFFFF"/><w:vAlign w:val="center"/></w:tcPr><w:p><w:pPr><w:spacing w:line="240" w:lineRule="auto"/><w:jc w:val="left"/></w:pPr><w:r><w:rPr><w:color w:val="152A35"/></w:rPr><w:lastRenderedPageBreak/><w:t>Git</w:t></w:r></w:p></w:tc><w:tc><w:tcPr><w:tcW w:w="3000" w:type="dxa"/><w:shd w:val="clear" w:color="auto" w:fill="FFFFFF"/><w:vAlign w:val="center"/></w:tcPr><w:p><w:pPr><w:spacing w:line="240" w:lineRule="auto"/><w:jc w:val="left"/></w:pPr><w:r><w:rPr><w:color w:val="152A35"/></w:rPr><w:t>Cualquier versión reciente</w:t></w:r></w:p></w:tc><w:tc><w:tcPr><w:tcW w:w="4078" w:type="dxa"/><w:shd w:val="clear" w:color="auto" w:fill="FFFFFF"/><w:vAlign w:val="center"/></w:tcPr><w:p><w:pPr><w:spacing w:line="240" w:lineRule="auto"/><w:jc w:val="left"/></w:pPr><w:r><w:rPr><w:color w:val="152A35"/></w:rPr><w:t>git --version</w:t></w:r></w:p></w:tc></w:tr><w:tr><w:trPr><w:trHeight w:val="500"/><w:jc w:val="center"/></w:trPr><w:tc><w:tcPr><w:tcW w:w="2500" w:type="dxa"/><w:shd w:val="clear" w:color="auto" w:fill="F0F0F0"/><w:vAlign w:val="center"/></w:tcPr><w:p><w:pPr><w:spacing w:line="240" w:lineRule="auto"/><w:jc w:val="left"/></w:pPr><w:r><w:rPr><w:color w:val="152A35"/></w:rPr><w:t>PowerShell</w:t></w:r></w:p></w:tc><w:tc><w:tcPr><w:tcW w:w="3000" w:type="dxa"/><w:shd w:val="clear" w:color="auto" w:fill="F0F0F0"/><w:vAlign w:val="center"/></w:tcPr><w:p><w:pPr><w:spacing w:line="240" w:lineRule="auto"/><w:jc w:val="left"/></w:pPr><w:r><w:rPr><w:color w:val="152A35"/></w:rPr><w:t>5.1 (incluido en Windows 10/11)</w:t></w:r></w:p></w:tc><w:tc><w:tcPr><w:tcW w:w="4078" w:type="dxa"/><w:shd w:val="clear" w:color="auto" w:fill="F0F0F0"/><w:vAlign w:val="center"/></w:tcPr><w:p><w:pPr><w:spacing w:line="240" w:lineRule="auto"/><w:jc w:val="left"/></w:pPr><w:r><w:rPr><w:color w:val="152A35"/></w:rPr><w:t>—</w:t></w:r></w:p></w:tc></w:tr><w:tr><w:trPr><w:trHeight w:val="500"/><w:jc w:val="center"/></w:trPr><w:tc><w:tcPr><w:tcW w:w="2500" w:type="dxa"/><w:shd w:val="clear" w:color="auto" w:fill="FFFFFF"/><w:vAlign w:val="center"/></w:tcPr><w:p><w:pPr><w:spacing w:line="240" w:lineRule="auto"/><w:jc w:val="left"/></w:pPr><w:r><w:rPr><w:color w:val="152A35"/></w:rPr><w:t>SVN CLI</w:t></w:r></w:p></w:tc><w:tc><w:tcPr><w:tcW w:w="3000" w:type="dxa"/><w:shd w:val="clear" w:color="auto" w:fill="FFFFFF"/><w:vAlign w:val="center"/></w:tcPr><w:p><w:pPr><w:spacing w:line="240" w:lineRule="auto"/><w:jc w:val="left"/></w:pPr><w:r><w:rPr><w:color w:val="152A35"/></w:rPr><w:t>Opcional (comandos SVN)</w:t></w:r></w:p></w:tc><w:tc><w:tcPr><w:tcW w:w="4078" w:type="dxa"/><w:shd w:val="clear" w:color="auto" w:fill="FFFFFF"/><w:vAlign w:val="center"/></w:tcPr><w:p><w:pPr><w:spacing w:line="240" w:lineRule="auto"/><w:jc w:val="left"/></w:pPr><w:r><w:rPr><w:color w:val="152A35"/></w:rPr><w:t>svn --version</w:t></w:r></w:p></w:tc></w:tr><w:tr><w:trPr><w:trHeight w:val="500"/><w:jc w:val="center"/></w:trPr><w:tc><w:tcPr><w:tcW w:w="2500" w:type="dxa"/><w:shd w:val="clear" w:color="auto" w:fill="F0F0F0"/><w:vAlign w:val="center"/></w:tcPr><w:p><w:pPr><w:spacing w:line="240" w:lineRule="auto"/><w:jc w:val="left"/></w:pPr><w:r><w:rPr><w:color w:val="152A35"/></w:rPr><w:t>dotnet / MSBuild</w:t></w:r></w:p></w:tc><w:tc><w:tcPr><w:tcW w:w="3000" w:type="dxa"/><w:shd w:val="clear" w:color="auto" w:fill="F0F0F0"/><w:vAlign w:val="center"/></w:tcPr><w:p><w:pPr><w:spacing w:line="240" w:lineRule="auto"/><w:jc w:val="left"/></w:pPr><w:r><w:rPr><w:color w:val="152A35"/></w:rPr><w:t>.NET Framework 4.0+</w:t></w:r></w:p></w:tc><w:tc><w:tcPr><w:tcW w:w="4078" w:type="dxa"/><w:shd w:val="clear" w:color="auto" w:fill="F0F0F0"/><w:vAlign w:val="center"/></w:tcPr><w:p><w:pPr><w:spacing w:line="240" w:lineRule="auto"/><w:jc w:val="left"/></w:pPr><w:r><w:rPr><w:color w:val="152A35"/></w:rPr><w:t>dotnet --version</w:t></w:r></w:p></w:tc></w:tr></w:tbl><w:p/><w:p><w:pPr><w:pStyle w:val="Ttulo1"/></w:pPr><w:bookmarkStart w:id="4" w:name="_Toc236310407"/><w:r><w:t>Instalación desde Git</w:t></w:r><w:bookmarkEnd w:id="4"/></w:p><w:p><w:r><w:t>El plugin se instala directamente desde el repositorio Git con un único comando en Claude Code. No se requiere clonar el repositorio manualmente.</w:t></w:r></w:p><w:p><w:pPr><w:pStyle w:val="Ttulo2"/></w:pPr><w:bookmarkStart w:id="5" w:name="_Toc236310408"/><w:r><w:t>Paso 1 — Instalar el plugin en Claude Code</w:t></w:r><w:bookmarkEnd w:id="5"/></w:p><w:p><w:r><w:t>Abre Claude Code y ejecuta el siguiente comando de barra:</w:t></w:r></w:p><w:p><w:pPr><w:shd w:val="clear" w:color="auto" w:fill="F5F5F5"/><w:spacing w:after="0" w:line="240" w:lineRule="auto"/></w:pPr><w:r><w:rPr><w:rFonts w:ascii="Courier New" w:hAnsi="Courier New" w:cs="Courier New"/><w:color w:val="152A35"/><w:sz w:val="18"/><w:szCs w:val="18"/></w:rPr><w:t>/plugin install https://github.com/aisaplica/Orchestrator-Agent.git</w:t></w:r></w:p><w:p/><w:p><w:r><w:t>Claude Code clonará el repositorio e instalará el plugin y el servidor MCP automáticamente. Si la red corporativa requiere proxy o certificado SSL personalizado, configúralo en Git antes de ejecutar este comando.</w:t></w:r></w:p><w:p><w:pPr><w:pStyle w:val="Ttulo2"/></w:pPr><w:bookmarkStart w:id="6" w:name="_Toc236310409"/><w:r><w:t>Paso 2 — Instalar dependencias Python</w:t></w:r><w:bookmarkEnd w:id="6"/></w:p><w:p><w:r><w:t>Ejecutar una sola vez por máquina. Abre PowerShell en el directorio donde Claude Code instaló el plugin:</w:t></w:r></w:p><w:p><w:pPr><w:shd w:val="clear" w:color="auto" w:fill="F5F5F5"/><w:spacing w:after="0" w:line="240" w:lineRule="auto"/></w:pPr><w:r><w:rPr><w:rFonts w:ascii="Courier New" w:hAnsi="Courier New" w:cs="Courier New"/><w:color w:val="152A35"/><w:sz w:val="18"/><w:szCs w:val="18"/></w:rPr><w:t>cd C:\Users\&lt;tu-usuario&gt;\.claude\plugins\cache\aisaplica\orchestrator-skill-full\</w:t></w:r></w:p><w:p><w:pPr><w:shd w:val="clear" w:color="auto" w:fill="F5F5F5"/><w:spacing w:after="0" w:line="240" w:lineRule="auto"/></w:pPr><w:r><w:rPr><w:rFonts w:ascii="Courier New" w:hAnsi="Courier New" w:cs="Courier New"/><w:color w:val="152A35"/><w:sz w:val="18"/><w:szCs w:val="18"/></w:rPr><w:t>.\setup.ps1</w:t></w:r></w:p><w:p/><w:p><w:r><w:t>El script realiza automáticamente:</w:t></w:r></w:p><w:p><w:pPr><w:numPr><w:ilvl w:val="0"/><w:numId w:val="1"/></w:numPr><w:spacing w:after="60"/></w:pPr><w:r><w:t>Verifica que Python 3.9+ esté disponible</w:t></w:r></w:p><w:p><w:pPr><w:numPr><w:ilvl w:val="0"/><w:numId w:val="1"/></w:numPr><w:spacing w:after="60"/></w:pPr><w:r><w:t>Instala los paquetes mcp y fastmcp</w:t></w:r></w:p><w:p><w:pPr><w:numPr><w:ilvl w:val="0"/><w:numId w:val="1"/></w:numPr><w:spacing w:after="60"/></w:pPr><w:r><w:t>Configura el servidor MCP local</w:t></w:r></w:p><w:p/><w:p><w:pPr><w:pStyle w:val="Ttulo2"/></w:pPr><w:r><w:t>Paso 3 &#x2014; Configurar credenciales (env.json)</w:t></w:r></w:p><w:p><w:r><w:t xml:space="preserve">El plugin incluye un archivo env.template.json con la estructura de configuraci&#xF3;n de entorno. Debes crear tu propio env.json (ignorado por Git, nunca se sube) con tus credenciales reales:</w:t></w:r></w:p><w:p><w:pPr><w:shd w:val="clear" w:color="auto" w:fill="F5F5F5"/><w:spacing w:after="0" w:line="240" w:lineRule="auto"/></w:pPr><w:r><w:rPr><w:rFonts w:ascii="Courier New" w:hAnsi="Courier New" w:cs="Courier New"/><w:color w:val="152A35"/><w:sz w:val="18"/><w:szCs w:val="18"/></w:rPr><w:t xml:space="preserve">Copy-Item env.template.json env.json</w:t></w:r></w:p><w:p><w:r><w:t xml:space="preserve">Abre env.json y rellena los valores marcados con &lt;COMPLETAR&gt;:</w:t></w:r></w:p><w:p><w:pPr><w:numPr><w:ilvl w:val="0"/><w:numId w:val="1"/></w:numPr><w:spacing w:after="60"/></w:pPr><w:r><w:t xml:space="preserve">herramientas.mantis &#x2014; URL y API key de MantisBT corporativo</w:t></w:r></w:p><w:p><w:pPr><w:numPr><w:ilvl w:val="0"/><w:numId w:val="1"/></w:numPr><w:spacing w:after="60"/></w:pPr><w:r><w:t xml:space="preserve">herramientas.svn &#x2014; URL y credenciales del repositorio SVN</w:t></w:r></w:p><w:p><w:pPr><w:numPr><w:ilvl w:val="0"/><w:numId w:val="1"/></w:numPr><w:spacing w:after="60"/></w:pPr><w:r><w:t xml:space="preserve">credenciales_bbdd &#x2014; usuarios y passwords por proyecto (Ingenieros, bancamarch...)</w:t></w:r></w:p><w:p><w:pPr><w:numPr><w:ilvl w:val="0"/><w:numId w:val="1"/></w:numPr><w:spacing w:after="60"/></w:pPr><w:r><w:t xml:space="preserve">entornos &#x2014; connection strings completas por proyecto y entorno (DEV/PRE/PRO)</w:t></w:r></w:p><w:p><w:pPr><w:numPr><w:ilvl w:val="0"/><w:numId w:val="1"/></w:numPr><w:spacing w:after="60"/></w:pPr><w:r><w:t xml:space="preserve">contexto_personal &#x2014; tu nombre, rol y equipo</w:t></w:r></w:p><w:p><w:r><w:t xml:space="preserve">Nota: Si no tienes env.json, el agente lo crear&#xE1; autom&#xE1;ticamente desde la plantilla la primera vez que uses un comando de base de datos, y te pedir&#xE1; que lo rellenes antes de continuar.</w:t></w:r></w:p><w:p><w:pPr><w:pStyle w:val="Ttulo2"/></w:pPr><w:bookmarkStart w:id="7" w:name="_Toc236310410"/><w:r><w:t>Paso 4 — Verificar la instalación</w:t></w:r><w:bookmarkEnd w:id="7"/></w:p><w:p><w:r><w:t>En Claude Code, escribe:</w:t></w:r></w:p><w:p><w:pPr><w:shd w:val="clear" w:color="auto" w:fill="F5F5F5"/><w:spacing w:after="0" w:line="240" w:lineRule="auto"/></w:pPr><w:r><w:rPr><w:rFonts w:ascii="Courier New" w:hAnsi="Courier New" w:cs="Courier New"/><w:color w:val="152A35"/><w:sz w:val="18"/><w:szCs w:val="18"/></w:rPr><w:t>/orchestrator-historial</w:t></w:r></w:p><w:p/><w:p><w:r><w:t>Si el plugin está activo, el agente responderá con el historial SVN/Git del workspace actual. El servidor MCP orchestrator-workspace arranca automáticamente en el primer uso.</w:t></w:r></w:p><w:p><w:pPr><w:pStyle w:val="Ttulo2"/></w:pPr><w:bookmarkStart w:id="8" w:name="_Toc236310411"/><w:r><w:t>Actualizar el plugin</w:t></w:r><w:bookmarkEnd w:id="8"/></w:p><w:p><w:pPr><w:shd w:val="clear" w:color="auto" w:fill="F5F5F5"/><w:spacing w:after="0" w:line="240" w:lineRule="auto"/></w:pPr><w:r><w:rPr><w:rFonts w:ascii="Courier New" w:hAnsi="Courier New" w:cs="Courier New"/><w:color w:val="152A35"/><w:sz w:val="18"/><w:szCs w:val="18"/></w:rPr><w:t>/plugin update orchestrator-skill-full</w:t></w:r></w:p><w:p/><w:p><w:pPr><w:pStyle w:val="Ttulo1"/></w:pPr><w:bookmarkStart w:id="9" w:name="_Toc236310412"/><w:r><w:t>Comandos disponibles</w:t></w:r><w:bookmarkEnd w:id="9"/></w:p><w:p><w:r><w:t>El plugin expone 41 comandos de barra agrupados por categoría. Todos siguen el patrón /orchestrator-&lt;nombre&gt;.</w:t></w:r></w:p><w:p/><w:p><w:pPr><w:pStyle w:val="Ttulo2"/></w:pPr><w:bookmarkStart w:id="10" w:name="_Toc236310413"/><w:r><w:t>Análisis y calidad</w:t></w:r><w:bookmarkEnd w:id="10"/></w:p><w:tbl><w:tblPr><w:tblStyle w:val="a"/><w:tblW w:w="9578" w:type="dxa"/><w:jc w:val="center"/><w:tblBorders><w:top w:val="single" w:sz="4" w:space="0" w:color="DDDDDD"/><w:left w:val="single" w:sz="4" w:space="0" w:color="DDDDDD"/><w:bottom w:val="single" w:sz="4" w:space="0" w:color="DDDDDD"/><w:right w:val="single" w:sz="4" w:space="0" w:color="DDDDDD"/><w:insideH w:val="single" w:sz="4" w:space="0" w:color="DDDDDD"/><w:insideV w:val="single" w:sz="4" w:space="0" w:color="DDDDDD"/></w:tblBorders><w:tblLayout w:type="fixed"/><w:tblLook w:val="04A0" w:firstRow="1" w:lastRow="0" w:firstColumn="1" w:lastColumn="0" w:noHBand="0" w:noVBand="1"/></w:tblPr><w:tblGrid><w:gridCol w:w="3500"/><w:gridCol w:w="6078"/></w:tblGrid><w:tr><w:trPr><w:trHeight w:val="500"/><w:jc w:val="center"/></w:trPr><w:tc><w:tcPr><w:tcW w:w="3500" w:type="dxa"/><w:shd w:val="clear" w:color="auto" w:fill="00F7BC"/><w:vAlign w:val="center"/></w:tcPr><w:p><w:pPr><w:spacing w:line="240" w:lineRule="auto"/><w:jc w:val="left"/></w:pPr><w:r><w:rPr><w:b/><w:bCs/><w:color w:val="152A35"/></w:rPr><w:t>COMANDO</w:t></w:r></w:p></w:tc><w:tc><w:tcPr><w:tcW w:w="6078" w:type="dxa"/><w:shd w:val="clear" w:color="auto" w:fill="00F7BC"/><w:vAlign w:val="center"/></w:tcPr><w:p><w:pPr><w:spacing w:line="240" w:lineRule="auto"/><w:jc w:val="left"/></w:pPr><w:r><w:rPr><w:b/><w:bCs/><w:color w:val="152A35"/></w:rPr><w:t>QUÉ HACE</w:t></w:r></w:p></w:tc></w:tr><w:tr><w:trPr><w:trHeight w:val="500"/><w:jc w:val="center"/></w:trPr><w:tc><w:tcPr><w:tcW w:w="3500" w:type="dxa"/><w:shd w:val="clear" w:color="auto" w:fill="FFFFFF"/><w:vAlign w:val="center"/></w:tcPr><w:p><w:pPr><w:spacing w:line="240" w:lineRule="auto"/><w:jc w:val="left"/></w:pPr><w:r><w:rPr><w:color w:val="152A35"/></w:rPr><w:t>/orchestrator-analizar &lt;Solucion&gt;.sln [rev|ficheros]</w:t></w:r></w:p></w:tc><w:tc><w:tcPr><w:tcW w:w="6078" w:type="dxa"/><w:shd w:val="clear" w:color="auto" w:fill="FFFFFF"/><w:vAlign w:val="center"/></w:tcPr><w:p><w:pPr><w:spacing w:line="240" w:lineRule="auto"/><w:jc w:val="left"/></w:pPr><w:r><w:rPr><w:color w:val="152A35"/></w:rPr><w:t>Análisis estático de calidad y riesgo de un diff o cambio concreto</w:t></w:r></w:p></w:tc></w:tr><w:tr><w:trPr><w:trHeight w:val="500"/><w:jc w:val="center"/></w:trPr><w:tc><w:tcPr><w:tcW w:w="3500" w:type="dxa"/><w:shd w:val="clear" w:color="auto" w:fill="F0F0F0"/><w:vAlign w:val="center"/></w:tcPr><w:p><w:pPr><w:spacing w:line="240" w:lineRule="auto"/><w:jc w:val="left"/></w:pPr><w:r><w:rPr><w:color w:val="152A35"/></w:rPr><w:t>/orchestrator-auditoria</w:t></w:r></w:p></w:tc><w:tc><w:tcPr><w:tcW w:w="6078" w:type="dxa"/><w:shd w:val="clear" w:color="auto" w:fill="F0F0F0"/><w:vAlign w:val="center"/></w:tcPr><w:p><w:pPr><w:spacing w:line="240" w:lineRule="auto"/><w:jc w:val="left"/></w:pPr><w:r><w:rPr><w:color w:val="152A35"/></w:rPr><w:t>Revisión de calidad y convenciones ScacsWeb (BPC, DALC, naming)</w:t></w:r></w:p></w:tc></w:tr><w:tr><w:trPr><w:trHeight w:val="500"/><w:jc w:val="center"/></w:trPr><w:tc><w:tcPr><w:tcW w:w="3500" w:type="dxa"/><w:shd w:val="clear" w:color="auto" w:fill="FFFFFF"/><w:vAlign w:val="center"/></w:tcPr><w:p><w:pPr><w:spacing w:line="240" w:lineRule="auto"/><w:jc w:val="left"/></w:pPr><w:r><w:rPr><w:color w:val="152A35"/></w:rPr><w:t>/orchestrator-security</w:t></w:r></w:p></w:tc><w:tc><w:tcPr><w:tcW w:w="6078" w:type="dxa"/><w:shd w:val="clear" w:color="auto" w:fill="FFFFFF"/><w:vAlign w:val="center"/></w:tcPr><w:p><w:pPr><w:spacing w:line="240" w:lineRule="auto"/><w:jc w:val="left"/></w:pPr><w:r><w:rPr><w:color w:val="152A35"/></w:rPr><w:t>Auditoría de seguridad: SQL injection, XSS, secretos en código</w:t></w:r></w:p></w:tc></w:tr><w:tr><w:trPr><w:trHeight w:val="500"/><w:jc w:val="center"/></w:trPr><w:tc><w:tcPr><w:tcW w:w="3500" w:type="dxa"/><w:shd w:val="clear" w:color="auto" w:fill="F0F0F0"/><w:vAlign w:val="center"/></w:tcPr><w:p><w:pPr><w:spacing w:line="240" w:lineRule="auto"/><w:jc w:val="left"/></w:pPr><w:r><w:rPr><w:color w:val="152A35"/></w:rPr><w:t>/orchestrator-review</w:t></w:r></w:p></w:tc><w:tc><w:tcPr><w:tcW w:w="6078" w:type="dxa"/><w:shd w:val="clear" w:color="auto" w:fill="F0F0F0"/><w:vAlign w:val="center"/></w:tcPr><w:p><w:pPr><w:spacing w:line="240" w:lineRule="auto"/><w:jc w:val="left"/></w:pPr><w:r><w:rPr><w:color w:val="152A35"/></w:rPr><w:t>Revisión de código del diff actual antes de commit</w:t></w:r></w:p></w:tc></w:tr><w:tr><w:trPr><w:trHeight w:val="500"/><w:jc w:val="center"/></w:trPr><w:tc><w:tcPr><w:tcW w:w="3500" w:type="dxa"/><w:shd w:val="clear" w:color="auto" w:fill="FFFFFF"/><w:vAlign w:val="center"/></w:tcPr><w:p><w:pPr><w:spacing w:line="240" w:lineRule="auto"/><w:jc w:val="left"/></w:pPr><w:r><w:rPr><w:color w:val="152A35"/></w:rPr><w:t>/orchestrator-hotspots</w:t></w:r></w:p></w:tc><w:tc><w:tcPr><w:tcW w:w="6078" w:type="dxa"/><w:shd w:val="clear" w:color="auto" w:fill="FFFFFF"/><w:vAlign w:val="center"/></w:tcPr><w:p><w:pPr><w:spacing w:line="240" w:lineRule="auto"/><w:jc w:val="left"/></w:pPr><w:r><w:rPr><w:color w:val="152A35"/></w:rPr><w:t>Detecta los ficheros con más cambios y mayor riesgo acumulado</w:t></w:r></w:p></w:tc></w:tr><w:tr><w:trPr><w:trHeight w:val="500"/><w:jc w:val="center"/></w:trPr><w:tc><w:tcPr><w:tcW w:w="3500" w:type="dxa"/><w:shd w:val="clear" w:color="auto" w:fill="F0F0F0"/><w:vAlign w:val="center"/></w:tcPr><w:p><w:pPr><w:spacing w:line="240" w:lineRule="auto"/><w:jc w:val="left"/></w:pPr><w:r><w:rPr><w:color w:val="152A35"/></w:rPr><w:lastRenderedPageBreak/><w:t>/orchestrator-dead-code</w:t></w:r></w:p></w:tc><w:tc><w:tcPr><w:tcW w:w="6078" w:type="dxa"/><w:shd w:val="clear" w:color="auto" w:fill="F0F0F0"/><w:vAlign w:val="center"/></w:tcPr><w:p><w:pPr><w:spacing w:line="240" w:lineRule="auto"/><w:jc w:val="left"/></w:pPr><w:r><w:rPr><w:color w:val="152A35"/></w:rPr><w:t>Localiza código muerto: métodos, clases y referencias sin uso</w:t></w:r></w:p></w:tc></w:tr><w:tr><w:trPr><w:trHeight w:val="500"/><w:jc w:val="center"/></w:trPr><w:tc><w:tcPr><w:tcW w:w="3500" w:type="dxa"/><w:shd w:val="clear" w:color="auto" w:fill="FFFFFF"/><w:vAlign w:val="center"/></w:tcPr><w:p><w:pPr><w:spacing w:line="240" w:lineRule="auto"/><w:jc w:val="left"/></w:pPr><w:r><w:rPr><w:color w:val="152A35"/></w:rPr><w:t>/orchestrator-perf</w:t></w:r></w:p></w:tc><w:tc><w:tcPr><w:tcW w:w="6078" w:type="dxa"/><w:shd w:val="clear" w:color="auto" w:fill="FFFFFF"/><w:vAlign w:val="center"/></w:tcPr><w:p><w:pPr><w:spacing w:line="240" w:lineRule="auto"/><w:jc w:val="left"/></w:pPr><w:r><w:rPr><w:color w:val="152A35"/></w:rPr><w:t>Análisis de rendimiento: consultas lentas, N+1, allocations</w:t></w:r></w:p></w:tc></w:tr><w:tr><w:trPr><w:trHeight w:val="500"/><w:jc w:val="center"/></w:trPr><w:tc><w:tcPr><w:tcW w:w="3500" w:type="dxa"/><w:shd w:val="clear" w:color="auto" w:fill="F0F0F0"/><w:vAlign w:val="center"/></w:tcPr><w:p><w:pPr><w:spacing w:line="240" w:lineRule="auto"/><w:jc w:val="left"/></w:pPr><w:r><w:rPr><w:color w:val="152A35"/></w:rPr><w:t>/orchestrator-cobertura</w:t></w:r></w:p></w:tc><w:tc><w:tcPr><w:tcW w:w="6078" w:type="dxa"/><w:shd w:val="clear" w:color="auto" w:fill="F0F0F0"/><w:vAlign w:val="center"/></w:tcPr><w:p><w:pPr><w:spacing w:line="240" w:lineRule="auto"/><w:jc w:val="left"/></w:pPr><w:r><w:rPr><w:color w:val="152A35"/></w:rPr><w:t>Informe de cobertura de tests del proyecto</w:t></w:r></w:p></w:tc></w:tr></w:tbl><w:p/><w:p><w:pPr><w:pStyle w:val="Ttulo2"/></w:pPr><w:bookmarkStart w:id="11" w:name="_Toc236310414"/><w:r><w:t>Implementación y scaffolding</w:t></w:r><w:bookmarkEnd w:id="11"/></w:p><w:tbl><w:tblPr><w:tblStyle w:val="a"/><w:tblW w:w="9578" w:type="dxa"/><w:jc w:val="center"/><w:tblBorders><w:top w:val="single" w:sz="4" w:space="0" w:color="DDDDDD"/><w:left w:val="single" w:sz="4" w:space="0" w:color="DDDDDD"/><w:bottom w:val="single" w:sz="4" w:space="0" w:color="DDDDDD"/><w:right w:val="single" w:sz="4" w:space="0" w:color="DDDDDD"/><w:insideH w:val="single" w:sz="4" w:space="0" w:color="DDDDDD"/><w:insideV w:val="single" w:sz="4" w:space="0" w:color="DDDDDD"/></w:tblBorders><w:tblLayout w:type="fixed"/><w:tblLook w:val="04A0" w:firstRow="1" w:lastRow="0" w:firstColumn="1" w:lastColumn="0" w:noHBand="0" w:noVBand="1"/></w:tblPr><w:tblGrid><w:gridCol w:w="3500"/><w:gridCol w:w="6078"/></w:tblGrid><w:tr><w:trPr><w:trHeight w:val="500"/><w:jc w:val="center"/></w:trPr><w:tc><w:tcPr><w:tcW w:w="3500" w:type="dxa"/><w:shd w:val="clear" w:color="auto" w:fill="00F7BC"/><w:vAlign w:val="center"/></w:tcPr><w:p><w:pPr><w:spacing w:line="240" w:lineRule="auto"/><w:jc w:val="left"/></w:pPr><w:r><w:rPr><w:b/><w:bCs/><w:color w:val="152A35"/></w:rPr><w:t>COMANDO</w:t></w:r></w:p></w:tc><w:tc><w:tcPr><w:tcW w:w="6078" w:type="dxa"/><w:shd w:val="clear" w:color="auto" w:fill="00F7BC"/><w:vAlign w:val="center"/></w:tcPr><w:p><w:pPr><w:spacing w:line="240" w:lineRule="auto"/><w:jc w:val="left"/></w:pPr><w:r><w:rPr><w:b/><w:bCs/><w:color w:val="152A35"/></w:rPr><w:t>QUÉ HACE</w:t></w:r></w:p></w:tc></w:tr><w:tr><w:trPr><w:trHeight w:val="500"/><w:jc w:val="center"/></w:trPr><w:tc><w:tcPr><w:tcW w:w="3500" w:type="dxa"/><w:shd w:val="clear" w:color="auto" w:fill="FFFFFF"/><w:vAlign w:val="center"/></w:tcPr><w:p><w:pPr><w:spacing w:line="240" w:lineRule="auto"/><w:jc w:val="left"/></w:pPr><w:r><w:rPr><w:color w:val="152A35"/></w:rPr><w:t>/orchestrator-init [workspace_path]</w:t></w:r></w:p></w:tc><w:tc><w:tcPr><w:tcW w:w="6078" w:type="dxa"/><w:shd w:val="clear" w:color="auto" w:fill="FFFFFF"/><w:vAlign w:val="center"/></w:tcPr><w:p><w:pPr><w:spacing w:line="240" w:lineRule="auto"/><w:jc w:val="left"/></w:pPr><w:r><w:rPr><w:color w:val="152A35"/></w:rPr><w:t>Bootstrap de workspace ScacsWeb: crea config BD, carpetas y modelo inicial</w:t></w:r></w:p></w:tc></w:tr><w:tr><w:trPr><w:trHeight w:val="500"/><w:jc w:val="center"/></w:trPr><w:tc><w:tcPr><w:tcW w:w="3500" w:type="dxa"/><w:shd w:val="clear" w:color="auto" w:fill="F0F0F0"/><w:vAlign w:val="center"/></w:tcPr><w:p><w:pPr><w:spacing w:line="240" w:lineRule="auto"/><w:jc w:val="left"/></w:pPr><w:r><w:rPr><w:color w:val="152A35"/></w:rPr><w:t>/orchestrator-generar-dalc</w:t></w:r></w:p></w:tc><w:tc><w:tcPr><w:tcW w:w="6078" w:type="dxa"/><w:shd w:val="clear" w:color="auto" w:fill="F0F0F0"/><w:vAlign w:val="center"/></w:tcPr><w:p><w:pPr><w:spacing w:line="240" w:lineRule="auto"/><w:jc w:val="left"/></w:pPr><w:r><w:rPr><w:color w:val="152A35"/></w:rPr><w:t>Genera clases DALC para Oracle/SQL Server a partir del modelo BD</w:t></w:r></w:p></w:tc></w:tr><w:tr><w:trPr><w:trHeight w:val="500"/><w:jc w:val="center"/></w:trPr><w:tc><w:tcPr><w:tcW w:w="3500" w:type="dxa"/><w:shd w:val="clear" w:color="auto" w:fill="FFFFFF"/><w:vAlign w:val="center"/></w:tcPr><w:p><w:pPr><w:spacing w:line="240" w:lineRule="auto"/><w:jc w:val="left"/></w:pPr><w:r><w:rPr><w:color w:val="152A35"/></w:rPr><w:t>/orchestrator-migrar</w:t></w:r></w:p></w:tc><w:tc><w:tcPr><w:tcW w:w="6078" w:type="dxa"/><w:shd w:val="clear" w:color="auto" w:fill="FFFFFF"/><w:vAlign w:val="center"/></w:tcPr><w:p><w:pPr><w:spacing w:line="240" w:lineRule="auto"/><w:jc w:val="left"/></w:pPr><w:r><w:rPr><w:color w:val="152A35"/></w:rPr><w:t>Genera y aplica migraciones SQL desde el modelo JSON local</w:t></w:r></w:p></w:tc></w:tr><w:tr><w:trPr><w:trHeight w:val="500"/><w:jc w:val="center"/></w:trPr><w:tc><w:tcPr><w:tcW w:w="3500" w:type="dxa"/><w:shd w:val="clear" w:color="auto" w:fill="F0F0F0"/><w:vAlign w:val="center"/></w:tcPr><w:p><w:pPr><w:spacing w:line="240" w:lineRule="auto"/><w:jc w:val="left"/></w:pPr><w:r><w:rPr><w:color w:val="152A35"/></w:rPr><w:t>/orchestrator-seed</w:t></w:r></w:p></w:tc><w:tc><w:tcPr><w:tcW w:w="6078" w:type="dxa"/><w:shd w:val="clear" w:color="auto" w:fill="F0F0F0"/><w:vAlign w:val="center"/></w:tcPr><w:p><w:pPr><w:spacing w:line="240" w:lineRule="auto"/><w:jc w:val="left"/></w:pPr><w:r><w:rPr><w:color w:val="152A35"/></w:rPr><w:t>Genera scripts SQL de datos iniciales (seed) para tablas de catálogo</w:t></w:r></w:p></w:tc></w:tr><w:tr><w:trPr><w:trHeight w:val="500"/><w:jc w:val="center"/></w:trPr><w:tc><w:tcPr><w:tcW w:w="3500" w:type="dxa"/><w:shd w:val="clear" w:color="auto" w:fill="FFFFFF"/><w:vAlign w:val="center"/></w:tcPr><w:p><w:pPr><w:spacing w:line="240" w:lineRule="auto"/><w:jc w:val="left"/></w:pPr><w:r><w:rPr><w:color w:val="152A35"/></w:rPr><w:t>/orchestrator-format</w:t></w:r></w:p></w:tc><w:tc><w:tcPr><w:tcW w:w="6078" w:type="dxa"/><w:shd w:val="clear" w:color="auto" w:fill="FFFFFF"/><w:vAlign w:val="center"/></w:tcPr><w:p><w:pPr><w:spacing w:line="240" w:lineRule="auto"/><w:jc w:val="left"/></w:pPr><w:r><w:rPr><w:color w:val="152A35"/></w:rPr><w:t>Aplica formato y convenciones de estilo al código fuente</w:t></w:r></w:p></w:tc></w:tr><w:tr><w:trPr><w:trHeight w:val="500"/><w:jc w:val="center"/></w:trPr><w:tc><w:tcPr><w:tcW w:w="3500" w:type="dxa"/><w:shd w:val="clear" w:color="auto" w:fill="F0F0F0"/><w:vAlign w:val="center"/></w:tcPr><w:p><w:pPr><w:spacing w:line="240" w:lineRule="auto"/><w:jc w:val="left"/></w:pPr><w:r><w:rPr><w:color w:val="152A35"/></w:rPr><w:t>/orchestrator-rename</w:t></w:r></w:p></w:tc><w:tc><w:tcPr><w:tcW w:w="6078" w:type="dxa"/><w:shd w:val="clear" w:color="auto" w:fill="F0F0F0"/><w:vAlign w:val="center"/></w:tcPr><w:p><w:pPr><w:spacing w:line="240" w:lineRule="auto"/><w:jc w:val="left"/></w:pPr><w:r><w:rPr><w:color w:val="152A35"/></w:rPr><w:t>Renombra símbolo (clase, método, tabla) propagando todos los usos</w:t></w:r></w:p></w:tc></w:tr></w:tbl><w:p/><w:p><w:pPr><w:pStyle w:val="Ttulo2"/></w:pPr><w:bookmarkStart w:id="12" w:name="_Toc236310415"/><w:r><w:t>Validación y entorno</w:t></w:r><w:bookmarkEnd w:id="12"/></w:p><w:tbl><w:tblPr><w:tblStyle w:val="a"/><w:tblW w:w="9578" w:type="dxa"/><w:jc w:val="center"/><w:tblBorders><w:top w:val="single" w:sz="4" w:space="0" w:color="DDDDDD"/><w:left w:val="single" w:sz="4" w:space="0" w:color="DDDDDD"/><w:bottom w:val="single" w:sz="4" w:space="0" w:color="DDDDDD"/><w:right w:val="single" w:sz="4" w:space="0" w:color="DDDDDD"/><w:insideH w:val="single" w:sz="4" w:space="0" w:color="DDDDDD"/><w:insideV w:val="single" w:sz="4" w:space="0" w:color="DDDDDD"/></w:tblBorders><w:tblLayout w:type="fixed"/><w:tblLook w:val="04A0" w:firstRow="1" w:lastRow="0" w:firstColumn="1" w:lastColumn="0" w:noHBand="0" w:noVBand="1"/></w:tblPr><w:tblGrid><w:gridCol w:w="3500"/><w:gridCol w:w="6078"/></w:tblGrid><w:tr><w:trPr><w:trHeight w:val="500"/><w:jc w:val="center"/></w:trPr><w:tc><w:tcPr><w:tcW w:w="3500" w:type="dxa"/><w:shd w:val="clear" w:color="auto" w:fill="00F7BC"/><w:vAlign w:val="center"/></w:tcPr><w:p><w:pPr><w:spacing w:line="240" w:lineRule="auto"/><w:jc w:val="left"/></w:pPr><w:r><w:rPr><w:b/><w:bCs/><w:color w:val="152A35"/></w:rPr><w:t>COMANDO</w:t></w:r></w:p></w:tc><w:tc><w:tcPr><w:tcW w:w="6078" w:type="dxa"/><w:shd w:val="clear" w:color="auto" w:fill="00F7BC"/><w:vAlign w:val="center"/></w:tcPr><w:p><w:pPr><w:spacing w:line="240" w:lineRule="auto"/><w:jc w:val="left"/></w:pPr><w:r><w:rPr><w:b/><w:bCs/><w:color w:val="152A35"/></w:rPr><w:t>QUÉ HACE</w:t></w:r></w:p></w:tc></w:tr><w:tr><w:trPr><w:trHeight w:val="500"/><w:jc w:val="center"/></w:trPr><w:tc><w:tcPr><w:tcW w:w="3500" w:type="dxa"/><w:shd w:val="clear" w:color="auto" w:fill="FFFFFF"/><w:vAlign w:val="center"/></w:tcPr><w:p><w:pPr><w:spacing w:line="240" w:lineRule="auto"/><w:jc w:val="left"/></w:pPr><w:r><w:rPr><w:color w:val="152A35"/></w:rPr><w:t>/orchestrator-validator</w:t></w:r></w:p></w:tc><w:tc><w:tcPr><w:tcW w:w="6078" w:type="dxa"/><w:shd w:val="clear" w:color="auto" w:fill="FFFFFF"/><w:vAlign w:val="center"/></w:tcPr><w:p><w:pPr><w:spacing w:line="240" w:lineRule="auto"/><w:jc w:val="left"/></w:pPr><w:r><w:rPr><w:color w:val="152A35"/></w:rPr><w:t>Valida compilación y coherencia lógica del código</w:t></w:r></w:p></w:tc></w:tr><w:tr><w:trPr><w:trHeight w:val="500"/><w:jc w:val="center"/></w:trPr><w:tc><w:tcPr><w:tcW w:w="3500" w:type="dxa"/><w:shd w:val="clear" w:color="auto" w:fill="F0F0F0"/><w:vAlign w:val="center"/></w:tcPr><w:p><w:pPr><w:spacing w:line="240" w:lineRule="auto"/><w:jc w:val="left"/></w:pPr><w:r><w:rPr><w:color w:val="152A35"/></w:rPr><w:t>/orchestrator-validar-entorno</w:t></w:r></w:p></w:tc><w:tc><w:tcPr><w:tcW w:w="6078" w:type="dxa"/><w:shd w:val="clear" w:color="auto" w:fill="F0F0F0"/><w:vAlign w:val="center"/></w:tcPr><w:p><w:pPr><w:spacing w:line="240" w:lineRule="auto"/><w:jc w:val="left"/></w:pPr><w:r><w:rPr><w:color w:val="152A35"/></w:rPr><w:t>Verifica entorno: AIS, SVN, dotnet, modelo BD</w:t></w:r></w:p></w:tc></w:tr><w:tr><w:trPr><w:trHeight w:val="500"/><w:jc w:val="center"/></w:trPr><w:tc><w:tcPr><w:tcW w:w="3500" w:type="dxa"/><w:shd w:val="clear" w:color="auto" w:fill="FFFFFF"/><w:vAlign w:val="center"/></w:tcPr><w:p><w:pPr><w:spacing w:line="240" w:lineRule="auto"/><w:jc w:val="left"/></w:pPr><w:r><w:rPr><w:color w:val="152A35"/></w:rPr><w:t>/orchestrator-validar-req</w:t></w:r></w:p></w:tc><w:tc><w:tcPr><w:tcW w:w="6078" w:type="dxa"/><w:shd w:val="clear" w:color="auto" w:fill="FFFFFF"/><w:vAlign w:val="center"/></w:tcPr><w:p><w:pPr><w:spacing w:line="240" w:lineRule="auto"/><w:jc w:val="left"/></w:pPr><w:r><w:rPr><w:color w:val="152A35"/></w:rPr><w:t>Valida si un commit SVN/Git cumple el requerimiento de Mantis</w:t></w:r></w:p></w:tc></w:tr><w:tr><w:trPr><w:trHeight w:val="500"/><w:jc w:val="center"/></w:trPr><w:tc><w:tcPr><w:tcW w:w="3500" w:type="dxa"/><w:shd w:val="clear" w:color="auto" w:fill="F0F0F0"/><w:vAlign w:val="center"/></w:tcPr><w:p><w:pPr><w:spacing w:line="240" w:lineRule="auto"/><w:jc w:val="left"/></w:pPr><w:r><w:rPr><w:color w:val="152A35"/></w:rPr><w:t>/orchestrator-comparar-modelo</w:t></w:r></w:p></w:tc><w:tc><w:tcPr><w:tcW w:w="6078" w:type="dxa"/><w:shd w:val="clear" w:color="auto" w:fill="F0F0F0"/><w:vAlign w:val="center"/></w:tcPr><w:p><w:pPr><w:spacing w:line="240" w:lineRule="auto"/><w:jc w:val="left"/></w:pPr><w:r><w:rPr><w:color w:val="152A35"/></w:rPr><w:t>Compara modelo BD JSON local con esquema real de la BD</w:t></w:r></w:p></w:tc></w:tr><w:tr><w:trPr><w:trHeight w:val="500"/><w:jc w:val="center"/></w:trPr><w:tc><w:tcPr><w:tcW w:w="3500" w:type="dxa"/><w:shd w:val="clear" w:color="auto" w:fill="FFFFFF"/><w:vAlign w:val="center"/></w:tcPr><w:p><w:pPr><w:spacing w:line="240" w:lineRule="auto"/><w:jc w:val="left"/></w:pPr><w:r><w:rPr><w:color w:val="152A35"/></w:rPr><w:lastRenderedPageBreak/><w:t>/orchestrator-comparar-entornos</w:t></w:r></w:p></w:tc><w:tc><w:tcPr><w:tcW w:w="6078" w:type="dxa"/><w:shd w:val="clear" w:color="auto" w:fill="FFFFFF"/><w:vAlign w:val="center"/></w:tcPr><w:p><w:pPr><w:spacing w:line="240" w:lineRule="auto"/><w:jc w:val="left"/></w:pPr><w:r><w:rPr><w:color w:val="152A35"/></w:rPr><w:t>Compara configuración entre entornos (dev, pre, pro)</w:t></w:r></w:p></w:tc></w:tr><w:tr><w:trPr><w:trHeight w:val="500"/><w:jc w:val="center"/></w:trPr><w:tc><w:tcPr><w:tcW w:w="3500" w:type="dxa"/><w:shd w:val="clear" w:color="auto" w:fill="F0F0F0"/><w:vAlign w:val="center"/></w:tcPr><w:p><w:pPr><w:spacing w:line="240" w:lineRule="auto"/><w:jc w:val="left"/></w:pPr><w:r><w:rPr><w:color w:val="152A35"/></w:rPr><w:t>/orchestrator-sync-indexes</w:t></w:r></w:p></w:tc><w:tc><w:tcPr><w:tcW w:w="6078" w:type="dxa"/><w:shd w:val="clear" w:color="auto" w:fill="F0F0F0"/><w:vAlign w:val="center"/></w:tcPr><w:p><w:pPr><w:spacing w:line="240" w:lineRule="auto"/><w:jc w:val="left"/></w:pPr><w:r><w:rPr><w:color w:val="152A35"/></w:rPr><w:t>Sincroniza índices del modelo JSON con los índices reales de la BD</w:t></w:r></w:p></w:tc></w:tr></w:tbl><w:p/><w:p><w:pPr><w:pStyle w:val="Ttulo2"/></w:pPr><w:bookmarkStart w:id="13" w:name="_Toc236310416"/><w:r><w:t>Base de datos y modelo</w:t></w:r><w:bookmarkEnd w:id="13"/></w:p><w:tbl><w:tblPr><w:tblStyle w:val="a"/><w:tblW w:w="9578" w:type="dxa"/><w:jc w:val="center"/><w:tblBorders><w:top w:val="single" w:sz="4" w:space="0" w:color="DDDDDD"/><w:left w:val="single" w:sz="4" w:space="0" w:color="DDDDDD"/><w:bottom w:val="single" w:sz="4" w:space="0" w:color="DDDDDD"/><w:right w:val="single" w:sz="4" w:space="0" w:color="DDDDDD"/><w:insideH w:val="single" w:sz="4" w:space="0" w:color="DDDDDD"/><w:insideV w:val="single" w:sz="4" w:space="0" w:color="DDDDDD"/></w:tblBorders><w:tblLayout w:type="fixed"/><w:tblLook w:val="04A0" w:firstRow="1" w:lastRow="0" w:firstColumn="1" w:lastColumn="0" w:noHBand="0" w:noVBand="1"/></w:tblPr><w:tblGrid><w:gridCol w:w="3500"/><w:gridCol w:w="6078"/></w:tblGrid><w:tr><w:trPr><w:trHeight w:val="500"/><w:jc w:val="center"/></w:trPr><w:tc><w:tcPr><w:tcW w:w="3500" w:type="dxa"/><w:shd w:val="clear" w:color="auto" w:fill="00F7BC"/><w:vAlign w:val="center"/></w:tcPr><w:p><w:pPr><w:spacing w:line="240" w:lineRule="auto"/><w:jc w:val="left"/></w:pPr><w:r><w:rPr><w:b/><w:bCs/><w:color w:val="152A35"/></w:rPr><w:t>COMANDO</w:t></w:r></w:p></w:tc><w:tc><w:tcPr><w:tcW w:w="6078" w:type="dxa"/><w:shd w:val="clear" w:color="auto" w:fill="00F7BC"/><w:vAlign w:val="center"/></w:tcPr><w:p><w:pPr><w:spacing w:line="240" w:lineRule="auto"/><w:jc w:val="left"/></w:pPr><w:r><w:rPr><w:b/><w:bCs/><w:color w:val="152A35"/></w:rPr><w:t>QUÉ HACE</w:t></w:r></w:p></w:tc></w:tr><w:tr><w:trPr><w:trHeight w:val="500"/><w:jc w:val="center"/></w:trPr><w:tc><w:tcPr><w:tcW w:w="3500" w:type="dxa"/><w:shd w:val="clear" w:color="auto" w:fill="FFFFFF"/><w:vAlign w:val="center"/></w:tcPr><w:p><w:pPr><w:spacing w:line="240" w:lineRule="auto"/><w:jc w:val="left"/></w:pPr><w:r><w:rPr><w:color w:val="152A35"/></w:rPr><w:t>/orchestrator-schema [tabla]</w:t></w:r></w:p></w:tc><w:tc><w:tcPr><w:tcW w:w="6078" w:type="dxa"/><w:shd w:val="clear" w:color="auto" w:fill="FFFFFF"/><w:vAlign w:val="center"/></w:tcPr><w:p><w:pPr><w:spacing w:line="240" w:lineRule="auto"/><w:jc w:val="left"/></w:pPr><w:r><w:rPr><w:color w:val="152A35"/></w:rPr><w:t>Muestra esquema detallado de una tabla: columnas, tipos, PKs, índices</w:t></w:r></w:p></w:tc></w:tr><w:tr><w:trPr><w:trHeight w:val="500"/><w:jc w:val="center"/></w:trPr><w:tc><w:tcPr><w:tcW w:w="3500" w:type="dxa"/><w:shd w:val="clear" w:color="auto" w:fill="F0F0F0"/><w:vAlign w:val="center"/></w:tcPr><w:p><w:pPr><w:spacing w:line="240" w:lineRule="auto"/><w:jc w:val="left"/></w:pPr><w:r><w:rPr><w:color w:val="152A35"/></w:rPr><w:t>/orchestrator-erd</w:t></w:r></w:p></w:tc><w:tc><w:tcPr><w:tcW w:w="6078" w:type="dxa"/><w:shd w:val="clear" w:color="auto" w:fill="F0F0F0"/><w:vAlign w:val="center"/></w:tcPr><w:p><w:pPr><w:spacing w:line="240" w:lineRule="auto"/><w:jc w:val="left"/></w:pPr><w:r><w:rPr><w:color w:val="152A35"/></w:rPr><w:t>Genera diagrama ERD del modelo BD en formato Mermaid</w:t></w:r></w:p></w:tc></w:tr><w:tr><w:trPr><w:trHeight w:val="500"/><w:jc w:val="center"/></w:trPr><w:tc><w:tcPr><w:tcW w:w="3500" w:type="dxa"/><w:shd w:val="clear" w:color="auto" w:fill="FFFFFF"/><w:vAlign w:val="center"/></w:tcPr><w:p><w:pPr><w:spacing w:line="240" w:lineRule="auto"/><w:jc w:val="left"/></w:pPr><w:r><w:rPr><w:color w:val="152A35"/></w:rPr><w:t>/orchestrator-db-env</w:t></w:r></w:p></w:tc><w:tc><w:tcPr><w:tcW w:w="6078" w:type="dxa"/><w:shd w:val="clear" w:color="auto" w:fill="FFFFFF"/><w:vAlign w:val="center"/></w:tcPr><w:p><w:pPr><w:spacing w:line="240" w:lineRule="auto"/><w:jc w:val="left"/></w:pPr><w:r><w:rPr><w:color w:val="152A35"/></w:rPr><w:t>Muestra configuración de conexión BD del workspace activo</w:t></w:r></w:p></w:tc></w:tr></w:tbl><w:p/><w:p><w:pPr><w:pStyle w:val="Ttulo2"/></w:pPr><w:bookmarkStart w:id="14" w:name="_Toc236310417"/><w:r><w:t>Control de versiones (SVN / Git)</w:t></w:r><w:bookmarkEnd w:id="14"/></w:p><w:tbl><w:tblPr><w:tblStyle w:val="a"/><w:tblW w:w="9578" w:type="dxa"/><w:jc w:val="center"/><w:tblBorders><w:top w:val="single" w:sz="4" w:space="0" w:color="DDDDDD"/><w:left w:val="single" w:sz="4" w:space="0" w:color="DDDDDD"/><w:bottom w:val="single" w:sz="4" w:space="0" w:color="DDDDDD"/><w:right w:val="single" w:sz="4" w:space="0" w:color="DDDDDD"/><w:insideH w:val="single" w:sz="4" w:space="0" w:color="DDDDDD"/><w:insideV w:val="single" w:sz="4" w:space="0" w:color="DDDDDD"/></w:tblBorders><w:tblLayout w:type="fixed"/><w:tblLook w:val="04A0" w:firstRow="1" w:lastRow="0" w:firstColumn="1" w:lastColumn="0" w:noHBand="0" w:noVBand="1"/></w:tblPr><w:tblGrid><w:gridCol w:w="3500"/><w:gridCol w:w="6078"/></w:tblGrid><w:tr><w:trPr><w:trHeight w:val="500"/><w:jc w:val="center"/></w:trPr><w:tc><w:tcPr><w:tcW w:w="3500" w:type="dxa"/><w:shd w:val="clear" w:color="auto" w:fill="00F7BC"/><w:vAlign w:val="center"/></w:tcPr><w:p><w:pPr><w:spacing w:line="240" w:lineRule="auto"/><w:jc w:val="left"/></w:pPr><w:r><w:rPr><w:b/><w:bCs/><w:color w:val="152A35"/></w:rPr><w:t>COMANDO</w:t></w:r></w:p></w:tc><w:tc><w:tcPr><w:tcW w:w="6078" w:type="dxa"/><w:shd w:val="clear" w:color="auto" w:fill="00F7BC"/><w:vAlign w:val="center"/></w:tcPr><w:p><w:pPr><w:spacing w:line="240" w:lineRule="auto"/><w:jc w:val="left"/></w:pPr><w:r><w:rPr><w:b/><w:bCs/><w:color w:val="152A35"/></w:rPr><w:t>QUÉ HACE</w:t></w:r></w:p></w:tc></w:tr><w:tr><w:trPr><w:trHeight w:val="500"/><w:jc w:val="center"/></w:trPr><w:tc><w:tcPr><w:tcW w:w="3500" w:type="dxa"/><w:shd w:val="clear" w:color="auto" w:fill="FFFFFF"/><w:vAlign w:val="center"/></w:tcPr><w:p><w:pPr><w:spacing w:line="240" w:lineRule="auto"/><w:jc w:val="left"/></w:pPr><w:r><w:rPr><w:color w:val="152A35"/></w:rPr><w:t>/orchestrator-historial</w:t></w:r></w:p></w:tc><w:tc><w:tcPr><w:tcW w:w="6078" w:type="dxa"/><w:shd w:val="clear" w:color="auto" w:fill="FFFFFF"/><w:vAlign w:val="center"/></w:tcPr><w:p><w:pPr><w:spacing w:line="240" w:lineRule="auto"/><w:jc w:val="left"/></w:pPr><w:r><w:rPr><w:color w:val="152A35"/></w:rPr><w:t>Historial SVN/Git con autor, fecha y mensaje por revisión</w:t></w:r></w:p></w:tc></w:tr><w:tr><w:trPr><w:trHeight w:val="500"/><w:jc w:val="center"/></w:trPr><w:tc><w:tcPr><w:tcW w:w="3500" w:type="dxa"/><w:shd w:val="clear" w:color="auto" w:fill="F0F0F0"/><w:vAlign w:val="center"/></w:tcPr><w:p><w:pPr><w:spacing w:line="240" w:lineRule="auto"/><w:jc w:val="left"/></w:pPr><w:r><w:rPr><w:color w:val="152A35"/></w:rPr><w:t>/orchestrator-diff</w:t></w:r></w:p></w:tc><w:tc><w:tcPr><w:tcW w:w="6078" w:type="dxa"/><w:shd w:val="clear" w:color="auto" w:fill="F0F0F0"/><w:vAlign w:val="center"/></w:tcPr><w:p><w:pPr><w:spacing w:line="240" w:lineRule="auto"/><w:jc w:val="left"/></w:pPr><w:r><w:rPr><w:color w:val="152A35"/></w:rPr><w:t>Diff del workspace actual o de una revisión concreta</w:t></w:r></w:p></w:tc></w:tr><w:tr><w:trPr><w:trHeight w:val="500"/><w:jc w:val="center"/></w:trPr><w:tc><w:tcPr><w:tcW w:w="3500" w:type="dxa"/><w:shd w:val="clear" w:color="auto" w:fill="FFFFFF"/><w:vAlign w:val="center"/></w:tcPr><w:p><w:pPr><w:spacing w:line="240" w:lineRule="auto"/><w:jc w:val="left"/></w:pPr><w:r><w:rPr><w:color w:val="152A35"/></w:rPr><w:t>/orchestrator-commit</w:t></w:r></w:p></w:tc><w:tc><w:tcPr><w:tcW w:w="6078" w:type="dxa"/><w:shd w:val="clear" w:color="auto" w:fill="FFFFFF"/><w:vAlign w:val="center"/></w:tcPr><w:p><w:pPr><w:spacing w:line="240" w:lineRule="auto"/><w:jc w:val="left"/></w:pPr><w:r><w:rPr><w:color w:val="152A35"/></w:rPr><w:t>Prepara y ejecuta commit SVN/Git con mensaje estructurado</w:t></w:r></w:p></w:tc></w:tr><w:tr><w:trPr><w:trHeight w:val="500"/><w:jc w:val="center"/></w:trPr><w:tc><w:tcPr><w:tcW w:w="3500" w:type="dxa"/><w:shd w:val="clear" w:color="auto" w:fill="F0F0F0"/><w:vAlign w:val="center"/></w:tcPr><w:p><w:pPr><w:spacing w:line="240" w:lineRule="auto"/><w:jc w:val="left"/></w:pPr><w:r><w:rPr><w:color w:val="152A35"/></w:rPr><w:t>/orchestrator-deshacer</w:t></w:r></w:p></w:tc><w:tc><w:tcPr><w:tcW w:w="6078" w:type="dxa"/><w:shd w:val="clear" w:color="auto" w:fill="F0F0F0"/><w:vAlign w:val="center"/></w:tcPr><w:p><w:pPr><w:spacing w:line="240" w:lineRule="auto"/><w:jc w:val="left"/></w:pPr><w:r><w:rPr><w:color w:val="152A35"/></w:rPr><w:t>Deshace cambios locales o revierte una revisión SVN/Git</w:t></w:r></w:p></w:tc></w:tr><w:tr><w:trPr><w:trHeight w:val="500"/><w:jc w:val="center"/></w:trPr><w:tc><w:tcPr><w:tcW w:w="3500" w:type="dxa"/><w:shd w:val="clear" w:color="auto" w:fill="FFFFFF"/><w:vAlign w:val="center"/></w:tcPr><w:p><w:pPr><w:spacing w:line="240" w:lineRule="auto"/><w:jc w:val="left"/></w:pPr><w:r><w:rPr><w:color w:val="152A35"/></w:rPr><w:t>/orchestrator-release-notes</w:t></w:r></w:p></w:tc><w:tc><w:tcPr><w:tcW w:w="6078" w:type="dxa"/><w:shd w:val="clear" w:color="auto" w:fill="FFFFFF"/><w:vAlign w:val="center"/></w:tcPr><w:p><w:pPr><w:spacing w:line="240" w:lineRule="auto"/><w:jc w:val="left"/></w:pPr><w:r><w:rPr><w:color w:val="152A35"/></w:rPr><w:t>Genera release notes a partir del historial de commits</w:t></w:r></w:p></w:tc></w:tr></w:tbl><w:p/><w:p><w:pPr><w:pStyle w:val="Ttulo2"/></w:pPr><w:bookmarkStart w:id="15" w:name="_Toc236310418"/><w:r><w:t>Arquitectura y documentación</w:t></w:r><w:bookmarkEnd w:id="15"/></w:p><w:tbl><w:tblPr><w:tblStyle w:val="a"/><w:tblW w:w="9578" w:type="dxa"/><w:jc w:val="center"/><w:tblBorders><w:top w:val="single" w:sz="4" w:space="0" w:color="DDDDDD"/><w:left w:val="single" w:sz="4" w:space="0" w:color="DDDDDD"/><w:bottom w:val="single" w:sz="4" w:space="0" w:color="DDDDDD"/><w:right w:val="single" w:sz="4" w:space="0" w:color="DDDDDD"/><w:insideH w:val="single" w:sz="4" w:space="0" w:color="DDDDDD"/><w:insideV w:val="single" w:sz="4" w:space="0" w:color="DDDDDD"/></w:tblBorders><w:tblLayout w:type="fixed"/><w:tblLook w:val="04A0" w:firstRow="1" w:lastRow="0" w:firstColumn="1" w:lastColumn="0" w:noHBand="0" w:noVBand="1"/></w:tblPr><w:tblGrid><w:gridCol w:w="3500"/><w:gridCol w:w="6078"/></w:tblGrid><w:tr><w:trPr><w:trHeight w:val="500"/><w:jc w:val="center"/></w:trPr><w:tc><w:tcPr><w:tcW w:w="3500" w:type="dxa"/><w:shd w:val="clear" w:color="auto" w:fill="00F7BC"/><w:vAlign w:val="center"/></w:tcPr><w:p><w:pPr><w:spacing w:line="240" w:lineRule="auto"/><w:jc w:val="left"/></w:pPr><w:r><w:rPr><w:b/><w:bCs/><w:color w:val="152A35"/></w:rPr><w:t>COMANDO</w:t></w:r></w:p></w:tc><w:tc><w:tcPr><w:tcW w:w="6078" w:type="dxa"/><w:shd w:val="clear" w:color="auto" w:fill="00F7BC"/><w:vAlign w:val="center"/></w:tcPr><w:p><w:pPr><w:spacing w:line="240" w:lineRule="auto"/><w:jc w:val="left"/></w:pPr><w:r><w:rPr><w:b/><w:bCs/><w:color w:val="152A35"/></w:rPr><w:t>QUÉ HACE</w:t></w:r></w:p></w:tc></w:tr><w:tr><w:trPr><w:trHeight w:val="500"/><w:jc w:val="center"/></w:trPr><w:tc><w:tcPr><w:tcW w:w="3500" w:type="dxa"/><w:shd w:val="clear" w:color="auto" w:fill="FFFFFF"/><w:vAlign w:val="center"/></w:tcPr><w:p><w:pPr><w:spacing w:line="240" w:lineRule="auto"/><w:jc w:val="left"/></w:pPr><w:r><w:rPr><w:color w:val="152A35"/></w:rPr><w:lastRenderedPageBreak/><w:t>/orchestrator-estructura</w:t></w:r></w:p></w:tc><w:tc><w:tcPr><w:tcW w:w="6078" w:type="dxa"/><w:shd w:val="clear" w:color="auto" w:fill="FFFFFF"/><w:vAlign w:val="center"/></w:tcPr><w:p><w:pPr><w:spacing w:line="240" w:lineRule="auto"/><w:jc w:val="left"/></w:pPr><w:r><w:rPr><w:color w:val="152A35"/></w:rPr><w:t>Visualiza capas y dependencias de una solución ScacsWeb</w:t></w:r></w:p></w:tc></w:tr><w:tr><w:trPr><w:trHeight w:val="500"/><w:jc w:val="center"/></w:trPr><w:tc><w:tcPr><w:tcW w:w="3500" w:type="dxa"/><w:shd w:val="clear" w:color="auto" w:fill="F0F0F0"/><w:vAlign w:val="center"/></w:tcPr><w:p><w:pPr><w:spacing w:line="240" w:lineRule="auto"/><w:jc w:val="left"/></w:pPr><w:r><w:rPr><w:color w:val="152A35"/></w:rPr><w:t>/orchestrator-deps</w:t></w:r></w:p></w:tc><w:tc><w:tcPr><w:tcW w:w="6078" w:type="dxa"/><w:shd w:val="clear" w:color="auto" w:fill="F0F0F0"/><w:vAlign w:val="center"/></w:tcPr><w:p><w:pPr><w:spacing w:line="240" w:lineRule="auto"/><w:jc w:val="left"/></w:pPr><w:r><w:rPr><w:color w:val="152A35"/></w:rPr><w:t>Mapa de dependencias entre proyectos de una solución</w:t></w:r></w:p></w:tc></w:tr><w:tr><w:trPr><w:trHeight w:val="500"/><w:jc w:val="center"/></w:trPr><w:tc><w:tcPr><w:tcW w:w="3500" w:type="dxa"/><w:shd w:val="clear" w:color="auto" w:fill="FFFFFF"/><w:vAlign w:val="center"/></w:tcPr><w:p><w:pPr><w:spacing w:line="240" w:lineRule="auto"/><w:jc w:val="left"/></w:pPr><w:r><w:rPr><w:color w:val="152A35"/></w:rPr><w:t>/orchestrator-impacto</w:t></w:r></w:p></w:tc><w:tc><w:tcPr><w:tcW w:w="6078" w:type="dxa"/><w:shd w:val="clear" w:color="auto" w:fill="FFFFFF"/><w:vAlign w:val="center"/></w:tcPr><w:p><w:pPr><w:spacing w:line="240" w:lineRule="auto"/><w:jc w:val="left"/></w:pPr><w:r><w:rPr><w:color w:val="152A35"/></w:rPr><w:t>Mapa de impacto de un cambio propuesto: qué puede romperse</w:t></w:r></w:p></w:tc></w:tr><w:tr><w:trPr><w:trHeight w:val="500"/><w:jc w:val="center"/></w:trPr><w:tc><w:tcPr><w:tcW w:w="3500" w:type="dxa"/><w:shd w:val="clear" w:color="auto" w:fill="F0F0F0"/><w:vAlign w:val="center"/></w:tcPr><w:p><w:pPr><w:spacing w:line="240" w:lineRule="auto"/><w:jc w:val="left"/></w:pPr><w:r><w:rPr><w:color w:val="152A35"/></w:rPr><w:t>/orchestrator-explicar [símbolo|fichero]</w:t></w:r></w:p></w:tc><w:tc><w:tcPr><w:tcW w:w="6078" w:type="dxa"/><w:shd w:val="clear" w:color="auto" w:fill="F0F0F0"/><w:vAlign w:val="center"/></w:tcPr><w:p><w:pPr><w:spacing w:line="240" w:lineRule="auto"/><w:jc w:val="left"/></w:pPr><w:r><w:rPr><w:color w:val="152A35"/></w:rPr><w:t>Explica en detalle una clase, método o fichero</w:t></w:r></w:p></w:tc></w:tr><w:tr><w:trPr><w:trHeight w:val="500"/><w:jc w:val="center"/></w:trPr><w:tc><w:tcPr><w:tcW w:w="3500" w:type="dxa"/><w:shd w:val="clear" w:color="auto" w:fill="FFFFFF"/><w:vAlign w:val="center"/></w:tcPr><w:p><w:pPr><w:spacing w:line="240" w:lineRule="auto"/><w:jc w:val="left"/></w:pPr><w:r><w:rPr><w:color w:val="152A35"/></w:rPr><w:t>/orchestrator-doc</w:t></w:r></w:p></w:tc><w:tc><w:tcPr><w:tcW w:w="6078" w:type="dxa"/><w:shd w:val="clear" w:color="auto" w:fill="FFFFFF"/><w:vAlign w:val="center"/></w:tcPr><w:p><w:pPr><w:spacing w:line="240" w:lineRule="auto"/><w:jc w:val="left"/></w:pPr><w:r><w:rPr><w:color w:val="152A35"/></w:rPr><w:t>Genera documentación técnica de un módulo o clase</w:t></w:r></w:p></w:tc></w:tr><w:tr><w:trPr><w:trHeight w:val="500"/><w:jc w:val="center"/></w:trPr><w:tc><w:tcPr><w:tcW w:w="3500" w:type="dxa"/><w:shd w:val="clear" w:color="auto" w:fill="F0F0F0"/><w:vAlign w:val="center"/></w:tcPr><w:p><w:pPr><w:spacing w:line="240" w:lineRule="auto"/><w:jc w:val="left"/></w:pPr><w:r><w:rPr><w:color w:val="152A35"/></w:rPr><w:t>/orchestrator-doc-drift</w:t></w:r></w:p></w:tc><w:tc><w:tcPr><w:tcW w:w="6078" w:type="dxa"/><w:shd w:val="clear" w:color="auto" w:fill="F0F0F0"/><w:vAlign w:val="center"/></w:tcPr><w:p><w:pPr><w:spacing w:line="240" w:lineRule="auto"/><w:jc w:val="left"/></w:pPr><w:r><w:rPr><w:color w:val="152A35"/></w:rPr><w:t>Detecta divergencia entre documentación y código actual</w:t></w:r></w:p></w:tc></w:tr><w:tr><w:trPr><w:trHeight w:val="500"/><w:jc w:val="center"/></w:trPr><w:tc><w:tcPr><w:tcW w:w="3500" w:type="dxa"/><w:shd w:val="clear" w:color="auto" w:fill="FFFFFF"/><w:vAlign w:val="center"/></w:tcPr><w:p><w:pPr><w:spacing w:line="240" w:lineRule="auto"/><w:jc w:val="left"/></w:pPr><w:r><w:rPr><w:color w:val="152A35"/></w:rPr><w:t>/orchestrator-scacs-docs</w:t></w:r></w:p></w:tc><w:tc><w:tcPr><w:tcW w:w="6078" w:type="dxa"/><w:shd w:val="clear" w:color="auto" w:fill="FFFFFF"/><w:vAlign w:val="center"/></w:tcPr><w:p><w:pPr><w:spacing w:line="240" w:lineRule="auto"/><w:jc w:val="left"/></w:pPr><w:r><w:rPr><w:color w:val="152A35"/></w:rPr><w:t>Consulta la base de conocimiento ScacsWeb integrada</w:t></w:r></w:p></w:tc></w:tr><w:tr><w:trPr><w:trHeight w:val="500"/><w:jc w:val="center"/></w:trPr><w:tc><w:tcPr><w:tcW w:w="3500" w:type="dxa"/><w:shd w:val="clear" w:color="auto" w:fill="F0F0F0"/><w:vAlign w:val="center"/></w:tcPr><w:p><w:pPr><w:spacing w:line="240" w:lineRule="auto"/><w:jc w:val="left"/></w:pPr><w:r><w:rPr><w:color w:val="152A35"/></w:rPr><w:t>/orchestrator-dashboard</w:t></w:r></w:p></w:tc><w:tc><w:tcPr><w:tcW w:w="6078" w:type="dxa"/><w:shd w:val="clear" w:color="auto" w:fill="F0F0F0"/><w:vAlign w:val="center"/></w:tcPr><w:p><w:pPr><w:spacing w:line="240" w:lineRule="auto"/><w:jc w:val="left"/></w:pPr><w:r><w:rPr><w:color w:val="152A35"/></w:rPr><w:t>Panel resumen del estado del workspace: build, tests, cobertura</w:t></w:r></w:p></w:tc></w:tr></w:tbl><w:p/><w:p><w:pPr><w:pStyle w:val="Ttulo2"/></w:pPr><w:bookmarkStart w:id="16" w:name="_Toc236310419"/><w:r><w:t>Tests</w:t></w:r><w:bookmarkEnd w:id="16"/></w:p><w:tbl><w:tblPr><w:tblStyle w:val="a"/><w:tblW w:w="9578" w:type="dxa"/><w:jc w:val="center"/><w:tblBorders><w:top w:val="single" w:sz="4" w:space="0" w:color="DDDDDD"/><w:left w:val="single" w:sz="4" w:space="0" w:color="DDDDDD"/><w:bottom w:val="single" w:sz="4" w:space="0" w:color="DDDDDD"/><w:right w:val="single" w:sz="4" w:space="0" w:color="DDDDDD"/><w:insideH w:val="single" w:sz="4" w:space="0" w:color="DDDDDD"/><w:insideV w:val="single" w:sz="4" w:space="0" w:color="DDDDDD"/></w:tblBorders><w:tblLayout w:type="fixed"/><w:tblLook w:val="04A0" w:firstRow="1" w:lastRow="0" w:firstColumn="1" w:lastColumn="0" w:noHBand="0" w:noVBand="1"/></w:tblPr><w:tblGrid><w:gridCol w:w="3500"/><w:gridCol w:w="6078"/></w:tblGrid><w:tr><w:trPr><w:trHeight w:val="500"/><w:jc w:val="center"/></w:trPr><w:tc><w:tcPr><w:tcW w:w="3500" w:type="dxa"/><w:shd w:val="clear" w:color="auto" w:fill="00F7BC"/><w:vAlign w:val="center"/></w:tcPr><w:p><w:pPr><w:spacing w:line="240" w:lineRule="auto"/><w:jc w:val="left"/></w:pPr><w:r><w:rPr><w:b/><w:bCs/><w:color w:val="152A35"/></w:rPr><w:t>COMANDO</w:t></w:r></w:p></w:tc><w:tc><w:tcPr><w:tcW w:w="6078" w:type="dxa"/><w:shd w:val="clear" w:color="auto" w:fill="00F7BC"/><w:vAlign w:val="center"/></w:tcPr><w:p><w:pPr><w:spacing w:line="240" w:lineRule="auto"/><w:jc w:val="left"/></w:pPr><w:r><w:rPr><w:b/><w:bCs/><w:color w:val="152A35"/></w:rPr><w:t>QUÉ HACE</w:t></w:r></w:p></w:tc></w:tr><w:tr><w:trPr><w:trHeight w:val="500"/><w:jc w:val="center"/></w:trPr><w:tc><w:tcPr><w:tcW w:w="3500" w:type="dxa"/><w:shd w:val="clear" w:color="auto" w:fill="FFFFFF"/><w:vAlign w:val="center"/></w:tcPr><w:p><w:pPr><w:spacing w:line="240" w:lineRule="auto"/><w:jc w:val="left"/></w:pPr><w:r><w:rPr><w:color w:val="152A35"/></w:rPr><w:t>/orchestrator-test</w:t></w:r></w:p></w:tc><w:tc><w:tcPr><w:tcW w:w="6078" w:type="dxa"/><w:shd w:val="clear" w:color="auto" w:fill="FFFFFF"/><w:vAlign w:val="center"/></w:tcPr><w:p><w:pPr><w:spacing w:line="240" w:lineRule="auto"/><w:jc w:val="left"/></w:pPr><w:r><w:rPr><w:color w:val="152A35"/></w:rPr><w:t>Ejecuta la suite de tests del proyecto</w:t></w:r></w:p></w:tc></w:tr><w:tr><w:trPr><w:trHeight w:val="500"/><w:jc w:val="center"/></w:trPr><w:tc><w:tcPr><w:tcW w:w="3500" w:type="dxa"/><w:shd w:val="clear" w:color="auto" w:fill="F0F0F0"/><w:vAlign w:val="center"/></w:tcPr><w:p><w:pPr><w:spacing w:line="240" w:lineRule="auto"/><w:jc w:val="left"/></w:pPr><w:r><w:rPr><w:color w:val="152A35"/></w:rPr><w:t>/orchestrator-crear-tests</w:t></w:r></w:p></w:tc><w:tc><w:tcPr><w:tcW w:w="6078" w:type="dxa"/><w:shd w:val="clear" w:color="auto" w:fill="F0F0F0"/><w:vAlign w:val="center"/></w:tcPr><w:p><w:pPr><w:spacing w:line="240" w:lineRule="auto"/><w:jc w:val="left"/></w:pPr><w:r><w:rPr><w:color w:val="152A35"/></w:rPr><w:t>Genera tests unitarios para una clase o método concreto</w:t></w:r></w:p></w:tc></w:tr></w:tbl><w:p/><w:p><w:pPr><w:pStyle w:val="Ttulo2"/></w:pPr><w:bookmarkStart w:id="17" w:name="_Toc236310420"/><w:r><w:t>Integración con Mantis</w:t></w:r><w:bookmarkEnd w:id="17"/></w:p><w:tbl><w:tblPr><w:tblStyle w:val="a"/><w:tblW w:w="9578" w:type="dxa"/><w:jc w:val="center"/><w:tblBorders><w:top w:val="single" w:sz="4" w:space="0" w:color="DDDDDD"/><w:left w:val="single" w:sz="4" w:space="0" w:color="DDDDDD"/><w:bottom w:val="single" w:sz="4" w:space="0" w:color="DDDDDD"/><w:right w:val="single" w:sz="4" w:space="0" w:color="DDDDDD"/><w:insideH w:val="single" w:sz="4" w:space="0" w:color="DDDDDD"/><w:insideV w:val="single" w:sz="4" w:space="0" w:color="DDDDDD"/></w:tblBorders><w:tblLayout w:type="fixed"/><w:tblLook w:val="04A0" w:firstRow="1" w:lastRow="0" w:firstColumn="1" w:lastColumn="0" w:noHBand="0" w:noVBand="1"/></w:tblPr><w:tblGrid><w:gridCol w:w="3500"/><w:gridCol w:w="6078"/></w:tblGrid><w:tr><w:trPr><w:trHeight w:val="500"/><w:jc w:val="center"/></w:trPr><w:tc><w:tcPr><w:tcW w:w="3500" w:type="dxa"/><w:shd w:val="clear" w:color="auto" w:fill="00F7BC"/><w:vAlign w:val="center"/></w:tcPr><w:p><w:pPr><w:spacing w:line="240" w:lineRule="auto"/><w:jc w:val="left"/></w:pPr><w:r><w:rPr><w:b/><w:bCs/><w:color w:val="152A35"/></w:rPr><w:t>COMANDO</w:t></w:r></w:p></w:tc><w:tc><w:tcPr><w:tcW w:w="6078" w:type="dxa"/><w:shd w:val="clear" w:color="auto" w:fill="00F7BC"/><w:vAlign w:val="center"/></w:tcPr><w:p><w:pPr><w:spacing w:line="240" w:lineRule="auto"/><w:jc w:val="left"/></w:pPr><w:r><w:rPr><w:b/><w:bCs/><w:color w:val="152A35"/></w:rPr><w:t>QUÉ HACE</w:t></w:r></w:p></w:tc></w:tr><w:tr><w:trPr><w:trHeight w:val="500"/><w:jc w:val="center"/></w:trPr><w:tc><w:tcPr><w:tcW w:w="3500" w:type="dxa"/><w:shd w:val="clear" w:color="auto" w:fill="FFFFFF"/><w:vAlign w:val="center"/></w:tcPr><w:p><w:pPr><w:spacing w:line="240" w:lineRule="auto"/><w:jc w:val="left"/></w:pPr><w:r><w:rPr><w:color w:val="152A35"/></w:rPr><w:t>/orchestrator-mantis #NNNN</w:t></w:r></w:p></w:tc><w:tc><w:tcPr><w:tcW w:w="6078" w:type="dxa"/><w:shd w:val="clear" w:color="auto" w:fill="FFFFFF"/><w:vAlign w:val="center"/></w:tcPr><w:p><w:pPr><w:spacing w:line="240" w:lineRule="auto"/><w:jc w:val="left"/></w:pPr><w:r><w:rPr><w:color w:val="152A35"/></w:rPr><w:t>Consulta un issue de MantisBT por número</w:t></w:r></w:p></w:tc></w:tr><w:tr><w:trPr><w:trHeight w:val="500"/><w:jc w:val="center"/></w:trPr><w:tc><w:tcPr><w:tcW w:w="3500" w:type="dxa"/><w:shd w:val="clear" w:color="auto" w:fill="F0F0F0"/><w:vAlign w:val="center"/></w:tcPr><w:p><w:pPr><w:spacing w:line="240" w:lineRule="auto"/><w:jc w:val="left"/></w:pPr><w:r><w:rPr><w:color w:val="152A35"/></w:rPr><w:t>/orchestrator-mantis proyecto NNNN</w:t></w:r></w:p></w:tc><w:tc><w:tcPr><w:tcW w:w="6078" w:type="dxa"/><w:shd w:val="clear" w:color="auto" w:fill="F0F0F0"/><w:vAlign w:val="center"/></w:tcPr><w:p><w:pPr><w:spacing w:line="240" w:lineRule="auto"/><w:jc w:val="left"/></w:pPr><w:r><w:rPr><w:color w:val="152A35"/></w:rPr><w:t>Lista issues de un proyecto de MantisBT</w:t></w:r></w:p></w:tc></w:tr></w:tbl><w:p/><w:p><w:pPr><w:pStyle w:val="Ttulo2"/></w:pPr><w:bookmarkStart w:id="18" w:name="_Toc236310421"/><w:r><w:t>Estadísticas y utilidades</w:t></w:r><w:bookmarkEnd w:id="18"/></w:p><w:tbl><w:tblPr><w:tblStyle w:val="a"/><w:tblW w:w="9578" w:type="dxa"/><w:jc w:val="center"/><w:tblBorders><w:top w:val="single" w:sz="4" w:space="0" w:color="DDDDDD"/><w:left w:val="single" w:sz="4" w:space="0" w:color="DDDDDD"/><w:bottom w:val="single" w:sz="4" w:space="0" w:color="DDDDDD"/><w:right w:val="single" w:sz="4" w:space="0" w:color="DDDDDD"/><w:insideH w:val="single" w:sz="4" w:space="0" w:color="DDDDDD"/><w:insideV w:val="single" w:sz="4" w:space="0" w:color="DDDDDD"/></w:tblBorders><w:tblLayout w:type="fixed"/><w:tblLook w:val="04A0" w:firstRow="1" w:lastRow="0" w:firstColumn="1" w:lastColumn="0" w:noHBand="0" w:noVBand="1"/></w:tblPr><w:tblGrid><w:gridCol w:w="3500"/><w:gridCol w:w="6078"/></w:tblGrid><w:tr><w:trPr><w:trHeight w:val="500"/><w:jc w:val="center"/></w:trPr><w:tc><w:tcPr><w:tcW w:w="3500" w:type="dxa"/><w:shd w:val="clear" w:color="auto" w:fill="00F7BC"/><w:vAlign w:val="center"/></w:tcPr><w:p><w:pPr><w:spacing w:line="240" w:lineRule="auto"/><w:jc w:val="left"/></w:pPr><w:r><w:rPr><w:b/><w:bCs/><w:color w:val="152A35"/></w:rPr><w:lastRenderedPageBreak/><w:t>COMANDO</w:t></w:r></w:p></w:tc><w:tc><w:tcPr><w:tcW w:w="6078" w:type="dxa"/><w:shd w:val="clear" w:color="auto" w:fill="00F7BC"/><w:vAlign w:val="center"/></w:tcPr><w:p><w:pPr><w:spacing w:line="240" w:lineRule="auto"/><w:jc w:val="left"/></w:pPr><w:r><w:rPr><w:b/><w:bCs/><w:color w:val="152A35"/></w:rPr><w:t>QUÉ HACE</w:t></w:r></w:p></w:tc></w:tr><w:tr><w:trPr><w:trHeight w:val="500"/><w:jc w:val="center"/></w:trPr><w:tc><w:tcPr><w:tcW w:w="3500" w:type="dxa"/><w:shd w:val="clear" w:color="auto" w:fill="FFFFFF"/><w:vAlign w:val="center"/></w:tcPr><w:p><w:pPr><w:spacing w:line="240" w:lineRule="auto"/><w:jc w:val="left"/></w:pPr><w:r><w:rPr><w:color w:val="152A35"/></w:rPr><w:t>/orchestrator-stats</w:t></w:r></w:p></w:tc><w:tc><w:tcPr><w:tcW w:w="6078" w:type="dxa"/><w:shd w:val="clear" w:color="auto" w:fill="FFFFFF"/><w:vAlign w:val="center"/></w:tcPr><w:p><w:pPr><w:spacing w:line="240" w:lineRule="auto"/><w:jc w:val="left"/></w:pPr><w:r><w:rPr><w:color w:val="152A35"/></w:rPr><w:t>Estadísticas de uso del pipeline: comandos más usados, tiempos</w:t></w:r></w:p></w:tc></w:tr><w:tr><w:trPr><w:trHeight w:val="500"/><w:jc w:val="center"/></w:trPr><w:tc><w:tcPr><w:tcW w:w="3500" w:type="dxa"/><w:shd w:val="clear" w:color="auto" w:fill="F0F0F0"/><w:vAlign w:val="center"/></w:tcPr><w:p><w:pPr><w:spacing w:line="240" w:lineRule="auto"/><w:jc w:val="left"/></w:pPr><w:r><w:rPr><w:color w:val="152A35"/></w:rPr><w:t>/orchestrator-idiomas</w:t></w:r></w:p></w:tc><w:tc><w:tcPr><w:tcW w:w="6078" w:type="dxa"/><w:shd w:val="clear" w:color="auto" w:fill="F0F0F0"/><w:vAlign w:val="center"/></w:tcPr><w:p><w:pPr><w:spacing w:line="240" w:lineRule="auto"/><w:jc w:val="left"/></w:pPr><w:r><w:rPr><w:color w:val="152A35"/></w:rPr><w:t>Detecta mezcla de idiomas en nombres de variables y métodos</w:t></w:r></w:p></w:tc></w:tr><w:tr><w:trPr><w:trHeight w:val="500"/><w:jc w:val="center"/></w:trPr><w:tc><w:tcPr><w:tcW w:w="3500" w:type="dxa"/><w:shd w:val="clear" w:color="auto" w:fill="FFFFFF"/><w:vAlign w:val="center"/></w:tcPr><w:p><w:pPr><w:spacing w:line="240" w:lineRule="auto"/><w:jc w:val="left"/></w:pPr><w:r><w:rPr><w:color w:val="152A35"/></w:rPr><w:t>/orchestrator-agent</w:t></w:r></w:p></w:tc><w:tc><w:tcPr><w:tcW w:w="6078" w:type="dxa"/><w:shd w:val="clear" w:color="auto" w:fill="FFFFFF"/><w:vAlign w:val="center"/></w:tcPr><w:p><w:pPr><w:spacing w:line="240" w:lineRule="auto"/><w:jc w:val="left"/></w:pPr><w:r><w:rPr><w:color w:val="152A35"/></w:rPr><w:t>Punto de entrada genérico para tareas no cubiertas por otros comandos</w:t></w:r></w:p></w:tc></w:tr><w:tr><w:trPr><w:trHeight w:val="500"/><w:jc w:val="center"/></w:trPr><w:tc><w:tcPr><w:tcW w:w="3500" w:type="dxa"/><w:shd w:val="clear" w:color="auto" w:fill="F0F0F0"/><w:vAlign w:val="center"/></w:tcPr><w:p><w:pPr><w:spacing w:line="240" w:lineRule="auto"/><w:jc w:val="left"/></w:pPr><w:r><w:rPr><w:color w:val="152A35"/></w:rPr><w:t>/orchestrator-help</w:t></w:r></w:p></w:tc><w:tc><w:tcPr><w:tcW w:w="6078" w:type="dxa"/><w:shd w:val="clear" w:color="auto" w:fill="F0F0F0"/><w:vAlign w:val="center"/></w:tcPr><w:p><w:pPr><w:spacing w:line="240" w:lineRule="auto"/><w:jc w:val="left"/></w:pPr><w:r><w:rPr><w:color w:val="152A35"/></w:rPr><w:t>Muestra esta ayuda como página HTML navegable</w:t></w:r></w:p></w:tc></w:tr></w:tbl><w:p/><w:p><w:pPr><w:pStyle w:val="Ttulo1"/></w:pPr><w:bookmarkStart w:id="40" w:name="_TocEnvJson"/><w:r><w:t>Configuraci&#xF3;n de entorno (env.json)</w:t></w:r><w:bookmarkEnd w:id="40"/></w:p><w:p><w:r><w:t xml:space="preserve">El plugin gestiona el contexto de base de datos y herramientas de forma aut&#xF3;noma, sin depender de skills externos.</w:t></w:r></w:p><w:p><w:pPr><w:pStyle w:val="Ttulo2"/></w:pPr><w:r><w:t>Estructura de archivos</w:t></w:r></w:p><w:p><w:pPr><w:shd w:val="clear" w:color="auto" w:fill="F5F5F5"/><w:spacing w:after="0" w:line="240" w:lineRule="auto"/></w:pPr><w:r><w:rPr><w:rFonts w:ascii="Courier New" w:hAnsi="Courier New" w:cs="Courier New"/><w:color w:val="152A35"/><w:sz w:val="18"/><w:szCs w:val="18"/></w:rPr><w:t xml:space="preserve">&lt;directorio-del-plugin&gt;/</w:t></w:r></w:p><w:p><w:pPr><w:shd w:val="clear" w:color="auto" w:fill="F5F5F5"/><w:spacing w:after="0" w:line="240" w:lineRule="auto"/></w:pPr><w:r><w:rPr><w:rFonts w:ascii="Courier New" w:hAnsi="Courier New" w:cs="Courier New"/><w:color w:val="152A35"/><w:sz w:val="18"/><w:szCs w:val="18"/></w:rPr><w:t xml:space="preserve">&#x251C;&#x2500;&#x2500; env.json              &lt;-- TU configuraci&#xF3;n local (gitignored)</w:t></w:r></w:p><w:p><w:pPr><w:shd w:val="clear" w:color="auto" w:fill="F5F5F5"/><w:spacing w:after="0" w:line="240" w:lineRule="auto"/></w:pPr><w:r><w:rPr><w:rFonts w:ascii="Courier New" w:hAnsi="Courier New" w:cs="Courier New"/><w:color w:val="152A35"/><w:sz w:val="18"/><w:szCs w:val="18"/></w:rPr><w:t xml:space="preserve">&#x251C;&#x2500;&#x2500; env.template.json     &lt;-- Plantilla vac&#xED;a (incluida en el repositorio)</w:t></w:r></w:p><w:p><w:pPr><w:shd w:val="clear" w:color="auto" w:fill="F5F5F5"/><w:spacing w:after="0" w:line="240" w:lineRule="auto"/></w:pPr><w:r><w:rPr><w:rFonts w:ascii="Courier New" w:hAnsi="Courier New" w:cs="Courier New"/><w:color w:val="152A35"/><w:sz w:val="18"/><w:szCs w:val="18"/></w:rPr><w:t xml:space="preserve">&#x2514;&#x2500;&#x2500; projects/</w:t></w:r></w:p><w:p><w:pPr><w:shd w:val="clear" w:color="auto" w:fill="F5F5F5"/><w:spacing w:after="0" w:line="240" w:lineRule="auto"/></w:pPr><w:r><w:rPr><w:rFonts w:ascii="Courier New" w:hAnsi="Courier New" w:cs="Courier New"/><w:color w:val="152A35"/><w:sz w:val="18"/><w:szCs w:val="18"/></w:rPr><w:t xml:space="preserve">    &#x251C;&#x2500;&#x2500; Ingenieros/</w:t></w:r></w:p><w:p><w:pPr><w:shd w:val="clear" w:color="auto" w:fill="F5F5F5"/><w:spacing w:after="0" w:line="240" w:lineRule="auto"/></w:pPr><w:r><w:rPr><w:rFonts w:ascii="Courier New" w:hAnsi="Courier New" w:cs="Courier New"/><w:color w:val="152A35"/><w:sz w:val="18"/><w:szCs w:val="18"/></w:rPr><w:t xml:space="preserve">    &#x2502;   &#x251C;&#x2500;&#x2500; config.json   &lt;-- Metadatos del proyecto (motor, host, TNS alias...)</w:t></w:r></w:p><w:p><w:pPr><w:shd w:val="clear" w:color="auto" w:fill="F5F5F5"/><w:spacing w:after="0" w:line="240" w:lineRule="auto"/></w:pPr><w:r><w:rPr><w:rFonts w:ascii="Courier New" w:hAnsi="Courier New" w:cs="Courier New"/><w:color w:val="152A35"/><w:sz w:val="18"/><w:szCs w:val="18"/></w:rPr><w:t xml:space="preserve">    &#x2502;   &#x2514;&#x2500;&#x2500; schema.md     &lt;-- Esquema completo BD (gitignored por tama&#xF1;o)</w:t></w:r></w:p><w:p><w:pPr><w:shd w:val="clear" w:color="auto" w:fill="F5F5F5"/><w:spacing w:after="0" w:line="240" w:lineRule="auto"/></w:pPr><w:r><w:rPr><w:rFonts w:ascii="Courier New" w:hAnsi="Courier New" w:cs="Courier New"/><w:color w:val="152A35"/><w:sz w:val="18"/><w:szCs w:val="18"/></w:rPr><w:t xml:space="preserve">    &#x2514;&#x2500;&#x2500; bancamarch/</w:t></w:r></w:p><w:p><w:pPr><w:shd w:val="clear" w:color="auto" w:fill="F5F5F5"/><w:spacing w:after="0" w:line="240" w:lineRule="auto"/></w:pPr><w:r><w:rPr><w:rFonts w:ascii="Courier New" w:hAnsi="Courier New" w:cs="Courier New"/><w:color w:val="152A35"/><w:sz w:val="18"/><w:szCs w:val="18"/></w:rPr><w:t xml:space="preserve">        &#x251C;&#x2500;&#x2500; config.json</w:t></w:r></w:p><w:p><w:pPr><w:shd w:val="clear" w:color="auto" w:fill="F5F5F5"/><w:spacing w:after="0" w:line="240" w:lineRule="auto"/></w:pPr><w:r><w:rPr><w:rFonts w:ascii="Courier New" w:hAnsi="Courier New" w:cs="Courier New"/><w:color w:val="152A35"/><w:sz w:val="18"/><w:szCs w:val="18"/></w:rPr><w:t xml:space="preserve">        &#x2514;&#x2500;&#x2500; schema.md</w:t></w:r></w:p><w:p><w:pPr><w:pStyle w:val="Ttulo2"/></w:pPr><w:r><w:t>Secciones principales de env.json</w:t></w:r></w:p><w:tbl><w:tblPr><w:tblStyle w:val="Tablaconestilo1"/><w:tblW w:w="9578" w:type="dxa"/><w:tblLook w:val="04A0" w:firstRow="1" w:lastRow="0" w:firstColumn="1" w:lastColumn="0" w:noHBand="0" w:noVBand="1"/></w:tblPr><w:tblGrid><w:gridCol w:w="4789"/><w:gridCol w:w="4789"/></w:tblGrid><w:tr w14:paraId="BB0002H0"><w:trPr><w:trHeight w:val="500"/><w:jc w:val="center"/></w:trPr><w:tc><w:tcPr><w:tcW w:w="4789" w:type="dxa"/><w:shd w:val="clear" w:color="auto" w:fill="152A35"/><w:vAlign w:val="center"/></w:tcPr><w:p w14:paraId="BB0002H1"><w:pPr><w:spacing w:line="240" w:lineRule="auto"/><w:jc w:val="left"/></w:pPr><w:r><w:rPr><w:b/><w:color w:val="FFFFFF"/></w:rPr><w:t>Secci&#xF3;n</w:t></w:r></w:p></w:tc><w:tc><w:tcPr><w:tcW w:w="4789" w:type="dxa"/><w:shd w:val="clear" w:color="auto" w:fill="152A35"/><w:vAlign w:val="center"/></w:tcPr><w:p w14:paraId="BB0002H2"><w:pPr><w:spacing w:line="240" w:lineRule="auto"/><w:jc w:val="left"/></w:pPr><w:r><w:rPr><w:b/><w:color w:val="FFFFFF"/></w:rPr><w:t>Contenido</w:t></w:r></w:p></w:tc></w:tr><w:tr w14:paraId="BB0002R0A0"><w:trPr><w:trHeight w:val="500"/><w:jc w:val="center"/></w:trPr><w:tc><w:tcPr><w:tcW w:w="4789" w:type="dxa"/><w:shd w:val="clear" w:color="auto" w:fill="F0F0F0"/><w:vAlign w:val="center"/></w:tcPr><w:p w14:paraId="BB0002R0A"><w:pPr><w:spacing w:line="240" w:lineRule="auto"/><w:jc w:val="left"/></w:pPr><w:r><w:rPr><w:color w:val="152A35"/></w:rPr><w:t xml:space="preserve">herramientas.mantis</w:t></w:r></w:p></w:tc><w:tc><w:tcPr><w:tcW w:w="4789" w:type="dxa"/><w:shd w:val="clear" w:color="auto" w:fill="F0F0F0"/><w:vAlign w:val="center"/></w:tcPr><w:p w14:paraId="BB0002R0B"><w:pPr><w:spacing w:line="240" w:lineRule="auto"/><w:jc w:val="left"/></w:pPr><w:r><w:rPr><w:color w:val="152A35"/></w:rPr><w:t xml:space="preserve">URL, usuario y API key de MantisBT</w:t></w:r></w:p></w:tc></w:tr><w:tr w14:paraId="BB0002R1A0"><w:trPr><w:trHeight w:val="500"/><w:jc w:val="center"/></w:trPr><w:tc><w:tcPr><w:tcW w:w="4789" w:type="dxa"/><w:shd w:val="clear" w:color="auto" w:fill="FFFFFF"/><w:vAlign w:val="center"/></w:tcPr><w:p w14:paraId="BB0002R1A"><w:pPr><w:spacing w:line="240" w:lineRule="auto"/><w:jc w:val="left"/></w:pPr><w:r><w:rPr><w:color w:val="152A35"/></w:rPr><w:t xml:space="preserve">herramientas.svn</w:t></w:r></w:p></w:tc><w:tc><w:tcPr><w:tcW w:w="4789" w:type="dxa"/><w:shd w:val="clear" w:color="auto" w:fill="FFFFFF"/><w:vAlign w:val="center"/></w:tcPr><w:p w14:paraId="BB0002R1B"><w:pPr><w:spacing w:line="240" w:lineRule="auto"/><w:jc w:val="left"/></w:pPr><w:r><w:rPr><w:color w:val="152A35"/></w:rPr><w:t xml:space="preserve">URL y credenciales del repositorio SVN</w:t></w:r></w:p></w:tc></w:tr><w:tr w14:paraId="BB0002R2A0"><w:trPr><w:trHeight w:val="500"/><w:jc w:val="center"/></w:trPr><w:tc><w:tcPr><w:tcW w:w="4789" w:type="dxa"/><w:shd w:val="clear" w:color="auto" w:fill="F0F0F0"/><w:vAlign w:val="center"/></w:tcPr><w:p w14:paraId="BB0002R2A"><w:pPr><w:spacing w:line="240" w:lineRule="auto"/><w:jc w:val="left"/></w:pPr><w:r><w:rPr><w:color w:val="152A35"/></w:rPr><w:t xml:space="preserve">herramientas.correo</w:t></w:r></w:p></w:tc><w:tc><w:tcPr><w:tcW w:w="4789" w:type="dxa"/><w:shd w:val="clear" w:color="auto" w:fill="F0F0F0"/><w:vAlign w:val="center"/></w:tcPr><w:p w14:paraId="BB0002R2B"><w:pPr><w:spacing w:line="240" w:lineRule="auto"/><w:jc w:val="left"/></w:pPr><w:r><w:rPr><w:color w:val="152A35"/></w:rPr><w:t xml:space="preserve">SMTP para ejemplos de env&#xED;o desde C#</w:t></w:r></w:p></w:tc></w:tr><w:tr w14:paraId="BB0002R3A0"><w:trPr><w:trHeight w:val="500"/><w:jc w:val="center"/></w:trPr><w:tc><w:tcPr><w:tcW w:w="4789" w:type="dxa"/><w:shd w:val="clear" w:color="auto" w:fill="FFFFFF"/><w:vAlign w:val="center"/></w:tcPr><w:p w14:paraId="BB0002R3A"><w:pPr><w:spacing w:line="240" w:lineRule="auto"/><w:jc w:val="left"/></w:pPr><w:r><w:rPr><w:color w:val="152A35"/></w:rPr><w:t xml:space="preserve">credenciales_bbdd</w:t></w:r></w:p></w:tc><w:tc><w:tcPr><w:tcW w:w="4789" w:type="dxa"/><w:shd w:val="clear" w:color="auto" w:fill="FFFFFF"/><w:vAlign w:val="center"/></w:tcPr><w:p w14:paraId="BB0002R3B"><w:pPr><w:spacing w:line="240" w:lineRule="auto"/><w:jc w:val="left"/></w:pPr><w:r><w:rPr><w:color w:val="152A35"/></w:rPr><w:t xml:space="preserve">Usuarios y passwords por proyecto y entorno</w:t></w:r></w:p></w:tc></w:tr><w:tr w14:paraId="BB0002R4A0"><w:trPr><w:trHeight w:val="500"/><w:jc w:val="center"/></w:trPr><w:tc><w:tcPr><w:tcW w:w="4789" w:type="dxa"/><w:shd w:val="clear" w:color="auto" w:fill="F0F0F0"/><w:vAlign w:val="center"/></w:tcPr><w:p w14:paraId="BB0002R4A"><w:pPr><w:spacing w:line="240" w:lineRule="auto"/><w:jc w:val="left"/></w:pPr><w:r><w:rPr><w:color w:val="152A35"/></w:rPr><w:t xml:space="preserve">entornos</w:t></w:r></w:p></w:tc><w:tc><w:tcPr><w:tcW w:w="4789" w:type="dxa"/><w:shd w:val="clear" w:color="auto" w:fill="F0F0F0"/><w:vAlign w:val="center"/></w:tcPr><w:p w14:paraId="BB0002R4B"><w:pPr><w:spacing w:line="240" w:lineRule="auto"/><w:jc w:val="left"/></w:pPr><w:r><w:rPr><w:color w:val="152A35"/></w:rPr><w:t xml:space="preserve">Connection strings Oracle/SQL Server por proyecto (DEV/PRE/PRO)</w:t></w:r></w:p></w:tc></w:tr><w:tr w14:paraId="BB0002R5A0"><w:trPr><w:trHeight w:val="500"/><w:jc w:val="center"/></w:trPr><w:tc><w:tcPr><w:tcW w:w="4789" w:type="dxa"/><w:shd w:val="clear" w:color="auto" w:fill="FFFFFF"/><w:vAlign w:val="center"/></w:tcPr><w:p w14:paraId="BB0002R5A"><w:pPr><w:spacing w:line="240" w:lineRule="auto"/><w:jc w:val="left"/></w:pPr><w:r><w:rPr><w:color w:val="152A35"/></w:rPr><w:t xml:space="preserve">contexto_personal</w:t></w:r></w:p></w:tc><w:tc><w:tcPr><w:tcW w:w="4789" w:type="dxa"/><w:shd w:val="clear" w:color="auto" w:fill="FFFFFF"/><w:vAlign w:val="center"/></w:tcPr><w:p w14:paraId="BB0002R5B"><w:pPr><w:spacing w:line="240" w:lineRule="auto"/><w:jc w:val="left"/></w:pPr><w:r><w:rPr><w:color w:val="152A35"/></w:rPr><w:t xml:space="preserve">Nombre, rol, empresa y equipo del desarrollador</w:t></w:r></w:p></w:tc></w:tr></w:tbl><w:p><w:pPr><w:pStyle w:val="Ttulo2"/></w:pPr><w:r><w:t>Comportamiento si env.json no existe</w:t></w:r></w:p><w:p><w:r><w:t xml:space="preserve">El agente detecta la ausencia autom&#xE1;ticamente:</w:t></w:r></w:p><w:p><w:pPr><w:numPr><w:ilvl w:val="0"/><w:numId w:val="1"/></w:numPr><w:spacing w:after="60"/></w:pPr><w:r><w:t xml:space="preserve">Copia env.template.json &#x2192; env.json</w:t></w:r></w:p><w:p><w:pPr><w:numPr><w:ilvl w:val="0"/><w:numId w:val="1"/></w:numPr><w:spacing w:after="60"/></w:pPr><w:r><w:t xml:space="preserve">Informa al usuario con la ruta del archivo creado</w:t></w:r></w:p><w:p><w:pPr><w:numPr><w:ilvl w:val="0"/><w:numId w:val="1"/></w:numPr><w:spacing w:after="60"/></w:pPr><w:r><w:t xml:space="preserve">Se detiene hasta que el usuario confirme que ha rellenado las credenciales</w:t></w:r></w:p><w:p><w:r><w:t xml:space="preserve">El comando /orchestrator-validar-entorno tambi&#xE9;n verifica el estado de env.json y reporta si quedan placeholders &lt;COMPLETAR&gt; sin rellenar.</w:t></w:r></w:p><w:p><w:pPr><w:pStyle w:val="Ttulo1"/></w:pPr><w:bookmarkStart w:id="19" w:name="_Toc236310422"/><w:r><w:t>Servidor MCP — orchestrator-workspace</w:t></w:r><w:bookmarkEnd w:id="19"/></w:p><w:p><w:r><w:t>El plugin incluye un servidor MCP Python que corre en local (stdio) y expone herramientas nativas. Claude las invoca automáticamente al ejecutar los comandos. El servidor arranca en el primer uso y se detiene al cerrar Claude Code.</w:t></w:r></w:p><w:p><w:pPr><w:pStyle w:val="Ttulo2"/></w:pPr><w:bookmarkStart w:id="20" w:name="_Toc236310423"/><w:r><w:t>Herramientas disponibles</w:t></w:r><w:bookmarkEnd w:id="20"/></w:p><w:tbl><w:tblPr><w:tblStyle w:val="a"/><w:tblW w:w="9578" w:type="dxa"/><w:jc w:val="center"/><w:tblBorders><w:top w:val="single" w:sz="4" w:space="0" w:color="DDDDDD"/><w:left w:val="single" w:sz="4" w:space="0" w:color="DDDDDD"/><w:bottom w:val="single" w:sz="4" w:space="0" w:color="DDDDDD"/><w:right w:val="single" w:sz="4" w:space="0" w:color="DDDDDD"/><w:insideH w:val="single" w:sz="4" w:space="0" w:color="DDDDDD"/><w:insideV w:val="single" w:sz="4" w:space="0" w:color="DDDDDD"/></w:tblBorders><w:tblLayout w:type="fixed"/><w:tblLook w:val="04A0" w:firstRow="1" w:lastRow="0" w:firstColumn="1" w:lastColumn="0" w:noHBand="0" w:noVBand="1"/></w:tblPr><w:tblGrid><w:gridCol w:w="4000"/><w:gridCol w:w="5578"/></w:tblGrid><w:tr><w:trPr><w:trHeight w:val="500"/><w:jc w:val="center"/></w:trPr><w:tc><w:tcPr><w:tcW w:w="4000" w:type="dxa"/><w:shd w:val="clear" w:color="auto" w:fill="00F7BC"/><w:vAlign w:val="center"/></w:tcPr><w:p><w:pPr><w:spacing w:line="240" w:lineRule="auto"/><w:jc w:val="left"/></w:pPr><w:r><w:rPr><w:b/><w:bCs/><w:color w:val="152A35"/></w:rPr><w:t>HERRAMIENTA MCP</w:t></w:r></w:p></w:tc><w:tc><w:tcPr><w:tcW w:w="5578" w:type="dxa"/><w:shd w:val="clear" w:color="auto" w:fill="00F7BC"/><w:vAlign w:val="center"/></w:tcPr><w:p><w:pPr><w:spacing w:line="240" w:lineRule="auto"/><w:jc w:val="left"/></w:pPr><w:r><w:rPr><w:b/><w:bCs/><w:color w:val="152A35"/></w:rPr><w:t>PROPÓSITO</w:t></w:r></w:p></w:tc></w:tr><w:tr><w:trPr><w:trHeight w:val="500"/><w:jc w:val="center"/></w:trPr><w:tc><w:tcPr><w:tcW w:w="4000" w:type="dxa"/><w:shd w:val="clear" w:color="auto" w:fill="FFFFFF"/><w:vAlign w:val="center"/></w:tcPr><w:p><w:pPr><w:spacing w:line="240" w:lineRule="auto"/><w:jc w:val="left"/></w:pPr><w:r><w:rPr><w:color w:val="152A35"/></w:rPr><w:t>detect_vcs</w:t></w:r></w:p></w:tc><w:tc><w:tcPr><w:tcW w:w="5578" w:type="dxa"/><w:shd w:val="clear" w:color="auto" w:fill="FFFFFF"/><w:vAlign w:val="center"/></w:tcPr><w:p><w:pPr><w:spacing w:line="240" w:lineRule="auto"/><w:jc w:val="left"/></w:pPr><w:r><w:rPr><w:color w:val="152A35"/></w:rPr><w:t>Detecta si el workspace usa SVN, Git o ambos</w:t></w:r></w:p></w:tc></w:tr><w:tr><w:trPr><w:trHeight w:val="500"/><w:jc w:val="center"/></w:trPr><w:tc><w:tcPr><w:tcW w:w="4000" w:type="dxa"/><w:shd w:val="clear" w:color="auto" w:fill="F0F0F0"/><w:vAlign w:val="center"/></w:tcPr><w:p><w:pPr><w:spacing w:line="240" w:lineRule="auto"/><w:jc w:val="left"/></w:pPr><w:r><w:rPr><w:color w:val="152A35"/></w:rPr><w:t>svn_log / git_log</w:t></w:r></w:p></w:tc><w:tc><w:tcPr><w:tcW w:w="5578" w:type="dxa"/><w:shd w:val="clear" w:color="auto" w:fill="F0F0F0"/><w:vAlign w:val="center"/></w:tcPr><w:p><w:pPr><w:spacing w:line="240" w:lineRule="auto"/><w:jc w:val="left"/></w:pPr><w:r><w:rPr><w:color w:val="152A35"/></w:rPr><w:t>Historial de commits/revisiones</w:t></w:r></w:p></w:tc></w:tr><w:tr><w:trPr><w:trHeight w:val="500"/><w:jc w:val="center"/></w:trPr><w:tc><w:tcPr><w:tcW w:w="4000" w:type="dxa"/><w:shd w:val="clear" w:color="auto" w:fill="FFFFFF"/><w:vAlign w:val="center"/></w:tcPr><w:p><w:pPr><w:spacing w:line="240" w:lineRule="auto"/><w:jc w:val="left"/></w:pPr><w:r><w:rPr><w:color w:val="152A35"/></w:rPr><w:t>svn_diff_revision / git_diff_revision</w:t></w:r></w:p></w:tc><w:tc><w:tcPr><w:tcW w:w="5578" w:type="dxa"/><w:shd w:val="clear" w:color="auto" w:fill="FFFFFF"/><w:vAlign w:val="center"/></w:tcPr><w:p><w:pPr><w:spacing w:line="240" w:lineRule="auto"/><w:jc w:val="left"/></w:pPr><w:r><w:rPr><w:color w:val="152A35"/></w:rPr><w:t>Diff de una revisión concreta</w:t></w:r></w:p></w:tc></w:tr><w:tr><w:trPr><w:trHeight w:val="500"/><w:jc w:val="center"/></w:trPr><w:tc><w:tcPr><w:tcW w:w="4000" w:type="dxa"/><w:shd w:val="clear" w:color="auto" w:fill="F0F0F0"/><w:vAlign w:val="center"/></w:tcPr><w:p><w:pPr><w:spacing w:line="240" w:lineRule="auto"/><w:jc w:val="left"/></w:pPr><w:r><w:rPr><w:color w:val="152A35"/></w:rPr><w:t>svn_status / git_status</w:t></w:r></w:p></w:tc><w:tc><w:tcPr><w:tcW w:w="5578" w:type="dxa"/><w:shd w:val="clear" w:color="auto" w:fill="F0F0F0"/><w:vAlign w:val="center"/></w:tcPr><w:p><w:pPr><w:spacing w:line="240" w:lineRule="auto"/><w:jc w:val="left"/></w:pPr><w:r><w:rPr><w:color w:val="152A35"/></w:rPr><w:t>Estado de cambios pendientes</w:t></w:r></w:p></w:tc></w:tr><w:tr><w:trPr><w:trHeight w:val="500"/><w:jc w:val="center"/></w:trPr><w:tc><w:tcPr><w:tcW w:w="4000" w:type="dxa"/><w:shd w:val="clear" w:color="auto" w:fill="FFFFFF"/><w:vAlign w:val="center"/></w:tcPr><w:p><w:pPr><w:spacing w:line="240" w:lineRule="auto"/><w:jc w:val="left"/></w:pPr><w:r><w:rPr><w:color w:val="152A35"/></w:rPr><w:t>compile_check</w:t></w:r></w:p></w:tc><w:tc><w:tcPr><w:tcW w:w="5578" w:type="dxa"/><w:shd w:val="clear" w:color="auto" w:fill="FFFFFF"/><w:vAlign w:val="center"/></w:tcPr><w:p><w:pPr><w:spacing w:line="240" w:lineRule="auto"/><w:jc w:val="left"/></w:pPr><w:r><w:rPr><w:color w:val="152A35"/></w:rPr><w:t>Invoca MSBuild y devuelve errores/warnings</w:t></w:r></w:p></w:tc></w:tr><w:tr><w:trPr><w:trHeight w:val="500"/><w:jc w:val="center"/></w:trPr><w:tc><w:tcPr><w:tcW w:w="4000" w:type="dxa"/><w:shd w:val="clear" w:color="auto" w:fill="F0F0F0"/><w:vAlign w:val="center"/></w:tcPr><w:p><w:pPr><w:spacing w:line="240" w:lineRule="auto"/><w:jc w:val="left"/></w:pPr><w:r><w:rPr><w:color w:val="152A35"/></w:rPr><w:t>validate_solution</w:t></w:r></w:p></w:tc><w:tc><w:tcPr><w:tcW w:w="5578" w:type="dxa"/><w:shd w:val="clear" w:color="auto" w:fill="F0F0F0"/><w:vAlign w:val="center"/></w:tcPr><w:p><w:pPr><w:spacing w:line="240" w:lineRule="auto"/><w:jc w:val="left"/></w:pPr><w:r><w:rPr><w:color w:val="152A35"/></w:rPr><w:t>Validación completa de la solución .sln</w:t></w:r></w:p></w:tc></w:tr><w:tr><w:trPr><w:trHeight w:val="500"/><w:jc w:val="center"/></w:trPr><w:tc><w:tcPr><w:tcW w:w="4000" w:type="dxa"/><w:shd w:val="clear" w:color="auto" w:fill="FFFFFF"/><w:vAlign w:val="center"/></w:tcPr><w:p><w:pPr><w:spacing w:line="240" w:lineRule="auto"/><w:jc w:val="left"/></w:pPr><w:r><w:rPr><w:color w:val="152A35"/></w:rPr><w:t>run_tests</w:t></w:r></w:p></w:tc><w:tc><w:tcPr><w:tcW w:w="5578" w:type="dxa"/><w:shd w:val="clear" w:color="auto" w:fill="FFFFFF"/><w:vAlign w:val="center"/></w:tcPr><w:p><w:pPr><w:spacing w:line="240" w:lineRule="auto"/><w:jc w:val="left"/></w:pPr><w:r><w:rPr><w:color w:val="152A35"/></w:rPr><w:t>Ejecuta tests .NET y devuelve resultados</w:t></w:r></w:p></w:tc></w:tr><w:tr><w:trPr><w:trHeight w:val="500"/><w:jc w:val="center"/></w:trPr><w:tc><w:tcPr><w:tcW w:w="4000" w:type="dxa"/><w:shd w:val="clear" w:color="auto" w:fill="F0F0F0"/><w:vAlign w:val="center"/></w:tcPr><w:p><w:pPr><w:spacing w:line="240" w:lineRule="auto"/><w:jc w:val="left"/></w:pPr><w:r><w:rPr><w:color w:val="152A35"/></w:rPr><w:t>db_query</w:t></w:r></w:p></w:tc><w:tc><w:tcPr><w:tcW w:w="5578" w:type="dxa"/><w:shd w:val="clear" w:color="auto" w:fill="F0F0F0"/><w:vAlign w:val="center"/></w:tcPr><w:p><w:pPr><w:spacing w:line="240" w:lineRule="auto"/><w:jc w:val="left"/></w:pPr><w:r><w:rPr><w:color w:val="152A35"/></w:rPr><w:t>Consulta Oracle/SQL Server vía XMLConfig.xml</w:t></w:r></w:p></w:tc></w:tr><w:tr><w:trPr><w:trHeight w:val="500"/><w:jc w:val="center"/></w:trPr><w:tc><w:tcPr><w:tcW w:w="4000" w:type="dxa"/><w:shd w:val="clear" w:color="auto" w:fill="FFFFFF"/><w:vAlign w:val="center"/></w:tcPr><w:p><w:pPr><w:spacing w:line="240" w:lineRule="auto"/><w:jc w:val="left"/></w:pPr><w:r><w:rPr><w:color w:val="152A35"/></w:rPr><w:t>get_db_config</w:t></w:r></w:p></w:tc><w:tc><w:tcPr><w:tcW w:w="5578" w:type="dxa"/><w:shd w:val="clear" w:color="auto" w:fill="FFFFFF"/><w:vAlign w:val="center"/></w:tcPr><w:p><w:pPr><w:spacing w:line="240" w:lineRule="auto"/><w:jc w:val="left"/></w:pPr><w:r><w:rPr><w:color w:val="152A35"/></w:rPr><w:t>Lee configuración de conexión del workspace</w:t></w:r></w:p></w:tc></w:tr><w:tr><w:trPr><w:trHeight w:val="500"/><w:jc w:val="center"/></w:trPr><w:tc><w:tcPr><w:tcW w:w="4000" w:type="dxa"/><w:shd w:val="clear" w:color="auto" w:fill="F0F0F0"/><w:vAlign w:val="center"/></w:tcPr><w:p><w:pPr><w:spacing w:line="240" w:lineRule="auto"/><w:jc w:val="left"/></w:pPr><w:r><w:rPr><w:color w:val="152A35"/></w:rPr><w:t>get_table_schema</w:t></w:r></w:p></w:tc><w:tc><w:tcPr><w:tcW w:w="5578" w:type="dxa"/><w:shd w:val="clear" w:color="auto" w:fill="F0F0F0"/><w:vAlign w:val="center"/></w:tcPr><w:p><w:pPr><w:spacing w:line="240" w:lineRule="auto"/><w:jc w:val="left"/></w:pPr><w:r><w:rPr><w:color w:val="152A35"/></w:rPr><w:t>Esquema detallado de una tabla</w:t></w:r></w:p></w:tc></w:tr><w:tr><w:trPr><w:trHeight w:val="500"/><w:jc w:val="center"/></w:trPr><w:tc><w:tcPr><w:tcW w:w="4000" w:type="dxa"/><w:shd w:val="clear" w:color="auto" w:fill="FFFFFF"/><w:vAlign w:val="center"/></w:tcPr><w:p><w:pPr><w:spacing w:line="240" w:lineRule="auto"/><w:jc w:val="left"/></w:pPr><w:r><w:rPr><w:color w:val="152A35"/></w:rPr><w:t>get_model_index / search_model</w:t></w:r></w:p></w:tc><w:tc><w:tcPr><w:tcW w:w="5578" w:type="dxa"/><w:shd w:val="clear" w:color="auto" w:fill="FFFFFF"/><w:vAlign w:val="center"/></w:tcPr><w:p><w:pPr><w:spacing w:line="240" w:lineRule="auto"/><w:jc w:val="left"/></w:pPr><w:r><w:rPr><w:color w:val="152A35"/></w:rPr><w:t>Búsqueda en modelo BD JSON local</w:t></w:r></w:p></w:tc></w:tr><w:tr><w:trPr><w:trHeight w:val="500"/><w:jc w:val="center"/></w:trPr><w:tc><w:tcPr><w:tcW w:w="4000" w:type="dxa"/><w:shd w:val="clear" w:color="auto" w:fill="F0F0F0"/><w:vAlign w:val="center"/></w:tcPr><w:p><w:pPr><w:spacing w:line="240" w:lineRule="auto"/><w:jc w:val="left"/></w:pPr><w:r><w:rPr><w:color w:val="152A35"/></w:rPr><w:lastRenderedPageBreak/><w:t>compare_model / compare_model_tables</w:t></w:r></w:p></w:tc><w:tc><w:tcPr><w:tcW w:w="5578" w:type="dxa"/><w:shd w:val="clear" w:color="auto" w:fill="F0F0F0"/><w:vAlign w:val="center"/></w:tcPr><w:p><w:pPr><w:spacing w:line="240" w:lineRule="auto"/><w:jc w:val="left"/></w:pPr><w:r><w:rPr><w:color w:val="152A35"/></w:rPr><w:t>Compara modelo local vs BD real</w:t></w:r></w:p></w:tc></w:tr><w:tr><w:trPr><w:trHeight w:val="500"/><w:jc w:val="center"/></w:trPr><w:tc><w:tcPr><w:tcW w:w="4000" w:type="dxa"/><w:shd w:val="clear" w:color="auto" w:fill="FFFFFF"/><w:vAlign w:val="center"/></w:tcPr><w:p><w:pPr><w:spacing w:line="240" w:lineRule="auto"/><w:jc w:val="left"/></w:pPr><w:r><w:rPr><w:color w:val="152A35"/></w:rPr><w:t>sync_from_db / sync_model_tables</w:t></w:r></w:p></w:tc><w:tc><w:tcPr><w:tcW w:w="5578" w:type="dxa"/><w:shd w:val="clear" w:color="auto" w:fill="FFFFFF"/><w:vAlign w:val="center"/></w:tcPr><w:p><w:pPr><w:spacing w:line="240" w:lineRule="auto"/><w:jc w:val="left"/></w:pPr><w:r><w:rPr><w:color w:val="152A35"/></w:rPr><w:t>Sincroniza modelo JSON desde la BD</w:t></w:r></w:p></w:tc></w:tr><w:tr><w:trPr><w:trHeight w:val="500"/><w:jc w:val="center"/></w:trPr><w:tc><w:tcPr><w:tcW w:w="4000" w:type="dxa"/><w:shd w:val="clear" w:color="auto" w:fill="F0F0F0"/><w:vAlign w:val="center"/></w:tcPr><w:p><w:pPr><w:spacing w:line="240" w:lineRule="auto"/><w:jc w:val="left"/></w:pPr><w:r><w:rPr><w:color w:val="152A35"/></w:rPr><w:t>sync_indexes</w:t></w:r></w:p></w:tc><w:tc><w:tcPr><w:tcW w:w="5578" w:type="dxa"/><w:shd w:val="clear" w:color="auto" w:fill="F0F0F0"/><w:vAlign w:val="center"/></w:tcPr><w:p><w:pPr><w:spacing w:line="240" w:lineRule="auto"/><w:jc w:val="left"/></w:pPr><w:r><w:rPr><w:color w:val="152A35"/></w:rPr><w:t>Sincroniza índices del modelo</w:t></w:r></w:p></w:tc></w:tr><w:tr><w:trPr><w:trHeight w:val="500"/><w:jc w:val="center"/></w:trPr><w:tc><w:tcPr><w:tcW w:w="4000" w:type="dxa"/><w:shd w:val="clear" w:color="auto" w:fill="FFFFFF"/><w:vAlign w:val="center"/></w:tcPr><w:p><w:pPr><w:spacing w:line="240" w:lineRule="auto"/><w:jc w:val="left"/></w:pPr><w:r><w:rPr><w:color w:val="152A35"/></w:rPr><w:t>export_dmd</w:t></w:r></w:p></w:tc><w:tc><w:tcPr><w:tcW w:w="5578" w:type="dxa"/><w:shd w:val="clear" w:color="auto" w:fill="FFFFFF"/><w:vAlign w:val="center"/></w:tcPr><w:p><w:pPr><w:spacing w:line="240" w:lineRule="auto"/><w:jc w:val="left"/></w:pPr><w:r><w:rPr><w:color w:val="152A35"/></w:rPr><w:t>Exporta modelo al formato Oracle Data Modeler (.dmd)</w:t></w:r></w:p></w:tc></w:tr><w:tr><w:trPr><w:trHeight w:val="500"/><w:jc w:val="center"/></w:trPr><w:tc><w:tcPr><w:tcW w:w="4000" w:type="dxa"/><w:shd w:val="clear" w:color="auto" w:fill="F0F0F0"/><w:vAlign w:val="center"/></w:tcPr><w:p><w:pPr><w:spacing w:line="240" w:lineRule="auto"/><w:jc w:val="left"/></w:pPr><w:r><w:rPr><w:color w:val="152A35"/></w:rPr><w:t>generate_migration / generate_sql</w:t></w:r></w:p></w:tc><w:tc><w:tcPr><w:tcW w:w="5578" w:type="dxa"/><w:shd w:val="clear" w:color="auto" w:fill="F0F0F0"/><w:vAlign w:val="center"/></w:tcPr><w:p><w:pPr><w:spacing w:line="240" w:lineRule="auto"/><w:jc w:val="left"/></w:pPr><w:r><w:rPr><w:color w:val="152A35"/></w:rPr><w:t>Genera SQL de migración desde el modelo</w:t></w:r></w:p></w:tc></w:tr><w:tr><w:trPr><w:trHeight w:val="500"/><w:jc w:val="center"/></w:trPr><w:tc><w:tcPr><w:tcW w:w="4000" w:type="dxa"/><w:shd w:val="clear" w:color="auto" w:fill="FFFFFF"/><w:vAlign w:val="center"/></w:tcPr><w:p><w:pPr><w:spacing w:line="240" w:lineRule="auto"/><w:jc w:val="left"/></w:pPr><w:r><w:rPr><w:color w:val="152A35"/></w:rPr><w:t>find_symbol / batch_find_symbols</w:t></w:r></w:p></w:tc><w:tc><w:tcPr><w:tcW w:w="5578" w:type="dxa"/><w:shd w:val="clear" w:color="auto" w:fill="FFFFFF"/><w:vAlign w:val="center"/></w:tcPr><w:p><w:pPr><w:spacing w:line="240" w:lineRule="auto"/><w:jc w:val="left"/></w:pPr><w:r><w:rPr><w:color w:val="152A35"/></w:rPr><w:t>Localiza clases, métodos o propiedades en el código</w:t></w:r></w:p></w:tc></w:tr><w:tr><w:trPr><w:trHeight w:val="500"/><w:jc w:val="center"/></w:trPr><w:tc><w:tcPr><w:tcW w:w="4000" w:type="dxa"/><w:shd w:val="clear" w:color="auto" w:fill="F0F0F0"/><w:vAlign w:val="center"/></w:tcPr><w:p><w:pPr><w:spacing w:line="240" w:lineRule="auto"/><w:jc w:val="left"/></w:pPr><w:r><w:rPr><w:color w:val="152A35"/></w:rPr><w:t>search_code</w:t></w:r></w:p></w:tc><w:tc><w:tcPr><w:tcW w:w="5578" w:type="dxa"/><w:shd w:val="clear" w:color="auto" w:fill="F0F0F0"/><w:vAlign w:val="center"/></w:tcPr><w:p><w:pPr><w:spacing w:line="240" w:lineRule="auto"/><w:jc w:val="left"/></w:pPr><w:r><w:rPr><w:color w:val="152A35"/></w:rPr><w:t>Búsqueda full-text en el código fuente</w:t></w:r></w:p></w:tc></w:tr><w:tr><w:trPr><w:trHeight w:val="500"/><w:jc w:val="center"/></w:trPr><w:tc><w:tcPr><w:tcW w:w="4000" w:type="dxa"/><w:shd w:val="clear" w:color="auto" w:fill="FFFFFF"/><w:vAlign w:val="center"/></w:tcPr><w:p><w:pPr><w:spacing w:line="240" w:lineRule="auto"/><w:jc w:val="left"/></w:pPr><w:r><w:rPr><w:color w:val="152A35"/></w:rPr><w:t>scan_aspx</w:t></w:r></w:p></w:tc><w:tc><w:tcPr><w:tcW w:w="5578" w:type="dxa"/><w:shd w:val="clear" w:color="auto" w:fill="FFFFFF"/><w:vAlign w:val="center"/></w:tcPr><w:p><w:pPr><w:spacing w:line="240" w:lineRule="auto"/><w:jc w:val="left"/></w:pPr><w:r><w:rPr><w:color w:val="152A35"/></w:rPr><w:t>Escanea ficheros ASPX/ASCX de la solución</w:t></w:r></w:p></w:tc></w:tr><w:tr><w:trPr><w:trHeight w:val="500"/><w:jc w:val="center"/></w:trPr><w:tc><w:tcPr><w:tcW w:w="4000" w:type="dxa"/><w:shd w:val="clear" w:color="auto" w:fill="F0F0F0"/><w:vAlign w:val="center"/></w:tcPr><w:p><w:pPr><w:spacing w:line="240" w:lineRule="auto"/><w:jc w:val="left"/></w:pPr><w:r><w:rPr><w:color w:val="152A35"/></w:rPr><w:t>analyze_dalc</w:t></w:r></w:p></w:tc><w:tc><w:tcPr><w:tcW w:w="5578" w:type="dxa"/><w:shd w:val="clear" w:color="auto" w:fill="F0F0F0"/><w:vAlign w:val="center"/></w:tcPr><w:p><w:pPr><w:spacing w:line="240" w:lineRule="auto"/><w:jc w:val="left"/></w:pPr><w:r><w:rPr><w:color w:val="152A35"/></w:rPr><w:t>Analiza clases DALC: queries SQL embebidas, parámetros</w:t></w:r></w:p></w:tc></w:tr><w:tr><w:trPr><w:trHeight w:val="500"/><w:jc w:val="center"/></w:trPr><w:tc><w:tcPr><w:tcW w:w="4000" w:type="dxa"/><w:shd w:val="clear" w:color="auto" w:fill="FFFFFF"/><w:vAlign w:val="center"/></w:tcPr><w:p><w:pPr><w:spacing w:line="240" w:lineRule="auto"/><w:jc w:val="left"/></w:pPr><w:r><w:rPr><w:color w:val="152A35"/></w:rPr><w:t>map_dependencies</w:t></w:r></w:p></w:tc><w:tc><w:tcPr><w:tcW w:w="5578" w:type="dxa"/><w:shd w:val="clear" w:color="auto" w:fill="FFFFFF"/><w:vAlign w:val="center"/></w:tcPr><w:p><w:pPr><w:spacing w:line="240" w:lineRule="auto"/><w:jc w:val="left"/></w:pPr><w:r><w:rPr><w:color w:val="152A35"/></w:rPr><w:t>Grafo de dependencias entre proyectos</w:t></w:r></w:p></w:tc></w:tr><w:tr><w:trPr><w:trHeight w:val="500"/><w:jc w:val="center"/></w:trPr><w:tc><w:tcPr><w:tcW w:w="4000" w:type="dxa"/><w:shd w:val="clear" w:color="auto" w:fill="F0F0F0"/><w:vAlign w:val="center"/></w:tcPr><w:p><w:pPr><w:spacing w:line="240" w:lineRule="auto"/><w:jc w:val="left"/></w:pPr><w:r><w:rPr><w:color w:val="152A35"/></w:rPr><w:t>render_erd</w:t></w:r></w:p></w:tc><w:tc><w:tcPr><w:tcW w:w="5578" w:type="dxa"/><w:shd w:val="clear" w:color="auto" w:fill="F0F0F0"/><w:vAlign w:val="center"/></w:tcPr><w:p><w:pPr><w:spacing w:line="240" w:lineRule="auto"/><w:jc w:val="left"/></w:pPr><w:r><w:rPr><w:color w:val="152A35"/></w:rPr><w:t>Diagrama ERD en Mermaid</w:t></w:r></w:p></w:tc></w:tr><w:tr><w:trPr><w:trHeight w:val="500"/><w:jc w:val="center"/></w:trPr><w:tc><w:tcPr><w:tcW w:w="4000" w:type="dxa"/><w:shd w:val="clear" w:color="auto" w:fill="FFFFFF"/><w:vAlign w:val="center"/></w:tcPr><w:p><w:pPr><w:spacing w:line="240" w:lineRule="auto"/><w:jc w:val="left"/></w:pPr><w:r><w:rPr><w:color w:val="152A35"/></w:rPr><w:t>security_scan</w:t></w:r></w:p></w:tc><w:tc><w:tcPr><w:tcW w:w="5578" w:type="dxa"/><w:shd w:val="clear" w:color="auto" w:fill="FFFFFF"/><w:vAlign w:val="center"/></w:tcPr><w:p><w:pPr><w:spacing w:line="240" w:lineRule="auto"/><w:jc w:val="left"/></w:pPr><w:r><w:rPr><w:color w:val="152A35"/></w:rPr><w:t>Escanea el código en busca de vulnerabilidades</w:t></w:r></w:p></w:tc></w:tr><w:tr><w:trPr><w:trHeight w:val="500"/><w:jc w:val="center"/></w:trPr><w:tc><w:tcPr><w:tcW w:w="4000" w:type="dxa"/><w:shd w:val="clear" w:color="auto" w:fill="F0F0F0"/><w:vAlign w:val="center"/></w:tcPr><w:p><w:pPr><w:spacing w:line="240" w:lineRule="auto"/><w:jc w:val="left"/></w:pPr><w:r><w:rPr><w:color w:val="152A35"/></w:rPr><w:t>check_env</w:t></w:r></w:p></w:tc><w:tc><w:tcPr><w:tcW w:w="5578" w:type="dxa"/><w:shd w:val="clear" w:color="auto" w:fill="F0F0F0"/><w:vAlign w:val="center"/></w:tcPr><w:p><w:pPr><w:spacing w:line="240" w:lineRule="auto"/><w:jc w:val="left"/></w:pPr><w:r><w:rPr><w:color w:val="152A35"/></w:rPr><w:t>Verifica entorno: AIS, SVN, dotnet, Python, BD</w:t></w:r></w:p></w:tc></w:tr><w:tr><w:trPr><w:trHeight w:val="500"/><w:jc w:val="center"/></w:trPr><w:tc><w:tcPr><w:tcW w:w="4000" w:type="dxa"/><w:shd w:val="clear" w:color="auto" w:fill="FFFFFF"/><w:vAlign w:val="center"/></w:tcPr><w:p><w:pPr><w:spacing w:line="240" w:lineRule="auto"/><w:jc w:val="left"/></w:pPr><w:r><w:rPr><w:color w:val="152A35"/></w:rPr><w:t>get_scope</w:t></w:r></w:p></w:tc><w:tc><w:tcPr><w:tcW w:w="5578" w:type="dxa"/><w:shd w:val="clear" w:color="auto" w:fill="FFFFFF"/><w:vAlign w:val="center"/></w:tcPr><w:p><w:pPr><w:spacing w:line="240" w:lineRule="auto"/><w:jc w:val="left"/></w:pPr><w:r><w:rPr><w:color w:val="152A35"/></w:rPr><w:t>Parsea el .sln y devuelve proyectos y rutas</w:t></w:r></w:p></w:tc></w:tr><w:tr><w:trPr><w:trHeight w:val="500"/><w:jc w:val="center"/></w:trPr><w:tc><w:tcPr><w:tcW w:w="4000" w:type="dxa"/><w:shd w:val="clear" w:color="auto" w:fill="F0F0F0"/><w:vAlign w:val="center"/></w:tcPr><w:p><w:pPr><w:spacing w:line="240" w:lineRule="auto"/><w:jc w:val="left"/></w:pPr><w:r><w:rPr><w:color w:val="152A35"/></w:rPr><w:t>ping</w:t></w:r></w:p></w:tc><w:tc><w:tcPr><w:tcW w:w="5578" w:type="dxa"/><w:shd w:val="clear" w:color="auto" w:fill="F0F0F0"/><w:vAlign w:val="center"/></w:tcPr><w:p><w:pPr><w:spacing w:line="240" w:lineRule="auto"/><w:jc w:val="left"/></w:pPr><w:r><w:rPr><w:color w:val="152A35"/></w:rPr><w:t>Test de conectividad del servidor MCP</w:t></w:r></w:p></w:tc></w:tr></w:tbl><w:p/><w:p><w:pPr><w:pStyle w:val="Ttulo1"/></w:pPr><w:bookmarkStart w:id="21" w:name="_Toc236310424"/><w:r><w:t>Arquitectura ScacsWeb asumida</w:t></w:r><w:bookmarkEnd w:id="21"/></w:p><w:p><w:r><w:t>El plugin asume la estructura estándar de proyectos ScacsWeb. Si el proyecto sigue una arquitectura diferente, algunos comandos pueden requerir ajuste manual.</w:t></w:r></w:p><w:p><w:pPr><w:pStyle w:val="Ttulo2"/></w:pPr><w:bookmarkStart w:id="22" w:name="_Toc236310425"/><w:r><w:t>Estructura de carpetas</w:t></w:r><w:bookmarkEnd w:id="22"/></w:p><w:p><w:pPr><w:shd w:val="clear" w:color="auto" w:fill="F5F5F5"/><w:spacing w:after="0" w:line="240" w:lineRule="auto"/></w:pPr><w:r><w:rPr><w:rFonts w:ascii="Courier New" w:hAnsi="Courier New" w:cs="Courier New"/><w:color w:val="152A35"/><w:sz w:val="18"/><w:szCs w:val="18"/></w:rPr><w:t>&lt;workspace&gt;/</w:t></w:r></w:p><w:p><w:pPr><w:shd w:val="clear" w:color="auto" w:fill="F5F5F5"/><w:spacing w:after="0" w:line="240" w:lineRule="auto"/></w:pPr><w:r><w:rPr><w:rFonts w:ascii="Courier New" w:hAnsi="Courier New" w:cs="Courier New"/><w:color w:val="152A35"/><w:sz w:val="18"/><w:szCs w:val="18"/></w:rPr><w:t>├── &lt;Proyecto&gt;.sln</w:t></w:r></w:p><w:p><w:pPr><w:shd w:val="clear" w:color="auto" w:fill="F5F5F5"/><w:spacing w:after="0" w:line="240" w:lineRule="auto"/></w:pPr><w:r><w:rPr><w:rFonts w:ascii="Courier New" w:hAnsi="Courier New" w:cs="Courier New"/><w:color w:val="152A35"/><w:sz w:val="18"/><w:szCs w:val="18"/></w:rPr><w:t>├── &lt;modulo&gt;/</w:t></w:r></w:p><w:p><w:pPr><w:shd w:val="clear" w:color="auto" w:fill="F5F5F5"/><w:spacing w:after="0" w:line="240" w:lineRule="auto"/></w:pPr><w:r><w:rPr><w:rFonts w:ascii="Courier New" w:hAnsi="Courier New" w:cs="Courier New"/><w:color w:val="152A35"/><w:sz w:val="18"/><w:szCs w:val="18"/></w:rPr><w:t>│   ├── BPC/          ← Business Process Classes</w:t></w:r></w:p><w:p><w:pPr><w:shd w:val="clear" w:color="auto" w:fill="F5F5F5"/><w:spacing w:after="0" w:line="240" w:lineRule="auto"/></w:pPr><w:r><w:rPr><w:rFonts w:ascii="Courier New" w:hAnsi="Courier New" w:cs="Courier New"/><w:color w:val="152A35"/><w:sz w:val="18"/><w:szCs w:val="18"/></w:rPr><w:t>│   ├── BE/           ← Business Entities</w:t></w:r></w:p><w:p><w:pPr><w:shd w:val="clear" w:color="auto" w:fill="F5F5F5"/><w:spacing w:after="0" w:line="240" w:lineRule="auto"/></w:pPr><w:r><w:rPr><w:rFonts w:ascii="Courier New" w:hAnsi="Courier New" w:cs="Courier New"/><w:color w:val="152A35"/><w:sz w:val="18"/><w:szCs w:val="18"/></w:rPr><w:lastRenderedPageBreak/><w:t>│   └── DALC/         ← Data Access Layer Classes</w:t></w:r></w:p><w:p><w:pPr><w:shd w:val="clear" w:color="auto" w:fill="F5F5F5"/><w:spacing w:after="0" w:line="240" w:lineRule="auto"/></w:pPr><w:r><w:rPr><w:rFonts w:ascii="Courier New" w:hAnsi="Courier New" w:cs="Courier New"/><w:color w:val="152A35"/><w:sz w:val="18"/><w:szCs w:val="18"/></w:rPr><w:t>├── XMLConfig.xml     ← Configuración de conexión BD</w:t></w:r></w:p><w:p><w:pPr><w:shd w:val="clear" w:color="auto" w:fill="F5F5F5"/><w:spacing w:after="0" w:line="240" w:lineRule="auto"/></w:pPr><w:r><w:rPr><w:rFonts w:ascii="Courier New" w:hAnsi="Courier New" w:cs="Courier New"/><w:color w:val="152A35"/><w:sz w:val="18"/><w:szCs w:val="18"/></w:rPr><w:t>└── model.json        ← Modelo BD en JSON (sincronizado por el plugin)</w:t></w:r></w:p><w:p/><w:p><w:pPr><w:pStyle w:val="Ttulo2"/></w:pPr><w:bookmarkStart w:id="23" w:name="_Toc236310426"/><w:r><w:t>Convenciones</w:t></w:r><w:bookmarkEnd w:id="23"/></w:p><w:tbl><w:tblPr><w:tblStyle w:val="a"/><w:tblW w:w="9578" w:type="dxa"/><w:jc w:val="center"/><w:tblBorders><w:top w:val="single" w:sz="4" w:space="0" w:color="DDDDDD"/><w:left w:val="single" w:sz="4" w:space="0" w:color="DDDDDD"/><w:bottom w:val="single" w:sz="4" w:space="0" w:color="DDDDDD"/><w:right w:val="single" w:sz="4" w:space="0" w:color="DDDDDD"/><w:insideH w:val="single" w:sz="4" w:space="0" w:color="DDDDDD"/><w:insideV w:val="single" w:sz="4" w:space="0" w:color="DDDDDD"/></w:tblBorders><w:tblLayout w:type="fixed"/><w:tblLook w:val="04A0" w:firstRow="1" w:lastRow="0" w:firstColumn="1" w:lastColumn="0" w:noHBand="0" w:noVBand="1"/></w:tblPr><w:tblGrid><w:gridCol w:w="3000"/><w:gridCol w:w="6578"/></w:tblGrid><w:tr><w:trPr><w:trHeight w:val="500"/><w:jc w:val="center"/></w:trPr><w:tc><w:tcPr><w:tcW w:w="3000" w:type="dxa"/><w:shd w:val="clear" w:color="auto" w:fill="00F7BC"/><w:vAlign w:val="center"/></w:tcPr><w:p><w:pPr><w:spacing w:line="240" w:lineRule="auto"/><w:jc w:val="left"/></w:pPr><w:r><w:rPr><w:b/><w:bCs/><w:color w:val="152A35"/></w:rPr><w:t>ELEMENTO</w:t></w:r></w:p></w:tc><w:tc><w:tcPr><w:tcW w:w="6578" w:type="dxa"/><w:shd w:val="clear" w:color="auto" w:fill="00F7BC"/><w:vAlign w:val="center"/></w:tcPr><w:p><w:pPr><w:spacing w:line="240" w:lineRule="auto"/><w:jc w:val="left"/></w:pPr><w:r><w:rPr><w:b/><w:bCs/><w:color w:val="152A35"/></w:rPr><w:t>VALOR</w:t></w:r></w:p></w:tc></w:tr><w:tr><w:trPr><w:trHeight w:val="500"/><w:jc w:val="center"/></w:trPr><w:tc><w:tcPr><w:tcW w:w="3000" w:type="dxa"/><w:shd w:val="clear" w:color="auto" w:fill="FFFFFF"/><w:vAlign w:val="center"/></w:tcPr><w:p><w:pPr><w:spacing w:line="240" w:lineRule="auto"/><w:jc w:val="left"/></w:pPr><w:r><w:rPr><w:color w:val="152A35"/></w:rPr><w:t>Framework</w:t></w:r></w:p></w:tc><w:tc><w:tcPr><w:tcW w:w="6578" w:type="dxa"/><w:shd w:val="clear" w:color="auto" w:fill="FFFFFF"/><w:vAlign w:val="center"/></w:tcPr><w:p><w:pPr><w:spacing w:line="240" w:lineRule="auto"/><w:jc w:val="left"/></w:pPr><w:r><w:rPr><w:color w:val="152A35"/></w:rPr><w:t>ASP.NET WebForms / .NET Framework 4.0 / C# 7.3</w:t></w:r></w:p></w:tc></w:tr><w:tr><w:trPr><w:trHeight w:val="500"/><w:jc w:val="center"/></w:trPr><w:tc><w:tcPr><w:tcW w:w="3000" w:type="dxa"/><w:shd w:val="clear" w:color="auto" w:fill="F0F0F0"/><w:vAlign w:val="center"/></w:tcPr><w:p><w:pPr><w:spacing w:line="240" w:lineRule="auto"/><w:jc w:val="left"/></w:pPr><w:r><w:rPr><w:color w:val="152A35"/></w:rPr><w:t>VCS</w:t></w:r></w:p></w:tc><w:tc><w:tcPr><w:tcW w:w="6578" w:type="dxa"/><w:shd w:val="clear" w:color="auto" w:fill="F0F0F0"/><w:vAlign w:val="center"/></w:tcPr><w:p><w:pPr><w:spacing w:line="240" w:lineRule="auto"/><w:jc w:val="left"/></w:pPr><w:r><w:rPr><w:color w:val="152A35"/></w:rPr><w:t>SVN (TortoiseSVN primario) + Git secundario</w:t></w:r></w:p></w:tc></w:tr><w:tr><w:trPr><w:trHeight w:val="500"/><w:jc w:val="center"/></w:trPr><w:tc><w:tcPr><w:tcW w:w="3000" w:type="dxa"/><w:shd w:val="clear" w:color="auto" w:fill="FFFFFF"/><w:vAlign w:val="center"/></w:tcPr><w:p><w:pPr><w:spacing w:line="240" w:lineRule="auto"/><w:jc w:val="left"/></w:pPr><w:r><w:rPr><w:color w:val="152A35"/></w:rPr><w:t>Bases de datos</w:t></w:r></w:p></w:tc><w:tc><w:tcPr><w:tcW w:w="6578" w:type="dxa"/><w:shd w:val="clear" w:color="auto" w:fill="FFFFFF"/><w:vAlign w:val="center"/></w:tcPr><w:p><w:pPr><w:spacing w:line="240" w:lineRule="auto"/><w:jc w:val="left"/></w:pPr><w:r><w:rPr><w:color w:val="152A35"/></w:rPr><w:t>Oracle 19c y/o SQL Server</w:t></w:r></w:p></w:tc></w:tr><w:tr><w:trPr><w:trHeight w:val="500"/><w:jc w:val="center"/></w:trPr><w:tc><w:tcPr><w:tcW w:w="3000" w:type="dxa"/><w:shd w:val="clear" w:color="auto" w:fill="F0F0F0"/><w:vAlign w:val="center"/></w:tcPr><w:p><w:pPr><w:spacing w:line="240" w:lineRule="auto"/><w:jc w:val="left"/></w:pPr><w:r><w:rPr><w:color w:val="152A35"/></w:rPr><w:t>Naming de módulos</w:t></w:r></w:p></w:tc><w:tc><w:tcPr><w:tcW w:w="6578" w:type="dxa"/><w:shd w:val="clear" w:color="auto" w:fill="F0F0F0"/><w:vAlign w:val="center"/></w:tcPr><w:p><w:pPr><w:spacing w:line="240" w:lineRule="auto"/><w:jc w:val="left"/></w:pPr><w:r><w:rPr><w:color w:val="152A35"/></w:rPr><w:t>AIS.PR.BR.EC.CL</w:t></w:r></w:p></w:tc></w:tr><w:tr><w:trPr><w:trHeight w:val="500"/><w:jc w:val="center"/></w:trPr><w:tc><w:tcPr><w:tcW w:w="3000" w:type="dxa"/><w:shd w:val="clear" w:color="auto" w:fill="FFFFFF"/><w:vAlign w:val="center"/></w:tcPr><w:p><w:pPr><w:spacing w:line="240" w:lineRule="auto"/><w:jc w:val="left"/></w:pPr><w:r><w:rPr><w:color w:val="152A35"/></w:rPr><w:t>Rutas AIS Batch</w:t></w:r></w:p></w:tc><w:tc><w:tcPr><w:tcW w:w="6578" w:type="dxa"/><w:shd w:val="clear" w:color="auto" w:fill="FFFFFF"/><w:vAlign w:val="center"/></w:tcPr><w:p><w:pPr><w:spacing w:line="240" w:lineRule="auto"/><w:jc w:val="left"/></w:pPr><w:r><w:rPr><w:color w:val="152A35"/></w:rPr><w:t>C:\AIS\&lt;proyecto&gt;\bin\</w:t></w:r></w:p></w:tc></w:tr><w:tr><w:trPr><w:trHeight w:val="500"/><w:jc w:val="center"/></w:trPr><w:tc><w:tcPr><w:tcW w:w="3000" w:type="dxa"/><w:shd w:val="clear" w:color="auto" w:fill="F0F0F0"/><w:vAlign w:val="center"/></w:tcPr><w:p><w:pPr><w:spacing w:line="240" w:lineRule="auto"/><w:jc w:val="left"/></w:pPr><w:r><w:rPr><w:color w:val="152A35"/></w:rPr><w:t>Rutas AIS Online</w:t></w:r></w:p></w:tc><w:tc><w:tcPr><w:tcW w:w="6578" w:type="dxa"/><w:shd w:val="clear" w:color="auto" w:fill="F0F0F0"/><w:vAlign w:val="center"/></w:tcPr><w:p><w:pPr><w:spacing w:line="240" w:lineRule="auto"/><w:jc w:val="left"/></w:pPr><w:r><w:rPr><w:color w:val="152A35"/></w:rPr><w:t>C:\AIS\&lt;proyecto&gt;\Web\</w:t></w:r></w:p></w:tc></w:tr></w:tbl><w:p/><w:p><w:pPr><w:pStyle w:val="Ttulo1"/></w:pPr><w:bookmarkStart w:id="24" w:name="_Toc236310427"/><w:r><w:t>Flujo de trabajo típico</w:t></w:r><w:bookmarkEnd w:id="24"/></w:p><w:tbl><w:tblPr><w:tblStyle w:val="a"/><w:tblW w:w="9578" w:type="dxa"/><w:jc w:val="center"/><w:tblBorders><w:top w:val="single" w:sz="4" w:space="0" w:color="DDDDDD"/><w:left w:val="single" w:sz="4" w:space="0" w:color="DDDDDD"/><w:bottom w:val="single" w:sz="4" w:space="0" w:color="DDDDDD"/><w:right w:val="single" w:sz="4" w:space="0" w:color="DDDDDD"/><w:insideH w:val="single" w:sz="4" w:space="0" w:color="DDDDDD"/><w:insideV w:val="single" w:sz="4" w:space="0" w:color="DDDDDD"/></w:tblBorders><w:tblLayout w:type="fixed"/><w:tblLook w:val="04A0" w:firstRow="1" w:lastRow="0" w:firstColumn="1" w:lastColumn="0" w:noHBand="0" w:noVBand="1"/></w:tblPr><w:tblGrid><w:gridCol w:w="800"/><w:gridCol w:w="3500"/><w:gridCol w:w="5278"/></w:tblGrid><w:tr><w:trPr><w:trHeight w:val="500"/><w:jc w:val="center"/></w:trPr><w:tc><w:tcPr><w:tcW w:w="800" w:type="dxa"/><w:shd w:val="clear" w:color="auto" w:fill="00F7BC"/><w:vAlign w:val="center"/></w:tcPr><w:p><w:pPr><w:spacing w:line="240" w:lineRule="auto"/><w:jc w:val="left"/></w:pPr><w:r><w:rPr><w:b/><w:bCs/><w:color w:val="152A35"/></w:rPr><w:t>PASO</w:t></w:r></w:p></w:tc><w:tc><w:tcPr><w:tcW w:w="3500" w:type="dxa"/><w:shd w:val="clear" w:color="auto" w:fill="00F7BC"/><w:vAlign w:val="center"/></w:tcPr><w:p><w:pPr><w:spacing w:line="240" w:lineRule="auto"/><w:jc w:val="left"/></w:pPr><w:r><w:rPr><w:b/><w:bCs/><w:color w:val="152A35"/></w:rPr><w:t>COMANDO</w:t></w:r></w:p></w:tc><w:tc><w:tcPr><w:tcW w:w="5278" w:type="dxa"/><w:shd w:val="clear" w:color="auto" w:fill="00F7BC"/><w:vAlign w:val="center"/></w:tcPr><w:p><w:pPr><w:spacing w:line="240" w:lineRule="auto"/><w:jc w:val="left"/></w:pPr><w:r><w:rPr><w:b/><w:bCs/><w:color w:val="152A35"/></w:rPr><w:t>CUÁNDO</w:t></w:r></w:p></w:tc></w:tr><w:tr><w:trPr><w:trHeight w:val="500"/><w:jc w:val="center"/></w:trPr><w:tc><w:tcPr><w:tcW w:w="800" w:type="dxa"/><w:shd w:val="clear" w:color="auto" w:fill="FFFFFF"/><w:vAlign w:val="center"/></w:tcPr><w:p><w:pPr><w:spacing w:line="240" w:lineRule="auto"/><w:jc w:val="left"/></w:pPr><w:r><w:rPr><w:color w:val="152A35"/></w:rPr><w:t>1</w:t></w:r></w:p></w:tc><w:tc><w:tcPr><w:tcW w:w="3500" w:type="dxa"/><w:shd w:val="clear" w:color="auto" w:fill="FFFFFF"/><w:vAlign w:val="center"/></w:tcPr><w:p><w:pPr><w:spacing w:line="240" w:lineRule="auto"/><w:jc w:val="left"/></w:pPr><w:r><w:rPr><w:color w:val="152A35"/></w:rPr><w:t>/orchestrator-init</w:t></w:r></w:p></w:tc><w:tc><w:tcPr><w:tcW w:w="5278" w:type="dxa"/><w:shd w:val="clear" w:color="auto" w:fill="FFFFFF"/><w:vAlign w:val="center"/></w:tcPr><w:p><w:pPr><w:spacing w:line="240" w:lineRule="auto"/><w:jc w:val="left"/></w:pPr><w:r><w:rPr><w:color w:val="152A35"/></w:rPr><w:t>Bootstrap inicial del workspace (una vez)</w:t></w:r></w:p></w:tc></w:tr><w:tr><w:trPr><w:trHeight w:val="500"/><w:jc w:val="center"/></w:trPr><w:tc><w:tcPr><w:tcW w:w="800" w:type="dxa"/><w:shd w:val="clear" w:color="auto" w:fill="F0F0F0"/><w:vAlign w:val="center"/></w:tcPr><w:p><w:pPr><w:spacing w:line="240" w:lineRule="auto"/><w:jc w:val="left"/></w:pPr><w:r><w:rPr><w:color w:val="152A35"/></w:rPr><w:t>2</w:t></w:r></w:p></w:tc><w:tc><w:tcPr><w:tcW w:w="3500" w:type="dxa"/><w:shd w:val="clear" w:color="auto" w:fill="F0F0F0"/><w:vAlign w:val="center"/></w:tcPr><w:p><w:pPr><w:spacing w:line="240" w:lineRule="auto"/><w:jc w:val="left"/></w:pPr><w:r><w:rPr><w:color w:val="152A35"/></w:rPr><w:t>/orchestrator-validar-entorno</w:t></w:r></w:p></w:tc><w:tc><w:tcPr><w:tcW w:w="5278" w:type="dxa"/><w:shd w:val="clear" w:color="auto" w:fill="F0F0F0"/><w:vAlign w:val="center"/></w:tcPr><w:p><w:pPr><w:spacing w:line="240" w:lineRule="auto"/><w:jc w:val="left"/></w:pPr><w:r><w:rPr><w:color w:val="152A35"/></w:rPr><w:t>Comprueba que todo esté OK</w:t></w:r></w:p></w:tc></w:tr><w:tr><w:trPr><w:trHeight w:val="500"/><w:jc w:val="center"/></w:trPr><w:tc><w:tcPr><w:tcW w:w="800" w:type="dxa"/><w:shd w:val="clear" w:color="auto" w:fill="FFFFFF"/><w:vAlign w:val="center"/></w:tcPr><w:p><w:pPr><w:spacing w:line="240" w:lineRule="auto"/><w:jc w:val="left"/></w:pPr><w:r><w:rPr><w:color w:val="152A35"/></w:rPr><w:t>3</w:t></w:r></w:p></w:tc><w:tc><w:tcPr><w:tcW w:w="3500" w:type="dxa"/><w:shd w:val="clear" w:color="auto" w:fill="FFFFFF"/><w:vAlign w:val="center"/></w:tcPr><w:p><w:pPr><w:spacing w:line="240" w:lineRule="auto"/><w:jc w:val="left"/></w:pPr><w:r><w:rPr><w:color w:val="152A35"/></w:rPr><w:t>—</w:t></w:r></w:p></w:tc><w:tc><w:tcPr><w:tcW w:w="5278" w:type="dxa"/><w:shd w:val="clear" w:color="auto" w:fill="FFFFFF"/><w:vAlign w:val="center"/></w:tcPr><w:p><w:pPr><w:spacing w:line="240" w:lineRule="auto"/><w:jc w:val="left"/></w:pPr><w:r><w:rPr><w:color w:val="152A35"/></w:rPr><w:t>Desarrollar el cambio</w:t></w:r></w:p></w:tc></w:tr><w:tr><w:trPr><w:trHeight w:val="500"/><w:jc w:val="center"/></w:trPr><w:tc><w:tcPr><w:tcW w:w="800" w:type="dxa"/><w:shd w:val="clear" w:color="auto" w:fill="F0F0F0"/><w:vAlign w:val="center"/></w:tcPr><w:p><w:pPr><w:spacing w:line="240" w:lineRule="auto"/><w:jc w:val="left"/></w:pPr><w:r><w:rPr><w:color w:val="152A35"/></w:rPr><w:t>4</w:t></w:r></w:p></w:tc><w:tc><w:tcPr><w:tcW w:w="3500" w:type="dxa"/><w:shd w:val="clear" w:color="auto" w:fill="F0F0F0"/><w:vAlign w:val="center"/></w:tcPr><w:p><w:pPr><w:spacing w:line="240" w:lineRule="auto"/><w:jc w:val="left"/></w:pPr><w:r><w:rPr><w:color w:val="152A35"/></w:rPr><w:t>/orchestrator-analizar</w:t></w:r></w:p></w:tc><w:tc><w:tcPr><w:tcW w:w="5278" w:type="dxa"/><w:shd w:val="clear" w:color="auto" w:fill="F0F0F0"/><w:vAlign w:val="center"/></w:tcPr><w:p><w:pPr><w:spacing w:line="240" w:lineRule="auto"/><w:jc w:val="left"/></w:pPr><w:r><w:rPr><w:color w:val="152A35"/></w:rPr><w:t>Análisis de calidad del diff</w:t></w:r></w:p></w:tc></w:tr><w:tr><w:trPr><w:trHeight w:val="500"/><w:jc w:val="center"/></w:trPr><w:tc><w:tcPr><w:tcW w:w="800" w:type="dxa"/><w:shd w:val="clear" w:color="auto" w:fill="FFFFFF"/><w:vAlign w:val="center"/></w:tcPr><w:p><w:pPr><w:spacing w:line="240" w:lineRule="auto"/><w:jc w:val="left"/></w:pPr><w:r><w:rPr><w:color w:val="152A35"/></w:rPr><w:t>5</w:t></w:r></w:p></w:tc><w:tc><w:tcPr><w:tcW w:w="3500" w:type="dxa"/><w:shd w:val="clear" w:color="auto" w:fill="FFFFFF"/><w:vAlign w:val="center"/></w:tcPr><w:p><w:pPr><w:spacing w:line="240" w:lineRule="auto"/><w:jc w:val="left"/></w:pPr><w:r><w:rPr><w:color w:val="152A35"/></w:rPr><w:t>/orchestrator-validator</w:t></w:r></w:p></w:tc><w:tc><w:tcPr><w:tcW w:w="5278" w:type="dxa"/><w:shd w:val="clear" w:color="auto" w:fill="FFFFFF"/><w:vAlign w:val="center"/></w:tcPr><w:p><w:pPr><w:spacing w:line="240" w:lineRule="auto"/><w:jc w:val="left"/></w:pPr><w:r><w:rPr><w:color w:val="152A35"/></w:rPr><w:t>Valida compilación</w:t></w:r></w:p></w:tc></w:tr><w:tr><w:trPr><w:trHeight w:val="500"/><w:jc w:val="center"/></w:trPr><w:tc><w:tcPr><w:tcW w:w="800" w:type="dxa"/><w:shd w:val="clear" w:color="auto" w:fill="F0F0F0"/><w:vAlign w:val="center"/></w:tcPr><w:p><w:pPr><w:spacing w:line="240" w:lineRule="auto"/><w:jc w:val="left"/></w:pPr><w:r><w:rPr><w:color w:val="152A35"/></w:rPr><w:t>6</w:t></w:r></w:p></w:tc><w:tc><w:tcPr><w:tcW w:w="3500" w:type="dxa"/><w:shd w:val="clear" w:color="auto" w:fill="F0F0F0"/><w:vAlign w:val="center"/></w:tcPr><w:p><w:pPr><w:spacing w:line="240" w:lineRule="auto"/><w:jc w:val="left"/></w:pPr><w:r><w:rPr><w:color w:val="152A35"/></w:rPr><w:t>/orchestrator-review</w:t></w:r></w:p></w:tc><w:tc><w:tcPr><w:tcW w:w="5278" w:type="dxa"/><w:shd w:val="clear" w:color="auto" w:fill="F0F0F0"/><w:vAlign w:val="center"/></w:tcPr><w:p><w:pPr><w:spacing w:line="240" w:lineRule="auto"/><w:jc w:val="left"/></w:pPr><w:r><w:rPr><w:color w:val="152A35"/></w:rPr><w:t>Revisión pre-commit</w:t></w:r></w:p></w:tc></w:tr><w:tr><w:trPr><w:trHeight w:val="500"/><w:jc w:val="center"/></w:trPr><w:tc><w:tcPr><w:tcW w:w="800" w:type="dxa"/><w:shd w:val="clear" w:color="auto" w:fill="FFFFFF"/><w:vAlign w:val="center"/></w:tcPr><w:p><w:pPr><w:spacing w:line="240" w:lineRule="auto"/><w:jc w:val="left"/></w:pPr><w:r><w:rPr><w:color w:val="152A35"/></w:rPr><w:t>7</w:t></w:r></w:p></w:tc><w:tc><w:tcPr><w:tcW w:w="3500" w:type="dxa"/><w:shd w:val="clear" w:color="auto" w:fill="FFFFFF"/><w:vAlign w:val="center"/></w:tcPr><w:p><w:pPr><w:spacing w:line="240" w:lineRule="auto"/><w:jc w:val="left"/></w:pPr><w:r><w:rPr><w:color w:val="152A35"/></w:rPr><w:t>/orchestrator-commit</w:t></w:r></w:p></w:tc><w:tc><w:tcPr><w:tcW w:w="5278" w:type="dxa"/><w:shd w:val="clear" w:color="auto" w:fill="FFFFFF"/><w:vAlign w:val="center"/></w:tcPr><w:p><w:pPr><w:spacing w:line="240" w:lineRule="auto"/><w:jc w:val="left"/></w:pPr><w:r><w:rPr><w:color w:val="152A35"/></w:rPr><w:t>Commit estructurado SVN/Git</w:t></w:r></w:p></w:tc></w:tr></w:tbl><w:p/><w:p><w:pPr><w:pStyle w:val="Ttulo1"/></w:pPr><w:bookmarkStart w:id="25" w:name="_Toc236310428"/><w:r><w:t>Preguntas frecuentes</w:t></w:r><w:bookmarkEnd w:id="25"/></w:p><w:p><w:pPr><w:pStyle w:val="Ttulo2"/></w:pPr><w:bookmarkStart w:id="26" w:name="_Toc236310429"/><w:r><w:t>¿El servidor MCP consume recursos en segundo plano?</w:t></w:r><w:bookmarkEnd w:id="26"/></w:p><w:p><w:r><w:lastRenderedPageBreak/><w:t>No. Arranca únicamente cuando se ejecuta el primer comando /orchestrator-* en la sesión y se detiene al cerrar Claude Code.</w:t></w:r></w:p><w:p><w:pPr><w:pStyle w:val="Ttulo2"/></w:pPr><w:bookmarkStart w:id="27" w:name="_Toc236310430"/><w:r><w:t>¿Puedo usar el plugin en proyectos que no son ScacsWeb?</w:t></w:r><w:bookmarkEnd w:id="27"/></w:p><w:p><w:r><w:t>Los comandos de análisis, revisión e historial son agnósticos y funcionan en cualquier proyecto .NET. Los comandos de scaffolding (DALC, migrar, init) están pensados para ScacsWeb y pueden requerir adaptación.</w:t></w:r></w:p><w:p><w:pPr><w:pStyle w:val="Ttulo2"/></w:pPr><w:bookmarkStart w:id="28" w:name="_Toc236310431"/><w:r><w:t>¿El plugin accede a Internet?</w:t></w:r><w:bookmarkEnd w:id="28"/></w:p><w:p><w:r><w:t>No. Todo corre en local. El único acceso de red es a la BD del proyecto (si está en un servidor) y a MantisBT (si se usan los comandos /orchestrator-mantis).</w:t></w:r></w:p><w:p><w:pPr><w:pStyle w:val="Ttulo2"/></w:pPr><w:r><w:t>&#xBF;Debo tener la skill project-db-env instalada?</w:t></w:r></w:p><w:p><w:r><w:t xml:space="preserve">No. Desde v1.6.0 el contexto de base de datos est&#xE1; integrado directamente en el plugin (env.json, projects/*/config.json y projects/*/schema.md). Si ten&#xED;as la skill externa instalada puedes desinstalarla.</w:t></w:r></w:p><w:p><w:pPr><w:pStyle w:val="Ttulo2"/></w:pPr><w:r><w:t>&#xBF;env.json se sube al repositorio?</w:t></w:r></w:p><w:p><w:r><w:t xml:space="preserve">No. Est&#xE1; en .gitignore. Solo env.template.json (con placeholders) se versiona. Cada desarrollador crea su propio env.json local con sus credenciales reales.</w:t></w:r></w:p><w:p><w:pPr><w:pStyle w:val="Ttulo1"/></w:pPr><w:bookmarkStart w:id="29" w:name="_Toc236310432"/><w:r><w:t>Soporte</w:t></w:r><w:bookmarkEnd w:id="29"/></w:p><w:tbl><w:tblPr><w:tblStyle w:val="a"/><w:tblW w:w="9578" w:type="dxa"/><w:jc w:val="center"/><w:tblBorders><w:top w:val="single" w:sz="4" w:space="0" w:color="DDDDDD"/><w:left w:val="single" w:sz="4" w:space="0" w:color="DDDDDD"/><w:bottom w:val="single" w:sz="4" w:space="0" w:color="DDDDDD"/><w:right w:val="single" w:sz="4" w:space="0" w:color="DDDDDD"/><w:insideH w:val="single" w:sz="4" w:space="0" w:color="DDDDDD"/><w:insideV w:val="single" w:sz="4" w:space="0" w:color="DDDDDD"/></w:tblBorders><w:tblLayout w:type="fixed"/><w:tblLook w:val="04A0" w:firstRow="1" w:lastRow="0" w:firstColumn="1" w:lastColumn="0" w:noHBand="0" w:noVBand="1"/></w:tblPr><w:tblGrid><w:gridCol w:w="2500"/><w:gridCol w:w="7078"/></w:tblGrid><w:tr><w:trPr><w:trHeight w:val="500"/><w:jc w:val="center"/></w:trPr><w:tc><w:tcPr><w:tcW w:w="2500" w:type="dxa"/><w:shd w:val="clear" w:color="auto" w:fill="00F7BC"/><w:vAlign w:val="center"/></w:tcPr><w:p><w:pPr><w:spacing w:line="240" w:lineRule="auto"/><w:jc w:val="left"/></w:pPr><w:r><w:rPr><w:b/><w:bCs/><w:color w:val="152A35"/></w:rPr><w:t>INFORMACIÓN</w:t></w:r></w:p></w:tc><w:tc><w:tcPr><w:tcW w:w="7078" w:type="dxa"/><w:shd w:val="clear" w:color="auto" w:fill="00F7BC"/><w:vAlign w:val="center"/></w:tcPr><w:p><w:pPr><w:spacing w:line="240" w:lineRule="auto"/><w:jc w:val="left"/></w:pPr><w:r><w:rPr><w:b/><w:bCs/><w:color w:val="152A35"/></w:rPr><w:t>DETALLE</w:t></w:r></w:p></w:tc></w:tr><w:tr><w:trPr><w:trHeight w:val="500"/><w:jc w:val="center"/></w:trPr><w:tc><w:tcPr><w:tcW w:w="2500" w:type="dxa"/><w:shd w:val="clear" w:color="auto" w:fill="FFFFFF"/><w:vAlign w:val="center"/></w:tcPr><w:p><w:pPr><w:spacing w:line="240" w:lineRule="auto"/><w:jc w:val="left"/></w:pPr><w:r><w:rPr><w:color w:val="152A35"/></w:rPr><w:t>Repositorio</w:t></w:r></w:p></w:tc><w:tc><w:tcPr><w:tcW w:w="7078" w:type="dxa"/><w:shd w:val="clear" w:color="auto" w:fill="FFFFFF"/><w:vAlign w:val="center"/></w:tcPr><w:p><w:pPr><w:spacing w:line="240" w:lineRule="auto"/><w:jc w:val="left"/></w:pPr><w:r><w:rPr><w:color w:val="152A35"/></w:rPr><w:t>https://github.com/aisaplica/Orchestrator-Agent.git</w:t></w:r></w:p></w:tc></w:tr><w:tr><w:trPr><w:trHeight w:val="500"/><w:jc w:val="center"/></w:trPr><w:tc><w:tcPr><w:tcW w:w="2500" w:type="dxa"/><w:shd w:val="clear" w:color="auto" w:fill="F0F0F0"/><w:vAlign w:val="center"/></w:tcPr><w:p><w:pPr><w:spacing w:line="240" w:lineRule="auto"/><w:jc w:val="left"/></w:pPr><w:r><w:rPr><w:color w:val="152A35"/></w:rPr><w:t>Versión actual</w:t></w:r></w:p></w:tc><w:tc><w:tcPr><w:tcW w:w="7078" w:type="dxa"/><w:shd w:val="clear" w:color="auto" w:fill="F0F0F0"/><w:vAlign w:val="center"/></w:tcPr><w:p><w:pPr><w:spacing w:line="240" w:lineRule="auto"/><w:jc w:val="left"/></w:pPr><w:r><w:rPr><w:color w:val="152A35"/></w:rPr><w:t>v1.6.0 (2026-08-07)</w:t></w:r></w:p></w:tc></w:tr><w:tr><w:trPr><w:trHeight w:val="500"/><w:jc w:val="center"/></w:trPr><w:tc><w:tcPr><w:tcW w:w="2500" w:type="dxa"/><w:shd w:val="clear" w:color="auto" w:fill="FFFFFF"/><w:vAlign w:val="center"/></w:tcPr><w:p><w:pPr><w:spacing w:line="240" w:lineRule="auto"/><w:jc w:val="left"/></w:pPr><w:r><w:rPr><w:color w:val="152A35"/></w:rPr><w:t>Incidencias</w:t></w:r></w:p></w:tc><w:tc><w:tcPr><w:tcW w:w="7078" w:type="dxa"/><w:shd w:val="clear" w:color="auto" w:fill="FFFFFF"/><w:vAlign w:val="center"/></w:tcPr><w:p><w:pPr><w:spacing w:line="240" w:lineRule="auto"/><w:jc w:val="left"/></w:pPr><w:r><w:rPr><w:color w:val="152A35"/></w:rPr><w:t>Abrir issue en el repositorio o contactar con el equipo de IA</w:t></w:r></w:p></w:tc></w:tr></w:tbl><w:p/><w:sectPr><w:headerReference w:type="default" r:id="rId18"/><w:footerReference w:type="default" r:id="rId19"/><w:headerReference w:type="first" r:id="rId20"/><w:pgSz w:w="11906" w:h="16838"/><w:pgMar w:top="0" w:right="1418" w:bottom="1418" w:left="1418" w:header="1531" w:footer="1021" w:gutter="0"/><w:cols w:space="720"/></w:sectPr></w:body></w:document>
-</file>
-
-<file path=word\endnotes.xml><?xml version="1.0" encoding="utf-8"?>
+<file path=word/endnotes.xml><?xml version="1.0" encoding="utf-8"?>
 <w:endnotes xmlns:wpc="http://schemas.microsoft.com/office/word/2010/wordprocessingCanvas" xmlns:cx="http://schemas.microsoft.com/office/drawing/2014/chartex" xmlns:cx1="http://schemas.microsoft.com/office/drawing/2015/9/8/chartex" xmlns:cx2="http://schemas.microsoft.com/office/drawing/2015/10/21/chartex" xmlns:cx3="http://schemas.microsoft.com/office/drawing/2016/5/9/chartex" xmlns:cx4="http://schemas.microsoft.com/office/drawing/2016/5/10/chartex" xmlns:cx5="http://schemas.microsoft.com/office/drawing/2016/5/11/chartex" xmlns:cx6="http://schemas.microsoft.com/office/drawing/2016/5/12/chartex" xmlns:cx7="http://schemas.microsoft.com/office/drawing/2016/5/13/chartex" xmlns:cx8="http://schemas.microsoft.com/office/drawing/2016/5/14/chartex" xmlns:mc="http://schemas.openxmlformats.org/markup-compatibility/2006" xmlns:aink="http://schemas.microsoft.com/office/drawing/2016/ink" xmlns:am3d="http://schemas.microsoft.com/office/drawing/2017/model3d" xmlns:o="urn:schemas-microsoft-com:office:office" xmlns:oel="http://schemas.microsoft.com/office/2019/extlst" xmlns:r="http://schemas.openxmlformats.org/officeDocument/2006/relationships" xmlns:m="http://schemas.openxmlformats.org/officeDocument/2006/math" xmlns:v="urn:schemas-microsoft-com:vml" xmlns:wp14="http://schemas.microsoft.com/office/word/2010/wordprocessingDrawing" xmlns:wp="http://schemas.openxmlformats.org/drawingml/2006/wordprocessingDrawing" xmlns:w10="urn:schemas-microsoft-com:office:word" xmlns:w="http://schemas.openxmlformats.org/wordprocessingml/2006/main" xmlns:w14="http://schemas.microsoft.com/office/word/2010/wordml" xmlns:w15="http://schemas.microsoft.com/office/word/2012/wordml" xmlns:w16cei="http://schemas.microsoft.com/office/word/2026/wordml/cei" xmlns:w16cex="http://schemas.microsoft.com/office/word/2018/wordml/cex" xmlns:w16cid="http://schemas.microsoft.com/office/word/2016/wordml/cid" xmlns:w16="http://schemas.microsoft.com/office/word/2018/wordml" xmlns:w16du="http://schemas.microsoft.com/office/word/2023/wordml/word16du" xmlns:w16sdtdh="http://schemas.microsoft.com/office/word/2020/wordml/sdtdatahash" xmlns:w16sdtfl="http://schemas.microsoft.com/office/word/2024/wordml/sdtformatlock" xmlns:w16se="http://schemas.microsoft.com/office/word/2015/wordml/symex" xmlns:wpg="http://schemas.microsoft.com/office/word/2010/wordprocessingGroup" xmlns:wpi="http://schemas.microsoft.com/office/word/2010/wordprocessingInk" xmlns:wne="http://schemas.microsoft.com/office/word/2006/wordml" xmlns:wps="http://schemas.microsoft.com/office/word/2010/wordprocessingShape" mc:Ignorable="w14 w15 w16se w16cid w16 w16cex w16sdtdh w16sdtfl w16du wp14">
   <w:endnote w:type="separator" w:id="-1">
     <w:p>
@@ -412,128 +27,7 @@
 </w:endnotes>
 </file>
 
-<file path=word\fontTable.xml><?xml version="1.0" encoding="utf-8"?>
-<w:fonts xmlns:mc="http://schemas.openxmlformats.org/markup-compatibility/2006" xmlns:r="http://schemas.openxmlformats.org/officeDocument/2006/relationships" xmlns:w="http://schemas.openxmlformats.org/wordprocessingml/2006/main" xmlns:w14="http://schemas.microsoft.com/office/word/2010/wordml" xmlns:w15="http://schemas.microsoft.com/office/word/2012/wordml" xmlns:w16cex="http://schemas.microsoft.com/office/word/2018/wordml/cex" xmlns:w16cid="http://schemas.microsoft.com/office/word/2016/wordml/cid" xmlns:w16="http://schemas.microsoft.com/office/word/2018/wordml" xmlns:w16du="http://schemas.microsoft.com/office/word/2023/wordml/word16du" xmlns:w16sdtdh="http://schemas.microsoft.com/office/word/2020/wordml/sdtdatahash" xmlns:w16sdtfl="http://schemas.microsoft.com/office/word/2024/wordml/sdtformatlock" xmlns:w16se="http://schemas.microsoft.com/office/word/2015/wordml/symex" mc:Ignorable="w14 w15 w16se w16cid w16 w16cex w16sdtdh w16sdtfl w16du">
-  <w:font w:name="Symbol">
-    <w:panose1 w:val="05050102010706020507"/>
-    <w:charset w:val="02"/>
-    <w:family w:val="roman"/>
-    <w:pitch w:val="variable"/>
-    <w:sig w:usb0="00000000" w:usb1="10000000" w:usb2="00000000" w:usb3="00000000" w:csb0="80000000" w:csb1="00000000"/>
-  </w:font>
-  <w:font w:name="Times New Roman">
-    <w:panose1 w:val="02020603050405020304"/>
-    <w:charset w:val="00"/>
-    <w:family w:val="roman"/>
-    <w:pitch w:val="variable"/>
-    <w:sig w:usb0="E0002EFF" w:usb1="C000785B" w:usb2="00000009" w:usb3="00000000" w:csb0="000001FF" w:csb1="00000000"/>
-  </w:font>
-  <w:font w:name="Cambria">
-    <w:panose1 w:val="02040503050406030204"/>
-    <w:charset w:val="00"/>
-    <w:family w:val="roman"/>
-    <w:pitch w:val="variable"/>
-    <w:sig w:usb0="E00006FF" w:usb1="420024FF" w:usb2="02000000" w:usb3="00000000" w:csb0="0000019F" w:csb1="00000000"/>
-  </w:font>
-  <w:font w:name="Wingdings">
-    <w:panose1 w:val="05000000000000000000"/>
-    <w:charset w:val="02"/>
-    <w:family w:val="auto"/>
-    <w:pitch w:val="variable"/>
-    <w:sig w:usb0="00000000" w:usb1="10000000" w:usb2="00000000" w:usb3="00000000" w:csb0="80000000" w:csb1="00000000"/>
-  </w:font>
-  <w:font w:name="Courier New">
-    <w:panose1 w:val="02070309020205020404"/>
-    <w:charset w:val="00"/>
-    <w:family w:val="modern"/>
-    <w:pitch w:val="fixed"/>
-    <w:sig w:usb0="E0002EFF" w:usb1="C0007843" w:usb2="00000009" w:usb3="00000000" w:csb0="000001FF" w:csb1="00000000"/>
-  </w:font>
-  <w:font w:name="Tahoma">
-    <w:panose1 w:val="020B0604030504040204"/>
-    <w:charset w:val="00"/>
-    <w:family w:val="swiss"/>
-    <w:pitch w:val="variable"/>
-    <w:sig w:usb0="E1002EFF" w:usb1="C000605B" w:usb2="00000029" w:usb3="00000000" w:csb0="000101FF" w:csb1="00000000"/>
-  </w:font>
-  <w:font w:name="Montserrat Medium">
-    <w:charset w:val="00"/>
-    <w:family w:val="auto"/>
-    <w:pitch w:val="variable"/>
-    <w:sig w:usb0="2000020F" w:usb1="00000003" w:usb2="00000000" w:usb3="00000000" w:csb0="00000197" w:csb1="00000000"/>
-  </w:font>
-  <w:font w:name="Space Grotesk">
-    <w:panose1 w:val="00000000000000000000"/>
-    <w:charset w:val="4D"/>
-    <w:family w:val="auto"/>
-    <w:pitch w:val="variable"/>
-    <w:sig w:usb0="A10000FF" w:usb1="5000207B" w:usb2="00000000" w:usb3="00000000" w:csb0="00000193" w:csb1="00000000"/>
-  </w:font>
-  <w:font w:name="Montserrat">
-    <w:charset w:val="00"/>
-    <w:family w:val="auto"/>
-    <w:pitch w:val="variable"/>
-    <w:sig w:usb0="2000020F" w:usb1="00000003" w:usb2="00000000" w:usb3="00000000" w:csb0="00000197" w:csb1="00000000"/>
-  </w:font>
-  <w:font w:name="Calibri">
-    <w:panose1 w:val="020F0502020204030204"/>
-    <w:charset w:val="00"/>
-    <w:family w:val="swiss"/>
-    <w:pitch w:val="variable"/>
-    <w:sig w:usb0="E4002EFF" w:usb1="C200247B" w:usb2="00000009" w:usb3="00000000" w:csb0="000001FF" w:csb1="00000000"/>
-  </w:font>
-  <w:font w:name="MS Gothic">
-    <w:altName w:val="ＭＳ ゴシック"/>
-    <w:panose1 w:val="020B0609070205080204"/>
-    <w:charset w:val="80"/>
-    <w:family w:val="modern"/>
-    <w:pitch w:val="fixed"/>
-    <w:sig w:usb0="E00002FF" w:usb1="6AC7FDFB" w:usb2="08000012" w:usb3="00000000" w:csb0="0002009F" w:csb1="00000000"/>
-  </w:font>
-  <w:font w:name="Arial">
-    <w:panose1 w:val="020B0604020202020204"/>
-    <w:charset w:val="00"/>
-    <w:family w:val="swiss"/>
-    <w:pitch w:val="variable"/>
-    <w:sig w:usb0="E0002EFF" w:usb1="C000785B" w:usb2="00000009" w:usb3="00000000" w:csb0="000001FF" w:csb1="00000000"/>
-  </w:font>
-  <w:font w:name="Calibri Light">
-    <w:panose1 w:val="020F0302020204030204"/>
-    <w:charset w:val="00"/>
-    <w:family w:val="swiss"/>
-    <w:pitch w:val="variable"/>
-    <w:sig w:usb0="E4002EFF" w:usb1="C200247B" w:usb2="00000009" w:usb3="00000000" w:csb0="000001FF" w:csb1="00000000"/>
-  </w:font>
-  <w:font w:name="Consolas">
-    <w:panose1 w:val="020B0609020204030204"/>
-    <w:charset w:val="00"/>
-    <w:family w:val="modern"/>
-    <w:pitch w:val="fixed"/>
-    <w:sig w:usb0="E00006FF" w:usb1="0000FCFF" w:usb2="00000001" w:usb3="00000000" w:csb0="0000019F" w:csb1="00000000"/>
-  </w:font>
-  <w:font w:name="Gotham Pro">
-    <w:altName w:val="Calibri"/>
-    <w:charset w:val="00"/>
-    <w:family w:val="auto"/>
-    <w:pitch w:val="default"/>
-  </w:font>
-  <w:font w:name="Montserrat ExtraBold">
-    <w:charset w:val="00"/>
-    <w:family w:val="auto"/>
-    <w:pitch w:val="variable"/>
-    <w:sig w:usb0="2000020F" w:usb1="00000003" w:usb2="00000000" w:usb3="00000000" w:csb0="00000197" w:csb1="00000000"/>
-  </w:font>
-  <w:font w:name="MS Mincho">
-    <w:panose1 w:val="02020609040205080304"/>
-    <w:charset w:val="80"/>
-    <w:family w:val="modern"/>
-    <w:pitch w:val="fixed"/>
-    <w:sig w:usb0="E00002FF" w:usb1="6AC7FDFB" w:usb2="08000012" w:usb3="00000000" w:csb0="0002009F" w:csb1="00000000"/>
-  </w:font>
-</w:fonts>
-</file>
-
-<file path=word\footer1.xml><?xml version="1.0" encoding="utf-8"?>
+<file path=word/footer1.xml><?xml version="1.0" encoding="utf-8"?>
 <w:ftr xmlns:wpc="http://schemas.microsoft.com/office/word/2010/wordprocessingCanvas" xmlns:cx="http://schemas.microsoft.com/office/drawing/2014/chartex" xmlns:cx1="http://schemas.microsoft.com/office/drawing/2015/9/8/chartex" xmlns:cx2="http://schemas.microsoft.com/office/drawing/2015/10/21/chartex" xmlns:cx3="http://schemas.microsoft.com/office/drawing/2016/5/9/chartex" xmlns:cx4="http://schemas.microsoft.com/office/drawing/2016/5/10/chartex" xmlns:cx5="http://schemas.microsoft.com/office/drawing/2016/5/11/chartex" xmlns:cx6="http://schemas.microsoft.com/office/drawing/2016/5/12/chartex" xmlns:cx7="http://schemas.microsoft.com/office/drawing/2016/5/13/chartex" xmlns:cx8="http://schemas.microsoft.com/office/drawing/2016/5/14/chartex" xmlns:mc="http://schemas.openxmlformats.org/markup-compatibility/2006" xmlns:aink="http://schemas.microsoft.com/office/drawing/2016/ink" xmlns:am3d="http://schemas.microsoft.com/office/drawing/2017/model3d" xmlns:o="urn:schemas-microsoft-com:office:office" xmlns:oel="http://schemas.microsoft.com/office/2019/extlst" xmlns:r="http://schemas.openxmlformats.org/officeDocument/2006/relationships" xmlns:m="http://schemas.openxmlformats.org/officeDocument/2006/math" xmlns:v="urn:schemas-microsoft-com:vml" xmlns:wp14="http://schemas.microsoft.com/office/word/2010/wordprocessingDrawing" xmlns:wp="http://schemas.openxmlformats.org/drawingml/2006/wordprocessingDrawing" xmlns:w10="urn:schemas-microsoft-com:office:word" xmlns:w="http://schemas.openxmlformats.org/wordprocessingml/2006/main" xmlns:w14="http://schemas.microsoft.com/office/word/2010/wordml" xmlns:w15="http://schemas.microsoft.com/office/word/2012/wordml" xmlns:w16cei="http://schemas.microsoft.com/office/word/2026/wordml/cei" xmlns:w16cex="http://schemas.microsoft.com/office/word/2018/wordml/cex" xmlns:w16cid="http://schemas.microsoft.com/office/word/2016/wordml/cid" xmlns:w16="http://schemas.microsoft.com/office/word/2018/wordml" xmlns:w16du="http://schemas.microsoft.com/office/word/2023/wordml/word16du" xmlns:w16sdtdh="http://schemas.microsoft.com/office/word/2020/wordml/sdtdatahash" xmlns:w16sdtfl="http://schemas.microsoft.com/office/word/2024/wordml/sdtformatlock" xmlns:w16se="http://schemas.microsoft.com/office/word/2015/wordml/symex" xmlns:wpg="http://schemas.microsoft.com/office/word/2010/wordprocessingGroup" xmlns:wpi="http://schemas.microsoft.com/office/word/2010/wordprocessingInk" xmlns:wne="http://schemas.microsoft.com/office/word/2006/wordml" xmlns:wps="http://schemas.microsoft.com/office/word/2010/wordprocessingShape" mc:Ignorable="w14 w15 w16se w16cid w16 w16cex w16sdtdh w16sdtfl w16du wp14">
   <w:p>
     <w:pPr>
@@ -855,7 +349,7 @@
 </w:ftr>
 </file>
 
-<file path=word\footer2.xml><?xml version="1.0" encoding="utf-8"?>
+<file path=word/footer2.xml><?xml version="1.0" encoding="utf-8"?>
 <w:ftr xmlns:wpc="http://schemas.microsoft.com/office/word/2010/wordprocessingCanvas" xmlns:cx="http://schemas.microsoft.com/office/drawing/2014/chartex" xmlns:cx1="http://schemas.microsoft.com/office/drawing/2015/9/8/chartex" xmlns:cx2="http://schemas.microsoft.com/office/drawing/2015/10/21/chartex" xmlns:cx3="http://schemas.microsoft.com/office/drawing/2016/5/9/chartex" xmlns:cx4="http://schemas.microsoft.com/office/drawing/2016/5/10/chartex" xmlns:cx5="http://schemas.microsoft.com/office/drawing/2016/5/11/chartex" xmlns:cx6="http://schemas.microsoft.com/office/drawing/2016/5/12/chartex" xmlns:cx7="http://schemas.microsoft.com/office/drawing/2016/5/13/chartex" xmlns:cx8="http://schemas.microsoft.com/office/drawing/2016/5/14/chartex" xmlns:mc="http://schemas.openxmlformats.org/markup-compatibility/2006" xmlns:aink="http://schemas.microsoft.com/office/drawing/2016/ink" xmlns:am3d="http://schemas.microsoft.com/office/drawing/2017/model3d" xmlns:o="urn:schemas-microsoft-com:office:office" xmlns:oel="http://schemas.microsoft.com/office/2019/extlst" xmlns:r="http://schemas.openxmlformats.org/officeDocument/2006/relationships" xmlns:m="http://schemas.openxmlformats.org/officeDocument/2006/math" xmlns:v="urn:schemas-microsoft-com:vml" xmlns:wp14="http://schemas.microsoft.com/office/word/2010/wordprocessingDrawing" xmlns:wp="http://schemas.openxmlformats.org/drawingml/2006/wordprocessingDrawing" xmlns:w10="urn:schemas-microsoft-com:office:word" xmlns:w="http://schemas.openxmlformats.org/wordprocessingml/2006/main" xmlns:w14="http://schemas.microsoft.com/office/word/2010/wordml" xmlns:w15="http://schemas.microsoft.com/office/word/2012/wordml" xmlns:w16cei="http://schemas.microsoft.com/office/word/2026/wordml/cei" xmlns:w16cex="http://schemas.microsoft.com/office/word/2018/wordml/cex" xmlns:w16cid="http://schemas.microsoft.com/office/word/2016/wordml/cid" xmlns:w16="http://schemas.microsoft.com/office/word/2018/wordml" xmlns:w16du="http://schemas.microsoft.com/office/word/2023/wordml/word16du" xmlns:w16sdtdh="http://schemas.microsoft.com/office/word/2020/wordml/sdtdatahash" xmlns:w16sdtfl="http://schemas.microsoft.com/office/word/2024/wordml/sdtformatlock" xmlns:w16se="http://schemas.microsoft.com/office/word/2015/wordml/symex" xmlns:wpg="http://schemas.microsoft.com/office/word/2010/wordprocessingGroup" xmlns:wpi="http://schemas.microsoft.com/office/word/2010/wordprocessingInk" xmlns:wne="http://schemas.microsoft.com/office/word/2006/wordml" xmlns:wps="http://schemas.microsoft.com/office/word/2010/wordprocessingShape" mc:Ignorable="w14 w15 w16se w16cid w16 w16cex w16sdtdh w16sdtfl w16du wp14">
   <w:p>
     <w:pPr>
@@ -973,7 +467,7 @@
 </w:ftr>
 </file>
 
-<file path=word\footer3.xml><?xml version="1.0" encoding="utf-8"?>
+<file path=word/footer3.xml><?xml version="1.0" encoding="utf-8"?>
 <w:ftr xmlns:wpc="http://schemas.microsoft.com/office/word/2010/wordprocessingCanvas" xmlns:cx="http://schemas.microsoft.com/office/drawing/2014/chartex" xmlns:cx1="http://schemas.microsoft.com/office/drawing/2015/9/8/chartex" xmlns:cx2="http://schemas.microsoft.com/office/drawing/2015/10/21/chartex" xmlns:cx3="http://schemas.microsoft.com/office/drawing/2016/5/9/chartex" xmlns:cx4="http://schemas.microsoft.com/office/drawing/2016/5/10/chartex" xmlns:cx5="http://schemas.microsoft.com/office/drawing/2016/5/11/chartex" xmlns:cx6="http://schemas.microsoft.com/office/drawing/2016/5/12/chartex" xmlns:cx7="http://schemas.microsoft.com/office/drawing/2016/5/13/chartex" xmlns:cx8="http://schemas.microsoft.com/office/drawing/2016/5/14/chartex" xmlns:mc="http://schemas.openxmlformats.org/markup-compatibility/2006" xmlns:aink="http://schemas.microsoft.com/office/drawing/2016/ink" xmlns:am3d="http://schemas.microsoft.com/office/drawing/2017/model3d" xmlns:o="urn:schemas-microsoft-com:office:office" xmlns:oel="http://schemas.microsoft.com/office/2019/extlst" xmlns:r="http://schemas.openxmlformats.org/officeDocument/2006/relationships" xmlns:m="http://schemas.openxmlformats.org/officeDocument/2006/math" xmlns:v="urn:schemas-microsoft-com:vml" xmlns:wp14="http://schemas.microsoft.com/office/word/2010/wordprocessingDrawing" xmlns:wp="http://schemas.openxmlformats.org/drawingml/2006/wordprocessingDrawing" xmlns:w10="urn:schemas-microsoft-com:office:word" xmlns:w="http://schemas.openxmlformats.org/wordprocessingml/2006/main" xmlns:w14="http://schemas.microsoft.com/office/word/2010/wordml" xmlns:w15="http://schemas.microsoft.com/office/word/2012/wordml" xmlns:w16cei="http://schemas.microsoft.com/office/word/2026/wordml/cei" xmlns:w16cex="http://schemas.microsoft.com/office/word/2018/wordml/cex" xmlns:w16cid="http://schemas.microsoft.com/office/word/2016/wordml/cid" xmlns:w16="http://schemas.microsoft.com/office/word/2018/wordml" xmlns:w16du="http://schemas.microsoft.com/office/word/2023/wordml/word16du" xmlns:w16sdtdh="http://schemas.microsoft.com/office/word/2020/wordml/sdtdatahash" xmlns:w16sdtfl="http://schemas.microsoft.com/office/word/2024/wordml/sdtformatlock" xmlns:w16se="http://schemas.microsoft.com/office/word/2015/wordml/symex" xmlns:wpg="http://schemas.microsoft.com/office/word/2010/wordprocessingGroup" xmlns:wpi="http://schemas.microsoft.com/office/word/2010/wordprocessingInk" xmlns:wne="http://schemas.microsoft.com/office/word/2006/wordml" xmlns:wps="http://schemas.microsoft.com/office/word/2010/wordprocessingShape" mc:Ignorable="w14 w15 w16se w16cid w16 w16cex w16sdtdh w16sdtfl w16du wp14">
   <w:p>
     <w:pPr>
@@ -1148,7 +642,7 @@
 </w:ftr>
 </file>
 
-<file path=word\footnotes.xml><?xml version="1.0" encoding="utf-8"?>
+<file path=word/footnotes.xml><?xml version="1.0" encoding="utf-8"?>
 <w:footnotes xmlns:wpc="http://schemas.microsoft.com/office/word/2010/wordprocessingCanvas" xmlns:cx="http://schemas.microsoft.com/office/drawing/2014/chartex" xmlns:cx1="http://schemas.microsoft.com/office/drawing/2015/9/8/chartex" xmlns:cx2="http://schemas.microsoft.com/office/drawing/2015/10/21/chartex" xmlns:cx3="http://schemas.microsoft.com/office/drawing/2016/5/9/chartex" xmlns:cx4="http://schemas.microsoft.com/office/drawing/2016/5/10/chartex" xmlns:cx5="http://schemas.microsoft.com/office/drawing/2016/5/11/chartex" xmlns:cx6="http://schemas.microsoft.com/office/drawing/2016/5/12/chartex" xmlns:cx7="http://schemas.microsoft.com/office/drawing/2016/5/13/chartex" xmlns:cx8="http://schemas.microsoft.com/office/drawing/2016/5/14/chartex" xmlns:mc="http://schemas.openxmlformats.org/markup-compatibility/2006" xmlns:aink="http://schemas.microsoft.com/office/drawing/2016/ink" xmlns:am3d="http://schemas.microsoft.com/office/drawing/2017/model3d" xmlns:o="urn:schemas-microsoft-com:office:office" xmlns:oel="http://schemas.microsoft.com/office/2019/extlst" xmlns:r="http://schemas.openxmlformats.org/officeDocument/2006/relationships" xmlns:m="http://schemas.openxmlformats.org/officeDocument/2006/math" xmlns:v="urn:schemas-microsoft-com:vml" xmlns:wp14="http://schemas.microsoft.com/office/word/2010/wordprocessingDrawing" xmlns:wp="http://schemas.openxmlformats.org/drawingml/2006/wordprocessingDrawing" xmlns:w10="urn:schemas-microsoft-com:office:word" xmlns:w="http://schemas.openxmlformats.org/wordprocessingml/2006/main" xmlns:w14="http://schemas.microsoft.com/office/word/2010/wordml" xmlns:w15="http://schemas.microsoft.com/office/word/2012/wordml" xmlns:w16cei="http://schemas.microsoft.com/office/word/2026/wordml/cei" xmlns:w16cex="http://schemas.microsoft.com/office/word/2018/wordml/cex" xmlns:w16cid="http://schemas.microsoft.com/office/word/2016/wordml/cid" xmlns:w16="http://schemas.microsoft.com/office/word/2018/wordml" xmlns:w16du="http://schemas.microsoft.com/office/word/2023/wordml/word16du" xmlns:w16sdtdh="http://schemas.microsoft.com/office/word/2020/wordml/sdtdatahash" xmlns:w16sdtfl="http://schemas.microsoft.com/office/word/2024/wordml/sdtformatlock" xmlns:w16se="http://schemas.microsoft.com/office/word/2015/wordml/symex" xmlns:wpg="http://schemas.microsoft.com/office/word/2010/wordprocessingGroup" xmlns:wpi="http://schemas.microsoft.com/office/word/2010/wordprocessingInk" xmlns:wne="http://schemas.microsoft.com/office/word/2006/wordml" xmlns:wps="http://schemas.microsoft.com/office/word/2010/wordprocessingShape" mc:Ignorable="w14 w15 w16se w16cid w16 w16cex w16sdtdh w16sdtfl w16du wp14">
   <w:footnote w:type="separator" w:id="-1">
     <w:p>
@@ -1173,7 +667,7 @@
 </w:footnotes>
 </file>
 
-<file path=word\header1.xml><?xml version="1.0" encoding="utf-8"?>
+<file path=word/header1.xml><?xml version="1.0" encoding="utf-8"?>
 <w:hdr xmlns:wpc="http://schemas.microsoft.com/office/word/2010/wordprocessingCanvas" xmlns:cx="http://schemas.microsoft.com/office/drawing/2014/chartex" xmlns:cx1="http://schemas.microsoft.com/office/drawing/2015/9/8/chartex" xmlns:cx2="http://schemas.microsoft.com/office/drawing/2015/10/21/chartex" xmlns:cx3="http://schemas.microsoft.com/office/drawing/2016/5/9/chartex" xmlns:cx4="http://schemas.microsoft.com/office/drawing/2016/5/10/chartex" xmlns:cx5="http://schemas.microsoft.com/office/drawing/2016/5/11/chartex" xmlns:cx6="http://schemas.microsoft.com/office/drawing/2016/5/12/chartex" xmlns:cx7="http://schemas.microsoft.com/office/drawing/2016/5/13/chartex" xmlns:cx8="http://schemas.microsoft.com/office/drawing/2016/5/14/chartex" xmlns:mc="http://schemas.openxmlformats.org/markup-compatibility/2006" xmlns:aink="http://schemas.microsoft.com/office/drawing/2016/ink" xmlns:am3d="http://schemas.microsoft.com/office/drawing/2017/model3d" xmlns:o="urn:schemas-microsoft-com:office:office" xmlns:oel="http://schemas.microsoft.com/office/2019/extlst" xmlns:r="http://schemas.openxmlformats.org/officeDocument/2006/relationships" xmlns:m="http://schemas.openxmlformats.org/officeDocument/2006/math" xmlns:v="urn:schemas-microsoft-com:vml" xmlns:wp14="http://schemas.microsoft.com/office/word/2010/wordprocessingDrawing" xmlns:wp="http://schemas.openxmlformats.org/drawingml/2006/wordprocessingDrawing" xmlns:w10="urn:schemas-microsoft-com:office:word" xmlns:w="http://schemas.openxmlformats.org/wordprocessingml/2006/main" xmlns:w14="http://schemas.microsoft.com/office/word/2010/wordml" xmlns:w15="http://schemas.microsoft.com/office/word/2012/wordml" xmlns:w16cei="http://schemas.microsoft.com/office/word/2026/wordml/cei" xmlns:w16cex="http://schemas.microsoft.com/office/word/2018/wordml/cex" xmlns:w16cid="http://schemas.microsoft.com/office/word/2016/wordml/cid" xmlns:w16="http://schemas.microsoft.com/office/word/2018/wordml" xmlns:w16du="http://schemas.microsoft.com/office/word/2023/wordml/word16du" xmlns:w16sdtdh="http://schemas.microsoft.com/office/word/2020/wordml/sdtdatahash" xmlns:w16sdtfl="http://schemas.microsoft.com/office/word/2024/wordml/sdtformatlock" xmlns:w16se="http://schemas.microsoft.com/office/word/2015/wordml/symex" xmlns:wpg="http://schemas.microsoft.com/office/word/2010/wordprocessingGroup" xmlns:wpi="http://schemas.microsoft.com/office/word/2010/wordprocessingInk" xmlns:wne="http://schemas.microsoft.com/office/word/2006/wordml" xmlns:wps="http://schemas.microsoft.com/office/word/2010/wordprocessingShape" mc:Ignorable="w14 w15 w16se w16cid w16 w16cex w16sdtdh w16sdtfl w16du wp14">
   <w:p>
     <w:pPr>
@@ -1272,7 +766,7 @@
 </w:hdr>
 </file>
 
-<file path=word\header2.xml><?xml version="1.0" encoding="utf-8"?>
+<file path=word/header2.xml><?xml version="1.0" encoding="utf-8"?>
 <w:hdr xmlns:wpc="http://schemas.microsoft.com/office/word/2010/wordprocessingCanvas" xmlns:cx="http://schemas.microsoft.com/office/drawing/2014/chartex" xmlns:cx1="http://schemas.microsoft.com/office/drawing/2015/9/8/chartex" xmlns:cx2="http://schemas.microsoft.com/office/drawing/2015/10/21/chartex" xmlns:cx3="http://schemas.microsoft.com/office/drawing/2016/5/9/chartex" xmlns:cx4="http://schemas.microsoft.com/office/drawing/2016/5/10/chartex" xmlns:cx5="http://schemas.microsoft.com/office/drawing/2016/5/11/chartex" xmlns:cx6="http://schemas.microsoft.com/office/drawing/2016/5/12/chartex" xmlns:cx7="http://schemas.microsoft.com/office/drawing/2016/5/13/chartex" xmlns:cx8="http://schemas.microsoft.com/office/drawing/2016/5/14/chartex" xmlns:mc="http://schemas.openxmlformats.org/markup-compatibility/2006" xmlns:aink="http://schemas.microsoft.com/office/drawing/2016/ink" xmlns:am3d="http://schemas.microsoft.com/office/drawing/2017/model3d" xmlns:o="urn:schemas-microsoft-com:office:office" xmlns:oel="http://schemas.microsoft.com/office/2019/extlst" xmlns:r="http://schemas.openxmlformats.org/officeDocument/2006/relationships" xmlns:m="http://schemas.openxmlformats.org/officeDocument/2006/math" xmlns:v="urn:schemas-microsoft-com:vml" xmlns:wp14="http://schemas.microsoft.com/office/word/2010/wordprocessingDrawing" xmlns:wp="http://schemas.openxmlformats.org/drawingml/2006/wordprocessingDrawing" xmlns:w10="urn:schemas-microsoft-com:office:word" xmlns:w="http://schemas.openxmlformats.org/wordprocessingml/2006/main" xmlns:w14="http://schemas.microsoft.com/office/word/2010/wordml" xmlns:w15="http://schemas.microsoft.com/office/word/2012/wordml" xmlns:w16cei="http://schemas.microsoft.com/office/word/2026/wordml/cei" xmlns:w16cex="http://schemas.microsoft.com/office/word/2018/wordml/cex" xmlns:w16cid="http://schemas.microsoft.com/office/word/2016/wordml/cid" xmlns:w16="http://schemas.microsoft.com/office/word/2018/wordml" xmlns:w16du="http://schemas.microsoft.com/office/word/2023/wordml/word16du" xmlns:w16sdtdh="http://schemas.microsoft.com/office/word/2020/wordml/sdtdatahash" xmlns:w16sdtfl="http://schemas.microsoft.com/office/word/2024/wordml/sdtformatlock" xmlns:w16se="http://schemas.microsoft.com/office/word/2015/wordml/symex" xmlns:wpg="http://schemas.microsoft.com/office/word/2010/wordprocessingGroup" xmlns:wpi="http://schemas.microsoft.com/office/word/2010/wordprocessingInk" xmlns:wne="http://schemas.microsoft.com/office/word/2006/wordml" xmlns:wps="http://schemas.microsoft.com/office/word/2010/wordprocessingShape" mc:Ignorable="w14 w15 w16se w16cid w16 w16cex w16sdtdh w16sdtfl w16du wp14">
   <w:tbl>
     <w:tblPr>
@@ -1334,7 +828,7 @@
 </w:hdr>
 </file>
 
-<file path=word\header3.xml><?xml version="1.0" encoding="utf-8"?>
+<file path=word/header3.xml><?xml version="1.0" encoding="utf-8"?>
 <w:hdr xmlns:wpc="http://schemas.microsoft.com/office/word/2010/wordprocessingCanvas" xmlns:cx="http://schemas.microsoft.com/office/drawing/2014/chartex" xmlns:cx1="http://schemas.microsoft.com/office/drawing/2015/9/8/chartex" xmlns:cx2="http://schemas.microsoft.com/office/drawing/2015/10/21/chartex" xmlns:cx3="http://schemas.microsoft.com/office/drawing/2016/5/9/chartex" xmlns:cx4="http://schemas.microsoft.com/office/drawing/2016/5/10/chartex" xmlns:cx5="http://schemas.microsoft.com/office/drawing/2016/5/11/chartex" xmlns:cx6="http://schemas.microsoft.com/office/drawing/2016/5/12/chartex" xmlns:cx7="http://schemas.microsoft.com/office/drawing/2016/5/13/chartex" xmlns:cx8="http://schemas.microsoft.com/office/drawing/2016/5/14/chartex" xmlns:mc="http://schemas.openxmlformats.org/markup-compatibility/2006" xmlns:aink="http://schemas.microsoft.com/office/drawing/2016/ink" xmlns:am3d="http://schemas.microsoft.com/office/drawing/2017/model3d" xmlns:o="urn:schemas-microsoft-com:office:office" xmlns:oel="http://schemas.microsoft.com/office/2019/extlst" xmlns:r="http://schemas.openxmlformats.org/officeDocument/2006/relationships" xmlns:m="http://schemas.openxmlformats.org/officeDocument/2006/math" xmlns:v="urn:schemas-microsoft-com:vml" xmlns:wp14="http://schemas.microsoft.com/office/word/2010/wordprocessingDrawing" xmlns:wp="http://schemas.openxmlformats.org/drawingml/2006/wordprocessingDrawing" xmlns:w10="urn:schemas-microsoft-com:office:word" xmlns:w="http://schemas.openxmlformats.org/wordprocessingml/2006/main" xmlns:w14="http://schemas.microsoft.com/office/word/2010/wordml" xmlns:w15="http://schemas.microsoft.com/office/word/2012/wordml" xmlns:w16cei="http://schemas.microsoft.com/office/word/2026/wordml/cei" xmlns:w16cex="http://schemas.microsoft.com/office/word/2018/wordml/cex" xmlns:w16cid="http://schemas.microsoft.com/office/word/2016/wordml/cid" xmlns:w16="http://schemas.microsoft.com/office/word/2018/wordml" xmlns:w16du="http://schemas.microsoft.com/office/word/2023/wordml/word16du" xmlns:w16sdtdh="http://schemas.microsoft.com/office/word/2020/wordml/sdtdatahash" xmlns:w16sdtfl="http://schemas.microsoft.com/office/word/2024/wordml/sdtformatlock" xmlns:w16se="http://schemas.microsoft.com/office/word/2015/wordml/symex" xmlns:wpg="http://schemas.microsoft.com/office/word/2010/wordprocessingGroup" xmlns:wpi="http://schemas.microsoft.com/office/word/2010/wordprocessingInk" xmlns:wne="http://schemas.microsoft.com/office/word/2006/wordml" xmlns:wps="http://schemas.microsoft.com/office/word/2010/wordprocessingShape" mc:Ignorable="w14 w15 w16se w16cid w16 w16cex w16sdtdh w16sdtfl w16du wp14">
   <w:tbl>
     <w:tblPr>
@@ -1396,7 +890,7 @@
 </w:hdr>
 </file>
 
-<file path=word\header4.xml><?xml version="1.0" encoding="utf-8"?>
+<file path=word/header4.xml><?xml version="1.0" encoding="utf-8"?>
 <w:hdr xmlns:wpc="http://schemas.microsoft.com/office/word/2010/wordprocessingCanvas" xmlns:cx="http://schemas.microsoft.com/office/drawing/2014/chartex" xmlns:cx1="http://schemas.microsoft.com/office/drawing/2015/9/8/chartex" xmlns:cx2="http://schemas.microsoft.com/office/drawing/2015/10/21/chartex" xmlns:cx3="http://schemas.microsoft.com/office/drawing/2016/5/9/chartex" xmlns:cx4="http://schemas.microsoft.com/office/drawing/2016/5/10/chartex" xmlns:cx5="http://schemas.microsoft.com/office/drawing/2016/5/11/chartex" xmlns:cx6="http://schemas.microsoft.com/office/drawing/2016/5/12/chartex" xmlns:cx7="http://schemas.microsoft.com/office/drawing/2016/5/13/chartex" xmlns:cx8="http://schemas.microsoft.com/office/drawing/2016/5/14/chartex" xmlns:mc="http://schemas.openxmlformats.org/markup-compatibility/2006" xmlns:aink="http://schemas.microsoft.com/office/drawing/2016/ink" xmlns:am3d="http://schemas.microsoft.com/office/drawing/2017/model3d" xmlns:o="urn:schemas-microsoft-com:office:office" xmlns:oel="http://schemas.microsoft.com/office/2019/extlst" xmlns:r="http://schemas.openxmlformats.org/officeDocument/2006/relationships" xmlns:m="http://schemas.openxmlformats.org/officeDocument/2006/math" xmlns:v="urn:schemas-microsoft-com:vml" xmlns:wp14="http://schemas.microsoft.com/office/word/2010/wordprocessingDrawing" xmlns:wp="http://schemas.openxmlformats.org/drawingml/2006/wordprocessingDrawing" xmlns:w10="urn:schemas-microsoft-com:office:word" xmlns:w="http://schemas.openxmlformats.org/wordprocessingml/2006/main" xmlns:w14="http://schemas.microsoft.com/office/word/2010/wordml" xmlns:w15="http://schemas.microsoft.com/office/word/2012/wordml" xmlns:w16cei="http://schemas.microsoft.com/office/word/2026/wordml/cei" xmlns:w16cex="http://schemas.microsoft.com/office/word/2018/wordml/cex" xmlns:w16cid="http://schemas.microsoft.com/office/word/2016/wordml/cid" xmlns:w16="http://schemas.microsoft.com/office/word/2018/wordml" xmlns:w16du="http://schemas.microsoft.com/office/word/2023/wordml/word16du" xmlns:w16sdtdh="http://schemas.microsoft.com/office/word/2020/wordml/sdtdatahash" xmlns:w16sdtfl="http://schemas.microsoft.com/office/word/2024/wordml/sdtformatlock" xmlns:w16se="http://schemas.microsoft.com/office/word/2015/wordml/symex" xmlns:wpg="http://schemas.microsoft.com/office/word/2010/wordprocessingGroup" xmlns:wpi="http://schemas.microsoft.com/office/word/2010/wordprocessingInk" xmlns:wne="http://schemas.microsoft.com/office/word/2006/wordml" xmlns:wps="http://schemas.microsoft.com/office/word/2010/wordprocessingShape" mc:Ignorable="w14 w15 w16se w16cid w16 w16cex w16sdtdh w16sdtfl w16du wp14">
   <w:tbl>
     <w:tblPr>
@@ -1458,7 +952,7 @@
 </w:hdr>
 </file>
 
-<file path=word\header5.xml><?xml version="1.0" encoding="utf-8"?>
+<file path=word/header5.xml><?xml version="1.0" encoding="utf-8"?>
 <w:hdr xmlns:wpc="http://schemas.microsoft.com/office/word/2010/wordprocessingCanvas" xmlns:cx="http://schemas.microsoft.com/office/drawing/2014/chartex" xmlns:cx1="http://schemas.microsoft.com/office/drawing/2015/9/8/chartex" xmlns:cx2="http://schemas.microsoft.com/office/drawing/2015/10/21/chartex" xmlns:cx3="http://schemas.microsoft.com/office/drawing/2016/5/9/chartex" xmlns:cx4="http://schemas.microsoft.com/office/drawing/2016/5/10/chartex" xmlns:cx5="http://schemas.microsoft.com/office/drawing/2016/5/11/chartex" xmlns:cx6="http://schemas.microsoft.com/office/drawing/2016/5/12/chartex" xmlns:cx7="http://schemas.microsoft.com/office/drawing/2016/5/13/chartex" xmlns:cx8="http://schemas.microsoft.com/office/drawing/2016/5/14/chartex" xmlns:mc="http://schemas.openxmlformats.org/markup-compatibility/2006" xmlns:aink="http://schemas.microsoft.com/office/drawing/2016/ink" xmlns:am3d="http://schemas.microsoft.com/office/drawing/2017/model3d" xmlns:o="urn:schemas-microsoft-com:office:office" xmlns:oel="http://schemas.microsoft.com/office/2019/extlst" xmlns:r="http://schemas.openxmlformats.org/officeDocument/2006/relationships" xmlns:m="http://schemas.openxmlformats.org/officeDocument/2006/math" xmlns:v="urn:schemas-microsoft-com:vml" xmlns:wp14="http://schemas.microsoft.com/office/word/2010/wordprocessingDrawing" xmlns:wp="http://schemas.openxmlformats.org/drawingml/2006/wordprocessingDrawing" xmlns:w10="urn:schemas-microsoft-com:office:word" xmlns:w="http://schemas.openxmlformats.org/wordprocessingml/2006/main" xmlns:w14="http://schemas.microsoft.com/office/word/2010/wordml" xmlns:w15="http://schemas.microsoft.com/office/word/2012/wordml" xmlns:w16cei="http://schemas.microsoft.com/office/word/2026/wordml/cei" xmlns:w16cex="http://schemas.microsoft.com/office/word/2018/wordml/cex" xmlns:w16cid="http://schemas.microsoft.com/office/word/2016/wordml/cid" xmlns:w16="http://schemas.microsoft.com/office/word/2018/wordml" xmlns:w16du="http://schemas.microsoft.com/office/word/2023/wordml/word16du" xmlns:w16sdtdh="http://schemas.microsoft.com/office/word/2020/wordml/sdtdatahash" xmlns:w16sdtfl="http://schemas.microsoft.com/office/word/2024/wordml/sdtformatlock" xmlns:w16se="http://schemas.microsoft.com/office/word/2015/wordml/symex" xmlns:wpg="http://schemas.microsoft.com/office/word/2010/wordprocessingGroup" xmlns:wpi="http://schemas.microsoft.com/office/word/2010/wordprocessingInk" xmlns:wne="http://schemas.microsoft.com/office/word/2006/wordml" xmlns:wps="http://schemas.microsoft.com/office/word/2010/wordprocessingShape" mc:Ignorable="w14 w15 w16se w16cid w16 w16cex w16sdtdh w16sdtfl w16du wp14">
   <w:p>
     <w:r>
@@ -1528,7 +1022,7 @@
 </w:hdr>
 </file>
 
-<file path=word\header6.xml><?xml version="1.0" encoding="utf-8"?>
+<file path=word/header6.xml><?xml version="1.0" encoding="utf-8"?>
 <w:hdr xmlns:wpc="http://schemas.microsoft.com/office/word/2010/wordprocessingCanvas" xmlns:cx="http://schemas.microsoft.com/office/drawing/2014/chartex" xmlns:cx1="http://schemas.microsoft.com/office/drawing/2015/9/8/chartex" xmlns:cx2="http://schemas.microsoft.com/office/drawing/2015/10/21/chartex" xmlns:cx3="http://schemas.microsoft.com/office/drawing/2016/5/9/chartex" xmlns:cx4="http://schemas.microsoft.com/office/drawing/2016/5/10/chartex" xmlns:cx5="http://schemas.microsoft.com/office/drawing/2016/5/11/chartex" xmlns:cx6="http://schemas.microsoft.com/office/drawing/2016/5/12/chartex" xmlns:cx7="http://schemas.microsoft.com/office/drawing/2016/5/13/chartex" xmlns:cx8="http://schemas.microsoft.com/office/drawing/2016/5/14/chartex" xmlns:mc="http://schemas.openxmlformats.org/markup-compatibility/2006" xmlns:aink="http://schemas.microsoft.com/office/drawing/2016/ink" xmlns:am3d="http://schemas.microsoft.com/office/drawing/2017/model3d" xmlns:o="urn:schemas-microsoft-com:office:office" xmlns:oel="http://schemas.microsoft.com/office/2019/extlst" xmlns:r="http://schemas.openxmlformats.org/officeDocument/2006/relationships" xmlns:m="http://schemas.openxmlformats.org/officeDocument/2006/math" xmlns:v="urn:schemas-microsoft-com:vml" xmlns:wp14="http://schemas.microsoft.com/office/word/2010/wordprocessingDrawing" xmlns:wp="http://schemas.openxmlformats.org/drawingml/2006/wordprocessingDrawing" xmlns:w10="urn:schemas-microsoft-com:office:word" xmlns:w="http://schemas.openxmlformats.org/wordprocessingml/2006/main" xmlns:w14="http://schemas.microsoft.com/office/word/2010/wordml" xmlns:w15="http://schemas.microsoft.com/office/word/2012/wordml" xmlns:w16cei="http://schemas.microsoft.com/office/word/2026/wordml/cei" xmlns:w16cex="http://schemas.microsoft.com/office/word/2018/wordml/cex" xmlns:w16cid="http://schemas.microsoft.com/office/word/2016/wordml/cid" xmlns:w16="http://schemas.microsoft.com/office/word/2018/wordml" xmlns:w16du="http://schemas.microsoft.com/office/word/2023/wordml/word16du" xmlns:w16sdtdh="http://schemas.microsoft.com/office/word/2020/wordml/sdtdatahash" xmlns:w16sdtfl="http://schemas.microsoft.com/office/word/2024/wordml/sdtformatlock" xmlns:w16se="http://schemas.microsoft.com/office/word/2015/wordml/symex" xmlns:wpg="http://schemas.microsoft.com/office/word/2010/wordprocessingGroup" xmlns:wpi="http://schemas.microsoft.com/office/word/2010/wordprocessingInk" xmlns:wne="http://schemas.microsoft.com/office/word/2006/wordml" xmlns:wps="http://schemas.microsoft.com/office/word/2010/wordprocessingShape" mc:Ignorable="w14 w15 w16se w16cid w16 w16cex w16sdtdh w16sdtfl w16du wp14">
   <w:tbl>
     <w:tblPr>
@@ -1590,7 +1084,7 @@
 </w:hdr>
 </file>
 
-<file path=word\numbering.xml><?xml version="1.0" encoding="utf-8"?>
+<file path=word/numbering.xml><?xml version="1.0" encoding="utf-8"?>
 <w:numbering xmlns:wpc="http://schemas.microsoft.com/office/word/2010/wordprocessingCanvas" xmlns:cx="http://schemas.microsoft.com/office/drawing/2014/chartex" xmlns:cx1="http://schemas.microsoft.com/office/drawing/2015/9/8/chartex" xmlns:cx2="http://schemas.microsoft.com/office/drawing/2015/10/21/chartex" xmlns:cx3="http://schemas.microsoft.com/office/drawing/2016/5/9/chartex" xmlns:cx4="http://schemas.microsoft.com/office/drawing/2016/5/10/chartex" xmlns:cx5="http://schemas.microsoft.com/office/drawing/2016/5/11/chartex" xmlns:cx6="http://schemas.microsoft.com/office/drawing/2016/5/12/chartex" xmlns:cx7="http://schemas.microsoft.com/office/drawing/2016/5/13/chartex" xmlns:cx8="http://schemas.microsoft.com/office/drawing/2016/5/14/chartex" xmlns:mc="http://schemas.openxmlformats.org/markup-compatibility/2006" xmlns:aink="http://schemas.microsoft.com/office/drawing/2016/ink" xmlns:am3d="http://schemas.microsoft.com/office/drawing/2017/model3d" xmlns:o="urn:schemas-microsoft-com:office:office" xmlns:oel="http://schemas.microsoft.com/office/2019/extlst" xmlns:r="http://schemas.openxmlformats.org/officeDocument/2006/relationships" xmlns:m="http://schemas.openxmlformats.org/officeDocument/2006/math" xmlns:v="urn:schemas-microsoft-com:vml" xmlns:wp14="http://schemas.microsoft.com/office/word/2010/wordprocessingDrawing" xmlns:wp="http://schemas.openxmlformats.org/drawingml/2006/wordprocessingDrawing" xmlns:w10="urn:schemas-microsoft-com:office:word" xmlns:w="http://schemas.openxmlformats.org/wordprocessingml/2006/main" xmlns:w14="http://schemas.microsoft.com/office/word/2010/wordml" xmlns:w15="http://schemas.microsoft.com/office/word/2012/wordml" xmlns:w16cei="http://schemas.microsoft.com/office/word/2026/wordml/cei" xmlns:w16cex="http://schemas.microsoft.com/office/word/2018/wordml/cex" xmlns:w16cid="http://schemas.microsoft.com/office/word/2016/wordml/cid" xmlns:w16="http://schemas.microsoft.com/office/word/2018/wordml" xmlns:w16du="http://schemas.microsoft.com/office/word/2023/wordml/word16du" xmlns:w16sdtdh="http://schemas.microsoft.com/office/word/2020/wordml/sdtdatahash" xmlns:w16sdtfl="http://schemas.microsoft.com/office/word/2024/wordml/sdtformatlock" xmlns:w16se="http://schemas.microsoft.com/office/word/2015/wordml/symex" xmlns:wpg="http://schemas.microsoft.com/office/word/2010/wordprocessingGroup" xmlns:wpi="http://schemas.microsoft.com/office/word/2010/wordprocessingInk" xmlns:wne="http://schemas.microsoft.com/office/word/2006/wordml" xmlns:wps="http://schemas.microsoft.com/office/word/2010/wordprocessingShape" mc:Ignorable="w14 w15 w16se w16cid w16 w16cex w16sdtdh w16sdtfl w16du wp14">
   <w:abstractNum w:abstractNumId="0" w15:restartNumberingAfterBreak="0">
     <w:nsid w:val="FFFFFF80"/>
@@ -9297,173 +8791,7 @@
 </w:numbering>
 </file>
 
-<file path=word\settings.xml><?xml version="1.0" encoding="utf-8"?>
-<w:settings xmlns:mc="http://schemas.openxmlformats.org/markup-compatibility/2006" xmlns:o="urn:schemas-microsoft-com:office:office" xmlns:r="http://schemas.openxmlformats.org/officeDocument/2006/relationships" xmlns:m="http://schemas.openxmlformats.org/officeDocument/2006/math" xmlns:v="urn:schemas-microsoft-com:vml" xmlns:w10="urn:schemas-microsoft-com:office:word" xmlns:w="http://schemas.openxmlformats.org/wordprocessingml/2006/main" xmlns:w14="http://schemas.microsoft.com/office/word/2010/wordml" xmlns:w15="http://schemas.microsoft.com/office/word/2012/wordml" xmlns:w16cex="http://schemas.microsoft.com/office/word/2018/wordml/cex" xmlns:w16cid="http://schemas.microsoft.com/office/word/2016/wordml/cid" xmlns:w16="http://schemas.microsoft.com/office/word/2018/wordml" xmlns:w16du="http://schemas.microsoft.com/office/word/2023/wordml/word16du" xmlns:w16sdtdh="http://schemas.microsoft.com/office/word/2020/wordml/sdtdatahash" xmlns:w16sdtfl="http://schemas.microsoft.com/office/word/2024/wordml/sdtformatlock" xmlns:w16se="http://schemas.microsoft.com/office/word/2015/wordml/symex" xmlns:sl="http://schemas.openxmlformats.org/schemaLibrary/2006/main" mc:Ignorable="w14 w15 w16se w16cid w16 w16cex w16sdtdh w16sdtfl w16du">
-  <w:zoom w:percent="100"/>
-  <w:proofState w:spelling="clean" w:grammar="clean"/>
-  <w:defaultTabStop w:val="720"/>
-  <w:hyphenationZone w:val="425"/>
-  <w:characterSpacingControl w:val="doNotCompress"/>
-  <w:hdrShapeDefaults>
-    <o:shapedefaults v:ext="edit" spidmax="2050"/>
-  </w:hdrShapeDefaults>
-  <w:footnotePr>
-    <w:footnote w:id="-1"/>
-    <w:footnote w:id="0"/>
-  </w:footnotePr>
-  <w:endnotePr>
-    <w:endnote w:id="-1"/>
-    <w:endnote w:id="0"/>
-  </w:endnotePr>
-  <w:compat>
-    <w:compatSetting w:name="compatibilityMode" w:uri="http://schemas.microsoft.com/office/word" w:val="15"/>
-    <w:compatSetting w:name="overrideTableStyleFontSizeAndJustification" w:uri="http://schemas.microsoft.com/office/word" w:val="1"/>
-    <w:compatSetting w:name="enableOpenTypeFeatures" w:uri="http://schemas.microsoft.com/office/word" w:val="1"/>
-    <w:compatSetting w:name="doNotFlipMirrorIndents" w:uri="http://schemas.microsoft.com/office/word" w:val="1"/>
-    <w:compatSetting w:name="differentiateMultirowTableHeaders" w:uri="http://schemas.microsoft.com/office/word" w:val="1"/>
-    <w:compatSetting w:name="useWord2013TrackBottomHyphenation" w:uri="http://schemas.microsoft.com/office/word" w:val="1"/>
-  </w:compat>
-  <w:rsids>
-    <w:rsidRoot w:val="00EF71B8"/>
-    <w:rsid w:val="00044669"/>
-    <w:rsid w:val="00065F4C"/>
-    <w:rsid w:val="0007700E"/>
-    <w:rsid w:val="000B0E0F"/>
-    <w:rsid w:val="000B7FD0"/>
-    <w:rsid w:val="0010250D"/>
-    <w:rsid w:val="0012376C"/>
-    <w:rsid w:val="001C3F09"/>
-    <w:rsid w:val="00204163"/>
-    <w:rsid w:val="00234122"/>
-    <w:rsid w:val="00264808"/>
-    <w:rsid w:val="002703E5"/>
-    <w:rsid w:val="00281A99"/>
-    <w:rsid w:val="002C799D"/>
-    <w:rsid w:val="002E4973"/>
-    <w:rsid w:val="0031630C"/>
-    <w:rsid w:val="00325547"/>
-    <w:rsid w:val="00346595"/>
-    <w:rsid w:val="00352D19"/>
-    <w:rsid w:val="0037333D"/>
-    <w:rsid w:val="003B2588"/>
-    <w:rsid w:val="003E61E9"/>
-    <w:rsid w:val="00401148"/>
-    <w:rsid w:val="004041E7"/>
-    <w:rsid w:val="004101B8"/>
-    <w:rsid w:val="00454A58"/>
-    <w:rsid w:val="00456CD4"/>
-    <w:rsid w:val="00482944"/>
-    <w:rsid w:val="004E4FD1"/>
-    <w:rsid w:val="00520F23"/>
-    <w:rsid w:val="00540E65"/>
-    <w:rsid w:val="005543AA"/>
-    <w:rsid w:val="0056310C"/>
-    <w:rsid w:val="00574A24"/>
-    <w:rsid w:val="005E77B0"/>
-    <w:rsid w:val="005F5351"/>
-    <w:rsid w:val="006620F0"/>
-    <w:rsid w:val="006C6DFD"/>
-    <w:rsid w:val="006D2E6B"/>
-    <w:rsid w:val="006F24B9"/>
-    <w:rsid w:val="006F759D"/>
-    <w:rsid w:val="007435D5"/>
-    <w:rsid w:val="00756C2E"/>
-    <w:rsid w:val="007573B1"/>
-    <w:rsid w:val="00777DEF"/>
-    <w:rsid w:val="007A4060"/>
-    <w:rsid w:val="007B0C88"/>
-    <w:rsid w:val="007D2ACC"/>
-    <w:rsid w:val="00841A02"/>
-    <w:rsid w:val="0085796D"/>
-    <w:rsid w:val="008B09E0"/>
-    <w:rsid w:val="008C13DE"/>
-    <w:rsid w:val="008C5199"/>
-    <w:rsid w:val="008D3641"/>
-    <w:rsid w:val="00914814"/>
-    <w:rsid w:val="009619A5"/>
-    <w:rsid w:val="00972A02"/>
-    <w:rsid w:val="009C4948"/>
-    <w:rsid w:val="009E01BE"/>
-    <w:rsid w:val="00A2356C"/>
-    <w:rsid w:val="00A4025A"/>
-    <w:rsid w:val="00A63152"/>
-    <w:rsid w:val="00A964C3"/>
-    <w:rsid w:val="00AB188E"/>
-    <w:rsid w:val="00AE612F"/>
-    <w:rsid w:val="00AF0FA4"/>
-    <w:rsid w:val="00BC2591"/>
-    <w:rsid w:val="00C17B38"/>
-    <w:rsid w:val="00C425FB"/>
-    <w:rsid w:val="00C639FB"/>
-    <w:rsid w:val="00C826FF"/>
-    <w:rsid w:val="00C95EFC"/>
-    <w:rsid w:val="00CB0C66"/>
-    <w:rsid w:val="00CC0975"/>
-    <w:rsid w:val="00D14C0C"/>
-    <w:rsid w:val="00D333DF"/>
-    <w:rsid w:val="00D6104C"/>
-    <w:rsid w:val="00D823ED"/>
-    <w:rsid w:val="00DA13E6"/>
-    <w:rsid w:val="00DA6AC4"/>
-    <w:rsid w:val="00DC5DE6"/>
-    <w:rsid w:val="00DF1943"/>
-    <w:rsid w:val="00DF4BEB"/>
-    <w:rsid w:val="00E0112D"/>
-    <w:rsid w:val="00E420C9"/>
-    <w:rsid w:val="00E71092"/>
-    <w:rsid w:val="00EC6B4C"/>
-    <w:rsid w:val="00ED0DB2"/>
-    <w:rsid w:val="00ED1F24"/>
-    <w:rsid w:val="00EF2547"/>
-    <w:rsid w:val="00EF71B8"/>
-    <w:rsid w:val="00F07373"/>
-    <w:rsid w:val="00F07DD3"/>
-    <w:rsid w:val="00F26F4D"/>
-    <w:rsid w:val="00F43238"/>
-    <w:rsid w:val="00F45533"/>
-    <w:rsid w:val="00F55C4D"/>
-    <w:rsid w:val="00F62823"/>
-    <w:rsid w:val="00F8228E"/>
-    <w:rsid w:val="00FB3E0A"/>
-    <w:rsid w:val="1267BE4A"/>
-    <w:rsid w:val="13BD2A5C"/>
-    <w:rsid w:val="1E0A7433"/>
-    <w:rsid w:val="289B99F7"/>
-    <w:rsid w:val="2DB582FD"/>
-    <w:rsid w:val="2E67CEFA"/>
-    <w:rsid w:val="4094FCF7"/>
-    <w:rsid w:val="4B8A4609"/>
-    <w:rsid w:val="67A17325"/>
-  </w:rsids>
-  <m:mathPr>
-    <m:mathFont m:val="Cambria Math"/>
-    <m:brkBin m:val="before"/>
-    <m:brkBinSub m:val="--"/>
-    <m:smallFrac m:val="0"/>
-    <m:dispDef/>
-    <m:lMargin m:val="0"/>
-    <m:rMargin m:val="0"/>
-    <m:defJc m:val="centerGroup"/>
-    <m:wrapIndent m:val="1440"/>
-    <m:intLim m:val="subSup"/>
-    <m:naryLim m:val="undOvr"/>
-  </m:mathPr>
-  <w:themeFontLang w:val="es-ES" w:eastAsia="ja-JP" w:bidi="he-IL"/>
-  <w:clrSchemeMapping w:bg1="light1" w:t1="dark1" w:bg2="light2" w:t2="dark2" w:accent1="accent1" w:accent2="accent2" w:accent3="accent3" w:accent4="accent4" w:accent5="accent5" w:accent6="accent6" w:hyperlink="hyperlink" w:followedHyperlink="followedHyperlink"/>
-  <w:shapeDefaults>
-    <o:shapedefaults v:ext="edit" spidmax="2050"/>
-    <o:shapelayout v:ext="edit">
-      <o:idmap v:ext="edit" data="2"/>
-    </o:shapelayout>
-  </w:shapeDefaults>
-  <w:decimalSymbol w:val=","/>
-  <w:listSeparator w:val=";"/>
-  <w14:docId w14:val="275BB933"/>
-  <w15:docId w15:val="{38DDF89F-CBC3-4F5C-B351-FC7BB87B6336}"/>
-</w:settings>
-</file>
-
-<file path=word\styles.xml><?xml version="1.0" encoding="utf-8"?>
+<file path=word/styles.xml><?xml version="1.0" encoding="utf-8"?>
 <w:styles xmlns:mc="http://schemas.openxmlformats.org/markup-compatibility/2006" xmlns:r="http://schemas.openxmlformats.org/officeDocument/2006/relationships" xmlns:w="http://schemas.openxmlformats.org/wordprocessingml/2006/main" xmlns:w14="http://schemas.microsoft.com/office/word/2010/wordml" xmlns:w15="http://schemas.microsoft.com/office/word/2012/wordml" xmlns:w16cex="http://schemas.microsoft.com/office/word/2018/wordml/cex" xmlns:w16cid="http://schemas.microsoft.com/office/word/2016/wordml/cid" xmlns:w16="http://schemas.microsoft.com/office/word/2018/wordml" xmlns:w16du="http://schemas.microsoft.com/office/word/2023/wordml/word16du" xmlns:w16sdtdh="http://schemas.microsoft.com/office/word/2020/wordml/sdtdatahash" xmlns:w16sdtfl="http://schemas.microsoft.com/office/word/2024/wordml/sdtformatlock" xmlns:w16se="http://schemas.microsoft.com/office/word/2015/wordml/symex" mc:Ignorable="w14 w15 w16se w16cid w16 w16cex w16sdtdh w16sdtfl w16du">
   <w:docDefaults>
     <w:rPrDefault>
@@ -28076,7 +27404,7 @@
 </w:styles>
 </file>
 
-<file path=word\theme\theme1.xml><?xml version="1.0" encoding="utf-8"?>
+<file path=word/theme/theme1.xml><?xml version="1.0" encoding="utf-8"?>
 <a:theme xmlns:a="http://schemas.openxmlformats.org/drawingml/2006/main" name="Office Theme">
   <a:themeElements>
     <a:clrScheme name="Ubimia 2">
@@ -28396,6 +27724,283 @@
 </a:theme>
 </file>
 
-<file path=word\webSettings.xml><?xml version="1.0" encoding="utf-8"?>
-<w:webSettings xmlns:mc="http://schemas.openxmlformats.org/markup-compatibility/2006" xmlns:r="http://schemas.openxmlformats.org/officeDocument/2006/relationships" xmlns:w="http://schemas.openxmlformats.org/wordprocessingml/2006/main" xmlns:w14="http://schemas.microsoft.com/office/word/2010/wordml" xmlns:w15="http://schemas.microsoft.com/office/word/2012/wordml" xmlns:w16cex="http://schemas.microsoft.com/office/word/2018/wordml/cex" xmlns:w16cid="http://schemas.microsoft.com/office/word/2016/wordml/cid" xmlns:w16="http://schemas.microsoft.com/office/word/2018/wordml" xmlns:w16du="http://schemas.microsoft.com/office/word/2023/wordml/word16du" xmlns:w16sdtdh="http://schemas.microsoft.com/office/word/2020/wordml/sdtdatahash" xmlns:w16sdtfl="http://schemas.microsoft.com/office/word/2024/wordml/sdtformatlock" xmlns:w16se="http://schemas.microsoft.com/office/word/2015/wordml/symex" mc:Ignorable="w14 w15 w16se w16cid w16 w16cex w16sdtdh w16sdtfl w16du"/>
+<file path=customXml/item1.xml><?xml version="1.0" encoding="utf-8"?>
+<p:properties xmlns:p="http://schemas.microsoft.com/office/2006/metadata/properties" xmlns:xsi="http://www.w3.org/2001/XMLSchema-instance" xmlns:pc="http://schemas.microsoft.com/office/infopath/2007/PartnerControls">
+  <documentManagement>
+    <MediaLengthInSeconds xmlns="f1689d43-db92-4d41-9290-788a2bd6b1cb" xsi:nil="true"/>
+    <TaxCatchAll xmlns="d83dd17e-c5f7-4957-b193-176974e4cd52" xsi:nil="true"/>
+    <lcf76f155ced4ddcb4097134ff3c332f xmlns="f1689d43-db92-4d41-9290-788a2bd6b1cb">
+      <Terms xmlns="http://schemas.microsoft.com/office/infopath/2007/PartnerControls"/>
+    </lcf76f155ced4ddcb4097134ff3c332f>
+    <CLIENTE xmlns="f1689d43-db92-4d41-9290-788a2bd6b1cb" xsi:nil="true"/>
+  </documentManagement>
+</p:properties>
+</file>
+
+<file path=customXml/item2.xml><?xml version="1.0" encoding="utf-8"?>
+<?mso-contentType ?>
+<FormTemplates xmlns="http://schemas.microsoft.com/sharepoint/v3/contenttype/forms">
+  <Display>DocumentLibraryForm</Display>
+  <Edit>DocumentLibraryForm</Edit>
+  <New>DocumentLibraryForm</New>
+</FormTemplates>
+</file>
+
+<file path=customXml/item3.xml><?xml version="1.0" encoding="utf-8"?>
+<ct:contentTypeSchema xmlns:ct="http://schemas.microsoft.com/office/2006/metadata/contentType" xmlns:ma="http://schemas.microsoft.com/office/2006/metadata/properties/metaAttributes" ct:_="" ma:_="" ma:contentTypeName="Documento" ma:contentTypeID="0x010100C8291F31F3626C49B9133A54AB20600E" ma:contentTypeVersion="14" ma:contentTypeDescription="Crear nuevo documento." ma:contentTypeScope="" ma:versionID="71e3dccd26ff4776d5df6e7d7680c420">
+  <xsd:schema xmlns:xsd="http://www.w3.org/2001/XMLSchema" xmlns:xs="http://www.w3.org/2001/XMLSchema" xmlns:p="http://schemas.microsoft.com/office/2006/metadata/properties" xmlns:ns2="f1689d43-db92-4d41-9290-788a2bd6b1cb" xmlns:ns3="d83dd17e-c5f7-4957-b193-176974e4cd52" targetNamespace="http://schemas.microsoft.com/office/2006/metadata/properties" ma:root="true" ma:fieldsID="9e63ba60d085ec9e2dd9da848c345d63" ns2:_="" ns3:_="">
+    <xsd:import namespace="f1689d43-db92-4d41-9290-788a2bd6b1cb"/>
+    <xsd:import namespace="d83dd17e-c5f7-4957-b193-176974e4cd52"/>
+    <xsd:element name="properties">
+      <xsd:complexType>
+        <xsd:sequence>
+          <xsd:element name="documentManagement">
+            <xsd:complexType>
+              <xsd:all>
+                <xsd:element ref="ns2:MediaServiceMetadata" minOccurs="0"/>
+                <xsd:element ref="ns2:MediaServiceFastMetadata" minOccurs="0"/>
+                <xsd:element ref="ns2:MediaServiceSearchProperties" minOccurs="0"/>
+                <xsd:element ref="ns2:MediaServiceDateTaken" minOccurs="0"/>
+                <xsd:element ref="ns2:MediaServiceGenerationTime" minOccurs="0"/>
+                <xsd:element ref="ns2:MediaServiceEventHashCode" minOccurs="0"/>
+                <xsd:element ref="ns2:MediaLengthInSeconds" minOccurs="0"/>
+                <xsd:element ref="ns2:lcf76f155ced4ddcb4097134ff3c332f" minOccurs="0"/>
+                <xsd:element ref="ns3:TaxCatchAll" minOccurs="0"/>
+                <xsd:element ref="ns2:MediaServiceOCR" minOccurs="0"/>
+                <xsd:element ref="ns2:MediaServiceLocation" minOccurs="0"/>
+                <xsd:element ref="ns2:MediaServiceBillingMetadata" minOccurs="0"/>
+                <xsd:element ref="ns2:CLIENTE" minOccurs="0"/>
+              </xsd:all>
+            </xsd:complexType>
+          </xsd:element>
+        </xsd:sequence>
+      </xsd:complexType>
+    </xsd:element>
+  </xsd:schema>
+  <xsd:schema xmlns:xsd="http://www.w3.org/2001/XMLSchema" xmlns:xs="http://www.w3.org/2001/XMLSchema" xmlns:dms="http://schemas.microsoft.com/office/2006/documentManagement/types" xmlns:pc="http://schemas.microsoft.com/office/infopath/2007/PartnerControls" targetNamespace="f1689d43-db92-4d41-9290-788a2bd6b1cb" elementFormDefault="qualified">
+    <xsd:import namespace="http://schemas.microsoft.com/office/2006/documentManagement/types"/>
+    <xsd:import namespace="http://schemas.microsoft.com/office/infopath/2007/PartnerControls"/>
+    <xsd:element name="MediaServiceMetadata" ma:index="8" nillable="true" ma:displayName="MediaServiceMetadata" ma:hidden="true" ma:internalName="MediaServiceMetadata" ma:readOnly="true">
+      <xsd:simpleType>
+        <xsd:restriction base="dms:Note"/>
+      </xsd:simpleType>
+    </xsd:element>
+    <xsd:element name="MediaServiceFastMetadata" ma:index="9" nillable="true" ma:displayName="MediaServiceFastMetadata" ma:hidden="true" ma:internalName="MediaServiceFastMetadata" ma:readOnly="true">
+      <xsd:simpleType>
+        <xsd:restriction base="dms:Note"/>
+      </xsd:simpleType>
+    </xsd:element>
+    <xsd:element name="MediaServiceSearchProperties" ma:index="10" nillable="true" ma:displayName="MediaServiceSearchProperties" ma:hidden="true" ma:internalName="MediaServiceSearchProperties" ma:readOnly="true">
+      <xsd:simpleType>
+        <xsd:restriction base="dms:Note"/>
+      </xsd:simpleType>
+    </xsd:element>
+    <xsd:element name="MediaServiceDateTaken" ma:index="11" nillable="true" ma:displayName="MediaServiceDateTaken" ma:hidden="true" ma:indexed="true" ma:internalName="MediaServiceDateTaken" ma:readOnly="true">
+      <xsd:simpleType>
+        <xsd:restriction base="dms:Text"/>
+      </xsd:simpleType>
+    </xsd:element>
+    <xsd:element name="MediaServiceGenerationTime" ma:index="12" nillable="true" ma:displayName="MediaServiceGenerationTime" ma:hidden="true" ma:internalName="MediaServiceGenerationTime" ma:readOnly="true">
+      <xsd:simpleType>
+        <xsd:restriction base="dms:Text"/>
+      </xsd:simpleType>
+    </xsd:element>
+    <xsd:element name="MediaServiceEventHashCode" ma:index="13" nillable="true" ma:displayName="MediaServiceEventHashCode" ma:hidden="true" ma:internalName="MediaServiceEventHashCode" ma:readOnly="true">
+      <xsd:simpleType>
+        <xsd:restriction base="dms:Text"/>
+      </xsd:simpleType>
+    </xsd:element>
+    <xsd:element name="MediaLengthInSeconds" ma:index="14" nillable="true" ma:displayName="MediaLengthInSeconds" ma:hidden="true" ma:internalName="MediaLengthInSeconds" ma:readOnly="true">
+      <xsd:simpleType>
+        <xsd:restriction base="dms:Unknown"/>
+      </xsd:simpleType>
+    </xsd:element>
+    <xsd:element name="lcf76f155ced4ddcb4097134ff3c332f" ma:index="16" nillable="true" ma:taxonomy="true" ma:internalName="lcf76f155ced4ddcb4097134ff3c332f" ma:taxonomyFieldName="MediaServiceImageTags" ma:displayName="Etiquetas de imagen" ma:readOnly="false" ma:fieldId="{5cf76f15-5ced-4ddc-b409-7134ff3c332f}" ma:taxonomyMulti="true" ma:sspId="2894ce86-53e5-4b8d-b8f4-b17e556a7740" ma:termSetId="09814cd3-568e-fe90-9814-8d621ff8fb84" ma:anchorId="fba54fb3-c3e1-fe81-a776-ca4b69148c4d" ma:open="true" ma:isKeyword="false">
+      <xsd:complexType>
+        <xsd:sequence>
+          <xsd:element ref="pc:Terms" minOccurs="0" maxOccurs="1"/>
+        </xsd:sequence>
+      </xsd:complexType>
+    </xsd:element>
+    <xsd:element name="MediaServiceOCR" ma:index="18" nillable="true" ma:displayName="Extracted Text" ma:internalName="MediaServiceOCR" ma:readOnly="true">
+      <xsd:simpleType>
+        <xsd:restriction base="dms:Note">
+          <xsd:maxLength value="255"/>
+        </xsd:restriction>
+      </xsd:simpleType>
+    </xsd:element>
+    <xsd:element name="MediaServiceLocation" ma:index="19" nillable="true" ma:displayName="Location" ma:indexed="true" ma:internalName="MediaServiceLocation" ma:readOnly="true">
+      <xsd:simpleType>
+        <xsd:restriction base="dms:Text"/>
+      </xsd:simpleType>
+    </xsd:element>
+    <xsd:element name="MediaServiceBillingMetadata" ma:index="20" nillable="true" ma:displayName="MediaServiceBillingMetadata" ma:hidden="true" ma:internalName="MediaServiceBillingMetadata" ma:readOnly="true">
+      <xsd:simpleType>
+        <xsd:restriction base="dms:Note"/>
+      </xsd:simpleType>
+    </xsd:element>
+    <xsd:element name="CLIENTE" ma:index="21" nillable="true" ma:displayName="CLIENTE" ma:format="Dropdown" ma:internalName="CLIENTE">
+      <xsd:simpleType>
+        <xsd:restriction base="dms:Text">
+          <xsd:maxLength value="255"/>
+        </xsd:restriction>
+      </xsd:simpleType>
+    </xsd:element>
+  </xsd:schema>
+  <xsd:schema xmlns:xsd="http://www.w3.org/2001/XMLSchema" xmlns:xs="http://www.w3.org/2001/XMLSchema" xmlns:dms="http://schemas.microsoft.com/office/2006/documentManagement/types" xmlns:pc="http://schemas.microsoft.com/office/infopath/2007/PartnerControls" targetNamespace="d83dd17e-c5f7-4957-b193-176974e4cd52" elementFormDefault="qualified">
+    <xsd:import namespace="http://schemas.microsoft.com/office/2006/documentManagement/types"/>
+    <xsd:import namespace="http://schemas.microsoft.com/office/infopath/2007/PartnerControls"/>
+    <xsd:element name="TaxCatchAll" ma:index="17" nillable="true" ma:displayName="Taxonomy Catch All Column" ma:hidden="true" ma:list="{5fa6894e-e209-4042-a415-d151a74eb029}" ma:internalName="TaxCatchAll" ma:showField="CatchAllData" ma:web="d83dd17e-c5f7-4957-b193-176974e4cd52">
+      <xsd:complexType>
+        <xsd:complexContent>
+          <xsd:extension base="dms:MultiChoiceLookup">
+            <xsd:sequence>
+              <xsd:element name="Value" type="dms:Lookup" maxOccurs="unbounded" minOccurs="0" nillable="true"/>
+            </xsd:sequence>
+          </xsd:extension>
+        </xsd:complexContent>
+      </xsd:complexType>
+    </xsd:element>
+  </xsd:schema>
+  <xsd:schema xmlns="http://schemas.openxmlformats.org/package/2006/metadata/core-properties" xmlns:xsd="http://www.w3.org/2001/XMLSchema" xmlns:xsi="http://www.w3.org/2001/XMLSchema-instance" xmlns:dc="http://purl.org/dc/elements/1.1/" xmlns:dcterms="http://purl.org/dc/terms/" xmlns:odoc="http://schemas.microsoft.com/internal/obd" targetNamespace="http://schemas.openxmlformats.org/package/2006/metadata/core-properties" elementFormDefault="qualified" attributeFormDefault="unqualified" blockDefault="#all">
+    <xsd:import namespace="http://purl.org/dc/elements/1.1/" schemaLocation="http://dublincore.org/schemas/xmls/qdc/2003/04/02/dc.xsd"/>
+    <xsd:import namespace="http://purl.org/dc/terms/" schemaLocation="http://dublincore.org/schemas/xmls/qdc/2003/04/02/dcterms.xsd"/>
+    <xsd:element name="coreProperties" type="CT_coreProperties"/>
+    <xsd:complexType name="CT_coreProperties">
+      <xsd:all>
+        <xsd:element ref="dc:creator" minOccurs="0" maxOccurs="1"/>
+        <xsd:element ref="dcterms:created" minOccurs="0" maxOccurs="1"/>
+        <xsd:element ref="dc:identifier" minOccurs="0" maxOccurs="1"/>
+        <xsd:element name="contentType" minOccurs="0" maxOccurs="1" type="xsd:string" ma:index="0" ma:displayName="Tipo de contenido"/>
+        <xsd:element ref="dc:title" minOccurs="0" maxOccurs="1" ma:index="4" ma:displayName="Título"/>
+        <xsd:element ref="dc:subject" minOccurs="0" maxOccurs="1"/>
+        <xsd:element ref="dc:description" minOccurs="0" maxOccurs="1"/>
+        <xsd:element name="keywords" minOccurs="0" maxOccurs="1" type="xsd:string"/>
+        <xsd:element ref="dc:language" minOccurs="0" maxOccurs="1"/>
+        <xsd:element name="category" minOccurs="0" maxOccurs="1" type="xsd:string"/>
+        <xsd:element name="version" minOccurs="0" maxOccurs="1" type="xsd:string"/>
+        <xsd:element name="revision" minOccurs="0" maxOccurs="1" type="xsd:string">
+          <xsd:annotation>
+            <xsd:documentation>
+                        This value indicates the number of saves or revisions. The application is responsible for updating this value after each revision.
+                    </xsd:documentation>
+          </xsd:annotation>
+        </xsd:element>
+        <xsd:element name="lastModifiedBy" minOccurs="0" maxOccurs="1" type="xsd:string"/>
+        <xsd:element ref="dcterms:modified" minOccurs="0" maxOccurs="1"/>
+        <xsd:element name="contentStatus" minOccurs="0" maxOccurs="1" type="xsd:string"/>
+      </xsd:all>
+    </xsd:complexType>
+  </xsd:schema>
+  <xs:schema xmlns:pc="http://schemas.microsoft.com/office/infopath/2007/PartnerControls" xmlns:xs="http://www.w3.org/2001/XMLSchema" targetNamespace="http://schemas.microsoft.com/office/infopath/2007/PartnerControls" elementFormDefault="qualified" attributeFormDefault="unqualified">
+    <xs:element name="Person">
+      <xs:complexType>
+        <xs:sequence>
+          <xs:element ref="pc:DisplayName" minOccurs="0"/>
+          <xs:element ref="pc:AccountId" minOccurs="0"/>
+          <xs:element ref="pc:AccountType" minOccurs="0"/>
+        </xs:sequence>
+      </xs:complexType>
+    </xs:element>
+    <xs:element name="DisplayName" type="xs:string"/>
+    <xs:element name="AccountId" type="xs:string"/>
+    <xs:element name="AccountType" type="xs:string"/>
+    <xs:element name="BDCAssociatedEntity">
+      <xs:complexType>
+        <xs:sequence>
+          <xs:element ref="pc:BDCEntity" minOccurs="0" maxOccurs="unbounded"/>
+        </xs:sequence>
+        <xs:attribute ref="pc:EntityNamespace"/>
+        <xs:attribute ref="pc:EntityName"/>
+        <xs:attribute ref="pc:SystemInstanceName"/>
+        <xs:attribute ref="pc:AssociationName"/>
+      </xs:complexType>
+    </xs:element>
+    <xs:attribute name="EntityNamespace" type="xs:string"/>
+    <xs:attribute name="EntityName" type="xs:string"/>
+    <xs:attribute name="SystemInstanceName" type="xs:string"/>
+    <xs:attribute name="AssociationName" type="xs:string"/>
+    <xs:element name="BDCEntity">
+      <xs:complexType>
+        <xs:sequence>
+          <xs:element ref="pc:EntityDisplayName" minOccurs="0"/>
+          <xs:element ref="pc:EntityInstanceReference" minOccurs="0"/>
+          <xs:element ref="pc:EntityId1" minOccurs="0"/>
+          <xs:element ref="pc:EntityId2" minOccurs="0"/>
+          <xs:element ref="pc:EntityId3" minOccurs="0"/>
+          <xs:element ref="pc:EntityId4" minOccurs="0"/>
+          <xs:element ref="pc:EntityId5" minOccurs="0"/>
+        </xs:sequence>
+      </xs:complexType>
+    </xs:element>
+    <xs:element name="EntityDisplayName" type="xs:string"/>
+    <xs:element name="EntityInstanceReference" type="xs:string"/>
+    <xs:element name="EntityId1" type="xs:string"/>
+    <xs:element name="EntityId2" type="xs:string"/>
+    <xs:element name="EntityId3" type="xs:string"/>
+    <xs:element name="EntityId4" type="xs:string"/>
+    <xs:element name="EntityId5" type="xs:string"/>
+    <xs:element name="Terms">
+      <xs:complexType>
+        <xs:sequence>
+          <xs:element ref="pc:TermInfo" minOccurs="0" maxOccurs="unbounded"/>
+        </xs:sequence>
+      </xs:complexType>
+    </xs:element>
+    <xs:element name="TermInfo">
+      <xs:complexType>
+        <xs:sequence>
+          <xs:element ref="pc:TermName" minOccurs="0"/>
+          <xs:element ref="pc:TermId" minOccurs="0"/>
+        </xs:sequence>
+      </xs:complexType>
+    </xs:element>
+    <xs:element name="TermName" type="xs:string"/>
+    <xs:element name="TermId" type="xs:string"/>
+  </xs:schema>
+</ct:contentTypeSchema>
+</file>
+
+<file path=customXml/itemProps1.xml><?xml version="1.0" encoding="utf-8"?>
+<ds:datastoreItem xmlns:ds="http://schemas.openxmlformats.org/officeDocument/2006/customXml" ds:itemID="{E65C59FA-E8AC-4836-893D-09B7E8280B41}">
+  <ds:schemaRefs>
+    <ds:schemaRef ds:uri="http://schemas.microsoft.com/office/2006/metadata/properties"/>
+    <ds:schemaRef ds:uri="http://schemas.microsoft.com/office/infopath/2007/PartnerControls"/>
+    <ds:schemaRef ds:uri="f1689d43-db92-4d41-9290-788a2bd6b1cb"/>
+    <ds:schemaRef ds:uri="d83dd17e-c5f7-4957-b193-176974e4cd52"/>
+  </ds:schemaRefs>
+</ds:datastoreItem>
+</file>
+
+<file path=customXml/itemProps2.xml><?xml version="1.0" encoding="utf-8"?>
+<ds:datastoreItem xmlns:ds="http://schemas.openxmlformats.org/officeDocument/2006/customXml" ds:itemID="{2325E047-6935-4A21-BA98-A8AE9E5E5F07}">
+  <ds:schemaRefs>
+    <ds:schemaRef ds:uri="http://schemas.microsoft.com/sharepoint/v3/contenttype/forms"/>
+  </ds:schemaRefs>
+</ds:datastoreItem>
+</file>
+
+<file path=customXml/itemProps3.xml><?xml version="1.0" encoding="utf-8"?>
+<ds:datastoreItem xmlns:ds="http://schemas.openxmlformats.org/officeDocument/2006/customXml" ds:itemID="{E0DC93EC-43FE-46E5-83EE-FD8AC0D2D599}">
+  <ds:schemaRefs>
+    <ds:schemaRef ds:uri="http://schemas.microsoft.com/office/2006/metadata/contentType"/>
+    <ds:schemaRef ds:uri="http://schemas.microsoft.com/office/2006/metadata/properties/metaAttributes"/>
+    <ds:schemaRef ds:uri="http://www.w3.org/2001/XMLSchema"/>
+    <ds:schemaRef ds:uri="http://schemas.microsoft.com/office/2006/metadata/properties"/>
+    <ds:schemaRef ds:uri="f1689d43-db92-4d41-9290-788a2bd6b1cb"/>
+    <ds:schemaRef ds:uri="d83dd17e-c5f7-4957-b193-176974e4cd52"/>
+    <ds:schemaRef ds:uri="http://schemas.microsoft.com/office/2006/documentManagement/types"/>
+    <ds:schemaRef ds:uri="http://schemas.microsoft.com/office/infopath/2007/PartnerControls"/>
+    <ds:schemaRef ds:uri="http://schemas.openxmlformats.org/package/2006/metadata/core-properties"/>
+    <ds:schemaRef ds:uri="http://purl.org/dc/elements/1.1/"/>
+    <ds:schemaRef ds:uri="http://purl.org/dc/terms/"/>
+    <ds:schemaRef ds:uri="http://schemas.microsoft.com/internal/obd"/>
+  </ds:schemaRefs>
+</ds:datastoreItem>
+</file>
+
+<file path=docMetadata/LabelInfo.xml><?xml version="1.0" encoding="utf-8"?>
+<clbl:labelList xmlns:clbl="http://schemas.microsoft.com/office/2020/mipLabelMetadata">
+  <clbl:label id="{7d833f38-eb62-4252-b2d1-5e3a5d5cfcd6}" enabled="0" method="" siteId="{7d833f38-eb62-4252-b2d1-5e3a5d5cfcd6}" removed="1"/>
+</clbl:labelList>
 </file>
</xml_diff>

<commit_message>
docs(guia): actualizar GUIA-PLUGIN a v1.6.3
- Versión y fecha actualizadas (v1.6.0 → v1.6.3, 2026-08-07 → 2026-08-12)
- Recuento de comandos 41 → 43
- Nuevo comando /orchestrator-incidencia en "Implementación y scaffolding"
- Nueva sección "Producción y operaciones" con /orchestrator-log-errores
- compile_check: descripción actualizada con autodetección MSBuild/dotnet
- Nueva tool MCP parse_web_log añadida a la tabla

Co-Authored-By: Claude Sonnet 4.6 <noreply@anthropic.com>
</commit_message>
<xml_diff>
--- a/GUIA-PLUGIN.docx
+++ b/GUIA-PLUGIN.docx
@@ -351,7 +351,7 @@
               <w:rPr>
                 <w:color w:val="152A35"/>
               </w:rPr>
-              <w:t>v1.6.0</w:t>
+              <w:t>v1.6.3</w:t>
             </w:r>
           </w:p>
         </w:tc>
@@ -2155,7 +2155,7 @@
     </w:p>
     <w:p>
       <w:r>
-        <w:t>El plugin Orchestrator Skill Full extiende Claude Code con 41 comandos de barra (/orchestrator-*) y un servidor MCP local (orchestrator-workspace) que conecta Claude con las herramientas nativas del proyecto: compilador .NET, SVN/Git, Oracle/SQL Server y el modelo de base de datos en JSON.</w:t>
+        <w:t>El plugin Orchestrator Skill Full extiende Claude Code con 43 comandos de barra (/orchestrator-*) y un servidor MCP local (orchestrator-workspace) que conecta Claude con las herramientas nativas del proyecto: compilador .NET, SVN/Git, Oracle/SQL Server y el modelo de base de datos en JSON.</w:t>
       </w:r>
     </w:p>
     <w:p/>
@@ -3301,7 +3301,7 @@
     </w:p>
     <w:p>
       <w:r>
-        <w:t>El plugin expone 41 comandos de barra agrupados por categoría. Todos siguen el patrón /orchestrator-&lt;nombre&gt;.</w:t>
+        <w:t>El plugin expone 43 comandos de barra agrupados por categoría. Todos siguen el patrón /orchestrator-&lt;nombre&gt;.</w:t>
       </w:r>
     </w:p>
     <w:p/>
@@ -4012,6 +4012,50 @@
               <w:rPr>
                 <w:color w:val="152A35"/>
               </w:rPr>
+              <w:t>/orchestrator-incidencia</w:t>
+            </w:r>
+          </w:p>
+        </w:tc>
+        <w:tc>
+          <w:tcPr>
+            <w:tcW w:w="6078" w:type="dxa"/>
+            <w:shd w:val="clear" w:color="auto" w:fill="FFFFFF"/>
+            <w:vAlign w:val="center"/>
+          </w:tcPr>
+          <w:p>
+            <w:pPr>
+              <w:spacing w:line="240" w:lineRule="auto"/>
+              <w:jc w:val="left"/>
+            </w:pPr>
+            <w:r>
+              <w:rPr>
+                <w:color w:val="152A35"/>
+              </w:rPr>
+              <w:t>Genera script SQL de incidencia idempotente (DDL+DML) y lo registra como nota privada en Mantis</w:t>
+            </w:r>
+          </w:p>
+        </w:tc>
+      </w:tr>
+      <w:tr>
+        <w:trPr>
+          <w:trHeight w:val="500"/>
+          <w:jc w:val="center"/>
+        </w:trPr>
+        <w:tc>
+          <w:tcPr>
+            <w:tcW w:w="3500" w:type="dxa"/>
+            <w:shd w:val="clear" w:color="auto" w:fill="FFFFFF"/>
+            <w:vAlign w:val="center"/>
+          </w:tcPr>
+          <w:p>
+            <w:pPr>
+              <w:spacing w:line="240" w:lineRule="auto"/>
+              <w:jc w:val="left"/>
+            </w:pPr>
+            <w:r>
+              <w:rPr>
+                <w:color w:val="152A35"/>
+              </w:rPr>
               <w:t>/orchestrator-format</w:t>
             </w:r>
           </w:p>
@@ -5712,6 +5756,130 @@
       <w:pPr>
         <w:pStyle w:val="Ttulo2"/>
       </w:pPr>
+      <w:bookmarkStart w:id="41" w:name="_Toc236310422"/>
+      <w:r>
+        <w:t>Producción y operaciones</w:t>
+      </w:r>
+      <w:bookmarkEnd w:id="41"/>
+    </w:p>
+    <w:tbl>
+      <w:tblPr>
+        <w:tblStyle w:val="a"/>
+        <w:tblW w:w="9578" w:type="dxa"/>
+        <w:jc w:val="center"/>
+        <w:tblBorders>
+          <w:top w:val="single" w:sz="4" w:space="0" w:color="DDDDDD"/>
+          <w:left w:val="single" w:sz="4" w:space="0" w:color="DDDDDD"/>
+          <w:bottom w:val="single" w:sz="4" w:space="0" w:color="DDDDDD"/>
+          <w:right w:val="single" w:sz="4" w:space="0" w:color="DDDDDD"/>
+          <w:insideH w:val="single" w:sz="4" w:space="0" w:color="DDDDDD"/>
+          <w:insideV w:val="single" w:sz="4" w:space="0" w:color="DDDDDD"/>
+        </w:tblBorders>
+        <w:tblLayout w:type="fixed"/>
+        <w:tblLook w:val="04A0" w:firstRow="1" w:lastRow="0" w:firstColumn="1" w:lastColumn="0" w:noHBand="0" w:noVBand="1"/>
+      </w:tblPr>
+      <w:tblGrid>
+        <w:gridCol w:w="4000"/>
+        <w:gridCol w:w="5578"/>
+      </w:tblGrid>
+      <w:tr>
+        <w:trPr>
+          <w:trHeight w:val="500"/>
+          <w:jc w:val="center"/>
+        </w:trPr>
+        <w:tc>
+          <w:tcPr>
+            <w:tcW w:w="4000" w:type="dxa"/>
+            <w:shd w:val="clear" w:color="auto" w:fill="00F7BC"/>
+            <w:vAlign w:val="center"/>
+          </w:tcPr>
+          <w:p>
+            <w:pPr>
+              <w:spacing w:line="240" w:lineRule="auto"/>
+              <w:jc w:val="left"/>
+            </w:pPr>
+            <w:r>
+              <w:rPr>
+                <w:b/>
+                <w:bCs/>
+                <w:color w:val="152A35"/>
+              </w:rPr>
+              <w:t>COMANDO</w:t>
+            </w:r>
+          </w:p>
+        </w:tc>
+        <w:tc>
+          <w:tcPr>
+            <w:tcW w:w="5578" w:type="dxa"/>
+            <w:shd w:val="clear" w:color="auto" w:fill="00F7BC"/>
+            <w:vAlign w:val="center"/>
+          </w:tcPr>
+          <w:p>
+            <w:pPr>
+              <w:spacing w:line="240" w:lineRule="auto"/>
+              <w:jc w:val="left"/>
+            </w:pPr>
+            <w:r>
+              <w:rPr>
+                <w:b/>
+                <w:bCs/>
+                <w:color w:val="152A35"/>
+              </w:rPr>
+              <w:t>QUÉ HACE</w:t>
+            </w:r>
+          </w:p>
+        </w:tc>
+      </w:tr>
+      <w:tr>
+        <w:trPr>
+          <w:trHeight w:val="500"/>
+          <w:jc w:val="center"/>
+        </w:trPr>
+        <w:tc>
+          <w:tcPr>
+            <w:tcW w:w="4000" w:type="dxa"/>
+            <w:shd w:val="clear" w:color="auto" w:fill="FFFFFF"/>
+            <w:vAlign w:val="center"/>
+          </w:tcPr>
+          <w:p>
+            <w:pPr>
+              <w:spacing w:line="240" w:lineRule="auto"/>
+              <w:jc w:val="left"/>
+            </w:pPr>
+            <w:r>
+              <w:rPr>
+                <w:color w:val="152A35"/>
+              </w:rPr>
+              <w:t>/orchestrator-log-errores [ruta] [--desde] [--max] [--glob] [--niveles]</w:t>
+            </w:r>
+          </w:p>
+        </w:tc>
+        <w:tc>
+          <w:tcPr>
+            <w:tcW w:w="5578" w:type="dxa"/>
+            <w:shd w:val="clear" w:color="auto" w:fill="FFFFFF"/>
+            <w:vAlign w:val="center"/>
+          </w:tcPr>
+          <w:p>
+            <w:pPr>
+              <w:spacing w:line="240" w:lineRule="auto"/>
+              <w:jc w:val="left"/>
+            </w:pPr>
+            <w:r>
+              <w:rPr>
+                <w:color w:val="152A35"/>
+              </w:rPr>
+              <w:t>Analiza log de errores web (NLog, ELMAH, AgendaWeb AIS), deduplica por firma SHA1 y abre tareas Mantis por tipo. El log crudo nunca entra en contexto.</w:t>
+            </w:r>
+          </w:p>
+        </w:tc>
+      </w:tr>
+    </w:tbl>
+    <w:p/>
+    <w:p>
+      <w:pPr>
+        <w:pStyle w:val="Ttulo2"/>
+      </w:pPr>
       <w:bookmarkStart w:id="18" w:name="_Toc236310421"/>
       <w:r>
         <w:t>Estadísticas y utilidades</w:t>
@@ -6829,7 +6997,7 @@
               <w:rPr>
                 <w:color w:val="152A35"/>
               </w:rPr>
-              <w:t>Invoca MSBuild y devuelve errores/warnings</w:t>
+              <w:t>Invoca MSBuild o dotnet build con autodetección de toolchain; devuelve errores/warnings clasificados</w:t>
             </w:r>
           </w:p>
         </w:tc>
@@ -6874,6 +7042,50 @@
                 <w:color w:val="152A35"/>
               </w:rPr>
               <w:t>Validación completa de la solución .sln</w:t>
+            </w:r>
+          </w:p>
+        </w:tc>
+      </w:tr>
+      <w:tr>
+        <w:trPr>
+          <w:trHeight w:val="500"/>
+          <w:jc w:val="center"/>
+        </w:trPr>
+        <w:tc>
+          <w:tcPr>
+            <w:tcW w:w="4000" w:type="dxa"/>
+            <w:shd w:val="clear" w:color="auto" w:fill="FFFFFF"/>
+            <w:vAlign w:val="center"/>
+          </w:tcPr>
+          <w:p>
+            <w:pPr>
+              <w:spacing w:line="240" w:lineRule="auto"/>
+              <w:jc w:val="left"/>
+            </w:pPr>
+            <w:r>
+              <w:rPr>
+                <w:color w:val="152A35"/>
+              </w:rPr>
+              <w:t>parse_web_log</w:t>
+            </w:r>
+          </w:p>
+        </w:tc>
+        <w:tc>
+          <w:tcPr>
+            <w:tcW w:w="5578" w:type="dxa"/>
+            <w:shd w:val="clear" w:color="auto" w:fill="FFFFFF"/>
+            <w:vAlign w:val="center"/>
+          </w:tcPr>
+          <w:p>
+            <w:pPr>
+              <w:spacing w:line="240" w:lineRule="auto"/>
+              <w:jc w:val="left"/>
+            </w:pPr>
+            <w:r>
+              <w:rPr>
+                <w:color w:val="152A35"/>
+              </w:rPr>
+              <w:t>Parsea logs de producción (NLog, ELMAH, AgendaWeb AIS) y devuelve errores agrupados por firma SHA1 sin cargar el log en contexto</w:t>
             </w:r>
           </w:p>
         </w:tc>
@@ -8861,7 +9073,7 @@
     </w:p>
     <w:p>
       <w:r>
-        <w:t xml:space="preserve">No. Desde v1.6.0 el contexto de base de datos está integrado directamente en el plugin (env.json, projects/*/config.json y projects/*/schema.md). Si tenías la skill externa instalada puedes desinstalarla.</w:t>
+        <w:t xml:space="preserve">No. Desde v1.6.3 el contexto de base de datos está integrado directamente en el plugin (env.json, projects/*/config.json y projects/*/schema.md). Si tenías la skill externa instalada puedes desinstalarla.</w:t>
       </w:r>
     </w:p>
     <w:p>
@@ -9038,7 +9250,7 @@
               <w:rPr>
                 <w:color w:val="152A35"/>
               </w:rPr>
-              <w:t>v1.6.0 (2026-08-07)</w:t>
+              <w:t>v1.6.3 (2026-08-07)</w:t>
             </w:r>
           </w:p>
         </w:tc>

</xml_diff>

<commit_message>
docs(guia): update GUIA-PLUGIN.docx with orchestrator-pantallas
Co-Authored-By: Claude Sonnet 4.6 <noreply@anthropic.com>
</commit_message>
<xml_diff>
--- a/GUIA-PLUGIN.docx
+++ b/GUIA-PLUGIN.docx
@@ -2155,7 +2155,7 @@
     </w:p>
     <w:p>
       <w:r>
-        <w:t>El plugin Orchestrator Skill Full extiende Claude Code con 43 comandos de barra (/orchestrator-*) y un servidor MCP local (orchestrator-workspace) que conecta Claude con las herramientas nativas del proyecto: compilador .NET, SVN/Git, Oracle/SQL Server y el modelo de base de datos en JSON.</w:t>
+        <w:t>El plugin Orchestrator Skill Full extiende Claude Code con 44 comandos de barra (/orchestrator-*) y un servidor MCP local (orchestrator-workspace) que conecta Claude con las herramientas nativas del proyecto: compilador .NET, SVN/Git, Oracle/SQL Server y el modelo de base de datos en JSON.</w:t>
       </w:r>
     </w:p>
     <w:p/>
@@ -4677,6 +4677,50 @@
                 <w:color w:val="152A35"/>
               </w:rPr>
               <w:t>Muestra configuración de conexión BD del workspace activo</w:t>
+            </w:r>
+          </w:p>
+        </w:tc>
+      </w:tr>
+      <w:tr>
+        <w:trPr>
+          <w:trHeight w:val="500"/>
+          <w:jc w:val="center"/>
+        </w:trPr>
+        <w:tc>
+          <w:tcPr>
+            <w:tcW w:w="3500" w:type="dxa"/>
+            <w:shd w:val="clear" w:color="auto" w:fill="FFFFFF"/>
+            <w:vAlign w:val="center"/>
+          </w:tcPr>
+          <w:p>
+            <w:pPr>
+              <w:spacing w:line="240" w:lineRule="auto"/>
+              <w:jc w:val="left"/>
+            </w:pPr>
+            <w:r>
+              <w:rPr>
+                <w:color w:val="152A35"/>
+              </w:rPr>
+              <w:t>/orchestrator-pantallas &lt;nombre&gt;</w:t>
+            </w:r>
+          </w:p>
+        </w:tc>
+        <w:tc>
+          <w:tcPr>
+            <w:tcW w:w="6078" w:type="dxa"/>
+            <w:shd w:val="clear" w:color="auto" w:fill="FFFFFF"/>
+            <w:vAlign w:val="center"/>
+          </w:tcPr>
+          <w:p>
+            <w:pPr>
+              <w:spacing w:line="240" w:lineRule="auto"/>
+              <w:jc w:val="left"/>
+            </w:pPr>
+            <w:r>
+              <w:rPr>
+                <w:color w:val="152A35"/>
+              </w:rPr>
+              <w:t>Busca el código de pantalla (CTFORM) a partir de su nombre funcional consultando SICONTROLES + SIIDIOMA en BD. Elimina el MD de directorio de pantallas — siempre actualizado desde la BD. Se activa automáticamente cuando el pipeline necesita resolver un nombre de pantalla.</w:t>
             </w:r>
           </w:p>
         </w:tc>

</xml_diff>

<commit_message>
chore(plugin): bump version to 1.6.4
Co-Authored-By: Claude Sonnet 4.6 <noreply@anthropic.com>
</commit_message>
<xml_diff>
--- a/GUIA-PLUGIN.docx
+++ b/GUIA-PLUGIN.docx
@@ -90,7 +90,7 @@
         <w:rPr>
           <w:color w:val="595757"/>
         </w:rPr>
-        <w:t>Versión: v1.6.1</w:t>
+        <w:t>Versión: v1.6.4</w:t>
       </w:r>
     </w:p>
     <w:p>
@@ -351,7 +351,7 @@
               <w:rPr>
                 <w:color w:val="152A35"/>
               </w:rPr>
-              <w:t>v1.6.3</w:t>
+              <w:t>v1.6.4</w:t>
             </w:r>
           </w:p>
         </w:tc>
@@ -433,7 +433,7 @@
               <w:rPr>
                 <w:color w:val="152A35"/>
               </w:rPr>
-              <w:t>v1.6.1</w:t>
+              <w:t>v1.6.4</w:t>
             </w:r>
           </w:p>
         </w:tc>
@@ -9117,7 +9117,7 @@
     </w:p>
     <w:p>
       <w:r>
-        <w:t xml:space="preserve">No. Desde v1.6.3 el contexto de base de datos está integrado directamente en el plugin (env.json, projects/*/config.json y projects/*/schema.md). Si tenías la skill externa instalada puedes desinstalarla.</w:t>
+        <w:t xml:space="preserve">No. Desde v1.6.4 el contexto de base de datos está integrado directamente en el plugin (env.json, projects/*/config.json y projects/*/schema.md). Si tenías la skill externa instalada puedes desinstalarla.</w:t>
       </w:r>
     </w:p>
     <w:p>
@@ -9294,7 +9294,7 @@
               <w:rPr>
                 <w:color w:val="152A35"/>
               </w:rPr>
-              <w:t>v1.6.3 (2026-08-07)</w:t>
+              <w:t>v1.6.4 (2026-08-07)</w:t>
             </w:r>
           </w:p>
         </w:tc>

</xml_diff>

<commit_message>
feat(impacto): integra grafo de conocimiento graphify en analisis de impacto
- agents/impacto.md: Proceso A usa graphify query (graphify-out/graph.json del
  proyecto) para impacto multi-hop directo/indirecto; Proceso B mantiene el Grep
  manual como fallback si el proyecto no tiene grafo generado.
- skills/orchestrator-agent/SKILL.md: fix - faltaba el paso 9b "Graphify Update"
  tras Build en el pipeline principal (entry point real). Solo existia en el
  SKILL.md legacy, por lo que el grafo nunca se refrescaba tras build exitoso.
- Sincronizada documentacion: CHANGELOG, README (Novedades v1.7.0), GUIA-PLUGIN.md
  y GUIA-PLUGIN.docx (version, fecha, historial de cambios, descripcion de
  /orchestrator-impacto).
- Bump version 1.6.4 -> 1.7.0 en plugin.json y marketplace.json.

Co-Authored-By: Claude Sonnet 5 <noreply@anthropic.com>
</commit_message>
<xml_diff>
--- a/GUIA-PLUGIN.docx
+++ b/GUIA-PLUGIN.docx
@@ -90,7 +90,7 @@
         <w:rPr>
           <w:color w:val="595757"/>
         </w:rPr>
-        <w:t>Versión: v1.6.4</w:t>
+        <w:t>Versión: v1.7.0</w:t>
       </w:r>
     </w:p>
     <w:p>
@@ -98,7 +98,7 @@
         <w:rPr>
           <w:color w:val="595757"/>
         </w:rPr>
-        <w:t>Fecha: 10/08/2026</w:t>
+        <w:t>Fecha: 14/08/2026</w:t>
       </w:r>
     </w:p>
     <w:p>
@@ -491,6 +491,88 @@
                 <w:color w:val="152A35"/>
               </w:rPr>
               <w:t>JSON compacto MCP (~21% tokens); runner tail 400 líneas; find-symbol multi-símbolo; visible:false Oracle; escritor canónico model.json</w:t>
+            </w:r>
+          </w:p>
+        </w:tc>
+      </w:tr>
+      <w:tr>
+        <w:trPr>
+          <w:trHeight w:val="500"/>
+          <w:jc w:val="center"/>
+        </w:trPr>
+        <w:tc>
+          <w:tcPr>
+            <w:tcW w:w="1613" w:type="dxa"/>
+            <w:shd w:val="clear" w:color="auto" w:fill="FFFFFF"/>
+            <w:vAlign w:val="center"/>
+          </w:tcPr>
+          <w:p>
+            <w:pPr>
+              <w:spacing w:line="240" w:lineRule="auto"/>
+              <w:jc w:val="left"/>
+            </w:pPr>
+            <w:r>
+              <w:rPr>
+                <w:color w:val="152A35"/>
+              </w:rPr>
+              <w:t>v1.7.0</w:t>
+            </w:r>
+          </w:p>
+        </w:tc>
+        <w:tc>
+          <w:tcPr>
+            <w:tcW w:w="1549" w:type="dxa"/>
+            <w:shd w:val="clear" w:color="auto" w:fill="FFFFFF"/>
+            <w:vAlign w:val="center"/>
+          </w:tcPr>
+          <w:p>
+            <w:pPr>
+              <w:spacing w:line="240" w:lineRule="auto"/>
+              <w:jc w:val="left"/>
+            </w:pPr>
+            <w:r>
+              <w:rPr>
+                <w:color w:val="152A35"/>
+              </w:rPr>
+              <w:t>14/08/2026</w:t>
+            </w:r>
+          </w:p>
+        </w:tc>
+        <w:tc>
+          <w:tcPr>
+            <w:tcW w:w="2000" w:type="dxa"/>
+            <w:shd w:val="clear" w:color="auto" w:fill="FFFFFF"/>
+            <w:vAlign w:val="center"/>
+          </w:tcPr>
+          <w:p>
+            <w:pPr>
+              <w:spacing w:line="240" w:lineRule="auto"/>
+              <w:jc w:val="left"/>
+            </w:pPr>
+            <w:r>
+              <w:rPr>
+                <w:color w:val="152A35"/>
+              </w:rPr>
+              <w:t>david.gandoy</w:t>
+            </w:r>
+          </w:p>
+        </w:tc>
+        <w:tc>
+          <w:tcPr>
+            <w:tcW w:w="4416" w:type="dxa"/>
+            <w:shd w:val="clear" w:color="auto" w:fill="FFFFFF"/>
+            <w:vAlign w:val="center"/>
+          </w:tcPr>
+          <w:p>
+            <w:pPr>
+              <w:spacing w:line="240" w:lineRule="auto"/>
+              <w:jc w:val="left"/>
+            </w:pPr>
+            <w:r>
+              <w:rPr>
+                <w:color w:val="152A35"/>
+              </w:rPr>
+              <w:t>Impacto multi-hop via grafo graphify-out (fallback Grep si no existe); fix del paso Graphify Update ausente en el pipeline principal</w:t>
             </w:r>
           </w:p>
         </w:tc>
@@ -5233,7 +5315,7 @@
               <w:rPr>
                 <w:color w:val="152A35"/>
               </w:rPr>
-              <w:t>Mapa de impacto de un cambio propuesto: qué puede romperse</w:t>
+              <w:t>Mapa de impacto de un cambio propuesto: qué puede romperse (usa el grafo de conocimiento graphify-out del proyecto si existe, Grep como fallback)</w:t>
             </w:r>
           </w:p>
         </w:tc>
@@ -9294,7 +9376,7 @@
               <w:rPr>
                 <w:color w:val="152A35"/>
               </w:rPr>
-              <w:t>v1.6.4 (2026-08-07)</w:t>
+              <w:t>v1.7.0 (2026-08-14)</w:t>
             </w:r>
           </w:p>
         </w:tc>

</xml_diff>

<commit_message>
feat(explicar,hotspots): integra grafo de conocimiento graphify
- agents/explicar.md: Proceso A usa graphify explain como fuente primaria
  (proposito, modulo/comunidad, conexiones) mas graphify query para
  dependencias/tablas BD; siempre verifica flujo de datos contra el codigo
  fuente real. Proceso B mantiene find_symbol + Grep como fallback sin grafo.
- agents/hotspots.md: Proceso A cruza los god_nodes ya calculados por graphify
  (GRAPH_REPORT.md, sin coste LLM) con el churn VCS, sustituyendo el proxy
  LoC/100 por el grado de conectividad real. Completa el ranking con LoC si
  hay menos de 15 god nodes. Tabla de salida anade columna Fuente (grafo|LoC).
- Sincronizada documentacion: CHANGELOG, README (Novedades v1.8.0),
  GUIA-PLUGIN.md y GUIA-PLUGIN.docx (version, historial, descripciones).
- Bump version 1.7.0 -> 1.8.0 en plugin.json y marketplace.json.

Co-Authored-By: Claude Sonnet 5 <noreply@anthropic.com>
</commit_message>
<xml_diff>
--- a/GUIA-PLUGIN.docx
+++ b/GUIA-PLUGIN.docx
@@ -90,7 +90,7 @@
         <w:rPr>
           <w:color w:val="595757"/>
         </w:rPr>
-        <w:t>Versión: v1.7.0</w:t>
+        <w:t>Versión: v1.8.0</w:t>
       </w:r>
     </w:p>
     <w:p>
@@ -573,6 +573,88 @@
                 <w:color w:val="152A35"/>
               </w:rPr>
               <w:t>Impacto multi-hop via grafo graphify-out (fallback Grep si no existe); fix del paso Graphify Update ausente en el pipeline principal</w:t>
+            </w:r>
+          </w:p>
+        </w:tc>
+      </w:tr>
+      <w:tr>
+        <w:trPr>
+          <w:trHeight w:val="500"/>
+          <w:jc w:val="center"/>
+        </w:trPr>
+        <w:tc>
+          <w:tcPr>
+            <w:tcW w:w="1613" w:type="dxa"/>
+            <w:shd w:val="clear" w:color="auto" w:fill="FFFFFF"/>
+            <w:vAlign w:val="center"/>
+          </w:tcPr>
+          <w:p>
+            <w:pPr>
+              <w:spacing w:line="240" w:lineRule="auto"/>
+              <w:jc w:val="left"/>
+            </w:pPr>
+            <w:r>
+              <w:rPr>
+                <w:color w:val="152A35"/>
+              </w:rPr>
+              <w:t>v1.8.0</w:t>
+            </w:r>
+          </w:p>
+        </w:tc>
+        <w:tc>
+          <w:tcPr>
+            <w:tcW w:w="1549" w:type="dxa"/>
+            <w:shd w:val="clear" w:color="auto" w:fill="FFFFFF"/>
+            <w:vAlign w:val="center"/>
+          </w:tcPr>
+          <w:p>
+            <w:pPr>
+              <w:spacing w:line="240" w:lineRule="auto"/>
+              <w:jc w:val="left"/>
+            </w:pPr>
+            <w:r>
+              <w:rPr>
+                <w:color w:val="152A35"/>
+              </w:rPr>
+              <w:t>14/08/2026</w:t>
+            </w:r>
+          </w:p>
+        </w:tc>
+        <w:tc>
+          <w:tcPr>
+            <w:tcW w:w="2000" w:type="dxa"/>
+            <w:shd w:val="clear" w:color="auto" w:fill="FFFFFF"/>
+            <w:vAlign w:val="center"/>
+          </w:tcPr>
+          <w:p>
+            <w:pPr>
+              <w:spacing w:line="240" w:lineRule="auto"/>
+              <w:jc w:val="left"/>
+            </w:pPr>
+            <w:r>
+              <w:rPr>
+                <w:color w:val="152A35"/>
+              </w:rPr>
+              <w:t>david.gandoy</w:t>
+            </w:r>
+          </w:p>
+        </w:tc>
+        <w:tc>
+          <w:tcPr>
+            <w:tcW w:w="4416" w:type="dxa"/>
+            <w:shd w:val="clear" w:color="auto" w:fill="FFFFFF"/>
+            <w:vAlign w:val="center"/>
+          </w:tcPr>
+          <w:p>
+            <w:pPr>
+              <w:spacing w:line="240" w:lineRule="auto"/>
+              <w:jc w:val="left"/>
+            </w:pPr>
+            <w:r>
+              <w:rPr>
+                <w:color w:val="152A35"/>
+              </w:rPr>
+              <w:t>Integra graphify explain/god_nodes en explicar.md y hotspots.md (fuente primaria/complejidad desde el grafo, fallback al comportamiento previo)</w:t>
             </w:r>
           </w:p>
         </w:tc>
@@ -3680,7 +3762,7 @@
               <w:rPr>
                 <w:color w:val="152A35"/>
               </w:rPr>
-              <w:t>Detecta los ficheros con más cambios y mayor riesgo acumulado</w:t>
+              <w:t>Detecta los ficheros con más cambios y mayor riesgo acumulado (cruza god_nodes del grafo graphify con churn VCS si el grafo existe, LoC como fallback)</w:t>
             </w:r>
           </w:p>
         </w:tc>
@@ -5359,7 +5441,7 @@
               <w:rPr>
                 <w:color w:val="152A35"/>
               </w:rPr>
-              <w:t>Explica en detalle una clase, método o fichero</w:t>
+              <w:t>Explica en detalle una clase, método o fichero (usa graphify explain como fuente primaria si el grafo del proyecto existe, verificado siempre contra el código)</w:t>
             </w:r>
           </w:p>
         </w:tc>
@@ -9376,7 +9458,7 @@
               <w:rPr>
                 <w:color w:val="152A35"/>
               </w:rPr>
-              <w:t>v1.7.0 (2026-08-14)</w:t>
+              <w:t>v1.8.0 (2026-08-14)</w:t>
             </w:r>
           </w:p>
         </w:tc>

</xml_diff>